<commit_message>
Revise handover from review; redraw Figure 1 as device states
- Port Jamie's review edits (title, scope note, logger status, next
  steps, key terms, goals) into the Markdown master
- Split §1: open items that need testing (storage bound, battery life,
  thresholds) vs. known limitations that follow from design decisions;
  explanations moved into §4.1, §4.4 and §5.1
- Clock drift: expected negligible with the board's crystal; replace the
  drift test with a free end-of-deployment time check (also in the SOP)
- Drop cx_Freeze from reader-facing text
- Figure 1: larger text, boxes are device states, arrows are triggers;
  fix Initialize from state 4 going to state 2 (not 1). Source HTML kept
  in docs/images/src/
- SOP: matching state names and the end-time check

Co-Authored-By: Claude Opus 5.5 <noreply@anthropic.com>
Claude-Session: https://claude.ai/code/session_01Ue3sWJSFRo3Bxhe8SfexR3
</commit_message>
<xml_diff>
--- a/docs/Project_Handover.docx
+++ b/docs/Project_Handover.docx
@@ -7,19 +7,55 @@
         <w:pStyle w:val="Title"/>
       </w:pPr>
       <w:r>
-        <w:t xml:space="preserve">Splint</w:t>
-      </w:r>
-      <w:r>
-        <w:t xml:space="preserve"> </w:t>
-      </w:r>
-      <w:r>
-        <w:t xml:space="preserve">Adherence</w:t>
-      </w:r>
-      <w:r>
-        <w:t xml:space="preserve"> </w:t>
-      </w:r>
-      <w:r>
-        <w:t xml:space="preserve">Logger</w:t>
+        <w:t xml:space="preserve">Measuring</w:t>
+      </w:r>
+      <w:r>
+        <w:t xml:space="preserve"> </w:t>
+      </w:r>
+      <w:r>
+        <w:t xml:space="preserve">Temperature</w:t>
+      </w:r>
+      <w:r>
+        <w:t xml:space="preserve"> </w:t>
+      </w:r>
+      <w:r>
+        <w:t xml:space="preserve">and</w:t>
+      </w:r>
+      <w:r>
+        <w:t xml:space="preserve"> </w:t>
+      </w:r>
+      <w:r>
+        <w:t xml:space="preserve">Muscle</w:t>
+      </w:r>
+      <w:r>
+        <w:t xml:space="preserve"> </w:t>
+      </w:r>
+      <w:r>
+        <w:t xml:space="preserve">Contraction</w:t>
+      </w:r>
+      <w:r>
+        <w:t xml:space="preserve"> </w:t>
+      </w:r>
+      <w:r>
+        <w:t xml:space="preserve">in</w:t>
+      </w:r>
+      <w:r>
+        <w:t xml:space="preserve"> </w:t>
+      </w:r>
+      <w:r>
+        <w:t xml:space="preserve">Custom</w:t>
+      </w:r>
+      <w:r>
+        <w:t xml:space="preserve"> </w:t>
+      </w:r>
+      <w:r>
+        <w:t xml:space="preserve">Orthotic</w:t>
+      </w:r>
+      <w:r>
+        <w:t xml:space="preserve"> </w:t>
+      </w:r>
+      <w:r>
+        <w:t xml:space="preserve">Devices</w:t>
       </w:r>
       <w:r>
         <w:t xml:space="preserve"> </w:t>
@@ -140,7 +176,20 @@
         <w:pStyle w:val="FirstParagraph"/>
       </w:pPr>
       <w:r>
-        <w:t xml:space="preserve">This is the handover record for the splint adherence logger: a temperature and proximity logger embedded in a thermoplastic splint, and the desktop app that configures it and estimates wear time from its recordings (January 2025 – October 2026). It is composed of the following:</w:t>
+        <w:t xml:space="preserve">This is the handover record for the project</w:t>
+      </w:r>
+      <w:r>
+        <w:t xml:space="preserve"> </w:t>
+      </w:r>
+      <w:r>
+        <w:rPr>
+          <w:iCs/>
+          <w:i/>
+        </w:rPr>
+        <w:t xml:space="preserve">Measuring Temperature and Muscle Contraction in Custom Orthotic Devices</w:t>
+      </w:r>
+      <w:r>
+        <w:t xml:space="preserve">, specifically its splint adherence logger: a temperature and proximity logger embedded in a thermoplastic splint, and the desktop app that configures it and estimates wear time from its recordings (May 2024 – October 2026). It is composed of the following:</w:t>
       </w:r>
     </w:p>
     <w:p>
@@ -162,7 +211,7 @@
         <w:t xml:space="preserve"> </w:t>
       </w:r>
       <w:r>
-        <w:t xml:space="preserve">the state of the project at transition, open issues, what to do next, and who to contact. Read this first.</w:t>
+        <w:t xml:space="preserve">the state of the project at transition, open items, known limitations, what to do next, and who to contact. Read this first.</w:t>
       </w:r>
     </w:p>
     <w:p>
@@ -236,7 +285,7 @@
         <w:pStyle w:val="FirstParagraph"/>
       </w:pPr>
       <w:r>
-        <w:t xml:space="preserve">Companion documents are listed in §1.4, and technical terms are explained under</w:t>
+        <w:t xml:space="preserve">Companion documents are listed in §1.5, and technical terms are explained under</w:t>
       </w:r>
       <w:r>
         <w:t xml:space="preserve"> </w:t>
@@ -250,6 +299,14 @@
       </w:r>
       <w:r>
         <w:t xml:space="preserve">, after §1.</w:t>
+      </w:r>
+    </w:p>
+    <w:p>
+      <w:pPr>
+        <w:pStyle w:val="BodyText"/>
+      </w:pPr>
+      <w:r>
+        <w:t xml:space="preserve">The muscle contraction variant of the project work will not be discussed as it was only explored at a preliminary level and has a different objective, where its focus is observing how much does the splint deactivate the target muscle.</w:t>
       </w:r>
     </w:p>
     <w:p>
@@ -460,7 +517,7 @@
               <w:rPr>
                 <w:sz w:val="19"/>
               </w:rPr>
-              <w:t xml:space="preserve">§1.2, §1.3, §8, §9 and Appendices A–B</w:t>
+              <w:t xml:space="preserve">§1.2–§1.4, §8, §9 and Appendices A–B</w:t>
             </w:r>
           </w:p>
         </w:tc>
@@ -499,7 +556,7 @@
       </w:tr>
     </w:tbl>
     <w:bookmarkEnd w:id="20"/>
-    <w:bookmarkStart w:id="26" w:name="state-at-transition-october-2026"/>
+    <w:bookmarkStart w:id="27" w:name="state-at-transition-october-2026"/>
     <w:p>
       <w:pPr>
         <w:pStyle w:val="Heading1"/>
@@ -596,13 +653,13 @@
           <w:bCs/>
           <w:b/>
         </w:rPr>
-        <w:t xml:space="preserve">Field use.</w:t>
-      </w:r>
-      <w:r>
-        <w:t xml:space="preserve"> </w:t>
-      </w:r>
-      <w:r>
-        <w:t xml:space="preserve">Recordings of up to about 36 days have been collected and analysed, and the analysis was hardened against what they showed (proximity drift, §5.3).</w:t>
+        <w:t xml:space="preserve">Preliminary test use.</w:t>
+      </w:r>
+      <w:r>
+        <w:t xml:space="preserve"> </w:t>
+      </w:r>
+      <w:r>
+        <w:t xml:space="preserve">Recordings of up to about 36 days have been collected and analysed, and the analysis was hardened against what they showed (proximity drift, §5.3). There are two loggers built, where one of them needs re-connection at the rear 3.3 V trace to update the firmware while the other one is ready for deployment. The logger that requires updated firmware is labelled</w:t>
       </w:r>
       <w:r>
         <w:t xml:space="preserve"> </w:t>
@@ -612,10 +669,10 @@
           <w:bCs/>
           <w:b/>
         </w:rPr>
-        <w:t xml:space="preserve">[TODO]</w:t>
-      </w:r>
-      <w:r>
-        <w:t xml:space="preserve">: number of loggers built, number of deployments and participants so far, and the state of each logger.</w:t>
+        <w:t xml:space="preserve">[TODO: label]</w:t>
+      </w:r>
+      <w:r>
+        <w:t xml:space="preserve">.</w:t>
       </w:r>
     </w:p>
     <w:p>
@@ -681,21 +738,13 @@
       </w:r>
     </w:p>
     <w:bookmarkEnd w:id="21"/>
-    <w:bookmarkStart w:id="22" w:name="open-issues"/>
+    <w:bookmarkStart w:id="22" w:name="open-items-need-testing"/>
     <w:p>
       <w:pPr>
         <w:pStyle w:val="Heading2"/>
       </w:pPr>
       <w:r>
-        <w:t xml:space="preserve">1.2 Open issues</w:t>
-      </w:r>
-    </w:p>
-    <w:p>
-      <w:pPr>
-        <w:pStyle w:val="FirstParagraph"/>
-      </w:pPr>
-      <w:r>
-        <w:t xml:space="preserve">Items 1–3 were found while preparing this handover, by reading the code; they have not been reproduced on hardware.</w:t>
+        <w:t xml:space="preserve">1.2 Open items (need testing)</w:t>
       </w:r>
     </w:p>
     <w:p>
@@ -711,22 +760,80 @@
           <w:bCs/>
           <w:b/>
         </w:rPr>
-        <w:t xml:space="preserve">Timestamps assume the logger was powered on exactly at the start time entered.</w:t>
-      </w:r>
-      <w:r>
-        <w:t xml:space="preserve"> </w:t>
-      </w:r>
-      <w:r>
-        <w:t xml:space="preserve">The logger stores the start time typed into the app and counts elapsed time from its next power-on (</w:t>
+        <w:t xml:space="preserve">Storage bound not enforced.</w:t>
+      </w:r>
+      <w:r>
+        <w:t xml:space="preserve"> </w:t>
       </w:r>
       <w:r>
         <w:rPr>
           <w:rStyle w:val="VerbatimChar"/>
         </w:rPr>
-        <w:t xml:space="preserve">startMillis</w:t>
-      </w:r>
-      <w:r>
-        <w:t xml:space="preserve">). Any gap between the two shifts every timestamp in the recording by that amount, and nothing in the file shows it. The SOP now tells operators to power on at the entered time and log the actual time. A fix is proposed in Appendix A.</w:t>
+        <w:t xml:space="preserve">saveTemperatureReading</w:t>
+      </w:r>
+      <w:r>
+        <w:t xml:space="preserve"> </w:t>
+      </w:r>
+      <w:r>
+        <w:t xml:space="preserve">checks against the whole flash rather than</w:t>
+      </w:r>
+      <w:r>
+        <w:t xml:space="preserve"> </w:t>
+      </w:r>
+      <w:r>
+        <w:rPr>
+          <w:rStyle w:val="VerbatimChar"/>
+        </w:rPr>
+        <w:t xml:space="preserve">MAX_DATA_ENTRIES</w:t>
+      </w:r>
+      <w:r>
+        <w:t xml:space="preserve"> </w:t>
+      </w:r>
+      <w:r>
+        <w:t xml:space="preserve">(15 000). Records beyond about 52 days go into pages that were never erased and are never downloaded.</w:t>
+      </w:r>
+      <w:r>
+        <w:t xml:space="preserve"> </w:t>
+      </w:r>
+      <w:r>
+        <w:rPr>
+          <w:iCs/>
+          <w:i/>
+        </w:rPr>
+        <w:t xml:space="preserve">Test:</w:t>
+      </w:r>
+      <w:r>
+        <w:t xml:space="preserve"> </w:t>
+      </w:r>
+      <w:r>
+        <w:t xml:space="preserve">initialize a logger with a 1-second interval (a temporary change to</w:t>
+      </w:r>
+      <w:r>
+        <w:t xml:space="preserve"> </w:t>
+      </w:r>
+      <w:r>
+        <w:rPr>
+          <w:rStyle w:val="VerbatimChar"/>
+        </w:rPr>
+        <w:t xml:space="preserve">WAKEUP_INTERVAL_SECONDS</w:t>
+      </w:r>
+      <w:r>
+        <w:t xml:space="preserve"> </w:t>
+      </w:r>
+      <w:r>
+        <w:t xml:space="preserve">in</w:t>
+      </w:r>
+      <w:r>
+        <w:t xml:space="preserve"> </w:t>
+      </w:r>
+      <w:r>
+        <w:rPr>
+          <w:rStyle w:val="VerbatimChar"/>
+        </w:rPr>
+        <w:t xml:space="preserve">arduino.py</w:t>
+      </w:r>
+      <w:r>
+        <w:t xml:space="preserve">; no firmware change needed) and leave it collecting for 5 hours, well past 15 000 records. The download should stop at exactly 15 000 rows, which confirms the later readings are silently lost. After the fix, the logger should stop cleanly at 15 000.</w:t>
       </w:r>
     </w:p>
     <w:p>
@@ -742,13 +849,29 @@
           <w:bCs/>
           <w:b/>
         </w:rPr>
-        <w:t xml:space="preserve">Any reset during a deployment ends the recording.</w:t>
-      </w:r>
-      <w:r>
-        <w:t xml:space="preserve"> </w:t>
-      </w:r>
-      <w:r>
-        <w:t xml:space="preserve">The mode is toggled on every power-up (§4.1). A reset, brown-out or loose battery while logging therefore puts the logger into idle mode, and it stays there. The data up to that point is kept, but nothing more is recorded. See Appendix A.</w:t>
+        <w:t xml:space="preserve">Battery life not measured</w:t>
+      </w:r>
+      <w:r>
+        <w:t xml:space="preserve"> </w:t>
+      </w:r>
+      <w:r>
+        <w:t xml:space="preserve">over a full deployment. Resting current was below about 750 µA on the bench.</w:t>
+      </w:r>
+      <w:r>
+        <w:t xml:space="preserve"> </w:t>
+      </w:r>
+      <w:r>
+        <w:rPr>
+          <w:iCs/>
+          <w:i/>
+        </w:rPr>
+        <w:t xml:space="preserve">Test:</w:t>
+      </w:r>
+      <w:r>
+        <w:t xml:space="preserve"> </w:t>
+      </w:r>
+      <w:r>
+        <w:t xml:space="preserve">see §1.4 step 2.</w:t>
       </w:r>
     </w:p>
     <w:p>
@@ -764,184 +887,6 @@
           <w:bCs/>
           <w:b/>
         </w:rPr>
-        <w:t xml:space="preserve">Long continuous wear may be cut short by the detector.</w:t>
-      </w:r>
-      <w:r>
-        <w:t xml:space="preserve"> </w:t>
-      </w:r>
-      <w:r>
-        <w:t xml:space="preserve">The temperature baseline is a rolling minimum over a centred window of about 2 hours (§5.1). After about an hour of continuous wear, the window is all</w:t>
-      </w:r>
-      <w:r>
-        <w:t xml:space="preserve"> </w:t>
-      </w:r>
-      <w:r>
-        <w:t xml:space="preserve">“</w:t>
-      </w:r>
-      <w:r>
-        <w:t xml:space="preserve">worn</w:t>
-      </w:r>
-      <w:r>
-        <w:t xml:space="preserve">”</w:t>
-      </w:r>
-      <w:r>
-        <w:t xml:space="preserve"> </w:t>
-      </w:r>
-      <w:r>
-        <w:t xml:space="preserve">samples and the temperature rise above baseline falls to about 0. From then on, a single drop of 0.4 °C between samples ends the event. It cannot restart, because restarting needs a rise of ≥ 3 °C above baseline or a jump of ≥ 0.8 °C. On synthetic 8-hour overnight wear, temperature noise with a standard deviation of 0.15 °C was enough to split the nights into short pieces; with 0.04 °C they were detected whole. Check on real overnight recordings before trusting long-wear totals.</w:t>
-      </w:r>
-    </w:p>
-    <w:p>
-      <w:pPr>
-        <w:numPr>
-          <w:ilvl w:val="0"/>
-          <w:numId w:val="1003"/>
-        </w:numPr>
-        <w:pStyle w:val="Compact"/>
-      </w:pPr>
-      <w:r>
-        <w:rPr>
-          <w:bCs/>
-          <w:b/>
-        </w:rPr>
-        <w:t xml:space="preserve">Clock rollover at ~49.7 days.</w:t>
-      </w:r>
-      <w:r>
-        <w:t xml:space="preserve"> </w:t>
-      </w:r>
-      <w:r>
-        <w:rPr>
-          <w:rStyle w:val="VerbatimChar"/>
-        </w:rPr>
-        <w:t xml:space="preserve">millis()</w:t>
-      </w:r>
-      <w:r>
-        <w:t xml:space="preserve"> </w:t>
-      </w:r>
-      <w:r>
-        <w:t xml:space="preserve">wraps, and the sleep check</w:t>
-      </w:r>
-      <w:r>
-        <w:t xml:space="preserve"> </w:t>
-      </w:r>
-      <w:r>
-        <w:rPr>
-          <w:rStyle w:val="VerbatimChar"/>
-        </w:rPr>
-        <w:t xml:space="preserve">nextWakeTime &gt; currentTime</w:t>
-      </w:r>
-      <w:r>
-        <w:t xml:space="preserve"> </w:t>
-      </w:r>
-      <w:r>
-        <w:t xml:space="preserve">is not wrap-safe. Expect a burst of readings followed by a long gap. Proposed fix (HANDOFF.md §8):</w:t>
-      </w:r>
-      <w:r>
-        <w:t xml:space="preserve"> </w:t>
-      </w:r>
-      <w:r>
-        <w:rPr>
-          <w:rStyle w:val="VerbatimChar"/>
-        </w:rPr>
-        <w:t xml:space="preserve">if ((int32_t)(nextWakeTime - currentTime) &gt; 0)</w:t>
-      </w:r>
-      <w:r>
-        <w:t xml:space="preserve">, bench-tested with a temporary offset on</w:t>
-      </w:r>
-      <w:r>
-        <w:t xml:space="preserve"> </w:t>
-      </w:r>
-      <w:r>
-        <w:rPr>
-          <w:rStyle w:val="VerbatimChar"/>
-        </w:rPr>
-        <w:t xml:space="preserve">millis()</w:t>
-      </w:r>
-      <w:r>
-        <w:t xml:space="preserve">. Until then, deployments are limited to about a month.</w:t>
-      </w:r>
-    </w:p>
-    <w:p>
-      <w:pPr>
-        <w:numPr>
-          <w:ilvl w:val="0"/>
-          <w:numId w:val="1003"/>
-        </w:numPr>
-        <w:pStyle w:val="Compact"/>
-      </w:pPr>
-      <w:r>
-        <w:rPr>
-          <w:bCs/>
-          <w:b/>
-        </w:rPr>
-        <w:t xml:space="preserve">Storage bound not enforced.</w:t>
-      </w:r>
-      <w:r>
-        <w:t xml:space="preserve"> </w:t>
-      </w:r>
-      <w:r>
-        <w:rPr>
-          <w:rStyle w:val="VerbatimChar"/>
-        </w:rPr>
-        <w:t xml:space="preserve">saveTemperatureReading</w:t>
-      </w:r>
-      <w:r>
-        <w:t xml:space="preserve"> </w:t>
-      </w:r>
-      <w:r>
-        <w:t xml:space="preserve">checks against the whole flash rather than</w:t>
-      </w:r>
-      <w:r>
-        <w:t xml:space="preserve"> </w:t>
-      </w:r>
-      <w:r>
-        <w:rPr>
-          <w:rStyle w:val="VerbatimChar"/>
-        </w:rPr>
-        <w:t xml:space="preserve">MAX_DATA_ENTRIES</w:t>
-      </w:r>
-      <w:r>
-        <w:t xml:space="preserve"> </w:t>
-      </w:r>
-      <w:r>
-        <w:t xml:space="preserve">(15 000). Records beyond about 52 days go into pages that were never erased and are never downloaded. In practice item 4 comes first.</w:t>
-      </w:r>
-    </w:p>
-    <w:p>
-      <w:pPr>
-        <w:numPr>
-          <w:ilvl w:val="0"/>
-          <w:numId w:val="1003"/>
-        </w:numPr>
-        <w:pStyle w:val="Compact"/>
-      </w:pPr>
-      <w:r>
-        <w:rPr>
-          <w:bCs/>
-          <w:b/>
-        </w:rPr>
-        <w:t xml:space="preserve">Battery life not measured</w:t>
-      </w:r>
-      <w:r>
-        <w:t xml:space="preserve"> </w:t>
-      </w:r>
-      <w:r>
-        <w:t xml:space="preserve">over a full deployment. Resting current was below about 750 µA on the bench.</w:t>
-      </w:r>
-    </w:p>
-    <w:p>
-      <w:pPr>
-        <w:numPr>
-          <w:ilvl w:val="0"/>
-          <w:numId w:val="1003"/>
-        </w:numPr>
-        <w:pStyle w:val="Compact"/>
-      </w:pPr>
-      <w:r>
-        <w:rPr>
-          <w:bCs/>
-          <w:b/>
-        </w:rPr>
         <w:t xml:space="preserve">Wear-detection thresholds not validated.</w:t>
       </w:r>
       <w:r>
@@ -950,59 +895,377 @@
       <w:r>
         <w:t xml:space="preserve">They were tuned by eye on a small number of recordings, with no ground-truth record of when the splint was actually worn (§5.4).</w:t>
       </w:r>
-    </w:p>
-    <w:p>
-      <w:pPr>
-        <w:numPr>
-          <w:ilvl w:val="0"/>
-          <w:numId w:val="1003"/>
-        </w:numPr>
-        <w:pStyle w:val="Compact"/>
-      </w:pPr>
-      <w:r>
-        <w:rPr>
-          <w:bCs/>
-          <w:b/>
-        </w:rPr>
-        <w:t xml:space="preserve">No clock correction.</w:t>
-      </w:r>
-      <w:r>
-        <w:t xml:space="preserve"> </w:t>
-      </w:r>
-      <w:r>
-        <w:t xml:space="preserve">Timestamps rely on the board’s crystal drifting very little over weeks; this has not been measured.</w:t>
-      </w:r>
-    </w:p>
-    <w:p>
-      <w:pPr>
-        <w:numPr>
-          <w:ilvl w:val="0"/>
-          <w:numId w:val="1003"/>
-        </w:numPr>
-        <w:pStyle w:val="Compact"/>
-      </w:pPr>
-      <w:r>
-        <w:rPr>
-          <w:bCs/>
-          <w:b/>
-        </w:rPr>
-        <w:t xml:space="preserve">Unsigned builds.</w:t>
-      </w:r>
-      <w:r>
-        <w:t xml:space="preserve"> </w:t>
-      </w:r>
-      <w:r>
-        <w:t xml:space="preserve">Windows SmartScreen and macOS Gatekeeper warn on first launch (the SOP covers the workaround).</w:t>
+      <w:r>
+        <w:t xml:space="preserve"> </w:t>
+      </w:r>
+      <w:r>
+        <w:rPr>
+          <w:iCs/>
+          <w:i/>
+        </w:rPr>
+        <w:t xml:space="preserve">Test:</w:t>
+      </w:r>
+      <w:r>
+        <w:t xml:space="preserve"> </w:t>
+      </w:r>
+      <w:r>
+        <w:t xml:space="preserve">Appendix B.</w:t>
       </w:r>
     </w:p>
     <w:bookmarkEnd w:id="22"/>
-    <w:bookmarkStart w:id="23" w:name="recommended-next-steps"/>
+    <w:bookmarkStart w:id="23" w:name="known-limitations-from-design-decisions"/>
     <w:p>
       <w:pPr>
         <w:pStyle w:val="Heading2"/>
       </w:pPr>
       <w:r>
-        <w:t xml:space="preserve">1.3 Recommended next steps</w:t>
+        <w:t xml:space="preserve">1.3 Known limitations (from design decisions)</w:t>
+      </w:r>
+    </w:p>
+    <w:p>
+      <w:pPr>
+        <w:pStyle w:val="FirstParagraph"/>
+      </w:pPr>
+      <w:r>
+        <w:t xml:space="preserve">These follow from how the logger and the analysis were designed. They are explained in the section named in the middle column; Appendix A covers the firmware changes that would remove the first three.</w:t>
+      </w:r>
+    </w:p>
+    <w:tbl>
+      <w:tblPr>
+        <w:tblStyle w:val="Table"/>
+        <w:tblW w:type="pct" w:w="5000"/>
+        <w:tblLook w:firstRow="1" w:lastRow="0" w:firstColumn="0" w:lastColumn="0" w:noHBand="0" w:noVBand="0" w:val="0020"/>
+        <w:jc w:val="start"/>
+        <w:tblBorders>
+          <w:top w:val="single" w:sz="4" w:space="0" w:color="BFBFBF"/>
+          <w:left w:val="single" w:sz="4" w:space="0" w:color="BFBFBF"/>
+          <w:bottom w:val="single" w:sz="4" w:space="0" w:color="BFBFBF"/>
+          <w:right w:val="single" w:sz="4" w:space="0" w:color="BFBFBF"/>
+          <w:insideH w:val="single" w:sz="4" w:space="0" w:color="BFBFBF"/>
+          <w:insideV w:val="single" w:sz="4" w:space="0" w:color="BFBFBF"/>
+        </w:tblBorders>
+      </w:tblPr>
+      <w:tblGrid>
+        <w:gridCol w:w="2795"/>
+        <w:gridCol w:w="2096"/>
+        <w:gridCol w:w="3028"/>
+      </w:tblGrid>
+      <w:tr>
+        <w:trPr>
+          <w:tblHeader w:val="true"/>
+        </w:trPr>
+        <w:tc>
+          <w:tcPr>
+            <w:shd w:val="clear" w:color="auto" w:fill="DCE6F1"/>
+          </w:tcPr>
+          <w:p>
+            <w:pPr>
+              <w:pStyle w:val="Compact"/>
+              <w:jc w:val="left"/>
+            </w:pPr>
+            <w:r>
+              <w:rPr>
+                <w:b/>
+                <w:sz w:val="19"/>
+              </w:rPr>
+              <w:t xml:space="preserve">Limitation</w:t>
+            </w:r>
+          </w:p>
+        </w:tc>
+        <w:tc>
+          <w:tcPr>
+            <w:shd w:val="clear" w:color="auto" w:fill="DCE6F1"/>
+          </w:tcPr>
+          <w:p>
+            <w:pPr>
+              <w:pStyle w:val="Compact"/>
+              <w:jc w:val="left"/>
+            </w:pPr>
+            <w:r>
+              <w:rPr>
+                <w:b/>
+                <w:sz w:val="19"/>
+              </w:rPr>
+              <w:t xml:space="preserve">Comes from</w:t>
+            </w:r>
+          </w:p>
+        </w:tc>
+        <w:tc>
+          <w:tcPr>
+            <w:shd w:val="clear" w:color="auto" w:fill="DCE6F1"/>
+          </w:tcPr>
+          <w:p>
+            <w:pPr>
+              <w:pStyle w:val="Compact"/>
+              <w:jc w:val="left"/>
+            </w:pPr>
+            <w:r>
+              <w:rPr>
+                <w:b/>
+                <w:sz w:val="19"/>
+              </w:rPr>
+              <w:t xml:space="preserve">What to do now</w:t>
+            </w:r>
+          </w:p>
+        </w:tc>
+      </w:tr>
+      <w:tr>
+        <w:tc>
+          <w:tcPr/>
+          <w:p>
+            <w:pPr>
+              <w:pStyle w:val="Compact"/>
+              <w:jc w:val="left"/>
+            </w:pPr>
+            <w:r>
+              <w:rPr>
+                <w:sz w:val="19"/>
+              </w:rPr>
+              <w:t xml:space="preserve">Timestamps are only right if the logger is powered on at the start time entered in the app</w:t>
+            </w:r>
+          </w:p>
+        </w:tc>
+        <w:tc>
+          <w:tcPr/>
+          <w:p>
+            <w:pPr>
+              <w:pStyle w:val="Compact"/>
+              <w:jc w:val="left"/>
+            </w:pPr>
+            <w:r>
+              <w:rPr>
+                <w:sz w:val="19"/>
+              </w:rPr>
+              <w:t xml:space="preserve">Elapsed-time records (§4.4)</w:t>
+            </w:r>
+          </w:p>
+        </w:tc>
+        <w:tc>
+          <w:tcPr/>
+          <w:p>
+            <w:pPr>
+              <w:pStyle w:val="Compact"/>
+              <w:jc w:val="left"/>
+            </w:pPr>
+            <w:r>
+              <w:rPr>
+                <w:sz w:val="19"/>
+              </w:rPr>
+              <w:t xml:space="preserve">Power on at the entered time and note the actual time (SOP §7.1)</w:t>
+            </w:r>
+          </w:p>
+        </w:tc>
+      </w:tr>
+      <w:tr>
+        <w:tc>
+          <w:tcPr/>
+          <w:p>
+            <w:pPr>
+              <w:pStyle w:val="Compact"/>
+              <w:jc w:val="left"/>
+            </w:pPr>
+            <w:r>
+              <w:rPr>
+                <w:sz w:val="19"/>
+              </w:rPr>
+              <w:t xml:space="preserve">Any reset or power loss during collection ends the recording</w:t>
+            </w:r>
+          </w:p>
+        </w:tc>
+        <w:tc>
+          <w:tcPr/>
+          <w:p>
+            <w:pPr>
+              <w:pStyle w:val="Compact"/>
+              <w:jc w:val="left"/>
+            </w:pPr>
+            <w:r>
+              <w:rPr>
+                <w:sz w:val="19"/>
+              </w:rPr>
+              <w:t xml:space="preserve">Mode chosen by power-up (§4.1)</w:t>
+            </w:r>
+          </w:p>
+        </w:tc>
+        <w:tc>
+          <w:tcPr/>
+          <w:p>
+            <w:pPr>
+              <w:pStyle w:val="Compact"/>
+              <w:jc w:val="left"/>
+            </w:pPr>
+            <w:r>
+              <w:rPr>
+                <w:sz w:val="19"/>
+              </w:rPr>
+              <w:t xml:space="preserve">Secure the battery; note any interruption</w:t>
+            </w:r>
+          </w:p>
+        </w:tc>
+      </w:tr>
+      <w:tr>
+        <w:tc>
+          <w:tcPr/>
+          <w:p>
+            <w:pPr>
+              <w:pStyle w:val="Compact"/>
+              <w:jc w:val="left"/>
+            </w:pPr>
+            <w:r>
+              <w:rPr>
+                <w:sz w:val="19"/>
+              </w:rPr>
+              <w:t xml:space="preserve">Clock rollover at ~49.7 days</w:t>
+            </w:r>
+          </w:p>
+        </w:tc>
+        <w:tc>
+          <w:tcPr/>
+          <w:p>
+            <w:pPr>
+              <w:pStyle w:val="Compact"/>
+              <w:jc w:val="left"/>
+            </w:pPr>
+            <w:r>
+              <w:rPr>
+                <w:rStyle w:val="VerbatimChar"/>
+                <w:sz w:val="19"/>
+              </w:rPr>
+              <w:t xml:space="preserve">millis()</w:t>
+            </w:r>
+            <w:r>
+              <w:rPr>
+                <w:sz w:val="19"/>
+              </w:rPr>
+              <w:t xml:space="preserve"> </w:t>
+            </w:r>
+            <w:r>
+              <w:rPr>
+                <w:sz w:val="19"/>
+              </w:rPr>
+              <w:t xml:space="preserve">timing (§4.4)</w:t>
+            </w:r>
+          </w:p>
+        </w:tc>
+        <w:tc>
+          <w:tcPr/>
+          <w:p>
+            <w:pPr>
+              <w:pStyle w:val="Compact"/>
+              <w:jc w:val="left"/>
+            </w:pPr>
+            <w:r>
+              <w:rPr>
+                <w:sz w:val="19"/>
+              </w:rPr>
+              <w:t xml:space="preserve">Keep deployments to about a month</w:t>
+            </w:r>
+          </w:p>
+        </w:tc>
+      </w:tr>
+      <w:tr>
+        <w:tc>
+          <w:tcPr/>
+          <w:p>
+            <w:pPr>
+              <w:pStyle w:val="Compact"/>
+              <w:jc w:val="left"/>
+            </w:pPr>
+            <w:r>
+              <w:rPr>
+                <w:sz w:val="19"/>
+              </w:rPr>
+              <w:t xml:space="preserve">Long continuous wear may be cut short by the detector</w:t>
+            </w:r>
+          </w:p>
+        </w:tc>
+        <w:tc>
+          <w:tcPr/>
+          <w:p>
+            <w:pPr>
+              <w:pStyle w:val="Compact"/>
+              <w:jc w:val="left"/>
+            </w:pPr>
+            <w:r>
+              <w:rPr>
+                <w:sz w:val="19"/>
+              </w:rPr>
+              <w:t xml:space="preserve">Rolling-minimum baseline (§5.1)</w:t>
+            </w:r>
+          </w:p>
+        </w:tc>
+        <w:tc>
+          <w:tcPr/>
+          <w:p>
+            <w:pPr>
+              <w:pStyle w:val="Compact"/>
+              <w:jc w:val="left"/>
+            </w:pPr>
+            <w:r>
+              <w:rPr>
+                <w:sz w:val="19"/>
+              </w:rPr>
+              <w:t xml:space="preserve">Check overnight wear on the traces, not only the totals</w:t>
+            </w:r>
+          </w:p>
+        </w:tc>
+      </w:tr>
+      <w:tr>
+        <w:tc>
+          <w:tcPr/>
+          <w:p>
+            <w:pPr>
+              <w:pStyle w:val="Compact"/>
+              <w:jc w:val="left"/>
+            </w:pPr>
+            <w:r>
+              <w:rPr>
+                <w:sz w:val="19"/>
+              </w:rPr>
+              <w:t xml:space="preserve">No clock correction</w:t>
+            </w:r>
+          </w:p>
+        </w:tc>
+        <w:tc>
+          <w:tcPr/>
+          <w:p>
+            <w:pPr>
+              <w:pStyle w:val="Compact"/>
+              <w:jc w:val="left"/>
+            </w:pPr>
+            <w:r>
+              <w:rPr>
+                <w:sz w:val="19"/>
+              </w:rPr>
+              <w:t xml:space="preserve">Board’s own oscillator (§4.4)</w:t>
+            </w:r>
+          </w:p>
+        </w:tc>
+        <w:tc>
+          <w:tcPr/>
+          <w:p>
+            <w:pPr>
+              <w:pStyle w:val="Compact"/>
+              <w:jc w:val="left"/>
+            </w:pPr>
+            <w:r>
+              <w:rPr>
+                <w:sz w:val="19"/>
+              </w:rPr>
+              <w:t xml:space="preserve">Expected negligible; check with §1.4 step 4</w:t>
+            </w:r>
+          </w:p>
+        </w:tc>
+      </w:tr>
+    </w:tbl>
+    <w:bookmarkEnd w:id="23"/>
+    <w:bookmarkStart w:id="24" w:name="recommended-next-steps"/>
+    <w:p>
+      <w:pPr>
+        <w:pStyle w:val="Heading2"/>
+      </w:pPr>
+      <w:r>
+        <w:t xml:space="preserve">1.4 Recommended next steps</w:t>
       </w:r>
     </w:p>
     <w:p>
@@ -1014,35 +1277,7 @@
         <w:pStyle w:val="Compact"/>
       </w:pPr>
       <w:r>
-        <w:t xml:space="preserve">Fix the firmware issues together, in one firmware release (Appendix A): wrap-safe sleep (item 4), the storage bound (item 5), and, ideally, starting the recording at Initialize (item 1) and choosing idle vs. logging by USB presence rather than by power-up count (item 2). Bench-test across the</w:t>
-      </w:r>
-      <w:r>
-        <w:t xml:space="preserve"> </w:t>
-      </w:r>
-      <w:r>
-        <w:rPr>
-          <w:rStyle w:val="VerbatimChar"/>
-        </w:rPr>
-        <w:t xml:space="preserve">millis()</w:t>
-      </w:r>
-      <w:r>
-        <w:t xml:space="preserve"> </w:t>
-      </w:r>
-      <w:r>
-        <w:t xml:space="preserve">wrap. Re-flash all loggers</w:t>
-      </w:r>
-      <w:r>
-        <w:t xml:space="preserve"> </w:t>
-      </w:r>
-      <w:r>
-        <w:rPr>
-          <w:bCs/>
-          <w:b/>
-        </w:rPr>
-        <w:t xml:space="preserve">after downloading their data</w:t>
-      </w:r>
-      <w:r>
-        <w:t xml:space="preserve">.</w:t>
+        <w:t xml:space="preserve">Fix the firmware issues together, in one firmware release (Appendix A): wrap-safe sleep (§1.3), the storage bound (§1.2), and, ideally, starting the recording at Initialize (§1.3). Upload the updated firmware and bench test.</w:t>
       </w:r>
     </w:p>
     <w:p>
@@ -1054,7 +1289,7 @@
         <w:pStyle w:val="Compact"/>
       </w:pPr>
       <w:r>
-        <w:t xml:space="preserve">Measure battery life: one logger on the bench for a full month (or until the battery is flat), recording its voltage or current.</w:t>
+        <w:t xml:space="preserve">Measure full battery life: one logger on the bench for a full month or until the battery dies, which is the duration of expected battery life.</w:t>
       </w:r>
     </w:p>
     <w:p>
@@ -1066,7 +1301,7 @@
         <w:pStyle w:val="Compact"/>
       </w:pPr>
       <w:r>
-        <w:t xml:space="preserve">Collect ground truth (Appendix B): a few deployments with a wear diary or a second reference sensor. Use them to check the detector, especially on overnight wear (item 3), and re-tune the thresholds.</w:t>
+        <w:t xml:space="preserve">Collect ground truth (Appendix B): a few deployments with a wear diary or a second reference sensor. Use them to check the detection algorithm, especially on overnight wear (§5.1), and re-tune the thresholds.</w:t>
       </w:r>
     </w:p>
     <w:p>
@@ -1078,45 +1313,17 @@
         <w:pStyle w:val="Compact"/>
       </w:pPr>
       <w:r>
-        <w:t xml:space="preserve">Measure clock drift over a month against a reference time.</w:t>
-      </w:r>
-    </w:p>
-    <w:p>
-      <w:pPr>
-        <w:numPr>
-          <w:ilvl w:val="0"/>
-          <w:numId w:val="1004"/>
-        </w:numPr>
-        <w:pStyle w:val="Compact"/>
-      </w:pPr>
-      <w:r>
-        <w:t xml:space="preserve">Fill in the</w:t>
-      </w:r>
-      <w:r>
-        <w:t xml:space="preserve"> </w:t>
-      </w:r>
-      <w:r>
-        <w:rPr>
-          <w:bCs/>
-          <w:b/>
-        </w:rPr>
-        <w:t xml:space="preserve">[TODO]</w:t>
-      </w:r>
-      <w:r>
-        <w:t xml:space="preserve"> </w:t>
-      </w:r>
-      <w:r>
-        <w:t xml:space="preserve">hardware sections of the SOP (battery, power switch, enclosure, mounting).</w:t>
-      </w:r>
-    </w:p>
-    <w:bookmarkEnd w:id="23"/>
-    <w:bookmarkStart w:id="24" w:name="documents-files-reference"/>
+        <w:t xml:space="preserve">At the end of each deployment, note the real time of the power-cycle and compare it with the last timestamp in the file. They should agree to within one interval (5 minutes); a larger gap shows clock drift or a late power-on. This costs nothing and replaces a dedicated drift test.</w:t>
+      </w:r>
+    </w:p>
+    <w:bookmarkEnd w:id="24"/>
+    <w:bookmarkStart w:id="25" w:name="documents-files-reference"/>
     <w:p>
       <w:pPr>
         <w:pStyle w:val="Heading2"/>
       </w:pPr>
       <w:r>
-        <w:t xml:space="preserve">1.4 Documents &amp; files reference</w:t>
+        <w:t xml:space="preserve">1.5 Documents &amp; files reference</w:t>
       </w:r>
     </w:p>
     <w:tbl>
@@ -1753,7 +1960,7 @@
               <w:rPr>
                 <w:sz w:val="19"/>
               </w:rPr>
-              <w:t xml:space="preserve">cx_Freeze build configuration and app version</w:t>
+              <w:t xml:space="preserve">App version and packaging settings used by the release workflow</w:t>
             </w:r>
           </w:p>
         </w:tc>
@@ -1940,47 +2147,14 @@
         </w:tc>
       </w:tr>
     </w:tbl>
-    <w:p>
-      <w:pPr>
-        <w:pStyle w:val="BodyText"/>
-      </w:pPr>
-      <w:r>
-        <w:rPr>
-          <w:bCs/>
-          <w:b/>
-        </w:rPr>
-        <w:t xml:space="preserve">Editing these documents.</w:t>
-      </w:r>
-      <w:r>
-        <w:t xml:space="preserve"> </w:t>
-      </w:r>
-      <w:r>
-        <w:t xml:space="preserve">The Markdown files are the master copies. The Word files are generated from them with</w:t>
-      </w:r>
-      <w:r>
-        <w:t xml:space="preserve"> </w:t>
-      </w:r>
-      <w:r>
-        <w:rPr>
-          <w:rStyle w:val="VerbatimChar"/>
-        </w:rPr>
-        <w:t xml:space="preserve">bash docs/build_docs.sh</w:t>
-      </w:r>
-      <w:r>
-        <w:t xml:space="preserve"> </w:t>
-      </w:r>
-      <w:r>
-        <w:t xml:space="preserve">(needs pandoc), so edits made only in Word are lost at the next rebuild.</w:t>
-      </w:r>
-    </w:p>
-    <w:bookmarkEnd w:id="24"/>
-    <w:bookmarkStart w:id="25" w:name="handover-logistics"/>
+    <w:bookmarkEnd w:id="25"/>
+    <w:bookmarkStart w:id="26" w:name="handover-logistics"/>
     <w:p>
       <w:pPr>
         <w:pStyle w:val="Heading2"/>
       </w:pPr>
       <w:r>
-        <w:t xml:space="preserve">1.5 Handover logistics</w:t>
+        <w:t xml:space="preserve">1.6 Handover logistics</w:t>
       </w:r>
     </w:p>
     <w:p>
@@ -1996,26 +2170,13 @@
           <w:bCs/>
           <w:b/>
         </w:rPr>
-        <w:t xml:space="preserve">Hardware:</w:t>
+        <w:t xml:space="preserve">Hardware location:</w:t>
       </w:r>
       <w:r>
         <w:t xml:space="preserve"> </w:t>
       </w:r>
       <w:r>
         <w:t xml:space="preserve">Room 1588, Elborn College, Western University. It may be relocated after October 2026.</w:t>
-      </w:r>
-      <w:r>
-        <w:t xml:space="preserve"> </w:t>
-      </w:r>
-      <w:r>
-        <w:rPr>
-          <w:bCs/>
-          <w:b/>
-        </w:rPr>
-        <w:t xml:space="preserve">[TODO]</w:t>
-      </w:r>
-      <w:r>
-        <w:t xml:space="preserve">: list of loggers and splints and their state.</w:t>
       </w:r>
     </w:p>
     <w:p>
@@ -2053,35 +2214,6 @@
           <w:bCs/>
           <w:b/>
         </w:rPr>
-        <w:t xml:space="preserve">Data:</w:t>
-      </w:r>
-      <w:r>
-        <w:t xml:space="preserve"> </w:t>
-      </w:r>
-      <w:r>
-        <w:rPr>
-          <w:bCs/>
-          <w:b/>
-        </w:rPr>
-        <w:t xml:space="preserve">[TODO]</w:t>
-      </w:r>
-      <w:r>
-        <w:t xml:space="preserve">: where study recordings and deployment logs are stored, and who can grant access.</w:t>
-      </w:r>
-    </w:p>
-    <w:p>
-      <w:pPr>
-        <w:numPr>
-          <w:ilvl w:val="0"/>
-          <w:numId w:val="1005"/>
-        </w:numPr>
-        <w:pStyle w:val="Compact"/>
-      </w:pPr>
-      <w:r>
-        <w:rPr>
-          <w:bCs/>
-          <w:b/>
-        </w:rPr>
         <w:t xml:space="preserve">Questions:</w:t>
       </w:r>
       <w:r>
@@ -2091,9 +2223,9 @@
         <w:t xml:space="preserve">reach out to Jamie Kim (jamiejmkim.jmk@gmail.com).</w:t>
       </w:r>
     </w:p>
-    <w:bookmarkEnd w:id="25"/>
     <w:bookmarkEnd w:id="26"/>
-    <w:bookmarkStart w:id="27" w:name="key-terms"/>
+    <w:bookmarkEnd w:id="27"/>
+    <w:bookmarkStart w:id="28" w:name="key-terms"/>
     <w:p>
       <w:pPr>
         <w:pStyle w:val="Heading1"/>
@@ -2189,7 +2321,7 @@
               <w:rPr>
                 <w:sz w:val="19"/>
               </w:rPr>
-              <w:t xml:space="preserve">The Arduino Nano 33 BLE Sense board in the splint, with its sensors</w:t>
+              <w:t xml:space="preserve">The Arduino Nano 33 BLE Sense board with programmed hardware, designed to be in the splint.</w:t>
             </w:r>
           </w:p>
         </w:tc>
@@ -2635,41 +2767,9 @@
           </w:p>
         </w:tc>
       </w:tr>
-      <w:tr>
-        <w:tc>
-          <w:tcPr/>
-          <w:p>
-            <w:pPr>
-              <w:pStyle w:val="Compact"/>
-              <w:jc w:val="left"/>
-            </w:pPr>
-            <w:r>
-              <w:rPr>
-                <w:sz w:val="19"/>
-              </w:rPr>
-              <w:t xml:space="preserve">cx_Freeze</w:t>
-            </w:r>
-          </w:p>
-        </w:tc>
-        <w:tc>
-          <w:tcPr/>
-          <w:p>
-            <w:pPr>
-              <w:pStyle w:val="Compact"/>
-              <w:jc w:val="left"/>
-            </w:pPr>
-            <w:r>
-              <w:rPr>
-                <w:sz w:val="19"/>
-              </w:rPr>
-              <w:t xml:space="preserve">The tool that packages the Python app into a stand-alone Windows/macOS program</w:t>
-            </w:r>
-          </w:p>
-        </w:tc>
-      </w:tr>
     </w:tbl>
-    <w:bookmarkEnd w:id="27"/>
-    <w:bookmarkStart w:id="28" w:name="problem-and-goals"/>
+    <w:bookmarkEnd w:id="28"/>
+    <w:bookmarkStart w:id="29" w:name="problem-and-goals"/>
     <w:p>
       <w:pPr>
         <w:pStyle w:val="Heading1"/>
@@ -2683,7 +2783,7 @@
         <w:pStyle w:val="FirstParagraph"/>
       </w:pPr>
       <w:r>
-        <w:t xml:space="preserve">The goal is a low-cost way to measure</w:t>
+        <w:t xml:space="preserve">The goal is to measure</w:t>
       </w:r>
       <w:r>
         <w:t xml:space="preserve"> </w:t>
@@ -2699,7 +2799,7 @@
         <w:t xml:space="preserve"> </w:t>
       </w:r>
       <w:r>
-        <w:t xml:space="preserve">— when, and for how long each day — without relying on self-report.</w:t>
+        <w:t xml:space="preserve">— when, and for how long each day, without relying on self-report.</w:t>
       </w:r>
     </w:p>
     <w:tbl>
@@ -2838,22 +2938,22 @@
               <w:rPr>
                 <w:sz w:val="19"/>
               </w:rPr>
-              <w:t xml:space="preserve">Simple for research staff</w:t>
-            </w:r>
-          </w:p>
-        </w:tc>
-        <w:tc>
-          <w:tcPr/>
-          <w:p>
-            <w:pPr>
-              <w:pStyle w:val="Compact"/>
-              <w:jc w:val="left"/>
-            </w:pPr>
-            <w:r>
-              <w:rPr>
-                <w:sz w:val="19"/>
-              </w:rPr>
-              <w:t xml:space="preserve">One app to set up a logger, download it, and see the results, with no programming</w:t>
+              <w:t xml:space="preserve">Simple workflow</w:t>
+            </w:r>
+          </w:p>
+        </w:tc>
+        <w:tc>
+          <w:tcPr/>
+          <w:p>
+            <w:pPr>
+              <w:pStyle w:val="Compact"/>
+              <w:jc w:val="left"/>
+            </w:pPr>
+            <w:r>
+              <w:rPr>
+                <w:sz w:val="19"/>
+              </w:rPr>
+              <w:t xml:space="preserve">One app to set up a logger, download it, and see the results</w:t>
             </w:r>
           </w:p>
         </w:tc>
@@ -2925,8 +3025,8 @@
         <w:t xml:space="preserve">the splint is worn (fit, position) or activity during wear is out of scope.</w:t>
       </w:r>
     </w:p>
-    <w:bookmarkEnd w:id="28"/>
-    <w:bookmarkStart w:id="35" w:name="system-architecture"/>
+    <w:bookmarkEnd w:id="29"/>
+    <w:bookmarkStart w:id="36" w:name="system-architecture"/>
     <w:p>
       <w:pPr>
         <w:pStyle w:val="Heading1"/>
@@ -2950,20 +3050,20 @@
       <w:r>
         <w:drawing>
           <wp:inline>
-            <wp:extent cx="5334000" cy="2506980"/>
+            <wp:extent cx="5334000" cy="3200400"/>
             <wp:effectExtent b="0" l="0" r="0" t="0"/>
-            <wp:docPr descr="Figure 1. The logger’s states. Each power-up moves it along the arrows; the app can only reach it in the idle states (1 and 4)." title="" id="30" name="Picture"/>
+            <wp:docPr descr="Figure 1. The logger’s states and what triggers each change. The app can connect only in states 1 and 4; in state 2 the board is powered down." title="" id="31" name="Picture"/>
             <a:graphic>
               <a:graphicData uri="http://schemas.openxmlformats.org/drawingml/2006/picture">
                 <pic:pic>
                   <pic:nvPicPr>
-                    <pic:cNvPr descr="images/device_lifecycle.png" id="31" name="Picture"/>
+                    <pic:cNvPr descr="images/device_lifecycle.png" id="32" name="Picture"/>
                     <pic:cNvPicPr>
                       <a:picLocks noChangeArrowheads="1" noChangeAspect="1"/>
                     </pic:cNvPicPr>
                   </pic:nvPicPr>
                   <pic:blipFill>
-                    <a:blip r:embed="rId29"/>
+                    <a:blip r:embed="rId30"/>
                     <a:stretch>
                       <a:fillRect/>
                     </a:stretch>
@@ -2971,7 +3071,7 @@
                   <pic:spPr bwMode="auto">
                     <a:xfrm>
                       <a:off x="0" y="0"/>
-                      <a:ext cx="5334000" cy="2506980"/>
+                      <a:ext cx="5334000" cy="3200400"/>
                     </a:xfrm>
                     <a:prstGeom prst="rect">
                       <a:avLst/>
@@ -2995,10 +3095,10 @@
         <w:pStyle w:val="ImageCaption"/>
       </w:pPr>
       <w:r>
-        <w:t xml:space="preserve">Figure 1. The logger’s states. Each power-up moves it along the arrows; the app can only reach it in the idle states (1 and 4).</w:t>
-      </w:r>
-    </w:p>
-    <w:bookmarkStart w:id="32" w:name="Xf94d73710224c8ed626aaa020021a29f2f7e816"/>
+        <w:t xml:space="preserve">Figure 1. The logger’s states and what triggers each change. The app can connect only in states 1 and 4; in state 2 the board is powered down.</w:t>
+      </w:r>
+    </w:p>
+    <w:bookmarkStart w:id="33" w:name="Xf94d73710224c8ed626aaa020021a29f2f7e816"/>
     <w:p>
       <w:pPr>
         <w:pStyle w:val="Heading2"/>
@@ -3073,8 +3173,8 @@
         <w:t xml:space="preserve">Detecting wear on the board (stores less, but loses the raw data and needs re-flashing to change); streaming over Bluetooth to a phone (needs the patient’s phone and much more power).</w:t>
       </w:r>
     </w:p>
-    <w:bookmarkEnd w:id="32"/>
-    <w:bookmarkStart w:id="33" w:name="hardware"/>
+    <w:bookmarkEnd w:id="33"/>
+    <w:bookmarkStart w:id="34" w:name="hardware"/>
     <w:p>
       <w:pPr>
         <w:pStyle w:val="Heading2"/>
@@ -3149,8 +3249,8 @@
         <w:t xml:space="preserve">The board is larger and draws more current than a purpose-built logger.</w:t>
       </w:r>
     </w:p>
-    <w:bookmarkEnd w:id="33"/>
-    <w:bookmarkStart w:id="34" w:name="serial-protocol"/>
+    <w:bookmarkEnd w:id="34"/>
+    <w:bookmarkStart w:id="35" w:name="serial-protocol"/>
     <w:p>
       <w:pPr>
         <w:pStyle w:val="Heading2"/>
@@ -3323,9 +3423,9 @@
         <w:t xml:space="preserve">to every serial port, so the user never has to choose a port.</w:t>
       </w:r>
     </w:p>
-    <w:bookmarkEnd w:id="34"/>
     <w:bookmarkEnd w:id="35"/>
-    <w:bookmarkStart w:id="41" w:name="firmware-design-decisions"/>
+    <w:bookmarkEnd w:id="36"/>
+    <w:bookmarkStart w:id="42" w:name="firmware-design-decisions"/>
     <w:p>
       <w:pPr>
         <w:pStyle w:val="Heading1"/>
@@ -3334,7 +3434,7 @@
         <w:t xml:space="preserve">4. Firmware design decisions</w:t>
       </w:r>
     </w:p>
-    <w:bookmarkStart w:id="36" w:name="mode-chosen-by-power-up"/>
+    <w:bookmarkStart w:id="37" w:name="mode-chosen-by-power-up"/>
     <w:p>
       <w:pPr>
         <w:pStyle w:val="Heading2"/>
@@ -3362,7 +3462,7 @@
         <w:t xml:space="preserve"> </w:t>
       </w:r>
       <w:r>
-        <w:t xml:space="preserve">The logger keeps a mode flag in flash and switches on every power-up: after Initialize (idle, no data) → logging; while logging → idle (Figure 1).</w:t>
+        <w:t xml:space="preserve">The logger keeps a mode flag in flash and changes it on every power-up: an initialized logger with no data starts collecting; a collecting logger becomes idle (Figure 1).</w:t>
       </w:r>
     </w:p>
     <w:p>
@@ -3384,7 +3484,7 @@
         <w:t xml:space="preserve"> </w:t>
       </w:r>
       <w:r>
-        <w:t xml:space="preserve">In logging mode USB is switched off to save power, so the computer can’t send it a</w:t>
+        <w:t xml:space="preserve">During collection USB is switched off to save power, so the computer can’t send a</w:t>
       </w:r>
       <w:r>
         <w:t xml:space="preserve"> </w:t>
@@ -3418,17 +3518,17 @@
           <w:bCs/>
           <w:b/>
         </w:rPr>
-        <w:t xml:space="preserve">Consequences:</w:t>
-      </w:r>
-      <w:r>
-        <w:t xml:space="preserve"> </w:t>
-      </w:r>
-      <w:r>
-        <w:t xml:space="preserve">The logger can’t be found while logging (the most common support question). Any reset during a deployment ends the recording (§1.2 item 2). Appendix A proposes using USB presence instead.</w:t>
-      </w:r>
-    </w:p>
-    <w:bookmarkEnd w:id="36"/>
-    <w:bookmarkStart w:id="37" w:name="settings-stored-twice-ab-with-a-checksum"/>
+        <w:t xml:space="preserve">Limitation:</w:t>
+      </w:r>
+      <w:r>
+        <w:t xml:space="preserve"> </w:t>
+      </w:r>
+      <w:r>
+        <w:t xml:space="preserve">The logger can’t be seen by the app while collecting; power-cycle it first. Any reset or power loss during collection also counts as a power-up, so the recording ends there: the data so far is kept, but nothing more is recorded. Appendix A.2 describes an alternative.</w:t>
+      </w:r>
+    </w:p>
+    <w:bookmarkEnd w:id="37"/>
+    <w:bookmarkStart w:id="38" w:name="settings-stored-twice-ab-with-a-checksum"/>
     <w:p>
       <w:pPr>
         <w:pStyle w:val="Heading2"/>
@@ -3534,14 +3634,14 @@
         <w:t xml:space="preserve">start times until re-initialized; download first.</w:t>
       </w:r>
     </w:p>
-    <w:bookmarkEnd w:id="37"/>
-    <w:bookmarkStart w:id="38" w:name="X9ab8f8832a6a44bb5215db56f823f08455cc05d"/>
+    <w:bookmarkEnd w:id="38"/>
+    <w:bookmarkStart w:id="39" w:name="low-power-by-switching-peripherals-off"/>
     <w:p>
       <w:pPr>
         <w:pStyle w:val="Heading2"/>
       </w:pPr>
       <w:r>
-        <w:t xml:space="preserve">4.3 Low power by switching peripherals off, not by deep sleep</w:t>
+        <w:t xml:space="preserve">4.3 Low power by switching peripherals off</w:t>
       </w:r>
     </w:p>
     <w:p>
@@ -3563,7 +3663,7 @@
         <w:t xml:space="preserve"> </w:t>
       </w:r>
       <w:r>
-        <w:t xml:space="preserve">In logging mode the firmware disables USB, UART, the radio and other unused peripherals, and waits between readings with</w:t>
+        <w:t xml:space="preserve">During collection the firmware disables USB, UART, the radio and other unused peripherals, and waits between readings with</w:t>
       </w:r>
       <w:r>
         <w:t xml:space="preserve"> </w:t>
@@ -3609,7 +3709,7 @@
         <w:t xml:space="preserve">__WFI</w:t>
       </w:r>
       <w:r>
-        <w:t xml:space="preserve">, aimed at the ~584 µA that</w:t>
+        <w:t xml:space="preserve">) was tried in August 2026 and reverted (commits</w:t>
       </w:r>
       <w:r>
         <w:t xml:space="preserve"> </w:t>
@@ -3618,13 +3718,13 @@
         <w:rPr>
           <w:rStyle w:val="VerbatimChar"/>
         </w:rPr>
-        <w:t xml:space="preserve">delay()</w:t>
-      </w:r>
-      <w:r>
-        <w:t xml:space="preserve"> </w:t>
-      </w:r>
-      <w:r>
-        <w:t xml:space="preserve">leaves) was tried in August 2026 and reverted the same day (commits</w:t>
+        <w:t xml:space="preserve">b0cdfce</w:t>
+      </w:r>
+      <w:r>
+        <w:t xml:space="preserve"> </w:t>
+      </w:r>
+      <w:r>
+        <w:t xml:space="preserve">→</w:t>
       </w:r>
       <w:r>
         <w:t xml:space="preserve"> </w:t>
@@ -3633,25 +3733,10 @@
         <w:rPr>
           <w:rStyle w:val="VerbatimChar"/>
         </w:rPr>
-        <w:t xml:space="preserve">b0cdfce</w:t>
-      </w:r>
-      <w:r>
-        <w:t xml:space="preserve"> </w:t>
-      </w:r>
-      <w:r>
-        <w:t xml:space="preserve">→</w:t>
-      </w:r>
-      <w:r>
-        <w:t xml:space="preserve"> </w:t>
-      </w:r>
-      <w:r>
-        <w:rPr>
-          <w:rStyle w:val="VerbatimChar"/>
-        </w:rPr>
         <w:t xml:space="preserve">c153218</w:t>
       </w:r>
       <w:r>
-        <w:t xml:space="preserve">); the reason is not recorded, so treat it as untested rather than ruled out.</w:t>
+        <w:t xml:space="preserve">); it may still be worth revisiting for battery life.</w:t>
       </w:r>
     </w:p>
     <w:p>
@@ -3686,8 +3771,8 @@
         <w:t xml:space="preserve">On the nRF52840 they share hardware with the I2C controllers the sensors use. Disabling them stopped the proximity read and nothing was logged.</w:t>
       </w:r>
     </w:p>
-    <w:bookmarkEnd w:id="38"/>
-    <w:bookmarkStart w:id="39" w:name="X411b90941db8c81d2e6ca52c8267385abd623de"/>
+    <w:bookmarkEnd w:id="39"/>
+    <w:bookmarkStart w:id="40" w:name="X411b90941db8c81d2e6ca52c8267385abd623de"/>
     <w:p>
       <w:pPr>
         <w:pStyle w:val="Heading2"/>
@@ -3739,7 +3824,19 @@
         <w:t xml:space="preserve">arduino.py</w:t>
       </w:r>
       <w:r>
-        <w:t xml:space="preserve">, sent at Initialize). Each record stores seconds elapsed since logging started, plus temperature and proximity, in 12 bytes; the app adds the start time.</w:t>
+        <w:t xml:space="preserve">, sent at Initialize). Each record stores seconds elapsed since collection started (from</w:t>
+      </w:r>
+      <w:r>
+        <w:t xml:space="preserve"> </w:t>
+      </w:r>
+      <w:r>
+        <w:rPr>
+          <w:rStyle w:val="VerbatimChar"/>
+        </w:rPr>
+        <w:t xml:space="preserve">millis()</w:t>
+      </w:r>
+      <w:r>
+        <w:t xml:space="preserve">), plus temperature and proximity, in 12 bytes; the app adds the start time.</w:t>
       </w:r>
     </w:p>
     <w:p>
@@ -3761,116 +3858,123 @@
         <w:t xml:space="preserve"> </w:t>
       </w:r>
       <w:r>
-        <w:t xml:space="preserve">5 minutes resolves wear periods well enough for daily totals, and fits a month in flash. The analysis infers the real interval from the timestamps, so the interval can be changed without changing the analysis.</w:t>
-      </w:r>
-    </w:p>
-    <w:bookmarkEnd w:id="39"/>
-    <w:bookmarkStart w:id="40" w:name="robust-proximity-reads"/>
-    <w:p>
-      <w:pPr>
-        <w:pStyle w:val="Heading2"/>
-      </w:pPr>
-      <w:r>
-        <w:t xml:space="preserve">4.5 Robust proximity reads</w:t>
+        <w:t xml:space="preserve">The board has no real-time clock, so elapsed time is the simplest reliable record. 5 minutes resolves wear periods well enough for daily totals, and fits a month in flash. The analysis infers the real interval from the timestamps, so the interval can be changed without changing the analysis.</w:t>
       </w:r>
     </w:p>
     <w:p>
       <w:pPr>
         <w:numPr>
           <w:ilvl w:val="0"/>
+          <w:numId w:val="1012"/>
+        </w:numPr>
+        <w:pStyle w:val="Compact"/>
+      </w:pPr>
+      <w:r>
+        <w:rPr>
+          <w:bCs/>
+          <w:b/>
+        </w:rPr>
+        <w:t xml:space="preserve">Limitations:</w:t>
+      </w:r>
+    </w:p>
+    <w:p>
+      <w:pPr>
+        <w:numPr>
+          <w:ilvl w:val="1"/>
           <w:numId w:val="1013"/>
         </w:numPr>
         <w:pStyle w:val="Compact"/>
       </w:pPr>
       <w:r>
         <w:rPr>
-          <w:bCs/>
-          <w:b/>
-        </w:rPr>
-        <w:t xml:space="preserve">Design Decision:</w:t>
-      </w:r>
-      <w:r>
-        <w:t xml:space="preserve"> </w:t>
-      </w:r>
-      <w:r>
-        <w:t xml:space="preserve">Discard the first 2 proximity samples after the sensor wakes, and bound every wait with a timeout; a missing sensor logs</w:t>
-      </w:r>
-      <w:r>
-        <w:t xml:space="preserve"> </w:t>
-      </w:r>
-      <w:r>
-        <w:rPr>
-          <w:rStyle w:val="VerbatimChar"/>
-        </w:rPr>
-        <w:t xml:space="preserve">0</w:t>
-      </w:r>
-      <w:r>
-        <w:t xml:space="preserve">.</w:t>
+          <w:iCs/>
+          <w:i/>
+        </w:rPr>
+        <w:t xml:space="preserve">Start time.</w:t>
+      </w:r>
+      <w:r>
+        <w:t xml:space="preserve"> </w:t>
+      </w:r>
+      <w:r>
+        <w:t xml:space="preserve">Elapsed time counts from the power-on that starts collection, while the start time is the one typed into the app at Initialize. Any gap between the two shifts every timestamp by that amount, and nothing in the file shows it. Appendix A.1 describes a fix.</w:t>
       </w:r>
     </w:p>
     <w:p>
       <w:pPr>
         <w:numPr>
-          <w:ilvl w:val="0"/>
+          <w:ilvl w:val="1"/>
           <w:numId w:val="1013"/>
         </w:numPr>
         <w:pStyle w:val="Compact"/>
       </w:pPr>
       <w:r>
         <w:rPr>
-          <w:bCs/>
-          <w:b/>
-        </w:rPr>
-        <w:t xml:space="preserve">Why:</w:t>
-      </w:r>
-      <w:r>
-        <w:t xml:space="preserve"> </w:t>
-      </w:r>
-      <w:r>
-        <w:t xml:space="preserve">The first samples after wake-up are unsettled, and an unbounded wait on a faulty sensor would freeze the logger for the rest of the deployment.</w:t>
+          <w:iCs/>
+          <w:i/>
+        </w:rPr>
+        <w:t xml:space="preserve">Rollover.</w:t>
+      </w:r>
+      <w:r>
+        <w:t xml:space="preserve"> </w:t>
+      </w:r>
+      <w:r>
+        <w:rPr>
+          <w:rStyle w:val="VerbatimChar"/>
+        </w:rPr>
+        <w:t xml:space="preserve">millis()</w:t>
+      </w:r>
+      <w:r>
+        <w:t xml:space="preserve"> </w:t>
+      </w:r>
+      <w:r>
+        <w:t xml:space="preserve">is 32-bit and wraps at about 49.7 days, and the sleep check</w:t>
+      </w:r>
+      <w:r>
+        <w:t xml:space="preserve"> </w:t>
+      </w:r>
+      <w:r>
+        <w:rPr>
+          <w:rStyle w:val="VerbatimChar"/>
+        </w:rPr>
+        <w:t xml:space="preserve">nextWakeTime &gt; currentTime</w:t>
+      </w:r>
+      <w:r>
+        <w:t xml:space="preserve"> </w:t>
+      </w:r>
+      <w:r>
+        <w:t xml:space="preserve">is not wrap-safe: expect a burst of readings, then a long gap. The stored elapsed times stay correct. Fix in Appendix A.3; until then, keep deployments to about a month.</w:t>
+      </w:r>
+    </w:p>
+    <w:p>
+      <w:pPr>
+        <w:numPr>
+          <w:ilvl w:val="1"/>
+          <w:numId w:val="1013"/>
+        </w:numPr>
+        <w:pStyle w:val="Compact"/>
+      </w:pPr>
+      <w:r>
+        <w:rPr>
+          <w:iCs/>
+          <w:i/>
+        </w:rPr>
+        <w:t xml:space="preserve">Clock accuracy.</w:t>
+      </w:r>
+      <w:r>
+        <w:t xml:space="preserve"> </w:t>
+      </w:r>
+      <w:r>
+        <w:t xml:space="preserve">Timestamps rely on the board’s oscillator, with no correction. With the board’s crystal (tens of ppm) the error is about 1–2 minutes a month, well under one interval; use over longer periods has shown no visible drift. Not measured directly (§1.4 step 4).</w:t>
       </w:r>
     </w:p>
     <w:bookmarkEnd w:id="40"/>
-    <w:bookmarkEnd w:id="41"/>
-    <w:bookmarkStart w:id="46" w:name="wear-detection-algorithm-app"/>
-    <w:p>
-      <w:pPr>
-        <w:pStyle w:val="Heading1"/>
-      </w:pPr>
-      <w:r>
-        <w:t xml:space="preserve">5. Wear-detection algorithm (app)</w:t>
-      </w:r>
-    </w:p>
-    <w:p>
-      <w:pPr>
-        <w:pStyle w:val="FirstParagraph"/>
-      </w:pPr>
-      <w:r>
-        <w:t xml:space="preserve">Full parameter table:</w:t>
-      </w:r>
-      <w:r>
-        <w:t xml:space="preserve"> </w:t>
-      </w:r>
-      <w:r>
-        <w:rPr>
-          <w:rStyle w:val="VerbatimChar"/>
-        </w:rPr>
-        <w:t xml:space="preserve">HANDOFF.md</w:t>
-      </w:r>
-      <w:r>
-        <w:t xml:space="preserve"> </w:t>
-      </w:r>
-      <w:r>
-        <w:t xml:space="preserve">§4.</w:t>
-      </w:r>
-    </w:p>
-    <w:bookmarkStart w:id="42" w:name="temperature-above-a-rolling-baseline"/>
+    <w:bookmarkStart w:id="41" w:name="robust-proximity-reads"/>
     <w:p>
       <w:pPr>
         <w:pStyle w:val="Heading2"/>
       </w:pPr>
       <w:r>
-        <w:t xml:space="preserve">5.1 Temperature above a rolling baseline</w:t>
+        <w:t xml:space="preserve">4.5 Robust proximity reads</w:t>
       </w:r>
     </w:p>
     <w:p>
@@ -3892,7 +3996,19 @@
         <w:t xml:space="preserve"> </w:t>
       </w:r>
       <w:r>
-        <w:t xml:space="preserve">Take room temperature as the rolling minimum over about 2 hours, and look at the rise above it (delta). An event starts when the sensor is covered, the temperature has risen over the last ~15 minutes, and either the jump is ≥ 0.8 °C in one sample or the rise is ≥ 3 °C. It ends when the sensor is uncovered, or the temperature is falling fast (≥ 0.4 °C per sample) and is near baseline or below 80 % of the event’s peak rise.</w:t>
+        <w:t xml:space="preserve">Discard the first 2 proximity samples after the sensor wakes, and bound every wait with a timeout; a missing sensor logs</w:t>
+      </w:r>
+      <w:r>
+        <w:t xml:space="preserve"> </w:t>
+      </w:r>
+      <w:r>
+        <w:rPr>
+          <w:rStyle w:val="VerbatimChar"/>
+        </w:rPr>
+        <w:t xml:space="preserve">0</w:t>
+      </w:r>
+      <w:r>
+        <w:t xml:space="preserve">.</w:t>
       </w:r>
     </w:p>
     <w:p>
@@ -3914,39 +4030,50 @@
         <w:t xml:space="preserve"> </w:t>
       </w:r>
       <w:r>
-        <w:t xml:space="preserve">Room temperature changes over the day, so a fixed threshold would fail; the rolling minimum follows it. The 15-minute trend check stops cooling slopes from triggering false onsets.</w:t>
-      </w:r>
-    </w:p>
-    <w:p>
-      <w:pPr>
-        <w:numPr>
-          <w:ilvl w:val="0"/>
-          <w:numId w:val="1014"/>
-        </w:numPr>
-        <w:pStyle w:val="Compact"/>
-      </w:pPr>
-      <w:r>
-        <w:rPr>
-          <w:bCs/>
-          <w:b/>
-        </w:rPr>
-        <w:t xml:space="preserve">Known weakness:</w:t>
-      </w:r>
-      <w:r>
-        <w:t xml:space="preserve"> </w:t>
-      </w:r>
-      <w:r>
-        <w:t xml:space="preserve">see §1.2 item 3: during long wear the baseline catches up with skin temperature.</w:t>
-      </w:r>
-    </w:p>
+        <w:t xml:space="preserve">The first samples after wake-up are unsettled, and an unbounded wait on a faulty sensor would freeze the logger for the rest of the deployment.</w:t>
+      </w:r>
+    </w:p>
+    <w:bookmarkEnd w:id="41"/>
     <w:bookmarkEnd w:id="42"/>
-    <w:bookmarkStart w:id="43" w:name="proximity-as-a-gate"/>
+    <w:bookmarkStart w:id="47" w:name="wear-detection-algorithm-app"/>
+    <w:p>
+      <w:pPr>
+        <w:pStyle w:val="Heading1"/>
+      </w:pPr>
+      <w:r>
+        <w:t xml:space="preserve">5. Wear-detection algorithm (app)</w:t>
+      </w:r>
+    </w:p>
+    <w:p>
+      <w:pPr>
+        <w:pStyle w:val="FirstParagraph"/>
+      </w:pPr>
+      <w:r>
+        <w:t xml:space="preserve">Full parameter table:</w:t>
+      </w:r>
+      <w:r>
+        <w:t xml:space="preserve"> </w:t>
+      </w:r>
+      <w:r>
+        <w:rPr>
+          <w:rStyle w:val="VerbatimChar"/>
+        </w:rPr>
+        <w:t xml:space="preserve">HANDOFF.md</w:t>
+      </w:r>
+      <w:r>
+        <w:t xml:space="preserve"> </w:t>
+      </w:r>
+      <w:r>
+        <w:t xml:space="preserve">§4.</w:t>
+      </w:r>
+    </w:p>
+    <w:bookmarkStart w:id="43" w:name="temperature-above-a-rolling-baseline"/>
     <w:p>
       <w:pPr>
         <w:pStyle w:val="Heading2"/>
       </w:pPr>
       <w:r>
-        <w:t xml:space="preserve">5.2 Proximity as a gate</w:t>
+        <w:t xml:space="preserve">5.1 Temperature above a rolling baseline</w:t>
       </w:r>
     </w:p>
     <w:p>
@@ -3968,22 +4095,7 @@
         <w:t xml:space="preserve"> </w:t>
       </w:r>
       <w:r>
-        <w:t xml:space="preserve">Use the proximity sensor only to confirm</w:t>
-      </w:r>
-      <w:r>
-        <w:t xml:space="preserve"> </w:t>
-      </w:r>
-      <w:r>
-        <w:t xml:space="preserve">“</w:t>
-      </w:r>
-      <w:r>
-        <w:t xml:space="preserve">covered</w:t>
-      </w:r>
-      <w:r>
-        <w:t xml:space="preserve">”</w:t>
-      </w:r>
-      <w:r>
-        <w:t xml:space="preserve">, not to detect wear on its own.</w:t>
+        <w:t xml:space="preserve">Take room temperature as the rolling minimum over about 2 hours, and look at the rise above it (delta). An event starts when the sensor is covered, the temperature has risen over the last ~15 minutes, and either the jump is ≥ 0.8 °C in one sample or the rise is ≥ 3 °C. It ends when the sensor is uncovered, or the temperature is falling fast (≥ 0.4 °C per sample) and is near baseline or below 80 % of the event’s peak rise.</w:t>
       </w:r>
     </w:p>
     <w:p>
@@ -4005,29 +4117,57 @@
         <w:t xml:space="preserve"> </w:t>
       </w:r>
       <w:r>
-        <w:t xml:space="preserve">Temperature alone can’t tell wear from a warm environment (e.g. the splint left on a radiator or in the sun); the covered sensor rules those out.</w:t>
+        <w:t xml:space="preserve">Room temperature changes over the day, so a fixed threshold would fail; the rolling minimum follows it. The 15-minute trend check stops cooling slopes from triggering false onsets.</w:t>
+      </w:r>
+    </w:p>
+    <w:p>
+      <w:pPr>
+        <w:numPr>
+          <w:ilvl w:val="0"/>
+          <w:numId w:val="1015"/>
+        </w:numPr>
+        <w:pStyle w:val="Compact"/>
+      </w:pPr>
+      <w:r>
+        <w:rPr>
+          <w:bCs/>
+          <w:b/>
+        </w:rPr>
+        <w:t xml:space="preserve">Limitation:</w:t>
+      </w:r>
+      <w:r>
+        <w:t xml:space="preserve"> </w:t>
+      </w:r>
+      <w:r>
+        <w:t xml:space="preserve">After about an hour of continuous wear the 2-hour window holds only</w:t>
+      </w:r>
+      <w:r>
+        <w:t xml:space="preserve"> </w:t>
+      </w:r>
+      <w:r>
+        <w:t xml:space="preserve">“</w:t>
+      </w:r>
+      <w:r>
+        <w:t xml:space="preserve">worn</w:t>
+      </w:r>
+      <w:r>
+        <w:t xml:space="preserve">”</w:t>
+      </w:r>
+      <w:r>
+        <w:t xml:space="preserve"> </w:t>
+      </w:r>
+      <w:r>
+        <w:t xml:space="preserve">samples, so the baseline rises to skin temperature and delta falls to about 0. From then on, a single drop of 0.4 °C between samples ends the event, and it cannot restart (that needs delta ≥ 3 °C or a jump ≥ 0.8 °C). On synthetic 8-hour overnight wear, noise with a standard deviation of 0.15 °C split the nights into short pieces; with 0.04 °C they were detected whole. Possible fixes are in Appendix B.2.</w:t>
       </w:r>
     </w:p>
     <w:bookmarkEnd w:id="43"/>
-    <w:bookmarkStart w:id="44" w:name="drift-invariant-covered"/>
+    <w:bookmarkStart w:id="44" w:name="proximity-as-a-gate"/>
     <w:p>
       <w:pPr>
         <w:pStyle w:val="Heading2"/>
       </w:pPr>
       <w:r>
-        <w:t xml:space="preserve">5.3 Drift-invariant</w:t>
-      </w:r>
-      <w:r>
-        <w:t xml:space="preserve"> </w:t>
-      </w:r>
-      <w:r>
-        <w:t xml:space="preserve">“</w:t>
-      </w:r>
-      <w:r>
-        <w:t xml:space="preserve">covered</w:t>
-      </w:r>
-      <w:r>
-        <w:t xml:space="preserve">”</w:t>
+        <w:t xml:space="preserve">5.2 Proximity as a gate</w:t>
       </w:r>
     </w:p>
     <w:p>
@@ -4049,16 +4189,22 @@
         <w:t xml:space="preserve"> </w:t>
       </w:r>
       <w:r>
-        <w:t xml:space="preserve">Track the proximity floor as the rolling 10th percentile over about a day, subtract it, and call the sensor covered when the remainder is within the noise (</w:t>
-      </w:r>
-      <w:r>
-        <w:rPr>
-          <w:rStyle w:val="VerbatimChar"/>
-        </w:rPr>
-        <w:t xml:space="preserve">max(5, 4 × MAD)</w:t>
-      </w:r>
-      <w:r>
-        <w:t xml:space="preserve">).</w:t>
+        <w:t xml:space="preserve">Use the proximity sensor only to confirm</w:t>
+      </w:r>
+      <w:r>
+        <w:t xml:space="preserve"> </w:t>
+      </w:r>
+      <w:r>
+        <w:t xml:space="preserve">“</w:t>
+      </w:r>
+      <w:r>
+        <w:t xml:space="preserve">covered</w:t>
+      </w:r>
+      <w:r>
+        <w:t xml:space="preserve">”</w:t>
+      </w:r>
+      <w:r>
+        <w:t xml:space="preserve">, not to detect wear on its own.</w:t>
       </w:r>
     </w:p>
     <w:p>
@@ -4080,45 +4226,29 @@
         <w:t xml:space="preserve"> </w:t>
       </w:r>
       <w:r>
-        <w:t xml:space="preserve">On a 35-day recording the proximity reading while worn crept from 0 into the 50s as the battery discharged. The original test (</w:t>
-      </w:r>
-      <w:r>
-        <w:rPr>
-          <w:rStyle w:val="VerbatimChar"/>
-        </w:rPr>
-        <w:t xml:space="preserve">prox == 0</w:t>
-      </w:r>
-      <w:r>
-        <w:t xml:space="preserve">) stopped working after about 11 days, and wear was missed from then on.</w:t>
+        <w:t xml:space="preserve">Temperature alone can’t tell wear from a warm environment (e.g. the splint left on a radiator or in the sun); the covered sensor rules those out.</w:t>
       </w:r>
     </w:p>
     <w:bookmarkEnd w:id="44"/>
-    <w:bookmarkStart w:id="45" w:name="thresholds-are-empirical"/>
+    <w:bookmarkStart w:id="45" w:name="drift-invariant-covered"/>
     <w:p>
       <w:pPr>
         <w:pStyle w:val="Heading2"/>
       </w:pPr>
       <w:r>
-        <w:t xml:space="preserve">5.4 Thresholds are empirical</w:t>
-      </w:r>
-    </w:p>
-    <w:p>
-      <w:pPr>
-        <w:pStyle w:val="FirstParagraph"/>
-      </w:pPr>
-      <w:r>
-        <w:t xml:space="preserve">All thresholds were set by inspecting a small number of recordings. There is no ground truth yet; Appendix B describes how to get one.</w:t>
-      </w:r>
-    </w:p>
-    <w:bookmarkEnd w:id="45"/>
-    <w:bookmarkEnd w:id="46"/>
-    <w:bookmarkStart w:id="47" w:name="time-handling"/>
-    <w:p>
-      <w:pPr>
-        <w:pStyle w:val="Heading1"/>
-      </w:pPr>
-      <w:r>
-        <w:t xml:space="preserve">6. Time handling</w:t>
+        <w:t xml:space="preserve">5.3 Drift-invariant</w:t>
+      </w:r>
+      <w:r>
+        <w:t xml:space="preserve"> </w:t>
+      </w:r>
+      <w:r>
+        <w:t xml:space="preserve">“</w:t>
+      </w:r>
+      <w:r>
+        <w:t xml:space="preserve">covered</w:t>
+      </w:r>
+      <w:r>
+        <w:t xml:space="preserve">”</w:t>
       </w:r>
     </w:p>
     <w:p>
@@ -4140,29 +4270,13 @@
         <w:t xml:space="preserve"> </w:t>
       </w:r>
       <w:r>
-        <w:t xml:space="preserve">The logger knows only UTC epoch seconds. The app asks for and shows</w:t>
-      </w:r>
-      <w:r>
-        <w:t xml:space="preserve"> </w:t>
-      </w:r>
-      <w:r>
-        <w:rPr>
-          <w:bCs/>
-          <w:b/>
-        </w:rPr>
-        <w:t xml:space="preserve">Eastern time</w:t>
-      </w:r>
-      <w:r>
-        <w:t xml:space="preserve"> </w:t>
-      </w:r>
-      <w:r>
-        <w:t xml:space="preserve">(America/New_York, daylight-saving aware) everywhere, and writes timestamps with their UTC offset (e.g. </w:t>
+        <w:t xml:space="preserve">Track the proximity floor as the rolling 10th percentile over about a day, subtract it, and call the sensor covered when the remainder is within the noise (</w:t>
       </w:r>
       <w:r>
         <w:rPr>
           <w:rStyle w:val="VerbatimChar"/>
         </w:rPr>
-        <w:t xml:space="preserve">-04:00</w:t>
+        <w:t xml:space="preserve">max(5, 4 × MAD)</w:t>
       </w:r>
       <w:r>
         <w:t xml:space="preserve">).</w:t>
@@ -4187,82 +4301,45 @@
         <w:t xml:space="preserve"> </w:t>
       </w:r>
       <w:r>
-        <w:t xml:space="preserve">The study runs in Ontario. The offset keeps the repeated hour at the November change unambiguous, and durations across the change come out right. Plotly is given wall-clock times so the charts show Eastern time whatever the browser’s own time zone.</w:t>
-      </w:r>
-    </w:p>
-    <w:p>
-      <w:pPr>
-        <w:numPr>
-          <w:ilvl w:val="0"/>
-          <w:numId w:val="1017"/>
-        </w:numPr>
-        <w:pStyle w:val="Compact"/>
-      </w:pPr>
-      <w:r>
-        <w:rPr>
-          <w:bCs/>
-          <w:b/>
-        </w:rPr>
-        <w:t xml:space="preserve">Recovery:</w:t>
-      </w:r>
-      <w:r>
-        <w:t xml:space="preserve"> </w:t>
-      </w:r>
-      <w:r>
-        <w:t xml:space="preserve">If a logger loses its start time, the elapsed times survive. The app detects such files and rebuilds the timestamps from a start time the user enters (</w:t>
+        <w:t xml:space="preserve">On a 35-day recording the proximity reading while worn crept from 0 into the 50s as the battery discharged. The original test (</w:t>
       </w:r>
       <w:r>
         <w:rPr>
           <w:rStyle w:val="VerbatimChar"/>
         </w:rPr>
-        <w:t xml:space="preserve">recover_timestamps</w:t>
-      </w:r>
-      <w:r>
-        <w:t xml:space="preserve">), during download or on the Data Analysis page.</w:t>
-      </w:r>
-    </w:p>
-    <w:p>
-      <w:pPr>
-        <w:numPr>
-          <w:ilvl w:val="0"/>
-          <w:numId w:val="1017"/>
-        </w:numPr>
-        <w:pStyle w:val="Compact"/>
-      </w:pPr>
-      <w:r>
-        <w:rPr>
-          <w:bCs/>
-          <w:b/>
-        </w:rPr>
-        <w:t xml:space="preserve">To change the zone:</w:t>
-      </w:r>
-      <w:r>
-        <w:t xml:space="preserve"> </w:t>
-      </w:r>
-      <w:r>
-        <w:t xml:space="preserve">edit</w:t>
-      </w:r>
-      <w:r>
-        <w:t xml:space="preserve"> </w:t>
-      </w:r>
-      <w:r>
-        <w:rPr>
-          <w:rStyle w:val="VerbatimChar"/>
-        </w:rPr>
-        <w:t xml:space="preserve">timezone_config.py</w:t>
-      </w:r>
-      <w:r>
-        <w:t xml:space="preserve">.</w:t>
-      </w:r>
-    </w:p>
+        <w:t xml:space="preserve">prox == 0</w:t>
+      </w:r>
+      <w:r>
+        <w:t xml:space="preserve">) stopped working after about 11 days, and wear was missed from then on.</w:t>
+      </w:r>
+    </w:p>
+    <w:bookmarkEnd w:id="45"/>
+    <w:bookmarkStart w:id="46" w:name="thresholds-are-empirical"/>
+    <w:p>
+      <w:pPr>
+        <w:pStyle w:val="Heading2"/>
+      </w:pPr>
+      <w:r>
+        <w:t xml:space="preserve">5.4 Thresholds are empirical</w:t>
+      </w:r>
+    </w:p>
+    <w:p>
+      <w:pPr>
+        <w:pStyle w:val="FirstParagraph"/>
+      </w:pPr>
+      <w:r>
+        <w:t xml:space="preserve">All thresholds were set by inspecting a small number of recordings. There is no ground truth yet; Appendix B describes how to get one.</w:t>
+      </w:r>
+    </w:p>
+    <w:bookmarkEnd w:id="46"/>
     <w:bookmarkEnd w:id="47"/>
-    <w:bookmarkStart w:id="48" w:name="desktop-app"/>
+    <w:bookmarkStart w:id="48" w:name="time-handling"/>
     <w:p>
       <w:pPr>
         <w:pStyle w:val="Heading1"/>
       </w:pPr>
       <w:r>
-        <w:t xml:space="preserve">7. Desktop app</w:t>
+        <w:t xml:space="preserve">6. Time handling</w:t>
       </w:r>
     </w:p>
     <w:p>
@@ -4278,28 +4355,38 @@
           <w:bCs/>
           <w:b/>
         </w:rPr>
-        <w:t xml:space="preserve">Browser-based UI (Dash + Flask-SocketIO on gevent).</w:t>
-      </w:r>
-      <w:r>
-        <w:t xml:space="preserve"> </w:t>
-      </w:r>
-      <w:r>
-        <w:t xml:space="preserve">Charts and tables come almost for free with Plotly/Dash; the app runs a local server on</w:t>
-      </w:r>
-      <w:r>
-        <w:t xml:space="preserve"> </w:t>
+        <w:t xml:space="preserve">Design Decision:</w:t>
+      </w:r>
+      <w:r>
+        <w:t xml:space="preserve"> </w:t>
+      </w:r>
+      <w:r>
+        <w:t xml:space="preserve">The logger knows only UTC epoch seconds. The app asks for and shows</w:t>
+      </w:r>
+      <w:r>
+        <w:t xml:space="preserve"> </w:t>
+      </w:r>
+      <w:r>
+        <w:rPr>
+          <w:bCs/>
+          <w:b/>
+        </w:rPr>
+        <w:t xml:space="preserve">Eastern time</w:t>
+      </w:r>
+      <w:r>
+        <w:t xml:space="preserve"> </w:t>
+      </w:r>
+      <w:r>
+        <w:t xml:space="preserve">(America/New_York, daylight-saving aware) everywhere, and writes timestamps with their UTC offset (e.g. </w:t>
       </w:r>
       <w:r>
         <w:rPr>
           <w:rStyle w:val="VerbatimChar"/>
         </w:rPr>
-        <w:t xml:space="preserve">127.0.0.1:8050</w:t>
-      </w:r>
-      <w:r>
-        <w:t xml:space="preserve"> </w:t>
-      </w:r>
-      <w:r>
-        <w:t xml:space="preserve">and opens the browser.</w:t>
+        <w:t xml:space="preserve">-04:00</w:t>
+      </w:r>
+      <w:r>
+        <w:t xml:space="preserve">).</w:t>
       </w:r>
     </w:p>
     <w:p>
@@ -4315,13 +4402,13 @@
           <w:bCs/>
           <w:b/>
         </w:rPr>
-        <w:t xml:space="preserve">Heartbeat shutdown.</w:t>
-      </w:r>
-      <w:r>
-        <w:t xml:space="preserve"> </w:t>
-      </w:r>
-      <w:r>
-        <w:t xml:space="preserve">The page sends a heartbeat every 5 s. With none for 5 minutes, the server warns the page and exits, so closing the tab doesn’t leave an invisible server holding the serial port.</w:t>
+        <w:t xml:space="preserve">Why:</w:t>
+      </w:r>
+      <w:r>
+        <w:t xml:space="preserve"> </w:t>
+      </w:r>
+      <w:r>
+        <w:t xml:space="preserve">The study runs in Ontario. The offset keeps the repeated hour at the November change unambiguous, and durations across the change come out right. Plotly is given wall-clock times so the charts show Eastern time whatever the browser’s own time zone.</w:t>
       </w:r>
     </w:p>
     <w:p>
@@ -4337,28 +4424,13 @@
           <w:bCs/>
           <w:b/>
         </w:rPr>
-        <w:t xml:space="preserve">Works offline.</w:t>
-      </w:r>
-      <w:r>
-        <w:t xml:space="preserve"> </w:t>
-      </w:r>
-      <w:r>
-        <w:t xml:space="preserve">Fonts, theme and icons are bundled under</w:t>
-      </w:r>
-      <w:r>
-        <w:t xml:space="preserve"> </w:t>
-      </w:r>
-      <w:r>
-        <w:rPr>
-          <w:rStyle w:val="VerbatimChar"/>
-        </w:rPr>
-        <w:t xml:space="preserve">assets/vendor/</w:t>
-      </w:r>
-      <w:r>
-        <w:t xml:space="preserve"> </w:t>
-      </w:r>
-      <w:r>
-        <w:t xml:space="preserve">instead of loaded from CDNs, because clinic computers may have no internet.</w:t>
+        <w:t xml:space="preserve">Recovery:</w:t>
+      </w:r>
+      <w:r>
+        <w:t xml:space="preserve"> </w:t>
+      </w:r>
+      <w:r>
+        <w:t xml:space="preserve">If a logger loses its start time, the elapsed times survive. The app detects such files and rebuilds the timestamps from a start time the user enters, during download or on the Data Analysis page.</w:t>
       </w:r>
     </w:p>
     <w:p>
@@ -4374,13 +4446,13 @@
           <w:bCs/>
           <w:b/>
         </w:rPr>
-        <w:t xml:space="preserve">Stand-alone builds.</w:t>
-      </w:r>
-      <w:r>
-        <w:t xml:space="preserve"> </w:t>
-      </w:r>
-      <w:r>
-        <w:t xml:space="preserve">cx_Freeze bundles Python and all dependencies, so staff need no Python. GitHub Actions builds Windows and macOS on each</w:t>
+        <w:t xml:space="preserve">To change the zone:</w:t>
+      </w:r>
+      <w:r>
+        <w:t xml:space="preserve"> </w:t>
+      </w:r>
+      <w:r>
+        <w:t xml:space="preserve">edit</w:t>
       </w:r>
       <w:r>
         <w:t xml:space="preserve"> </w:t>
@@ -4389,20 +4461,27 @@
         <w:rPr>
           <w:rStyle w:val="VerbatimChar"/>
         </w:rPr>
-        <w:t xml:space="preserve">v*</w:t>
-      </w:r>
-      <w:r>
-        <w:t xml:space="preserve"> </w:t>
-      </w:r>
-      <w:r>
-        <w:t xml:space="preserve">tag (SOP Appendix B).</w:t>
+        <w:t xml:space="preserve">timezone_config.py</w:t>
+      </w:r>
+      <w:r>
+        <w:t xml:space="preserve">.</w:t>
+      </w:r>
+    </w:p>
+    <w:bookmarkEnd w:id="48"/>
+    <w:bookmarkStart w:id="49" w:name="desktop-app"/>
+    <w:p>
+      <w:pPr>
+        <w:pStyle w:val="Heading1"/>
+      </w:pPr>
+      <w:r>
+        <w:t xml:space="preserve">7. Desktop app</w:t>
       </w:r>
     </w:p>
     <w:p>
       <w:pPr>
         <w:numPr>
           <w:ilvl w:val="0"/>
-          <w:numId w:val="1018"/>
+          <w:numId w:val="1019"/>
         </w:numPr>
         <w:pStyle w:val="Compact"/>
       </w:pPr>
@@ -4411,6 +4490,139 @@
           <w:bCs/>
           <w:b/>
         </w:rPr>
+        <w:t xml:space="preserve">Browser-based interface (Dash + Flask-SocketIO).</w:t>
+      </w:r>
+      <w:r>
+        <w:t xml:space="preserve"> </w:t>
+      </w:r>
+      <w:r>
+        <w:t xml:space="preserve">Plotly/Dash provide the charts and tables; the app runs a local server on</w:t>
+      </w:r>
+      <w:r>
+        <w:t xml:space="preserve"> </w:t>
+      </w:r>
+      <w:r>
+        <w:rPr>
+          <w:rStyle w:val="VerbatimChar"/>
+        </w:rPr>
+        <w:t xml:space="preserve">127.0.0.1:8050</w:t>
+      </w:r>
+      <w:r>
+        <w:t xml:space="preserve"> </w:t>
+      </w:r>
+      <w:r>
+        <w:t xml:space="preserve">and opens the browser.</w:t>
+      </w:r>
+    </w:p>
+    <w:p>
+      <w:pPr>
+        <w:numPr>
+          <w:ilvl w:val="0"/>
+          <w:numId w:val="1019"/>
+        </w:numPr>
+        <w:pStyle w:val="Compact"/>
+      </w:pPr>
+      <w:r>
+        <w:rPr>
+          <w:bCs/>
+          <w:b/>
+        </w:rPr>
+        <w:t xml:space="preserve">Heartbeat shutdown.</w:t>
+      </w:r>
+      <w:r>
+        <w:t xml:space="preserve"> </w:t>
+      </w:r>
+      <w:r>
+        <w:t xml:space="preserve">The page sends a heartbeat every 5 s. With none for 5 minutes, the server warns the page and exits, so closing the tab doesn’t leave a hidden server holding the serial port.</w:t>
+      </w:r>
+    </w:p>
+    <w:p>
+      <w:pPr>
+        <w:numPr>
+          <w:ilvl w:val="0"/>
+          <w:numId w:val="1019"/>
+        </w:numPr>
+        <w:pStyle w:val="Compact"/>
+      </w:pPr>
+      <w:r>
+        <w:rPr>
+          <w:bCs/>
+          <w:b/>
+        </w:rPr>
+        <w:t xml:space="preserve">Works offline.</w:t>
+      </w:r>
+      <w:r>
+        <w:t xml:space="preserve"> </w:t>
+      </w:r>
+      <w:r>
+        <w:t xml:space="preserve">Fonts, theme and icons are bundled under</w:t>
+      </w:r>
+      <w:r>
+        <w:t xml:space="preserve"> </w:t>
+      </w:r>
+      <w:r>
+        <w:rPr>
+          <w:rStyle w:val="VerbatimChar"/>
+        </w:rPr>
+        <w:t xml:space="preserve">assets/vendor/</w:t>
+      </w:r>
+      <w:r>
+        <w:t xml:space="preserve"> </w:t>
+      </w:r>
+      <w:r>
+        <w:t xml:space="preserve">instead of loaded from the internet, because clinic computers may have no connection.</w:t>
+      </w:r>
+    </w:p>
+    <w:p>
+      <w:pPr>
+        <w:numPr>
+          <w:ilvl w:val="0"/>
+          <w:numId w:val="1019"/>
+        </w:numPr>
+        <w:pStyle w:val="Compact"/>
+      </w:pPr>
+      <w:r>
+        <w:rPr>
+          <w:bCs/>
+          <w:b/>
+        </w:rPr>
+        <w:t xml:space="preserve">Automated releases.</w:t>
+      </w:r>
+      <w:r>
+        <w:t xml:space="preserve"> </w:t>
+      </w:r>
+      <w:r>
+        <w:t xml:space="preserve">GitHub Actions builds stand-alone Windows and macOS programs on each</w:t>
+      </w:r>
+      <w:r>
+        <w:t xml:space="preserve"> </w:t>
+      </w:r>
+      <w:r>
+        <w:rPr>
+          <w:rStyle w:val="VerbatimChar"/>
+        </w:rPr>
+        <w:t xml:space="preserve">v*</w:t>
+      </w:r>
+      <w:r>
+        <w:t xml:space="preserve"> </w:t>
+      </w:r>
+      <w:r>
+        <w:t xml:space="preserve">tag, with Python included, so staff need no Python (SOP Appendix B).</w:t>
+      </w:r>
+    </w:p>
+    <w:p>
+      <w:pPr>
+        <w:numPr>
+          <w:ilvl w:val="0"/>
+          <w:numId w:val="1019"/>
+        </w:numPr>
+        <w:pStyle w:val="Compact"/>
+      </w:pPr>
+      <w:r>
+        <w:rPr>
+          <w:bCs/>
+          <w:b/>
+        </w:rPr>
         <w:t xml:space="preserve">Participant IDs.</w:t>
       </w:r>
       <w:r>
@@ -4447,8 +4659,8 @@
         <w:t xml:space="preserve">, up to 15 characters: they go into the CSV header and often into file names, where commas or spaces would cause trouble.</w:t>
       </w:r>
     </w:p>
-    <w:bookmarkEnd w:id="48"/>
-    <w:bookmarkStart w:id="49" w:name="testing-and-validation-to-date"/>
+    <w:bookmarkEnd w:id="49"/>
+    <w:bookmarkStart w:id="50" w:name="testing-and-validation-to-date"/>
     <w:p>
       <w:pPr>
         <w:pStyle w:val="Heading1"/>
@@ -4676,6 +4888,18 @@
               </w:rPr>
               <w:t xml:space="preserve">Not measured</w:t>
             </w:r>
+            <w:r>
+              <w:rPr>
+                <w:sz w:val="19"/>
+              </w:rPr>
+              <w:t xml:space="preserve"> </w:t>
+            </w:r>
+            <w:r>
+              <w:rPr>
+                <w:sz w:val="19"/>
+              </w:rPr>
+              <w:t xml:space="preserve">(§1.2)</w:t>
+            </w:r>
           </w:p>
         </w:tc>
       </w:tr>
@@ -4691,7 +4915,7 @@
               <w:rPr>
                 <w:sz w:val="19"/>
               </w:rPr>
-              <w:t xml:space="preserve">Clock rollover (~49.7 d), storage bound (~52 d)</w:t>
+              <w:t xml:space="preserve">Storage bound (~52 d)</w:t>
             </w:r>
           </w:p>
         </w:tc>
@@ -4714,7 +4938,7 @@
               <w:rPr>
                 <w:sz w:val="19"/>
               </w:rPr>
-              <w:t xml:space="preserve">, not bench-tested</w:t>
+              <w:t xml:space="preserve">, not bench-tested (§1.2)</w:t>
             </w:r>
           </w:p>
         </w:tc>
@@ -4760,7 +4984,7 @@
               <w:rPr>
                 <w:sz w:val="19"/>
               </w:rPr>
-              <w:t xml:space="preserve">against ground truth</w:t>
+              <w:t xml:space="preserve">against ground truth (§1.2)</w:t>
             </w:r>
           </w:p>
         </w:tc>
@@ -4777,7 +5001,7 @@
               <w:rPr>
                 <w:sz w:val="19"/>
               </w:rPr>
-              <w:t xml:space="preserve">Clock drift</w:t>
+              <w:t xml:space="preserve">Clock rollover (~49.7 d)</w:t>
             </w:r>
           </w:p>
         </w:tc>
@@ -4794,14 +5018,52 @@
                 <w:b/>
                 <w:sz w:val="19"/>
               </w:rPr>
-              <w:t xml:space="preserve">Not measured</w:t>
+              <w:t xml:space="preserve">Predicted from code</w:t>
+            </w:r>
+            <w:r>
+              <w:rPr>
+                <w:sz w:val="19"/>
+              </w:rPr>
+              <w:t xml:space="preserve">, not bench-tested (§4.4)</w:t>
+            </w:r>
+          </w:p>
+        </w:tc>
+      </w:tr>
+      <w:tr>
+        <w:tc>
+          <w:tcPr/>
+          <w:p>
+            <w:pPr>
+              <w:pStyle w:val="Compact"/>
+              <w:jc w:val="left"/>
+            </w:pPr>
+            <w:r>
+              <w:rPr>
+                <w:sz w:val="19"/>
+              </w:rPr>
+              <w:t xml:space="preserve">Clock drift</w:t>
+            </w:r>
+          </w:p>
+        </w:tc>
+        <w:tc>
+          <w:tcPr/>
+          <w:p>
+            <w:pPr>
+              <w:pStyle w:val="Compact"/>
+              <w:jc w:val="left"/>
+            </w:pPr>
+            <w:r>
+              <w:rPr>
+                <w:sz w:val="19"/>
+              </w:rPr>
+              <w:t xml:space="preserve">Not measured; expected negligible (§4.4)</w:t>
             </w:r>
           </w:p>
         </w:tc>
       </w:tr>
     </w:tbl>
-    <w:bookmarkEnd w:id="49"/>
-    <w:bookmarkStart w:id="50" w:name="directions-to-explore"/>
+    <w:bookmarkEnd w:id="50"/>
+    <w:bookmarkStart w:id="51" w:name="directions-to-explore"/>
     <w:p>
       <w:pPr>
         <w:pStyle w:val="Heading1"/>
@@ -4897,7 +5159,7 @@
               <w:rPr>
                 <w:sz w:val="19"/>
               </w:rPr>
-              <w:t xml:space="preserve">Start logging at Initialize, choose idle/logging by USB presence, wrap-safe timing, enforce the storage bound (Appendix A)</w:t>
+              <w:t xml:space="preserve">Wrap-safe timing, the storage bound, and starting collection at Initialize; optionally, choosing idle/collection by USB presence (Appendix A)</w:t>
             </w:r>
           </w:p>
         </w:tc>
@@ -5025,14 +5287,14 @@
               <w:rPr>
                 <w:sz w:val="19"/>
               </w:rPr>
-              <w:t xml:space="preserve">An external RTC (or the nRF52840’s RTC with drift calibration) would remove the power-on timing error and the rollover limit</w:t>
+              <w:t xml:space="preserve">An external RTC would remove the start-time dependence on power-on and the rollover limit</w:t>
             </w:r>
           </w:p>
         </w:tc>
       </w:tr>
     </w:tbl>
-    <w:bookmarkEnd w:id="50"/>
-    <w:bookmarkStart w:id="55" w:name="appendix-a-firmware-robustness"/>
+    <w:bookmarkEnd w:id="51"/>
+    <w:bookmarkStart w:id="56" w:name="appendix-a-firmware-robustness"/>
     <w:p>
       <w:pPr>
         <w:pStyle w:val="Heading1"/>
@@ -5056,10 +5318,10 @@
         <w:t xml:space="preserve"> </w:t>
       </w:r>
       <w:r>
-        <w:t xml:space="preserve">Problems identified from the code (§1.2 items 1, 2, 4, 5). Not yet implemented.</w:t>
-      </w:r>
-    </w:p>
-    <w:bookmarkStart w:id="51" w:name="a.1-start-the-recording-at-initialize"/>
+        <w:t xml:space="preserve">Identified from the code (§1.2 item 1; §1.3). Not yet implemented.</w:t>
+      </w:r>
+    </w:p>
+    <w:bookmarkStart w:id="52" w:name="a.1-start-the-recording-at-initialize"/>
     <w:p>
       <w:pPr>
         <w:pStyle w:val="Heading2"/>
@@ -5089,95 +5351,7 @@
         <w:t xml:space="preserve"> </w:t>
       </w:r>
       <w:r>
-        <w:t xml:space="preserve">power-on, so the start time is only right if staff power it on at the entered minute. Alternatives:</w:t>
-      </w:r>
-    </w:p>
-    <w:p>
-      <w:pPr>
-        <w:numPr>
-          <w:ilvl w:val="0"/>
-          <w:numId w:val="1019"/>
-        </w:numPr>
-        <w:pStyle w:val="Compact"/>
-      </w:pPr>
-      <w:r>
-        <w:rPr>
-          <w:bCs/>
-          <w:b/>
-        </w:rPr>
-        <w:t xml:space="preserve">Start at Initialize, from the computer’s clock.</w:t>
-      </w:r>
-      <w:r>
-        <w:t xml:space="preserve"> </w:t>
-      </w:r>
-      <w:r>
-        <w:t xml:space="preserve">The app sends</w:t>
-      </w:r>
-      <w:r>
-        <w:t xml:space="preserve"> </w:t>
-      </w:r>
-      <w:r>
-        <w:t xml:space="preserve">“</w:t>
-      </w:r>
-      <w:r>
-        <w:t xml:space="preserve">now</w:t>
-      </w:r>
-      <w:r>
-        <w:t xml:space="preserve">”</w:t>
-      </w:r>
-      <w:r>
-        <w:t xml:space="preserve"> </w:t>
-      </w:r>
-      <w:r>
-        <w:t xml:space="preserve">and the logger begins logging immediately (no power-down). The start time is then exact, and the scheduled-start option disappears.</w:t>
-      </w:r>
-    </w:p>
-    <w:p>
-      <w:pPr>
-        <w:numPr>
-          <w:ilvl w:val="0"/>
-          <w:numId w:val="1019"/>
-        </w:numPr>
-        <w:pStyle w:val="Compact"/>
-      </w:pPr>
-      <w:r>
-        <w:rPr>
-          <w:bCs/>
-          <w:b/>
-        </w:rPr>
-        <w:t xml:space="preserve">Keep the scheduled start, but count from Initialize.</w:t>
-      </w:r>
-      <w:r>
-        <w:t xml:space="preserve"> </w:t>
-      </w:r>
-      <w:r>
-        <w:t xml:space="preserve">The logger stays on (in low power) after Initialize and starts recording when the entered start time arrives. Also exact, at the cost of a little battery between Initialize and the start.</w:t>
-      </w:r>
-    </w:p>
-    <w:p>
-      <w:pPr>
-        <w:pStyle w:val="FirstParagraph"/>
-      </w:pPr>
-      <w:r>
-        <w:t xml:space="preserve">Either removes the main source of timestamp error. The second keeps today’s workflow.</w:t>
-      </w:r>
-    </w:p>
-    <w:bookmarkEnd w:id="51"/>
-    <w:bookmarkStart w:id="52" w:name="a.2-idle-vs.-logging-by-usb-presence"/>
-    <w:p>
-      <w:pPr>
-        <w:pStyle w:val="Heading2"/>
-      </w:pPr>
-      <w:r>
-        <w:t xml:space="preserve">A.2 Idle vs. logging by USB presence</w:t>
-      </w:r>
-    </w:p>
-    <w:p>
-      <w:pPr>
-        <w:pStyle w:val="FirstParagraph"/>
-      </w:pPr>
-      <w:r>
-        <w:t xml:space="preserve">Choose the mode at power-up by whether USB power is present (the nRF52840 reports this), instead of toggling on every power-up:</w:t>
+        <w:t xml:space="preserve">power-on, so the start time is only right if it is powered on at the entered minute. Two ways to remove this:</w:t>
       </w:r>
     </w:p>
     <w:p>
@@ -5189,7 +5363,35 @@
         <w:pStyle w:val="Compact"/>
       </w:pPr>
       <w:r>
-        <w:t xml:space="preserve">USB connected → idle, answer the app.</w:t>
+        <w:rPr>
+          <w:bCs/>
+          <w:b/>
+        </w:rPr>
+        <w:t xml:space="preserve">Start at Initialize, from the computer’s clock.</w:t>
+      </w:r>
+      <w:r>
+        <w:t xml:space="preserve"> </w:t>
+      </w:r>
+      <w:r>
+        <w:t xml:space="preserve">The app sends</w:t>
+      </w:r>
+      <w:r>
+        <w:t xml:space="preserve"> </w:t>
+      </w:r>
+      <w:r>
+        <w:t xml:space="preserve">“</w:t>
+      </w:r>
+      <w:r>
+        <w:t xml:space="preserve">now</w:t>
+      </w:r>
+      <w:r>
+        <w:t xml:space="preserve">”</w:t>
+      </w:r>
+      <w:r>
+        <w:t xml:space="preserve"> </w:t>
+      </w:r>
+      <w:r>
+        <w:t xml:space="preserve">and the logger starts collecting immediately (no power-down). The start time is then exact, but the scheduled start goes away.</w:t>
       </w:r>
     </w:p>
     <w:p>
@@ -5201,23 +5403,27 @@
         <w:pStyle w:val="Compact"/>
       </w:pPr>
       <w:r>
-        <w:t xml:space="preserve">No USB → if initialized, (re)start or</w:t>
-      </w:r>
-      <w:r>
-        <w:t xml:space="preserve"> </w:t>
-      </w:r>
-      <w:r>
         <w:rPr>
           <w:bCs/>
           <w:b/>
         </w:rPr>
-        <w:t xml:space="preserve">resume</w:t>
-      </w:r>
-      <w:r>
-        <w:t xml:space="preserve"> </w:t>
-      </w:r>
-      <w:r>
-        <w:t xml:space="preserve">logging, appending after the last record.</w:t>
+        <w:t xml:space="preserve">Keep the scheduled start, but count from Initialize.</w:t>
+      </w:r>
+      <w:r>
+        <w:t xml:space="preserve"> </w:t>
+      </w:r>
+      <w:r>
+        <w:t xml:space="preserve">The logger stays on in low power after Initialize and starts collecting when the entered start time arrives. Also exact, at the cost of a little battery between Initialize and the start. This keeps today’s workflow.</w:t>
+      </w:r>
+    </w:p>
+    <w:bookmarkEnd w:id="52"/>
+    <w:bookmarkStart w:id="53" w:name="X7067aa404fd0484d1413deb92c2ee6bdcfc5df0"/>
+    <w:p>
+      <w:pPr>
+        <w:pStyle w:val="Heading2"/>
+      </w:pPr>
+      <w:r>
+        <w:t xml:space="preserve">A.2 Idle vs. collection by USB presence (optional)</w:t>
       </w:r>
     </w:p>
     <w:p>
@@ -5225,35 +5431,7 @@
         <w:pStyle w:val="FirstParagraph"/>
       </w:pPr>
       <w:r>
-        <w:t xml:space="preserve">This makes resets during a deployment harmless (the logger resumes; record the gap), and</w:t>
-      </w:r>
-      <w:r>
-        <w:t xml:space="preserve"> </w:t>
-      </w:r>
-      <w:r>
-        <w:t xml:space="preserve">“</w:t>
-      </w:r>
-      <w:r>
-        <w:t xml:space="preserve">can’t find the logger</w:t>
-      </w:r>
-      <w:r>
-        <w:t xml:space="preserve">”</w:t>
-      </w:r>
-      <w:r>
-        <w:t xml:space="preserve"> </w:t>
-      </w:r>
-      <w:r>
-        <w:t xml:space="preserve">goes away: plugging it in is enough. Resuming needs the elapsed time to continue across the reset, e.g. by storing a reset counter and leaving a marker row in the data.</w:t>
-      </w:r>
-    </w:p>
-    <w:bookmarkEnd w:id="52"/>
-    <w:bookmarkStart w:id="53" w:name="a.3-timing-and-storage"/>
-    <w:p>
-      <w:pPr>
-        <w:pStyle w:val="Heading2"/>
-      </w:pPr>
-      <w:r>
-        <w:t xml:space="preserve">A.3 Timing and storage</w:t>
+        <w:t xml:space="preserve">Choose the mode at power-up by whether USB power is present (the nRF52840 reports this), instead of toggling on every power-up:</w:t>
       </w:r>
     </w:p>
     <w:p>
@@ -5265,34 +5443,7 @@
         <w:pStyle w:val="Compact"/>
       </w:pPr>
       <w:r>
-        <w:t xml:space="preserve">Wrap-safe sleep:</w:t>
-      </w:r>
-      <w:r>
-        <w:t xml:space="preserve"> </w:t>
-      </w:r>
-      <w:r>
-        <w:rPr>
-          <w:rStyle w:val="VerbatimChar"/>
-        </w:rPr>
-        <w:t xml:space="preserve">if ((int32_t)(nextWakeTime - currentTime) &gt; 0)</w:t>
-      </w:r>
-      <w:r>
-        <w:t xml:space="preserve">. Test across the wrap with a temporary offset of about 2³² − 10 min added to</w:t>
-      </w:r>
-      <w:r>
-        <w:t xml:space="preserve"> </w:t>
-      </w:r>
-      <w:r>
-        <w:rPr>
-          <w:rStyle w:val="VerbatimChar"/>
-        </w:rPr>
-        <w:t xml:space="preserve">millis()</w:t>
-      </w:r>
-      <w:r>
-        <w:t xml:space="preserve"> </w:t>
-      </w:r>
-      <w:r>
-        <w:t xml:space="preserve">in the logging path.</w:t>
+        <w:t xml:space="preserve">USB connected → idle, answer the app.</w:t>
       </w:r>
     </w:p>
     <w:p>
@@ -5304,114 +5455,41 @@
         <w:pStyle w:val="Compact"/>
       </w:pPr>
       <w:r>
-        <w:t xml:space="preserve">Stop at</w:t>
-      </w:r>
-      <w:r>
-        <w:t xml:space="preserve"> </w:t>
-      </w:r>
-      <w:r>
-        <w:rPr>
-          <w:rStyle w:val="VerbatimChar"/>
-        </w:rPr>
-        <w:t xml:space="preserve">MAX_DATA_ENTRIES</w:t>
-      </w:r>
-      <w:r>
-        <w:t xml:space="preserve"> </w:t>
-      </w:r>
-      <w:r>
-        <w:t xml:space="preserve">in</w:t>
-      </w:r>
-      <w:r>
-        <w:t xml:space="preserve"> </w:t>
-      </w:r>
-      <w:r>
-        <w:rPr>
-          <w:rStyle w:val="VerbatimChar"/>
-        </w:rPr>
-        <w:t xml:space="preserve">saveTemperatureReading</w:t>
-      </w:r>
-      <w:r>
-        <w:t xml:space="preserve">, or erase all the pages that may be written.</w:t>
-      </w:r>
-    </w:p>
-    <w:p>
-      <w:pPr>
-        <w:numPr>
-          <w:ilvl w:val="0"/>
-          <w:numId w:val="1021"/>
-        </w:numPr>
-        <w:pStyle w:val="Compact"/>
-      </w:pPr>
-      <w:r>
-        <w:t xml:space="preserve">Consider counting time in seconds from an RTC tick instead of</w:t>
-      </w:r>
-      <w:r>
-        <w:t xml:space="preserve"> </w:t>
-      </w:r>
-      <w:r>
-        <w:rPr>
-          <w:rStyle w:val="VerbatimChar"/>
-        </w:rPr>
-        <w:t xml:space="preserve">millis()</w:t>
-      </w:r>
-      <w:r>
-        <w:t xml:space="preserve">.</w:t>
-      </w:r>
-    </w:p>
-    <w:bookmarkEnd w:id="53"/>
-    <w:bookmarkStart w:id="54" w:name="a.4-next-steps"/>
-    <w:p>
-      <w:pPr>
-        <w:pStyle w:val="Heading2"/>
-      </w:pPr>
-      <w:r>
-        <w:t xml:space="preserve">A.4 Next steps</w:t>
-      </w:r>
-    </w:p>
-    <w:p>
-      <w:pPr>
-        <w:pStyle w:val="FirstParagraph"/>
-      </w:pPr>
-      <w:r>
-        <w:t xml:space="preserve">Implement A.3 first (small, low risk), then A.1/A.2 together, bench-test for a full month, and update the SOP (§1.1, §6, §7).</w:t>
-      </w:r>
-    </w:p>
-    <w:bookmarkEnd w:id="54"/>
-    <w:bookmarkEnd w:id="55"/>
-    <w:bookmarkStart w:id="59" w:name="X1e46ee66dcce5645c2d432b6ebfb1a5d4d92f07"/>
-    <w:p>
-      <w:pPr>
-        <w:pStyle w:val="Heading1"/>
-      </w:pPr>
-      <w:r>
-        <w:t xml:space="preserve">Appendix B — Ground truth and re-tuning the detector</w:t>
-      </w:r>
-    </w:p>
-    <w:p>
-      <w:pPr>
-        <w:pStyle w:val="FirstParagraph"/>
-      </w:pPr>
+        <w:t xml:space="preserve">No USB → if initialized, start or</w:t>
+      </w:r>
+      <w:r>
+        <w:t xml:space="preserve"> </w:t>
+      </w:r>
       <w:r>
         <w:rPr>
           <w:bCs/>
           <w:b/>
         </w:rPr>
-        <w:t xml:space="preserve">Status:</w:t>
-      </w:r>
-      <w:r>
-        <w:t xml:space="preserve"> </w:t>
-      </w:r>
-      <w:r>
-        <w:t xml:space="preserve">Needed before wear times are reported as results.</w:t>
-      </w:r>
-    </w:p>
-    <w:bookmarkStart w:id="56" w:name="b.1-collecting-ground-truth"/>
+        <w:t xml:space="preserve">resume</w:t>
+      </w:r>
+      <w:r>
+        <w:t xml:space="preserve"> </w:t>
+      </w:r>
+      <w:r>
+        <w:t xml:space="preserve">collection, appending after the last record.</w:t>
+      </w:r>
+    </w:p>
+    <w:p>
+      <w:pPr>
+        <w:pStyle w:val="FirstParagraph"/>
+      </w:pPr>
+      <w:r>
+        <w:t xml:space="preserve">This makes a reset during a deployment cost only a gap instead of the rest of the recording, and the logger no longer needs a power-cycle before download. Resuming needs the elapsed time to continue across the reset, e.g. by storing a reset counter and leaving a marker row in the data.</w:t>
+      </w:r>
+    </w:p>
+    <w:bookmarkEnd w:id="53"/>
+    <w:bookmarkStart w:id="54" w:name="a.3-timing-and-storage"/>
     <w:p>
       <w:pPr>
         <w:pStyle w:val="Heading2"/>
       </w:pPr>
       <w:r>
-        <w:t xml:space="preserve">B.1 Collecting ground truth</w:t>
+        <w:t xml:space="preserve">A.3 Timing and storage</w:t>
       </w:r>
     </w:p>
     <w:p>
@@ -5423,17 +5501,34 @@
         <w:pStyle w:val="Compact"/>
       </w:pPr>
       <w:r>
-        <w:rPr>
-          <w:bCs/>
-          <w:b/>
-        </w:rPr>
-        <w:t xml:space="preserve">Wear diary:</w:t>
-      </w:r>
-      <w:r>
-        <w:t xml:space="preserve"> </w:t>
-      </w:r>
-      <w:r>
-        <w:t xml:space="preserve">the participant (or staff, in a supervised session) records on/off times. Cheap, but coarse and subject to the same recall bias the logger is meant to avoid.</w:t>
+        <w:t xml:space="preserve">Wrap-safe sleep:</w:t>
+      </w:r>
+      <w:r>
+        <w:t xml:space="preserve"> </w:t>
+      </w:r>
+      <w:r>
+        <w:rPr>
+          <w:rStyle w:val="VerbatimChar"/>
+        </w:rPr>
+        <w:t xml:space="preserve">if ((int32_t)(nextWakeTime - currentTime) &gt; 0)</w:t>
+      </w:r>
+      <w:r>
+        <w:t xml:space="preserve">. Test across the wrap with a temporary offset of about 2³² − 10 min added to</w:t>
+      </w:r>
+      <w:r>
+        <w:t xml:space="preserve"> </w:t>
+      </w:r>
+      <w:r>
+        <w:rPr>
+          <w:rStyle w:val="VerbatimChar"/>
+        </w:rPr>
+        <w:t xml:space="preserve">millis()</w:t>
+      </w:r>
+      <w:r>
+        <w:t xml:space="preserve"> </w:t>
+      </w:r>
+      <w:r>
+        <w:t xml:space="preserve">in the logging path.</w:t>
       </w:r>
     </w:p>
     <w:p>
@@ -5445,49 +5540,90 @@
         <w:pStyle w:val="Compact"/>
       </w:pPr>
       <w:r>
+        <w:t xml:space="preserve">Stop at</w:t>
+      </w:r>
+      <w:r>
+        <w:t xml:space="preserve"> </w:t>
+      </w:r>
+      <w:r>
+        <w:rPr>
+          <w:rStyle w:val="VerbatimChar"/>
+        </w:rPr>
+        <w:t xml:space="preserve">MAX_DATA_ENTRIES</w:t>
+      </w:r>
+      <w:r>
+        <w:t xml:space="preserve"> </w:t>
+      </w:r>
+      <w:r>
+        <w:t xml:space="preserve">in</w:t>
+      </w:r>
+      <w:r>
+        <w:t xml:space="preserve"> </w:t>
+      </w:r>
+      <w:r>
+        <w:rPr>
+          <w:rStyle w:val="VerbatimChar"/>
+        </w:rPr>
+        <w:t xml:space="preserve">saveTemperatureReading</w:t>
+      </w:r>
+      <w:r>
+        <w:t xml:space="preserve">, or erase all the pages that may be written.</w:t>
+      </w:r>
+    </w:p>
+    <w:bookmarkEnd w:id="54"/>
+    <w:bookmarkStart w:id="55" w:name="a.4-next-steps"/>
+    <w:p>
+      <w:pPr>
+        <w:pStyle w:val="Heading2"/>
+      </w:pPr>
+      <w:r>
+        <w:t xml:space="preserve">A.4 Next steps</w:t>
+      </w:r>
+    </w:p>
+    <w:p>
+      <w:pPr>
+        <w:pStyle w:val="FirstParagraph"/>
+      </w:pPr>
+      <w:r>
+        <w:t xml:space="preserve">Implement A.3 first (small, low risk), then A.1, bench-test for a full month, and update the SOP (§1.1, §6, §7).</w:t>
+      </w:r>
+    </w:p>
+    <w:bookmarkEnd w:id="55"/>
+    <w:bookmarkEnd w:id="56"/>
+    <w:bookmarkStart w:id="60" w:name="X1e46ee66dcce5645c2d432b6ebfb1a5d4d92f07"/>
+    <w:p>
+      <w:pPr>
+        <w:pStyle w:val="Heading1"/>
+      </w:pPr>
+      <w:r>
+        <w:t xml:space="preserve">Appendix B — Ground truth and re-tuning the detector</w:t>
+      </w:r>
+    </w:p>
+    <w:p>
+      <w:pPr>
+        <w:pStyle w:val="FirstParagraph"/>
+      </w:pPr>
+      <w:r>
         <w:rPr>
           <w:bCs/>
           <w:b/>
         </w:rPr>
-        <w:t xml:space="preserve">Supervised sessions:</w:t>
-      </w:r>
-      <w:r>
-        <w:t xml:space="preserve"> </w:t>
-      </w:r>
-      <w:r>
-        <w:t xml:space="preserve">scripted on/off periods in the lab, including long continuous wear and confounders (warm room, splint left on a warm surface, covered but not worn).</w:t>
-      </w:r>
-    </w:p>
-    <w:p>
-      <w:pPr>
-        <w:numPr>
-          <w:ilvl w:val="0"/>
-          <w:numId w:val="1022"/>
-        </w:numPr>
-        <w:pStyle w:val="Compact"/>
-      </w:pPr>
-      <w:r>
-        <w:rPr>
-          <w:bCs/>
-          <w:b/>
-        </w:rPr>
-        <w:t xml:space="preserve">Reference sensor:</w:t>
-      </w:r>
-      <w:r>
-        <w:t xml:space="preserve"> </w:t>
-      </w:r>
-      <w:r>
-        <w:t xml:space="preserve">a second, independent sensor (e.g. a commercial temperature button logger on the skin side) for a few deployments.</w:t>
-      </w:r>
-    </w:p>
-    <w:bookmarkEnd w:id="56"/>
-    <w:bookmarkStart w:id="57" w:name="b.2-what-to-check"/>
+        <w:t xml:space="preserve">Status:</w:t>
+      </w:r>
+      <w:r>
+        <w:t xml:space="preserve"> </w:t>
+      </w:r>
+      <w:r>
+        <w:t xml:space="preserve">Needed before wear times are reported as results.</w:t>
+      </w:r>
+    </w:p>
+    <w:bookmarkStart w:id="57" w:name="b.1-collecting-ground-truth"/>
     <w:p>
       <w:pPr>
         <w:pStyle w:val="Heading2"/>
       </w:pPr>
       <w:r>
-        <w:t xml:space="preserve">B.2 What to check</w:t>
+        <w:t xml:space="preserve">B.1 Collecting ground truth</w:t>
       </w:r>
     </w:p>
     <w:p>
@@ -5499,7 +5635,17 @@
         <w:pStyle w:val="Compact"/>
       </w:pPr>
       <w:r>
-        <w:t xml:space="preserve">Per-event agreement (onset/offset within ±1 sample) and per-day wear minutes.</w:t>
+        <w:rPr>
+          <w:bCs/>
+          <w:b/>
+        </w:rPr>
+        <w:t xml:space="preserve">Wear diary:</w:t>
+      </w:r>
+      <w:r>
+        <w:t xml:space="preserve"> </w:t>
+      </w:r>
+      <w:r>
+        <w:t xml:space="preserve">the participant (or staff, in a supervised session) records on/off times. Cheap, but coarse and subject to the same recall bias the logger is meant to avoid.</w:t>
       </w:r>
     </w:p>
     <w:p>
@@ -5515,13 +5661,13 @@
           <w:bCs/>
           <w:b/>
         </w:rPr>
-        <w:t xml:space="preserve">Long wear:</w:t>
-      </w:r>
-      <w:r>
-        <w:t xml:space="preserve"> </w:t>
-      </w:r>
-      <w:r>
-        <w:t xml:space="preserve">whether overnight wear is split or cut short (§1.2 item 3). Possible fixes: a longer baseline window, freezing the baseline while an event is in progress, or requiring two consecutive cooling samples before ending an event.</w:t>
+        <w:t xml:space="preserve">Supervised sessions:</w:t>
+      </w:r>
+      <w:r>
+        <w:t xml:space="preserve"> </w:t>
+      </w:r>
+      <w:r>
+        <w:t xml:space="preserve">scripted on/off periods in the lab, including long continuous wear and confounders (warm room, splint left on a warm surface, covered but not worn).</w:t>
       </w:r>
     </w:p>
     <w:p>
@@ -5533,11 +5679,77 @@
         <w:pStyle w:val="Compact"/>
       </w:pPr>
       <w:r>
+        <w:rPr>
+          <w:bCs/>
+          <w:b/>
+        </w:rPr>
+        <w:t xml:space="preserve">Reference sensor:</w:t>
+      </w:r>
+      <w:r>
+        <w:t xml:space="preserve"> </w:t>
+      </w:r>
+      <w:r>
+        <w:t xml:space="preserve">a second, independent sensor (e.g. a commercial temperature button logger on the skin side) for a few deployments.</w:t>
+      </w:r>
+    </w:p>
+    <w:bookmarkEnd w:id="57"/>
+    <w:bookmarkStart w:id="58" w:name="b.2-what-to-check"/>
+    <w:p>
+      <w:pPr>
+        <w:pStyle w:val="Heading2"/>
+      </w:pPr>
+      <w:r>
+        <w:t xml:space="preserve">B.2 What to check</w:t>
+      </w:r>
+    </w:p>
+    <w:p>
+      <w:pPr>
+        <w:numPr>
+          <w:ilvl w:val="0"/>
+          <w:numId w:val="1024"/>
+        </w:numPr>
+        <w:pStyle w:val="Compact"/>
+      </w:pPr>
+      <w:r>
+        <w:t xml:space="preserve">Per-event agreement (onset/offset within ±1 sample) and per-day wear minutes.</w:t>
+      </w:r>
+    </w:p>
+    <w:p>
+      <w:pPr>
+        <w:numPr>
+          <w:ilvl w:val="0"/>
+          <w:numId w:val="1024"/>
+        </w:numPr>
+        <w:pStyle w:val="Compact"/>
+      </w:pPr>
+      <w:r>
+        <w:rPr>
+          <w:bCs/>
+          <w:b/>
+        </w:rPr>
+        <w:t xml:space="preserve">Long wear:</w:t>
+      </w:r>
+      <w:r>
+        <w:t xml:space="preserve"> </w:t>
+      </w:r>
+      <w:r>
+        <w:t xml:space="preserve">whether overnight wear is split or cut short (§5.1). Possible fixes: a longer baseline window, freezing the baseline while an event is in progress, or requiring two consecutive cooling samples before ending an event.</w:t>
+      </w:r>
+    </w:p>
+    <w:p>
+      <w:pPr>
+        <w:numPr>
+          <w:ilvl w:val="0"/>
+          <w:numId w:val="1024"/>
+        </w:numPr>
+        <w:pStyle w:val="Compact"/>
+      </w:pPr>
+      <w:r>
         <w:t xml:space="preserve">False positives in warm environments, and false negatives with a loose splint.</w:t>
       </w:r>
     </w:p>
-    <w:bookmarkEnd w:id="57"/>
-    <w:bookmarkStart w:id="58" w:name="b.3-next-steps"/>
+    <w:bookmarkEnd w:id="58"/>
+    <w:bookmarkStart w:id="59" w:name="b.3-next-steps"/>
     <w:p>
       <w:pPr>
         <w:pStyle w:val="Heading2"/>
@@ -5599,8 +5811,8 @@
         <w:t xml:space="preserve">§4.</w:t>
       </w:r>
     </w:p>
-    <w:bookmarkEnd w:id="58"/>
     <w:bookmarkEnd w:id="59"/>
+    <w:bookmarkEnd w:id="60"/>
     <w:sectPr/>
   </w:body>
 </w:document>
@@ -5992,6 +6204,9 @@
     <w:abstractNumId w:val="991"/>
   </w:num>
   <w:num w:numId="1023">
+    <w:abstractNumId w:val="991"/>
+  </w:num>
+  <w:num w:numId="1024">
     <w:abstractNumId w:val="991"/>
   </w:num>
 </w:numbering>

</xml_diff>

<commit_message>
Handover round 3: merge limitations into design, split next steps
- Port Jamie's review edits (US spelling, §3–§7 wording, removed §3.3)
- Remove the §1.3 limitations table; limitations live in §4.1, §4.4
  and §5.1; renumber §1 and fix cross-references (incl. the SOP)
- Key terms: add Serial (USB serial) with the four commands
- §8 keeps only what has been tested; new §9 Next steps (unverified
  items plus firmware robustness, ground truth, battery monitoring);
  §10 Directions adds a custom PCB
- MAD spelled out as the median absolute deviation, matching the code
- Figure 1: clearer trigger labels, low power mode, GUI download
- New Figure 2: one reading from flash to the downloaded CSV

Co-Authored-By: Claude Opus 5.5 <noreply@anthropic.com>
Claude-Session: https://claude.ai/code/session_01Ue3sWJSFRo3Bxhe8SfexR3
</commit_message>
<xml_diff>
--- a/docs/Project_Handover.docx
+++ b/docs/Project_Handover.docx
@@ -211,7 +211,7 @@
         <w:t xml:space="preserve"> </w:t>
       </w:r>
       <w:r>
-        <w:t xml:space="preserve">the state of the project at transition, open items, known limitations, what to do next, and who to contact. Read this first.</w:t>
+        <w:t xml:space="preserve">the state of the project at transition, open items, what to do next, and who to contact. Read this first.</w:t>
       </w:r>
     </w:p>
     <w:p>
@@ -249,13 +249,13 @@
           <w:bCs/>
           <w:b/>
         </w:rPr>
-        <w:t xml:space="preserve">Testing and future directions (§8–§9):</w:t>
-      </w:r>
-      <w:r>
-        <w:t xml:space="preserve"> </w:t>
-      </w:r>
-      <w:r>
-        <w:t xml:space="preserve">what has been verified so far, and the areas to explore.</w:t>
+        <w:t xml:space="preserve">Testing, next steps and future directions (§8–§10):</w:t>
+      </w:r>
+      <w:r>
+        <w:t xml:space="preserve"> </w:t>
+      </w:r>
+      <w:r>
+        <w:t xml:space="preserve">what has been verified so far, what still needs testing or building, and the areas to explore.</w:t>
       </w:r>
     </w:p>
     <w:p>
@@ -285,7 +285,7 @@
         <w:pStyle w:val="FirstParagraph"/>
       </w:pPr>
       <w:r>
-        <w:t xml:space="preserve">Companion documents are listed in §1.5, and technical terms are explained under</w:t>
+        <w:t xml:space="preserve">Companion documents are listed in §1.4, and technical terms are explained under</w:t>
       </w:r>
       <w:r>
         <w:t xml:space="preserve"> </w:t>
@@ -393,7 +393,7 @@
               <w:rPr>
                 <w:sz w:val="19"/>
               </w:rPr>
-              <w:t xml:space="preserve">Build a logger, run a deployment, or download and analyse data</w:t>
+              <w:t xml:space="preserve">Build a logger, run a deployment, or download and analyze data</w:t>
             </w:r>
           </w:p>
         </w:tc>
@@ -517,7 +517,7 @@
               <w:rPr>
                 <w:sz w:val="19"/>
               </w:rPr>
-              <w:t xml:space="preserve">§1.2–§1.4, §8, §9 and Appendices A–B</w:t>
+              <w:t xml:space="preserve">§1.2, §1.3, §8–§10 and Appendices A–B</w:t>
             </w:r>
           </w:p>
         </w:tc>
@@ -556,7 +556,7 @@
       </w:tr>
     </w:tbl>
     <w:bookmarkEnd w:id="20"/>
-    <w:bookmarkStart w:id="27" w:name="state-at-transition-october-2026"/>
+    <w:bookmarkStart w:id="26" w:name="state-at-transition-october-2026"/>
     <w:p>
       <w:pPr>
         <w:pStyle w:val="Heading1"/>
@@ -659,20 +659,7 @@
         <w:t xml:space="preserve"> </w:t>
       </w:r>
       <w:r>
-        <w:t xml:space="preserve">Recordings of up to about 36 days have been collected and analysed, and the analysis was hardened against what they showed (proximity drift, §5.3). There are two loggers built, where one of them needs re-connection at the rear 3.3 V trace to update the firmware while the other one is ready for deployment. The logger that requires updated firmware is labelled</w:t>
-      </w:r>
-      <w:r>
-        <w:t xml:space="preserve"> </w:t>
-      </w:r>
-      <w:r>
-        <w:rPr>
-          <w:bCs/>
-          <w:b/>
-        </w:rPr>
-        <w:t xml:space="preserve">[TODO: label]</w:t>
-      </w:r>
-      <w:r>
-        <w:t xml:space="preserve">.</w:t>
+        <w:t xml:space="preserve">Recordings of up to about 36 days have been collected and analyzed, and the analysis was hardened against what they showed (proximity drift, §5.3). There are two loggers built, where one of them needs re-connection at the rear 3.3 V trace to update the firmware while the other one is ready for deployment. The logger that requires updated firmware has a tag attached noting that its firmware needs updating.</w:t>
       </w:r>
     </w:p>
     <w:p>
@@ -688,13 +675,13 @@
           <w:bCs/>
           <w:b/>
         </w:rPr>
-        <w:t xml:space="preserve">Tests.</w:t>
-      </w:r>
-      <w:r>
-        <w:t xml:space="preserve"> </w:t>
-      </w:r>
-      <w:r>
-        <w:t xml:space="preserve">22 automated tests (wear detection, time zones, timestamp recovery, serial protocol) run on every pull request and need no hardware.</w:t>
+        <w:t xml:space="preserve">Automated application tests.</w:t>
+      </w:r>
+      <w:r>
+        <w:t xml:space="preserve"> </w:t>
+      </w:r>
+      <w:r>
+        <w:t xml:space="preserve">22 automated tests (wear detection, time zones, timestamp recovery, serial protocol) run on every pull request for maintaining the application.</w:t>
       </w:r>
     </w:p>
     <w:p>
@@ -716,7 +703,7 @@
         <w:t xml:space="preserve"> </w:t>
       </w:r>
       <w:r>
-        <w:t xml:space="preserve">SOP for operators (</w:t>
+        <w:t xml:space="preserve">SOP (</w:t>
       </w:r>
       <w:r>
         <w:rPr>
@@ -871,7 +858,7 @@
         <w:t xml:space="preserve"> </w:t>
       </w:r>
       <w:r>
-        <w:t xml:space="preserve">see §1.4 step 2.</w:t>
+        <w:t xml:space="preserve">see §1.3 step 2.</w:t>
       </w:r>
     </w:p>
     <w:p>
@@ -913,359 +900,13 @@
       </w:r>
     </w:p>
     <w:bookmarkEnd w:id="22"/>
-    <w:bookmarkStart w:id="23" w:name="known-limitations-from-design-decisions"/>
+    <w:bookmarkStart w:id="23" w:name="recommended-next-steps"/>
     <w:p>
       <w:pPr>
         <w:pStyle w:val="Heading2"/>
       </w:pPr>
       <w:r>
-        <w:t xml:space="preserve">1.3 Known limitations (from design decisions)</w:t>
-      </w:r>
-    </w:p>
-    <w:p>
-      <w:pPr>
-        <w:pStyle w:val="FirstParagraph"/>
-      </w:pPr>
-      <w:r>
-        <w:t xml:space="preserve">These follow from how the logger and the analysis were designed. They are explained in the section named in the middle column; Appendix A covers the firmware changes that would remove the first three.</w:t>
-      </w:r>
-    </w:p>
-    <w:tbl>
-      <w:tblPr>
-        <w:tblStyle w:val="Table"/>
-        <w:tblW w:type="pct" w:w="5000"/>
-        <w:tblLook w:firstRow="1" w:lastRow="0" w:firstColumn="0" w:lastColumn="0" w:noHBand="0" w:noVBand="0" w:val="0020"/>
-        <w:jc w:val="start"/>
-        <w:tblBorders>
-          <w:top w:val="single" w:sz="4" w:space="0" w:color="BFBFBF"/>
-          <w:left w:val="single" w:sz="4" w:space="0" w:color="BFBFBF"/>
-          <w:bottom w:val="single" w:sz="4" w:space="0" w:color="BFBFBF"/>
-          <w:right w:val="single" w:sz="4" w:space="0" w:color="BFBFBF"/>
-          <w:insideH w:val="single" w:sz="4" w:space="0" w:color="BFBFBF"/>
-          <w:insideV w:val="single" w:sz="4" w:space="0" w:color="BFBFBF"/>
-        </w:tblBorders>
-      </w:tblPr>
-      <w:tblGrid>
-        <w:gridCol w:w="2795"/>
-        <w:gridCol w:w="2096"/>
-        <w:gridCol w:w="3028"/>
-      </w:tblGrid>
-      <w:tr>
-        <w:trPr>
-          <w:tblHeader w:val="true"/>
-        </w:trPr>
-        <w:tc>
-          <w:tcPr>
-            <w:shd w:val="clear" w:color="auto" w:fill="DCE6F1"/>
-          </w:tcPr>
-          <w:p>
-            <w:pPr>
-              <w:pStyle w:val="Compact"/>
-              <w:jc w:val="left"/>
-            </w:pPr>
-            <w:r>
-              <w:rPr>
-                <w:b/>
-                <w:sz w:val="19"/>
-              </w:rPr>
-              <w:t xml:space="preserve">Limitation</w:t>
-            </w:r>
-          </w:p>
-        </w:tc>
-        <w:tc>
-          <w:tcPr>
-            <w:shd w:val="clear" w:color="auto" w:fill="DCE6F1"/>
-          </w:tcPr>
-          <w:p>
-            <w:pPr>
-              <w:pStyle w:val="Compact"/>
-              <w:jc w:val="left"/>
-            </w:pPr>
-            <w:r>
-              <w:rPr>
-                <w:b/>
-                <w:sz w:val="19"/>
-              </w:rPr>
-              <w:t xml:space="preserve">Comes from</w:t>
-            </w:r>
-          </w:p>
-        </w:tc>
-        <w:tc>
-          <w:tcPr>
-            <w:shd w:val="clear" w:color="auto" w:fill="DCE6F1"/>
-          </w:tcPr>
-          <w:p>
-            <w:pPr>
-              <w:pStyle w:val="Compact"/>
-              <w:jc w:val="left"/>
-            </w:pPr>
-            <w:r>
-              <w:rPr>
-                <w:b/>
-                <w:sz w:val="19"/>
-              </w:rPr>
-              <w:t xml:space="preserve">What to do now</w:t>
-            </w:r>
-          </w:p>
-        </w:tc>
-      </w:tr>
-      <w:tr>
-        <w:tc>
-          <w:tcPr/>
-          <w:p>
-            <w:pPr>
-              <w:pStyle w:val="Compact"/>
-              <w:jc w:val="left"/>
-            </w:pPr>
-            <w:r>
-              <w:rPr>
-                <w:sz w:val="19"/>
-              </w:rPr>
-              <w:t xml:space="preserve">Timestamps are only right if the logger is powered on at the start time entered in the app</w:t>
-            </w:r>
-          </w:p>
-        </w:tc>
-        <w:tc>
-          <w:tcPr/>
-          <w:p>
-            <w:pPr>
-              <w:pStyle w:val="Compact"/>
-              <w:jc w:val="left"/>
-            </w:pPr>
-            <w:r>
-              <w:rPr>
-                <w:sz w:val="19"/>
-              </w:rPr>
-              <w:t xml:space="preserve">Elapsed-time records (§4.4)</w:t>
-            </w:r>
-          </w:p>
-        </w:tc>
-        <w:tc>
-          <w:tcPr/>
-          <w:p>
-            <w:pPr>
-              <w:pStyle w:val="Compact"/>
-              <w:jc w:val="left"/>
-            </w:pPr>
-            <w:r>
-              <w:rPr>
-                <w:sz w:val="19"/>
-              </w:rPr>
-              <w:t xml:space="preserve">Power on at the entered time and note the actual time (SOP §7.1)</w:t>
-            </w:r>
-          </w:p>
-        </w:tc>
-      </w:tr>
-      <w:tr>
-        <w:tc>
-          <w:tcPr/>
-          <w:p>
-            <w:pPr>
-              <w:pStyle w:val="Compact"/>
-              <w:jc w:val="left"/>
-            </w:pPr>
-            <w:r>
-              <w:rPr>
-                <w:sz w:val="19"/>
-              </w:rPr>
-              <w:t xml:space="preserve">Any reset or power loss during collection ends the recording</w:t>
-            </w:r>
-          </w:p>
-        </w:tc>
-        <w:tc>
-          <w:tcPr/>
-          <w:p>
-            <w:pPr>
-              <w:pStyle w:val="Compact"/>
-              <w:jc w:val="left"/>
-            </w:pPr>
-            <w:r>
-              <w:rPr>
-                <w:sz w:val="19"/>
-              </w:rPr>
-              <w:t xml:space="preserve">Mode chosen by power-up (§4.1)</w:t>
-            </w:r>
-          </w:p>
-        </w:tc>
-        <w:tc>
-          <w:tcPr/>
-          <w:p>
-            <w:pPr>
-              <w:pStyle w:val="Compact"/>
-              <w:jc w:val="left"/>
-            </w:pPr>
-            <w:r>
-              <w:rPr>
-                <w:sz w:val="19"/>
-              </w:rPr>
-              <w:t xml:space="preserve">Secure the battery; note any interruption</w:t>
-            </w:r>
-          </w:p>
-        </w:tc>
-      </w:tr>
-      <w:tr>
-        <w:tc>
-          <w:tcPr/>
-          <w:p>
-            <w:pPr>
-              <w:pStyle w:val="Compact"/>
-              <w:jc w:val="left"/>
-            </w:pPr>
-            <w:r>
-              <w:rPr>
-                <w:sz w:val="19"/>
-              </w:rPr>
-              <w:t xml:space="preserve">Clock rollover at ~49.7 days</w:t>
-            </w:r>
-          </w:p>
-        </w:tc>
-        <w:tc>
-          <w:tcPr/>
-          <w:p>
-            <w:pPr>
-              <w:pStyle w:val="Compact"/>
-              <w:jc w:val="left"/>
-            </w:pPr>
-            <w:r>
-              <w:rPr>
-                <w:rStyle w:val="VerbatimChar"/>
-                <w:sz w:val="19"/>
-              </w:rPr>
-              <w:t xml:space="preserve">millis()</w:t>
-            </w:r>
-            <w:r>
-              <w:rPr>
-                <w:sz w:val="19"/>
-              </w:rPr>
-              <w:t xml:space="preserve"> </w:t>
-            </w:r>
-            <w:r>
-              <w:rPr>
-                <w:sz w:val="19"/>
-              </w:rPr>
-              <w:t xml:space="preserve">timing (§4.4)</w:t>
-            </w:r>
-          </w:p>
-        </w:tc>
-        <w:tc>
-          <w:tcPr/>
-          <w:p>
-            <w:pPr>
-              <w:pStyle w:val="Compact"/>
-              <w:jc w:val="left"/>
-            </w:pPr>
-            <w:r>
-              <w:rPr>
-                <w:sz w:val="19"/>
-              </w:rPr>
-              <w:t xml:space="preserve">Keep deployments to about a month</w:t>
-            </w:r>
-          </w:p>
-        </w:tc>
-      </w:tr>
-      <w:tr>
-        <w:tc>
-          <w:tcPr/>
-          <w:p>
-            <w:pPr>
-              <w:pStyle w:val="Compact"/>
-              <w:jc w:val="left"/>
-            </w:pPr>
-            <w:r>
-              <w:rPr>
-                <w:sz w:val="19"/>
-              </w:rPr>
-              <w:t xml:space="preserve">Long continuous wear may be cut short by the detector</w:t>
-            </w:r>
-          </w:p>
-        </w:tc>
-        <w:tc>
-          <w:tcPr/>
-          <w:p>
-            <w:pPr>
-              <w:pStyle w:val="Compact"/>
-              <w:jc w:val="left"/>
-            </w:pPr>
-            <w:r>
-              <w:rPr>
-                <w:sz w:val="19"/>
-              </w:rPr>
-              <w:t xml:space="preserve">Rolling-minimum baseline (§5.1)</w:t>
-            </w:r>
-          </w:p>
-        </w:tc>
-        <w:tc>
-          <w:tcPr/>
-          <w:p>
-            <w:pPr>
-              <w:pStyle w:val="Compact"/>
-              <w:jc w:val="left"/>
-            </w:pPr>
-            <w:r>
-              <w:rPr>
-                <w:sz w:val="19"/>
-              </w:rPr>
-              <w:t xml:space="preserve">Check overnight wear on the traces, not only the totals</w:t>
-            </w:r>
-          </w:p>
-        </w:tc>
-      </w:tr>
-      <w:tr>
-        <w:tc>
-          <w:tcPr/>
-          <w:p>
-            <w:pPr>
-              <w:pStyle w:val="Compact"/>
-              <w:jc w:val="left"/>
-            </w:pPr>
-            <w:r>
-              <w:rPr>
-                <w:sz w:val="19"/>
-              </w:rPr>
-              <w:t xml:space="preserve">No clock correction</w:t>
-            </w:r>
-          </w:p>
-        </w:tc>
-        <w:tc>
-          <w:tcPr/>
-          <w:p>
-            <w:pPr>
-              <w:pStyle w:val="Compact"/>
-              <w:jc w:val="left"/>
-            </w:pPr>
-            <w:r>
-              <w:rPr>
-                <w:sz w:val="19"/>
-              </w:rPr>
-              <w:t xml:space="preserve">Board’s own oscillator (§4.4)</w:t>
-            </w:r>
-          </w:p>
-        </w:tc>
-        <w:tc>
-          <w:tcPr/>
-          <w:p>
-            <w:pPr>
-              <w:pStyle w:val="Compact"/>
-              <w:jc w:val="left"/>
-            </w:pPr>
-            <w:r>
-              <w:rPr>
-                <w:sz w:val="19"/>
-              </w:rPr>
-              <w:t xml:space="preserve">Expected negligible; check with §1.4 step 4</w:t>
-            </w:r>
-          </w:p>
-        </w:tc>
-      </w:tr>
-    </w:tbl>
-    <w:bookmarkEnd w:id="23"/>
-    <w:bookmarkStart w:id="24" w:name="recommended-next-steps"/>
-    <w:p>
-      <w:pPr>
-        <w:pStyle w:val="Heading2"/>
-      </w:pPr>
-      <w:r>
-        <w:t xml:space="preserve">1.4 Recommended next steps</w:t>
+        <w:t xml:space="preserve">1.3 Recommended next steps</w:t>
       </w:r>
     </w:p>
     <w:p>
@@ -1277,7 +918,7 @@
         <w:pStyle w:val="Compact"/>
       </w:pPr>
       <w:r>
-        <w:t xml:space="preserve">Fix the firmware issues together, in one firmware release (Appendix A): wrap-safe sleep (§1.3), the storage bound (§1.2), and, ideally, starting the recording at Initialize (§1.3). Upload the updated firmware and bench test.</w:t>
+        <w:t xml:space="preserve">Fix the firmware issues together, in one firmware release (Appendix A): wrap-safe sleep (§4.4), the storage bound (§1.2), and, ideally, starting the recording at Initialize (§4.4). Upload the updated firmware and bench test.</w:t>
       </w:r>
     </w:p>
     <w:p>
@@ -1316,14 +957,14 @@
         <w:t xml:space="preserve">At the end of each deployment, note the real time of the power-cycle and compare it with the last timestamp in the file. They should agree to within one interval (5 minutes); a larger gap shows clock drift or a late power-on. This costs nothing and replaces a dedicated drift test.</w:t>
       </w:r>
     </w:p>
-    <w:bookmarkEnd w:id="24"/>
-    <w:bookmarkStart w:id="25" w:name="documents-files-reference"/>
+    <w:bookmarkEnd w:id="23"/>
+    <w:bookmarkStart w:id="24" w:name="documents-files-reference"/>
     <w:p>
       <w:pPr>
         <w:pStyle w:val="Heading2"/>
       </w:pPr>
       <w:r>
-        <w:t xml:space="preserve">1.5 Documents &amp; files reference</w:t>
+        <w:t xml:space="preserve">1.4 Documents &amp; files reference</w:t>
       </w:r>
     </w:p>
     <w:tbl>
@@ -2147,14 +1788,14 @@
         </w:tc>
       </w:tr>
     </w:tbl>
-    <w:bookmarkEnd w:id="25"/>
-    <w:bookmarkStart w:id="26" w:name="handover-logistics"/>
+    <w:bookmarkEnd w:id="24"/>
+    <w:bookmarkStart w:id="25" w:name="handover-logistics"/>
     <w:p>
       <w:pPr>
         <w:pStyle w:val="Heading2"/>
       </w:pPr>
       <w:r>
-        <w:t xml:space="preserve">1.6 Handover logistics</w:t>
+        <w:t xml:space="preserve">1.5 Handover logistics</w:t>
       </w:r>
     </w:p>
     <w:p>
@@ -2223,9 +1864,9 @@
         <w:t xml:space="preserve">reach out to Jamie Kim (jamiejmkim.jmk@gmail.com).</w:t>
       </w:r>
     </w:p>
+    <w:bookmarkEnd w:id="25"/>
     <w:bookmarkEnd w:id="26"/>
-    <w:bookmarkEnd w:id="27"/>
-    <w:bookmarkStart w:id="28" w:name="key-terms"/>
+    <w:bookmarkStart w:id="27" w:name="key-terms"/>
     <w:p>
       <w:pPr>
         <w:pStyle w:val="Heading1"/>
@@ -2616,25 +2257,124 @@
             </w:pPr>
             <w:r>
               <w:rPr>
+                <w:sz w:val="19"/>
+              </w:rPr>
+              <w:t xml:space="preserve">Serial (USB serial)</w:t>
+            </w:r>
+          </w:p>
+        </w:tc>
+        <w:tc>
+          <w:tcPr/>
+          <w:p>
+            <w:pPr>
+              <w:pStyle w:val="Compact"/>
+              <w:jc w:val="left"/>
+            </w:pPr>
+            <w:r>
+              <w:rPr>
+                <w:sz w:val="19"/>
+              </w:rPr>
+              <w:t xml:space="preserve">The text connection over the USB cable between the app and the logger (9600 baud). The app sends one-character commands:</w:t>
+            </w:r>
+            <w:r>
+              <w:rPr>
+                <w:sz w:val="19"/>
+              </w:rPr>
+              <w:t xml:space="preserve"> </w:t>
+            </w:r>
+            <w:r>
+              <w:rPr>
                 <w:rStyle w:val="VerbatimChar"/>
                 <w:sz w:val="19"/>
               </w:rPr>
-              <w:t xml:space="preserve">millis()</w:t>
-            </w:r>
-          </w:p>
-        </w:tc>
-        <w:tc>
-          <w:tcPr/>
-          <w:p>
-            <w:pPr>
-              <w:pStyle w:val="Compact"/>
-              <w:jc w:val="left"/>
-            </w:pPr>
-            <w:r>
-              <w:rPr>
-                <w:sz w:val="19"/>
-              </w:rPr>
-              <w:t xml:space="preserve">The board’s millisecond counter since power-on; the logger’s only clock. 32 bits, so it wraps after ~49.7 days</w:t>
+              <w:t xml:space="preserve">?</w:t>
+            </w:r>
+            <w:r>
+              <w:rPr>
+                <w:sz w:val="19"/>
+              </w:rPr>
+              <w:t xml:space="preserve"> </w:t>
+            </w:r>
+            <w:r>
+              <w:rPr>
+                <w:sz w:val="19"/>
+              </w:rPr>
+              <w:t xml:space="preserve">handshake,</w:t>
+            </w:r>
+            <w:r>
+              <w:rPr>
+                <w:sz w:val="19"/>
+              </w:rPr>
+              <w:t xml:space="preserve"> </w:t>
+            </w:r>
+            <w:r>
+              <w:rPr>
+                <w:rStyle w:val="VerbatimChar"/>
+                <w:sz w:val="19"/>
+              </w:rPr>
+              <w:t xml:space="preserve">!</w:t>
+            </w:r>
+            <w:r>
+              <w:rPr>
+                <w:sz w:val="19"/>
+              </w:rPr>
+              <w:t xml:space="preserve"> </w:t>
+            </w:r>
+            <w:r>
+              <w:rPr>
+                <w:sz w:val="19"/>
+              </w:rPr>
+              <w:t xml:space="preserve">status,</w:t>
+            </w:r>
+            <w:r>
+              <w:rPr>
+                <w:sz w:val="19"/>
+              </w:rPr>
+              <w:t xml:space="preserve"> </w:t>
+            </w:r>
+            <w:r>
+              <w:rPr>
+                <w:rStyle w:val="VerbatimChar"/>
+                <w:sz w:val="19"/>
+              </w:rPr>
+              <w:t xml:space="preserve">i</w:t>
+            </w:r>
+            <w:r>
+              <w:rPr>
+                <w:sz w:val="19"/>
+              </w:rPr>
+              <w:t xml:space="preserve"> </w:t>
+            </w:r>
+            <w:r>
+              <w:rPr>
+                <w:sz w:val="19"/>
+              </w:rPr>
+              <w:t xml:space="preserve">initialize,</w:t>
+            </w:r>
+            <w:r>
+              <w:rPr>
+                <w:sz w:val="19"/>
+              </w:rPr>
+              <w:t xml:space="preserve"> </w:t>
+            </w:r>
+            <w:r>
+              <w:rPr>
+                <w:rStyle w:val="VerbatimChar"/>
+                <w:sz w:val="19"/>
+              </w:rPr>
+              <w:t xml:space="preserve">r</w:t>
+            </w:r>
+            <w:r>
+              <w:rPr>
+                <w:sz w:val="19"/>
+              </w:rPr>
+              <w:t xml:space="preserve"> </w:t>
+            </w:r>
+            <w:r>
+              <w:rPr>
+                <w:sz w:val="19"/>
+              </w:rPr>
+              <w:t xml:space="preserve">read data</w:t>
             </w:r>
           </w:p>
         </w:tc>
@@ -2649,24 +2389,25 @@
             </w:pPr>
             <w:r>
               <w:rPr>
-                <w:sz w:val="19"/>
-              </w:rPr>
-              <w:t xml:space="preserve">Epoch</w:t>
-            </w:r>
-          </w:p>
-        </w:tc>
-        <w:tc>
-          <w:tcPr/>
-          <w:p>
-            <w:pPr>
-              <w:pStyle w:val="Compact"/>
-              <w:jc w:val="left"/>
-            </w:pPr>
-            <w:r>
-              <w:rPr>
-                <w:sz w:val="19"/>
-              </w:rPr>
-              <w:t xml:space="preserve">Time as seconds since 1 Jan 1970 UTC; how the logger stores the start time</w:t>
+                <w:rStyle w:val="VerbatimChar"/>
+                <w:sz w:val="19"/>
+              </w:rPr>
+              <w:t xml:space="preserve">millis()</w:t>
+            </w:r>
+          </w:p>
+        </w:tc>
+        <w:tc>
+          <w:tcPr/>
+          <w:p>
+            <w:pPr>
+              <w:pStyle w:val="Compact"/>
+              <w:jc w:val="left"/>
+            </w:pPr>
+            <w:r>
+              <w:rPr>
+                <w:sz w:val="19"/>
+              </w:rPr>
+              <w:t xml:space="preserve">The board’s millisecond counter since power-on; the logger’s only clock. 32 bits, so it wraps after ~49.7 days</w:t>
             </w:r>
           </w:p>
         </w:tc>
@@ -2683,22 +2424,22 @@
               <w:rPr>
                 <w:sz w:val="19"/>
               </w:rPr>
-              <w:t xml:space="preserve">Baseline / delta</w:t>
-            </w:r>
-          </w:p>
-        </w:tc>
-        <w:tc>
-          <w:tcPr/>
-          <w:p>
-            <w:pPr>
-              <w:pStyle w:val="Compact"/>
-              <w:jc w:val="left"/>
-            </w:pPr>
-            <w:r>
-              <w:rPr>
-                <w:sz w:val="19"/>
-              </w:rPr>
-              <w:t xml:space="preserve">The rolling-minimum temperature (taken as room temperature), and the temperature above it</w:t>
+              <w:t xml:space="preserve">Epoch</w:t>
+            </w:r>
+          </w:p>
+        </w:tc>
+        <w:tc>
+          <w:tcPr/>
+          <w:p>
+            <w:pPr>
+              <w:pStyle w:val="Compact"/>
+              <w:jc w:val="left"/>
+            </w:pPr>
+            <w:r>
+              <w:rPr>
+                <w:sz w:val="19"/>
+              </w:rPr>
+              <w:t xml:space="preserve">Time as seconds since 1 Jan 1970 UTC; how the logger stores the start time</w:t>
             </w:r>
           </w:p>
         </w:tc>
@@ -2715,22 +2456,22 @@
               <w:rPr>
                 <w:sz w:val="19"/>
               </w:rPr>
-              <w:t xml:space="preserve">Onset / offset</w:t>
-            </w:r>
-          </w:p>
-        </w:tc>
-        <w:tc>
-          <w:tcPr/>
-          <w:p>
-            <w:pPr>
-              <w:pStyle w:val="Compact"/>
-              <w:jc w:val="left"/>
-            </w:pPr>
-            <w:r>
-              <w:rPr>
-                <w:sz w:val="19"/>
-              </w:rPr>
-              <w:t xml:space="preserve">The start / end of a detected wear event</w:t>
+              <w:t xml:space="preserve">Baseline / delta</w:t>
+            </w:r>
+          </w:p>
+        </w:tc>
+        <w:tc>
+          <w:tcPr/>
+          <w:p>
+            <w:pPr>
+              <w:pStyle w:val="Compact"/>
+              <w:jc w:val="left"/>
+            </w:pPr>
+            <w:r>
+              <w:rPr>
+                <w:sz w:val="19"/>
+              </w:rPr>
+              <w:t xml:space="preserve">The rolling-minimum temperature (taken as room temperature), and the temperature above it</w:t>
             </w:r>
           </w:p>
         </w:tc>
@@ -2747,6 +2488,38 @@
               <w:rPr>
                 <w:sz w:val="19"/>
               </w:rPr>
+              <w:t xml:space="preserve">Onset / offset</w:t>
+            </w:r>
+          </w:p>
+        </w:tc>
+        <w:tc>
+          <w:tcPr/>
+          <w:p>
+            <w:pPr>
+              <w:pStyle w:val="Compact"/>
+              <w:jc w:val="left"/>
+            </w:pPr>
+            <w:r>
+              <w:rPr>
+                <w:sz w:val="19"/>
+              </w:rPr>
+              <w:t xml:space="preserve">The start / end of a detected wear event</w:t>
+            </w:r>
+          </w:p>
+        </w:tc>
+      </w:tr>
+      <w:tr>
+        <w:tc>
+          <w:tcPr/>
+          <w:p>
+            <w:pPr>
+              <w:pStyle w:val="Compact"/>
+              <w:jc w:val="left"/>
+            </w:pPr>
+            <w:r>
+              <w:rPr>
+                <w:sz w:val="19"/>
+              </w:rPr>
               <w:t xml:space="preserve">Dash / Flask</w:t>
             </w:r>
           </w:p>
@@ -2768,8 +2541,8 @@
         </w:tc>
       </w:tr>
     </w:tbl>
-    <w:bookmarkEnd w:id="28"/>
-    <w:bookmarkStart w:id="29" w:name="problem-and-goals"/>
+    <w:bookmarkEnd w:id="27"/>
+    <w:bookmarkStart w:id="28" w:name="problem-and-goals"/>
     <w:p>
       <w:pPr>
         <w:pStyle w:val="Heading1"/>
@@ -3006,27 +2779,11 @@
         <w:t xml:space="preserve"> </w:t>
       </w:r>
       <w:r>
-        <w:t xml:space="preserve">wear detection from body heat and sensor covering, at 5-minute resolution, for deployments of up to about a month. Recognising</w:t>
-      </w:r>
-      <w:r>
-        <w:t xml:space="preserve"> </w:t>
-      </w:r>
-      <w:r>
-        <w:rPr>
-          <w:iCs/>
-          <w:i/>
-        </w:rPr>
-        <w:t xml:space="preserve">how</w:t>
-      </w:r>
-      <w:r>
-        <w:t xml:space="preserve"> </w:t>
-      </w:r>
-      <w:r>
-        <w:t xml:space="preserve">the splint is worn (fit, position) or activity during wear is out of scope.</w:t>
-      </w:r>
-    </w:p>
-    <w:bookmarkEnd w:id="29"/>
-    <w:bookmarkStart w:id="36" w:name="system-architecture"/>
+        <w:t xml:space="preserve">wear detection from body heat and sensor covering, at 5-minute resolution, for deployments of up to about a month.</w:t>
+      </w:r>
+    </w:p>
+    <w:bookmarkEnd w:id="28"/>
+    <w:bookmarkStart w:id="34" w:name="system-architecture"/>
     <w:p>
       <w:pPr>
         <w:pStyle w:val="Heading1"/>
@@ -3052,18 +2809,18 @@
           <wp:inline>
             <wp:extent cx="5334000" cy="3200400"/>
             <wp:effectExtent b="0" l="0" r="0" t="0"/>
-            <wp:docPr descr="Figure 1. The logger’s states and what triggers each change. The app can connect only in states 1 and 4; in state 2 the board is powered down." title="" id="31" name="Picture"/>
+            <wp:docPr descr="Figure 1. The logger’s states and what triggers each change." title="" id="30" name="Picture"/>
             <a:graphic>
               <a:graphicData uri="http://schemas.openxmlformats.org/drawingml/2006/picture">
                 <pic:pic>
                   <pic:nvPicPr>
-                    <pic:cNvPr descr="images/device_lifecycle.png" id="32" name="Picture"/>
+                    <pic:cNvPr descr="images/device_lifecycle.png" id="31" name="Picture"/>
                     <pic:cNvPicPr>
                       <a:picLocks noChangeArrowheads="1" noChangeAspect="1"/>
                     </pic:cNvPicPr>
                   </pic:nvPicPr>
                   <pic:blipFill>
-                    <a:blip r:embed="rId30"/>
+                    <a:blip r:embed="rId29"/>
                     <a:stretch>
                       <a:fillRect/>
                     </a:stretch>
@@ -3095,16 +2852,16 @@
         <w:pStyle w:val="ImageCaption"/>
       </w:pPr>
       <w:r>
-        <w:t xml:space="preserve">Figure 1. The logger’s states and what triggers each change. The app can connect only in states 1 and 4; in state 2 the board is powered down.</w:t>
-      </w:r>
-    </w:p>
-    <w:bookmarkStart w:id="33" w:name="Xf94d73710224c8ed626aaa020021a29f2f7e816"/>
+        <w:t xml:space="preserve">Figure 1. The logger’s states and what triggers each change.</w:t>
+      </w:r>
+    </w:p>
+    <w:bookmarkStart w:id="32" w:name="X4d76758aa6b0c38cffa934231f019fecf83cf94"/>
     <w:p>
       <w:pPr>
         <w:pStyle w:val="Heading2"/>
       </w:pPr>
       <w:r>
-        <w:t xml:space="preserve">3.1 Record on the device, analyse on the computer</w:t>
+        <w:t xml:space="preserve">3.1 Record on the device, analyze on the computer</w:t>
       </w:r>
     </w:p>
     <w:p>
@@ -3148,7 +2905,7 @@
         <w:t xml:space="preserve"> </w:t>
       </w:r>
       <w:r>
-        <w:t xml:space="preserve">The detection rules are still being tuned. Keeping them on the computer means old recordings can be re-analysed with improved rules, and changes need no re-flashing. It also keeps the firmware small and the stored data raw.</w:t>
+        <w:t xml:space="preserve">This enables fine-tuning the detection algorithm as raw recordings are preserved. It also keeps the firmware small and simple, ideal for low power mode operation.</w:t>
       </w:r>
     </w:p>
     <w:p>
@@ -3170,11 +2927,11 @@
         <w:t xml:space="preserve"> </w:t>
       </w:r>
       <w:r>
-        <w:t xml:space="preserve">Detecting wear on the board (stores less, but loses the raw data and needs re-flashing to change); streaming over Bluetooth to a phone (needs the patient’s phone and much more power).</w:t>
-      </w:r>
-    </w:p>
-    <w:bookmarkEnd w:id="33"/>
-    <w:bookmarkStart w:id="34" w:name="hardware"/>
+        <w:t xml:space="preserve">Detecting wear on the board; streaming over Bluetooth to a phone (needs the patient’s phone and consumes more power).</w:t>
+      </w:r>
+    </w:p>
+    <w:bookmarkEnd w:id="32"/>
+    <w:bookmarkStart w:id="33" w:name="hardware"/>
     <w:p>
       <w:pPr>
         <w:pStyle w:val="Heading2"/>
@@ -3224,7 +2981,7 @@
         <w:t xml:space="preserve"> </w:t>
       </w:r>
       <w:r>
-        <w:t xml:space="preserve">Both sensors are already on the board, so there is no extra wiring. The nRF52840 has enough flash for a month of readings and can be put into a low-power state. The board also has Bluetooth for a future wireless version.</w:t>
+        <w:t xml:space="preserve">Both sensors are already on the board, so there is no extra wiring. The nRF52840 has enough flash for a month of readings and can be put into a low-power state. The board also has Bluetooth available if pursuing a wireless version in future.</w:t>
       </w:r>
     </w:p>
     <w:p>
@@ -3246,17 +3003,27 @@
         <w:t xml:space="preserve"> </w:t>
       </w:r>
       <w:r>
-        <w:t xml:space="preserve">The board is larger and draws more current than a purpose-built logger.</w:t>
-      </w:r>
-    </w:p>
+        <w:t xml:space="preserve">The board is larger and draws more current than a custom designed printed circuit board.</w:t>
+      </w:r>
+    </w:p>
+    <w:bookmarkEnd w:id="33"/>
     <w:bookmarkEnd w:id="34"/>
-    <w:bookmarkStart w:id="35" w:name="serial-protocol"/>
+    <w:bookmarkStart w:id="43" w:name="firmware"/>
+    <w:p>
+      <w:pPr>
+        <w:pStyle w:val="Heading1"/>
+      </w:pPr>
+      <w:r>
+        <w:t xml:space="preserve">4. Firmware</w:t>
+      </w:r>
+    </w:p>
+    <w:bookmarkStart w:id="35" w:name="mode-chosen-by-power-up"/>
     <w:p>
       <w:pPr>
         <w:pStyle w:val="Heading2"/>
       </w:pPr>
       <w:r>
-        <w:t xml:space="preserve">3.3 Serial protocol</w:t>
+        <w:t xml:space="preserve">4.1 Mode chosen by power-up</w:t>
       </w:r>
     </w:p>
     <w:p>
@@ -3278,112 +3045,7 @@
         <w:t xml:space="preserve"> </w:t>
       </w:r>
       <w:r>
-        <w:t xml:space="preserve">Four one-character commands over USB serial at 9600 baud:</w:t>
-      </w:r>
-      <w:r>
-        <w:t xml:space="preserve"> </w:t>
-      </w:r>
-      <w:r>
-        <w:rPr>
-          <w:rStyle w:val="VerbatimChar"/>
-        </w:rPr>
-        <w:t xml:space="preserve">?</w:t>
-      </w:r>
-      <w:r>
-        <w:t xml:space="preserve"> </w:t>
-      </w:r>
-      <w:r>
-        <w:t xml:space="preserve">handshake (</w:t>
-      </w:r>
-      <w:r>
-        <w:rPr>
-          <w:rStyle w:val="VerbatimChar"/>
-        </w:rPr>
-        <w:t xml:space="preserve">Hello World!</w:t>
-      </w:r>
-      <w:r>
-        <w:t xml:space="preserve">),</w:t>
-      </w:r>
-      <w:r>
-        <w:t xml:space="preserve"> </w:t>
-      </w:r>
-      <w:r>
-        <w:rPr>
-          <w:rStyle w:val="VerbatimChar"/>
-        </w:rPr>
-        <w:t xml:space="preserve">!</w:t>
-      </w:r>
-      <w:r>
-        <w:t xml:space="preserve"> </w:t>
-      </w:r>
-      <w:r>
-        <w:t xml:space="preserve">status (</w:t>
-      </w:r>
-      <w:r>
-        <w:rPr>
-          <w:rStyle w:val="VerbatimChar"/>
-        </w:rPr>
-        <w:t xml:space="preserve">HAS_DATA</w:t>
-      </w:r>
-      <w:r>
-        <w:t xml:space="preserve"> </w:t>
-      </w:r>
-      <w:r>
-        <w:t xml:space="preserve">/</w:t>
-      </w:r>
-      <w:r>
-        <w:t xml:space="preserve"> </w:t>
-      </w:r>
-      <w:r>
-        <w:rPr>
-          <w:rStyle w:val="VerbatimChar"/>
-        </w:rPr>
-        <w:t xml:space="preserve">NEED_CONFIGURATION</w:t>
-      </w:r>
-      <w:r>
-        <w:t xml:space="preserve">),</w:t>
-      </w:r>
-      <w:r>
-        <w:t xml:space="preserve"> </w:t>
-      </w:r>
-      <w:r>
-        <w:rPr>
-          <w:rStyle w:val="VerbatimChar"/>
-        </w:rPr>
-        <w:t xml:space="preserve">i</w:t>
-      </w:r>
-      <w:r>
-        <w:t xml:space="preserve"> </w:t>
-      </w:r>
-      <w:r>
-        <w:t xml:space="preserve">initialize (a 28-byte packed record: start epoch, interval, ID, checksum),</w:t>
-      </w:r>
-      <w:r>
-        <w:t xml:space="preserve"> </w:t>
-      </w:r>
-      <w:r>
-        <w:rPr>
-          <w:rStyle w:val="VerbatimChar"/>
-        </w:rPr>
-        <w:t xml:space="preserve">r</w:t>
-      </w:r>
-      <w:r>
-        <w:t xml:space="preserve"> </w:t>
-      </w:r>
-      <w:r>
-        <w:t xml:space="preserve">read (CSV rows ending</w:t>
-      </w:r>
-      <w:r>
-        <w:t xml:space="preserve"> </w:t>
-      </w:r>
-      <w:r>
-        <w:rPr>
-          <w:rStyle w:val="VerbatimChar"/>
-        </w:rPr>
-        <w:t xml:space="preserve">END_DATA</w:t>
-      </w:r>
-      <w:r>
-        <w:t xml:space="preserve">).</w:t>
+        <w:t xml:space="preserve">The logger keeps a mode flag in flash and changes it on every power-up: an initialized logger with no data starts collecting; a collecting logger becomes idle (Figure 1).</w:t>
       </w:r>
     </w:p>
     <w:p>
@@ -3405,42 +3067,57 @@
         <w:t xml:space="preserve"> </w:t>
       </w:r>
       <w:r>
-        <w:t xml:space="preserve">Simple to implement on both sides and easy to test by hand in the Arduino Serial Monitor. The app finds the logger by sending</w:t>
-      </w:r>
-      <w:r>
-        <w:t xml:space="preserve"> </w:t>
-      </w:r>
-      <w:r>
-        <w:rPr>
-          <w:rStyle w:val="VerbatimChar"/>
-        </w:rPr>
-        <w:t xml:space="preserve">?</w:t>
-      </w:r>
-      <w:r>
-        <w:t xml:space="preserve"> </w:t>
-      </w:r>
-      <w:r>
-        <w:t xml:space="preserve">to every serial port, so the user never has to choose a port.</w:t>
+        <w:t xml:space="preserve">During collection USB is switched off to save power, so the computer can’t send a</w:t>
+      </w:r>
+      <w:r>
+        <w:t xml:space="preserve"> </w:t>
+      </w:r>
+      <w:r>
+        <w:t xml:space="preserve">“</w:t>
+      </w:r>
+      <w:r>
+        <w:t xml:space="preserve">stop</w:t>
+      </w:r>
+      <w:r>
+        <w:t xml:space="preserve">”</w:t>
+      </w:r>
+      <w:r>
+        <w:t xml:space="preserve"> </w:t>
+      </w:r>
+      <w:r>
+        <w:t xml:space="preserve">command. Power-cycling is the only control available without extra buttons.</w:t>
+      </w:r>
+    </w:p>
+    <w:p>
+      <w:pPr>
+        <w:numPr>
+          <w:ilvl w:val="0"/>
+          <w:numId w:val="1008"/>
+        </w:numPr>
+        <w:pStyle w:val="Compact"/>
+      </w:pPr>
+      <w:r>
+        <w:rPr>
+          <w:bCs/>
+          <w:b/>
+        </w:rPr>
+        <w:t xml:space="preserve">Limitation:</w:t>
+      </w:r>
+      <w:r>
+        <w:t xml:space="preserve"> </w:t>
+      </w:r>
+      <w:r>
+        <w:t xml:space="preserve">The logger can’t be seen by the app while collecting; power-cycle it first. Any reset or power loss during collection also counts as a power-up, so the recording ends there: the data so far is kept, but nothing more is recorded. Appendix A.2 describes an alternative.</w:t>
       </w:r>
     </w:p>
     <w:bookmarkEnd w:id="35"/>
-    <w:bookmarkEnd w:id="36"/>
-    <w:bookmarkStart w:id="42" w:name="firmware-design-decisions"/>
-    <w:p>
-      <w:pPr>
-        <w:pStyle w:val="Heading1"/>
-      </w:pPr>
-      <w:r>
-        <w:t xml:space="preserve">4. Firmware design decisions</w:t>
-      </w:r>
-    </w:p>
-    <w:bookmarkStart w:id="37" w:name="mode-chosen-by-power-up"/>
+    <w:bookmarkStart w:id="36" w:name="settings-stored-twice-ab-with-a-checksum"/>
     <w:p>
       <w:pPr>
         <w:pStyle w:val="Heading2"/>
       </w:pPr>
       <w:r>
-        <w:t xml:space="preserve">4.1 Mode chosen by power-up</w:t>
+        <w:t xml:space="preserve">4.2 Settings stored twice (A/B), with a checksum</w:t>
       </w:r>
     </w:p>
     <w:p>
@@ -3462,7 +3139,23 @@
         <w:t xml:space="preserve"> </w:t>
       </w:r>
       <w:r>
-        <w:t xml:space="preserve">The logger keeps a mode flag in flash and changes it on every power-up: an initialized logger with no data starts collecting; a collecting logger becomes idle (Figure 1).</w:t>
+        <w:t xml:space="preserve">The settings (start time, interval, participant ID, mode) are kept in two flash pages. Each save writes to the page</w:t>
+      </w:r>
+      <w:r>
+        <w:t xml:space="preserve"> </w:t>
+      </w:r>
+      <w:r>
+        <w:rPr>
+          <w:iCs/>
+          <w:i/>
+        </w:rPr>
+        <w:t xml:space="preserve">not</w:t>
+      </w:r>
+      <w:r>
+        <w:t xml:space="preserve"> </w:t>
+      </w:r>
+      <w:r>
+        <w:t xml:space="preserve">holding the current copy, with a magic number, sequence number and CRC; on power-up the newest valid copy wins.</w:t>
       </w:r>
     </w:p>
     <w:p>
@@ -3484,25 +3177,7 @@
         <w:t xml:space="preserve"> </w:t>
       </w:r>
       <w:r>
-        <w:t xml:space="preserve">During collection USB is switched off to save power, so the computer can’t send a</w:t>
-      </w:r>
-      <w:r>
-        <w:t xml:space="preserve"> </w:t>
-      </w:r>
-      <w:r>
-        <w:t xml:space="preserve">“</w:t>
-      </w:r>
-      <w:r>
-        <w:t xml:space="preserve">stop</w:t>
-      </w:r>
-      <w:r>
-        <w:t xml:space="preserve">”</w:t>
-      </w:r>
-      <w:r>
-        <w:t xml:space="preserve"> </w:t>
-      </w:r>
-      <w:r>
-        <w:t xml:space="preserve">command. Power-cycling is the only control available without extra buttons.</w:t>
+        <w:t xml:space="preserve">The earlier single-page layout could be wiped by a reset during a save, losing the start time. The A/B layout always leaves one good copy.</w:t>
       </w:r>
     </w:p>
     <w:p>
@@ -3518,23 +3193,38 @@
           <w:bCs/>
           <w:b/>
         </w:rPr>
-        <w:t xml:space="preserve">Limitation:</w:t>
-      </w:r>
-      <w:r>
-        <w:t xml:space="preserve"> </w:t>
-      </w:r>
-      <w:r>
-        <w:t xml:space="preserve">The logger can’t be seen by the app while collecting; power-cycle it first. Any reset or power loss during collection also counts as a power-up, so the recording ends there: the data so far is kept, but nothing more is recorded. Appendix A.2 describes an alternative.</w:t>
-      </w:r>
-    </w:p>
-    <w:bookmarkEnd w:id="37"/>
-    <w:bookmarkStart w:id="38" w:name="settings-stored-twice-ab-with-a-checksum"/>
+        <w:t xml:space="preserve">Constraint:</w:t>
+      </w:r>
+      <w:r>
+        <w:t xml:space="preserve"> </w:t>
+      </w:r>
+      <w:r>
+        <w:t xml:space="preserve">Loggers flashed before this change hold settings the current firmware doesn’t recognize. They report</w:t>
+      </w:r>
+      <w:r>
+        <w:t xml:space="preserve"> </w:t>
+      </w:r>
+      <w:r>
+        <w:rPr>
+          <w:rStyle w:val="VerbatimChar"/>
+        </w:rPr>
+        <w:t xml:space="preserve">UNKNOWN</w:t>
+      </w:r>
+      <w:r>
+        <w:t xml:space="preserve"> </w:t>
+      </w:r>
+      <w:r>
+        <w:t xml:space="preserve">start times until re-initialized; these loggers will need to be updated to the latest firmware.</w:t>
+      </w:r>
+    </w:p>
+    <w:bookmarkEnd w:id="36"/>
+    <w:bookmarkStart w:id="37" w:name="low-power-by-switching-peripherals-off"/>
     <w:p>
       <w:pPr>
         <w:pStyle w:val="Heading2"/>
       </w:pPr>
       <w:r>
-        <w:t xml:space="preserve">4.2 Settings stored twice (A/B), with a checksum</w:t>
+        <w:t xml:space="preserve">4.3 Low power by switching peripherals off</w:t>
       </w:r>
     </w:p>
     <w:p>
@@ -3556,23 +3246,19 @@
         <w:t xml:space="preserve"> </w:t>
       </w:r>
       <w:r>
-        <w:t xml:space="preserve">The settings (start time, interval, participant ID, mode) are kept in two flash pages. Each save writes to the page</w:t>
-      </w:r>
-      <w:r>
-        <w:t xml:space="preserve"> </w:t>
-      </w:r>
-      <w:r>
-        <w:rPr>
-          <w:iCs/>
-          <w:i/>
-        </w:rPr>
-        <w:t xml:space="preserve">not</w:t>
-      </w:r>
-      <w:r>
-        <w:t xml:space="preserve"> </w:t>
-      </w:r>
-      <w:r>
-        <w:t xml:space="preserve">holding the current copy, with a magic number, sequence number and CRC; on power-up the newest valid copy wins.</w:t>
+        <w:t xml:space="preserve">During collection the firmware disables USB, UART, the radio and other unused peripherals, and waits between readings with</w:t>
+      </w:r>
+      <w:r>
+        <w:t xml:space="preserve"> </w:t>
+      </w:r>
+      <w:r>
+        <w:rPr>
+          <w:rStyle w:val="VerbatimChar"/>
+        </w:rPr>
+        <w:t xml:space="preserve">delay()</w:t>
+      </w:r>
+      <w:r>
+        <w:t xml:space="preserve">. Resting current measured below about 750 µA.</w:t>
       </w:r>
     </w:p>
     <w:p>
@@ -3594,29 +3280,7 @@
         <w:t xml:space="preserve"> </w:t>
       </w:r>
       <w:r>
-        <w:t xml:space="preserve">The earlier single-page layout could be wiped by a reset during a save, losing the start time. The A/B layout always leaves one good copy.</w:t>
-      </w:r>
-    </w:p>
-    <w:p>
-      <w:pPr>
-        <w:numPr>
-          <w:ilvl w:val="0"/>
-          <w:numId w:val="1010"/>
-        </w:numPr>
-        <w:pStyle w:val="Compact"/>
-      </w:pPr>
-      <w:r>
-        <w:rPr>
-          <w:bCs/>
-          <w:b/>
-        </w:rPr>
-        <w:t xml:space="preserve">Constraint:</w:t>
-      </w:r>
-      <w:r>
-        <w:t xml:space="preserve"> </w:t>
-      </w:r>
-      <w:r>
-        <w:t xml:space="preserve">Loggers flashed before this change hold settings the current firmware doesn’t recognise. They report</w:t>
+        <w:t xml:space="preserve">A deeper sleep (RTC2 timer +</w:t>
       </w:r>
       <w:r>
         <w:t xml:space="preserve"> </w:t>
@@ -3625,23 +3289,20 @@
         <w:rPr>
           <w:rStyle w:val="VerbatimChar"/>
         </w:rPr>
-        <w:t xml:space="preserve">UNKNOWN</w:t>
-      </w:r>
-      <w:r>
-        <w:t xml:space="preserve"> </w:t>
-      </w:r>
-      <w:r>
-        <w:t xml:space="preserve">start times until re-initialized; download first.</w:t>
-      </w:r>
-    </w:p>
-    <w:bookmarkEnd w:id="38"/>
-    <w:bookmarkStart w:id="39" w:name="low-power-by-switching-peripherals-off"/>
+        <w:t xml:space="preserve">__WFI</w:t>
+      </w:r>
+      <w:r>
+        <w:t xml:space="preserve">) was tried, but the Arduino never woke up to resume collecting data once in deep sleep; it may still be worth revisiting to further optimize battery life.</w:t>
+      </w:r>
+    </w:p>
+    <w:bookmarkEnd w:id="37"/>
+    <w:bookmarkStart w:id="41" w:name="X411b90941db8c81d2e6ca52c8267385abd623de"/>
     <w:p>
       <w:pPr>
         <w:pStyle w:val="Heading2"/>
       </w:pPr>
       <w:r>
-        <w:t xml:space="preserve">4.3 Low power by switching peripherals off</w:t>
+        <w:t xml:space="preserve">4.4 Fixed 5-minute interval, elapsed-time records</w:t>
       </w:r>
     </w:p>
     <w:p>
@@ -3663,19 +3324,43 @@
         <w:t xml:space="preserve"> </w:t>
       </w:r>
       <w:r>
-        <w:t xml:space="preserve">During collection the firmware disables USB, UART, the radio and other unused peripherals, and waits between readings with</w:t>
-      </w:r>
-      <w:r>
-        <w:t xml:space="preserve"> </w:t>
+        <w:t xml:space="preserve">One reading every 300 s (</w:t>
       </w:r>
       <w:r>
         <w:rPr>
           <w:rStyle w:val="VerbatimChar"/>
         </w:rPr>
-        <w:t xml:space="preserve">delay()</w:t>
-      </w:r>
-      <w:r>
-        <w:t xml:space="preserve">. Resting current measured below about 750 µA.</w:t>
+        <w:t xml:space="preserve">WAKEUP_INTERVAL_SECONDS</w:t>
+      </w:r>
+      <w:r>
+        <w:t xml:space="preserve"> </w:t>
+      </w:r>
+      <w:r>
+        <w:t xml:space="preserve">in</w:t>
+      </w:r>
+      <w:r>
+        <w:t xml:space="preserve"> </w:t>
+      </w:r>
+      <w:r>
+        <w:rPr>
+          <w:rStyle w:val="VerbatimChar"/>
+        </w:rPr>
+        <w:t xml:space="preserve">arduino.py</w:t>
+      </w:r>
+      <w:r>
+        <w:t xml:space="preserve">, sent at Initialize). Each record stores seconds elapsed since collection started (from</w:t>
+      </w:r>
+      <w:r>
+        <w:t xml:space="preserve"> </w:t>
+      </w:r>
+      <w:r>
+        <w:rPr>
+          <w:rStyle w:val="VerbatimChar"/>
+        </w:rPr>
+        <w:t xml:space="preserve">millis()</w:t>
+      </w:r>
+      <w:r>
+        <w:t xml:space="preserve">), plus temperature and proximity, in 12 bytes; the app adds the start time.</w:t>
       </w:r>
     </w:p>
     <w:p>
@@ -3697,46 +3382,7 @@
         <w:t xml:space="preserve"> </w:t>
       </w:r>
       <w:r>
-        <w:t xml:space="preserve">Simple and proven on the bench. A deeper sleep (RTC2 timer +</w:t>
-      </w:r>
-      <w:r>
-        <w:t xml:space="preserve"> </w:t>
-      </w:r>
-      <w:r>
-        <w:rPr>
-          <w:rStyle w:val="VerbatimChar"/>
-        </w:rPr>
-        <w:t xml:space="preserve">__WFI</w:t>
-      </w:r>
-      <w:r>
-        <w:t xml:space="preserve">) was tried in August 2026 and reverted (commits</w:t>
-      </w:r>
-      <w:r>
-        <w:t xml:space="preserve"> </w:t>
-      </w:r>
-      <w:r>
-        <w:rPr>
-          <w:rStyle w:val="VerbatimChar"/>
-        </w:rPr>
-        <w:t xml:space="preserve">b0cdfce</w:t>
-      </w:r>
-      <w:r>
-        <w:t xml:space="preserve"> </w:t>
-      </w:r>
-      <w:r>
-        <w:t xml:space="preserve">→</w:t>
-      </w:r>
-      <w:r>
-        <w:t xml:space="preserve"> </w:t>
-      </w:r>
-      <w:r>
-        <w:rPr>
-          <w:rStyle w:val="VerbatimChar"/>
-        </w:rPr>
-        <w:t xml:space="preserve">c153218</w:t>
-      </w:r>
-      <w:r>
-        <w:t xml:space="preserve">); it may still be worth revisiting for battery life.</w:t>
+        <w:t xml:space="preserve">The board has no real-time clock, so elapsed time is the simplest reliable record. 5 minutes resolves wear periods well enough for daily totals, and fits a month in flash. The analysis infers the real interval from the timestamps, so the interval can be changed without changing the analysis. Figure 2 shows how one reading is stored and downloaded.</w:t>
       </w:r>
     </w:p>
     <w:p>
@@ -3752,167 +3398,237 @@
           <w:bCs/>
           <w:b/>
         </w:rPr>
-        <w:t xml:space="preserve">Lesson:</w:t>
-      </w:r>
-      <w:r>
-        <w:t xml:space="preserve"> </w:t>
-      </w:r>
-      <w:r>
-        <w:rPr>
-          <w:bCs/>
-          <w:b/>
-        </w:rPr>
-        <w:t xml:space="preserve">Do not disable SPI0/SPI1.</w:t>
-      </w:r>
-      <w:r>
-        <w:t xml:space="preserve"> </w:t>
-      </w:r>
-      <w:r>
-        <w:t xml:space="preserve">On the nRF52840 they share hardware with the I2C controllers the sensors use. Disabling them stopped the proximity read and nothing was logged.</w:t>
-      </w:r>
-    </w:p>
-    <w:bookmarkEnd w:id="39"/>
-    <w:bookmarkStart w:id="40" w:name="X411b90941db8c81d2e6ca52c8267385abd623de"/>
-    <w:p>
-      <w:pPr>
-        <w:pStyle w:val="Heading2"/>
-      </w:pPr>
-      <w:r>
-        <w:t xml:space="preserve">4.4 Fixed 5-minute interval, elapsed-time records</w:t>
+        <w:t xml:space="preserve">Limitations:</w:t>
       </w:r>
     </w:p>
     <w:p>
       <w:pPr>
         <w:numPr>
-          <w:ilvl w:val="0"/>
+          <w:ilvl w:val="1"/>
           <w:numId w:val="1012"/>
         </w:numPr>
         <w:pStyle w:val="Compact"/>
       </w:pPr>
       <w:r>
         <w:rPr>
-          <w:bCs/>
-          <w:b/>
-        </w:rPr>
-        <w:t xml:space="preserve">Design Decision:</w:t>
-      </w:r>
-      <w:r>
-        <w:t xml:space="preserve"> </w:t>
-      </w:r>
-      <w:r>
-        <w:t xml:space="preserve">One reading every 300 s (</w:t>
-      </w:r>
-      <w:r>
-        <w:rPr>
-          <w:rStyle w:val="VerbatimChar"/>
-        </w:rPr>
-        <w:t xml:space="preserve">WAKEUP_INTERVAL_SECONDS</w:t>
-      </w:r>
-      <w:r>
-        <w:t xml:space="preserve"> </w:t>
-      </w:r>
-      <w:r>
-        <w:t xml:space="preserve">in</w:t>
-      </w:r>
-      <w:r>
-        <w:t xml:space="preserve"> </w:t>
-      </w:r>
-      <w:r>
-        <w:rPr>
-          <w:rStyle w:val="VerbatimChar"/>
-        </w:rPr>
-        <w:t xml:space="preserve">arduino.py</w:t>
-      </w:r>
-      <w:r>
-        <w:t xml:space="preserve">, sent at Initialize). Each record stores seconds elapsed since collection started (from</w:t>
-      </w:r>
-      <w:r>
-        <w:t xml:space="preserve"> </w:t>
-      </w:r>
-      <w:r>
-        <w:rPr>
-          <w:rStyle w:val="VerbatimChar"/>
-        </w:rPr>
-        <w:t xml:space="preserve">millis()</w:t>
-      </w:r>
-      <w:r>
-        <w:t xml:space="preserve">), plus temperature and proximity, in 12 bytes; the app adds the start time.</w:t>
+          <w:iCs/>
+          <w:i/>
+        </w:rPr>
+        <w:t xml:space="preserve">Start time.</w:t>
+      </w:r>
+      <w:r>
+        <w:t xml:space="preserve"> </w:t>
+      </w:r>
+      <w:r>
+        <w:t xml:space="preserve">Elapsed time counts from the power-on that starts collection, while the start time is the one typed into the app at Initialize. Any gap between the two shifts every timestamp by that amount, and nothing in the file shows it. Appendix A.1 describes a fix.</w:t>
       </w:r>
     </w:p>
     <w:p>
       <w:pPr>
         <w:numPr>
-          <w:ilvl w:val="0"/>
+          <w:ilvl w:val="1"/>
           <w:numId w:val="1012"/>
         </w:numPr>
         <w:pStyle w:val="Compact"/>
       </w:pPr>
       <w:r>
         <w:rPr>
-          <w:bCs/>
-          <w:b/>
-        </w:rPr>
-        <w:t xml:space="preserve">Why:</w:t>
-      </w:r>
-      <w:r>
-        <w:t xml:space="preserve"> </w:t>
-      </w:r>
-      <w:r>
-        <w:t xml:space="preserve">The board has no real-time clock, so elapsed time is the simplest reliable record. 5 minutes resolves wear periods well enough for daily totals, and fits a month in flash. The analysis infers the real interval from the timestamps, so the interval can be changed without changing the analysis.</w:t>
+          <w:iCs/>
+          <w:i/>
+        </w:rPr>
+        <w:t xml:space="preserve">Rollover.</w:t>
+      </w:r>
+      <w:r>
+        <w:t xml:space="preserve"> </w:t>
+      </w:r>
+      <w:r>
+        <w:rPr>
+          <w:rStyle w:val="VerbatimChar"/>
+        </w:rPr>
+        <w:t xml:space="preserve">millis()</w:t>
+      </w:r>
+      <w:r>
+        <w:t xml:space="preserve"> </w:t>
+      </w:r>
+      <w:r>
+        <w:t xml:space="preserve">is 32-bit and wraps at about 49.7 days, and the sleep check</w:t>
+      </w:r>
+      <w:r>
+        <w:t xml:space="preserve"> </w:t>
+      </w:r>
+      <w:r>
+        <w:rPr>
+          <w:rStyle w:val="VerbatimChar"/>
+        </w:rPr>
+        <w:t xml:space="preserve">nextWakeTime &gt; currentTime</w:t>
+      </w:r>
+      <w:r>
+        <w:t xml:space="preserve"> </w:t>
+      </w:r>
+      <w:r>
+        <w:t xml:space="preserve">is not wrap-safe: expect a burst of readings, then a long gap. The stored elapsed times stay correct. Fix in Appendix A.3; until then, keep deployments to about a month.</w:t>
       </w:r>
     </w:p>
     <w:p>
       <w:pPr>
         <w:numPr>
-          <w:ilvl w:val="0"/>
+          <w:ilvl w:val="1"/>
           <w:numId w:val="1012"/>
         </w:numPr>
         <w:pStyle w:val="Compact"/>
       </w:pPr>
       <w:r>
         <w:rPr>
-          <w:bCs/>
-          <w:b/>
-        </w:rPr>
-        <w:t xml:space="preserve">Limitations:</w:t>
+          <w:iCs/>
+          <w:i/>
+        </w:rPr>
+        <w:t xml:space="preserve">Clock accuracy.</w:t>
+      </w:r>
+      <w:r>
+        <w:t xml:space="preserve"> </w:t>
+      </w:r>
+      <w:r>
+        <w:t xml:space="preserve">Timestamps rely on the board’s oscillator, with no correction. With the board’s crystal (tens of ppm) the error is about 1–2 minutes a month, well under one interval; while this is not measured directly, it is a commonly known limitation of using onboard crystal (§1.3 step 4).</w:t>
+      </w:r>
+    </w:p>
+    <w:p>
+      <w:pPr>
+        <w:pStyle w:val="CaptionedFigure"/>
+      </w:pPr>
+      <w:r>
+        <w:drawing>
+          <wp:inline>
+            <wp:extent cx="5334000" cy="2570321"/>
+            <wp:effectExtent b="0" l="0" r="0" t="0"/>
+            <wp:docPr descr="Figure 2. One reading, from flash to the downloaded CSV." title="" id="39" name="Picture"/>
+            <a:graphic>
+              <a:graphicData uri="http://schemas.openxmlformats.org/drawingml/2006/picture">
+                <pic:pic>
+                  <pic:nvPicPr>
+                    <pic:cNvPr descr="images/data_row.png" id="40" name="Picture"/>
+                    <pic:cNvPicPr>
+                      <a:picLocks noChangeArrowheads="1" noChangeAspect="1"/>
+                    </pic:cNvPicPr>
+                  </pic:nvPicPr>
+                  <pic:blipFill>
+                    <a:blip r:embed="rId38"/>
+                    <a:stretch>
+                      <a:fillRect/>
+                    </a:stretch>
+                  </pic:blipFill>
+                  <pic:spPr bwMode="auto">
+                    <a:xfrm>
+                      <a:off x="0" y="0"/>
+                      <a:ext cx="5334000" cy="2570321"/>
+                    </a:xfrm>
+                    <a:prstGeom prst="rect">
+                      <a:avLst/>
+                    </a:prstGeom>
+                    <a:noFill/>
+                    <a:ln w="9525">
+                      <a:noFill/>
+                      <a:headEnd/>
+                      <a:tailEnd/>
+                    </a:ln>
+                  </pic:spPr>
+                </pic:pic>
+              </a:graphicData>
+            </a:graphic>
+          </wp:inline>
+        </w:drawing>
+      </w:r>
+    </w:p>
+    <w:p>
+      <w:pPr>
+        <w:pStyle w:val="ImageCaption"/>
+      </w:pPr>
+      <w:r>
+        <w:t xml:space="preserve">Figure 2. One reading, from flash to the downloaded CSV.</w:t>
+      </w:r>
+    </w:p>
+    <w:bookmarkEnd w:id="41"/>
+    <w:bookmarkStart w:id="42" w:name="robust-proximity-reads"/>
+    <w:p>
+      <w:pPr>
+        <w:pStyle w:val="Heading2"/>
+      </w:pPr>
+      <w:r>
+        <w:t xml:space="preserve">4.5 Robust proximity reads</w:t>
       </w:r>
     </w:p>
     <w:p>
       <w:pPr>
         <w:numPr>
-          <w:ilvl w:val="1"/>
+          <w:ilvl w:val="0"/>
           <w:numId w:val="1013"/>
         </w:numPr>
         <w:pStyle w:val="Compact"/>
       </w:pPr>
       <w:r>
         <w:rPr>
-          <w:iCs/>
-          <w:i/>
-        </w:rPr>
-        <w:t xml:space="preserve">Start time.</w:t>
-      </w:r>
-      <w:r>
-        <w:t xml:space="preserve"> </w:t>
-      </w:r>
-      <w:r>
-        <w:t xml:space="preserve">Elapsed time counts from the power-on that starts collection, while the start time is the one typed into the app at Initialize. Any gap between the two shifts every timestamp by that amount, and nothing in the file shows it. Appendix A.1 describes a fix.</w:t>
+          <w:bCs/>
+          <w:b/>
+        </w:rPr>
+        <w:t xml:space="preserve">Design Decision:</w:t>
+      </w:r>
+      <w:r>
+        <w:t xml:space="preserve"> </w:t>
+      </w:r>
+      <w:r>
+        <w:t xml:space="preserve">Discard the first 2 proximity samples after the sensor wakes, and bound every wait with a timeout; a missing sensor logs</w:t>
+      </w:r>
+      <w:r>
+        <w:t xml:space="preserve"> </w:t>
+      </w:r>
+      <w:r>
+        <w:rPr>
+          <w:rStyle w:val="VerbatimChar"/>
+        </w:rPr>
+        <w:t xml:space="preserve">0</w:t>
+      </w:r>
+      <w:r>
+        <w:t xml:space="preserve">.</w:t>
       </w:r>
     </w:p>
     <w:p>
       <w:pPr>
         <w:numPr>
-          <w:ilvl w:val="1"/>
+          <w:ilvl w:val="0"/>
           <w:numId w:val="1013"/>
         </w:numPr>
         <w:pStyle w:val="Compact"/>
       </w:pPr>
       <w:r>
         <w:rPr>
-          <w:iCs/>
-          <w:i/>
-        </w:rPr>
-        <w:t xml:space="preserve">Rollover.</w:t>
+          <w:bCs/>
+          <w:b/>
+        </w:rPr>
+        <w:t xml:space="preserve">Why:</w:t>
+      </w:r>
+      <w:r>
+        <w:t xml:space="preserve"> </w:t>
+      </w:r>
+      <w:r>
+        <w:t xml:space="preserve">The first samples after wake-up are unsettled, and an unbounded wait on a faulty sensor would freeze the logger for the rest of the deployment.</w:t>
+      </w:r>
+    </w:p>
+    <w:bookmarkEnd w:id="42"/>
+    <w:bookmarkEnd w:id="43"/>
+    <w:bookmarkStart w:id="48" w:name="wear-detection-algorithm"/>
+    <w:p>
+      <w:pPr>
+        <w:pStyle w:val="Heading1"/>
+      </w:pPr>
+      <w:r>
+        <w:t xml:space="preserve">5. Wear-detection algorithm</w:t>
+      </w:r>
+    </w:p>
+    <w:p>
+      <w:pPr>
+        <w:pStyle w:val="FirstParagraph"/>
+      </w:pPr>
+      <w:r>
+        <w:t xml:space="preserve">Full parameter table:</w:t>
       </w:r>
       <w:r>
         <w:t xml:space="preserve"> </w:t>
@@ -3921,60 +3637,22 @@
         <w:rPr>
           <w:rStyle w:val="VerbatimChar"/>
         </w:rPr>
-        <w:t xml:space="preserve">millis()</w:t>
-      </w:r>
-      <w:r>
-        <w:t xml:space="preserve"> </w:t>
-      </w:r>
-      <w:r>
-        <w:t xml:space="preserve">is 32-bit and wraps at about 49.7 days, and the sleep check</w:t>
-      </w:r>
-      <w:r>
-        <w:t xml:space="preserve"> </w:t>
-      </w:r>
-      <w:r>
-        <w:rPr>
-          <w:rStyle w:val="VerbatimChar"/>
-        </w:rPr>
-        <w:t xml:space="preserve">nextWakeTime &gt; currentTime</w:t>
-      </w:r>
-      <w:r>
-        <w:t xml:space="preserve"> </w:t>
-      </w:r>
-      <w:r>
-        <w:t xml:space="preserve">is not wrap-safe: expect a burst of readings, then a long gap. The stored elapsed times stay correct. Fix in Appendix A.3; until then, keep deployments to about a month.</w:t>
-      </w:r>
-    </w:p>
-    <w:p>
-      <w:pPr>
-        <w:numPr>
-          <w:ilvl w:val="1"/>
-          <w:numId w:val="1013"/>
-        </w:numPr>
-        <w:pStyle w:val="Compact"/>
-      </w:pPr>
-      <w:r>
-        <w:rPr>
-          <w:iCs/>
-          <w:i/>
-        </w:rPr>
-        <w:t xml:space="preserve">Clock accuracy.</w:t>
-      </w:r>
-      <w:r>
-        <w:t xml:space="preserve"> </w:t>
-      </w:r>
-      <w:r>
-        <w:t xml:space="preserve">Timestamps rely on the board’s oscillator, with no correction. With the board’s crystal (tens of ppm) the error is about 1–2 minutes a month, well under one interval; use over longer periods has shown no visible drift. Not measured directly (§1.4 step 4).</w:t>
-      </w:r>
-    </w:p>
-    <w:bookmarkEnd w:id="40"/>
-    <w:bookmarkStart w:id="41" w:name="robust-proximity-reads"/>
+        <w:t xml:space="preserve">HANDOFF.md</w:t>
+      </w:r>
+      <w:r>
+        <w:t xml:space="preserve"> </w:t>
+      </w:r>
+      <w:r>
+        <w:t xml:space="preserve">§4.</w:t>
+      </w:r>
+    </w:p>
+    <w:bookmarkStart w:id="44" w:name="temperature-above-a-rolling-baseline"/>
     <w:p>
       <w:pPr>
         <w:pStyle w:val="Heading2"/>
       </w:pPr>
       <w:r>
-        <w:t xml:space="preserve">4.5 Robust proximity reads</w:t>
+        <w:t xml:space="preserve">5.1 Temperature above a rolling baseline</w:t>
       </w:r>
     </w:p>
     <w:p>
@@ -3996,19 +3674,7 @@
         <w:t xml:space="preserve"> </w:t>
       </w:r>
       <w:r>
-        <w:t xml:space="preserve">Discard the first 2 proximity samples after the sensor wakes, and bound every wait with a timeout; a missing sensor logs</w:t>
-      </w:r>
-      <w:r>
-        <w:t xml:space="preserve"> </w:t>
-      </w:r>
-      <w:r>
-        <w:rPr>
-          <w:rStyle w:val="VerbatimChar"/>
-        </w:rPr>
-        <w:t xml:space="preserve">0</w:t>
-      </w:r>
-      <w:r>
-        <w:t xml:space="preserve">.</w:t>
+        <w:t xml:space="preserve">Take room temperature as the rolling minimum over about 2 hours, and look at the rise above it (delta). An event starts when the proximity sensor is covered, the temperature has risen over the last ~15 minutes, and either the jump is ≥ 0.8 °C in one sample or the rise is ≥ 3 °C. It ends when the proximity sensor is uncovered, or the temperature is falling fast (≥ 0.4 °C per sample) and is near baseline or below 80 % of the event’s peak rise.</w:t>
       </w:r>
     </w:p>
     <w:p>
@@ -4030,50 +3696,57 @@
         <w:t xml:space="preserve"> </w:t>
       </w:r>
       <w:r>
-        <w:t xml:space="preserve">The first samples after wake-up are unsettled, and an unbounded wait on a faulty sensor would freeze the logger for the rest of the deployment.</w:t>
-      </w:r>
-    </w:p>
-    <w:bookmarkEnd w:id="41"/>
-    <w:bookmarkEnd w:id="42"/>
-    <w:bookmarkStart w:id="47" w:name="wear-detection-algorithm-app"/>
-    <w:p>
-      <w:pPr>
-        <w:pStyle w:val="Heading1"/>
-      </w:pPr>
-      <w:r>
-        <w:t xml:space="preserve">5. Wear-detection algorithm (app)</w:t>
-      </w:r>
-    </w:p>
-    <w:p>
-      <w:pPr>
-        <w:pStyle w:val="FirstParagraph"/>
-      </w:pPr>
-      <w:r>
-        <w:t xml:space="preserve">Full parameter table:</w:t>
-      </w:r>
-      <w:r>
-        <w:t xml:space="preserve"> </w:t>
-      </w:r>
-      <w:r>
-        <w:rPr>
-          <w:rStyle w:val="VerbatimChar"/>
-        </w:rPr>
-        <w:t xml:space="preserve">HANDOFF.md</w:t>
-      </w:r>
-      <w:r>
-        <w:t xml:space="preserve"> </w:t>
-      </w:r>
-      <w:r>
-        <w:t xml:space="preserve">§4.</w:t>
-      </w:r>
-    </w:p>
-    <w:bookmarkStart w:id="43" w:name="temperature-above-a-rolling-baseline"/>
+        <w:t xml:space="preserve">Room temperature changes over the day, so a fixed threshold would fail; the rolling minimum follows it. The 15-minute trend check stops cooling slopes from triggering false onsets.</w:t>
+      </w:r>
+    </w:p>
+    <w:p>
+      <w:pPr>
+        <w:numPr>
+          <w:ilvl w:val="0"/>
+          <w:numId w:val="1014"/>
+        </w:numPr>
+        <w:pStyle w:val="Compact"/>
+      </w:pPr>
+      <w:r>
+        <w:rPr>
+          <w:bCs/>
+          <w:b/>
+        </w:rPr>
+        <w:t xml:space="preserve">Limitation:</w:t>
+      </w:r>
+      <w:r>
+        <w:t xml:space="preserve"> </w:t>
+      </w:r>
+      <w:r>
+        <w:t xml:space="preserve">After about an hour of continuous wear the 2-hour window holds only</w:t>
+      </w:r>
+      <w:r>
+        <w:t xml:space="preserve"> </w:t>
+      </w:r>
+      <w:r>
+        <w:t xml:space="preserve">“</w:t>
+      </w:r>
+      <w:r>
+        <w:t xml:space="preserve">worn</w:t>
+      </w:r>
+      <w:r>
+        <w:t xml:space="preserve">”</w:t>
+      </w:r>
+      <w:r>
+        <w:t xml:space="preserve"> </w:t>
+      </w:r>
+      <w:r>
+        <w:t xml:space="preserve">samples, so the baseline rises to skin temperature and delta falls to about 0. From then on, a single drop of 0.4 °C between samples ends the event, and it cannot restart (that needs delta ≥ 3 °C or a jump ≥ 0.8 °C). On synthetic 8-hour overnight wear, noise with a standard deviation of 0.15 °C split the nights into short pieces; with 0.04 °C they were detected whole. Possible fixes are in Appendix B.2.</w:t>
+      </w:r>
+    </w:p>
+    <w:bookmarkEnd w:id="44"/>
+    <w:bookmarkStart w:id="45" w:name="proximity-as-a-gate"/>
     <w:p>
       <w:pPr>
         <w:pStyle w:val="Heading2"/>
       </w:pPr>
       <w:r>
-        <w:t xml:space="preserve">5.1 Temperature above a rolling baseline</w:t>
+        <w:t xml:space="preserve">5.2 Proximity as a gate</w:t>
       </w:r>
     </w:p>
     <w:p>
@@ -4095,7 +3768,22 @@
         <w:t xml:space="preserve"> </w:t>
       </w:r>
       <w:r>
-        <w:t xml:space="preserve">Take room temperature as the rolling minimum over about 2 hours, and look at the rise above it (delta). An event starts when the sensor is covered, the temperature has risen over the last ~15 minutes, and either the jump is ≥ 0.8 °C in one sample or the rise is ≥ 3 °C. It ends when the sensor is uncovered, or the temperature is falling fast (≥ 0.4 °C per sample) and is near baseline or below 80 % of the event’s peak rise.</w:t>
+        <w:t xml:space="preserve">Use the proximity sensor only to confirm</w:t>
+      </w:r>
+      <w:r>
+        <w:t xml:space="preserve"> </w:t>
+      </w:r>
+      <w:r>
+        <w:t xml:space="preserve">“</w:t>
+      </w:r>
+      <w:r>
+        <w:t xml:space="preserve">covered</w:t>
+      </w:r>
+      <w:r>
+        <w:t xml:space="preserve">”</w:t>
+      </w:r>
+      <w:r>
+        <w:t xml:space="preserve">, not to detect wear on its own.</w:t>
       </w:r>
     </w:p>
     <w:p>
@@ -4117,29 +3805,17 @@
         <w:t xml:space="preserve"> </w:t>
       </w:r>
       <w:r>
-        <w:t xml:space="preserve">Room temperature changes over the day, so a fixed threshold would fail; the rolling minimum follows it. The 15-minute trend check stops cooling slopes from triggering false onsets.</w:t>
-      </w:r>
-    </w:p>
-    <w:p>
-      <w:pPr>
-        <w:numPr>
-          <w:ilvl w:val="0"/>
-          <w:numId w:val="1015"/>
-        </w:numPr>
-        <w:pStyle w:val="Compact"/>
-      </w:pPr>
-      <w:r>
-        <w:rPr>
-          <w:bCs/>
-          <w:b/>
-        </w:rPr>
-        <w:t xml:space="preserve">Limitation:</w:t>
-      </w:r>
-      <w:r>
-        <w:t xml:space="preserve"> </w:t>
-      </w:r>
-      <w:r>
-        <w:t xml:space="preserve">After about an hour of continuous wear the 2-hour window holds only</w:t>
+        <w:t xml:space="preserve">Temperature alone can’t tell wear from a warm environment (e.g. the splint left on a radiator or in the sun); the covered sensor rules those out.</w:t>
+      </w:r>
+    </w:p>
+    <w:bookmarkEnd w:id="45"/>
+    <w:bookmarkStart w:id="46" w:name="drift-invariant-covered"/>
+    <w:p>
+      <w:pPr>
+        <w:pStyle w:val="Heading2"/>
+      </w:pPr>
+      <w:r>
+        <w:t xml:space="preserve">5.3 Drift-invariant</w:t>
       </w:r>
       <w:r>
         <w:t xml:space="preserve"> </w:t>
@@ -4148,26 +3824,10 @@
         <w:t xml:space="preserve">“</w:t>
       </w:r>
       <w:r>
-        <w:t xml:space="preserve">worn</w:t>
+        <w:t xml:space="preserve">covered</w:t>
       </w:r>
       <w:r>
         <w:t xml:space="preserve">”</w:t>
-      </w:r>
-      <w:r>
-        <w:t xml:space="preserve"> </w:t>
-      </w:r>
-      <w:r>
-        <w:t xml:space="preserve">samples, so the baseline rises to skin temperature and delta falls to about 0. From then on, a single drop of 0.4 °C between samples ends the event, and it cannot restart (that needs delta ≥ 3 °C or a jump ≥ 0.8 °C). On synthetic 8-hour overnight wear, noise with a standard deviation of 0.15 °C split the nights into short pieces; with 0.04 °C they were detected whole. Possible fixes are in Appendix B.2.</w:t>
-      </w:r>
-    </w:p>
-    <w:bookmarkEnd w:id="43"/>
-    <w:bookmarkStart w:id="44" w:name="proximity-as-a-gate"/>
-    <w:p>
-      <w:pPr>
-        <w:pStyle w:val="Heading2"/>
-      </w:pPr>
-      <w:r>
-        <w:t xml:space="preserve">5.2 Proximity as a gate</w:t>
       </w:r>
     </w:p>
     <w:p>
@@ -4189,22 +3849,16 @@
         <w:t xml:space="preserve"> </w:t>
       </w:r>
       <w:r>
-        <w:t xml:space="preserve">Use the proximity sensor only to confirm</w:t>
-      </w:r>
-      <w:r>
-        <w:t xml:space="preserve"> </w:t>
-      </w:r>
-      <w:r>
-        <w:t xml:space="preserve">“</w:t>
-      </w:r>
-      <w:r>
-        <w:t xml:space="preserve">covered</w:t>
-      </w:r>
-      <w:r>
-        <w:t xml:space="preserve">”</w:t>
-      </w:r>
-      <w:r>
-        <w:t xml:space="preserve">, not to detect wear on its own.</w:t>
+        <w:t xml:space="preserve">Track the proximity floor as the rolling 10th percentile over about a day, subtract it, and call the sensor covered when the remainder is within the noise (</w:t>
+      </w:r>
+      <w:r>
+        <w:rPr>
+          <w:rStyle w:val="VerbatimChar"/>
+        </w:rPr>
+        <w:t xml:space="preserve">max(5, 4 × MAD)</w:t>
+      </w:r>
+      <w:r>
+        <w:t xml:space="preserve">, where MAD is the median absolute deviation).</w:t>
       </w:r>
     </w:p>
     <w:p>
@@ -4226,29 +3880,45 @@
         <w:t xml:space="preserve"> </w:t>
       </w:r>
       <w:r>
-        <w:t xml:space="preserve">Temperature alone can’t tell wear from a warm environment (e.g. the splint left on a radiator or in the sun); the covered sensor rules those out.</w:t>
-      </w:r>
-    </w:p>
-    <w:bookmarkEnd w:id="44"/>
-    <w:bookmarkStart w:id="45" w:name="drift-invariant-covered"/>
+        <w:t xml:space="preserve">On a 35-day recording the proximity reading while worn crept from 0 into the 50s as the battery discharged. The original test (</w:t>
+      </w:r>
+      <w:r>
+        <w:rPr>
+          <w:rStyle w:val="VerbatimChar"/>
+        </w:rPr>
+        <w:t xml:space="preserve">prox == 0</w:t>
+      </w:r>
+      <w:r>
+        <w:t xml:space="preserve">) stopped working after about 11 days, and wear was missed from then on.</w:t>
+      </w:r>
+    </w:p>
+    <w:bookmarkEnd w:id="46"/>
+    <w:bookmarkStart w:id="47" w:name="thresholds-are-empirical"/>
     <w:p>
       <w:pPr>
         <w:pStyle w:val="Heading2"/>
       </w:pPr>
       <w:r>
-        <w:t xml:space="preserve">5.3 Drift-invariant</w:t>
-      </w:r>
-      <w:r>
-        <w:t xml:space="preserve"> </w:t>
-      </w:r>
-      <w:r>
-        <w:t xml:space="preserve">“</w:t>
-      </w:r>
-      <w:r>
-        <w:t xml:space="preserve">covered</w:t>
-      </w:r>
-      <w:r>
-        <w:t xml:space="preserve">”</w:t>
+        <w:t xml:space="preserve">5.4 Thresholds are empirical</w:t>
+      </w:r>
+    </w:p>
+    <w:p>
+      <w:pPr>
+        <w:pStyle w:val="FirstParagraph"/>
+      </w:pPr>
+      <w:r>
+        <w:t xml:space="preserve">All thresholds were set by inspecting a small number of recordings. A finer tuning may be required based on the larger sample data. Appendix B describes further on how.</w:t>
+      </w:r>
+    </w:p>
+    <w:bookmarkEnd w:id="47"/>
+    <w:bookmarkEnd w:id="48"/>
+    <w:bookmarkStart w:id="49" w:name="time-handling"/>
+    <w:p>
+      <w:pPr>
+        <w:pStyle w:val="Heading1"/>
+      </w:pPr>
+      <w:r>
+        <w:t xml:space="preserve">6. Time handling</w:t>
       </w:r>
     </w:p>
     <w:p>
@@ -4270,13 +3940,29 @@
         <w:t xml:space="preserve"> </w:t>
       </w:r>
       <w:r>
-        <w:t xml:space="preserve">Track the proximity floor as the rolling 10th percentile over about a day, subtract it, and call the sensor covered when the remainder is within the noise (</w:t>
+        <w:t xml:space="preserve">The logger knows only UTC epoch seconds. The app asks for and shows</w:t>
+      </w:r>
+      <w:r>
+        <w:t xml:space="preserve"> </w:t>
+      </w:r>
+      <w:r>
+        <w:rPr>
+          <w:bCs/>
+          <w:b/>
+        </w:rPr>
+        <w:t xml:space="preserve">Eastern time</w:t>
+      </w:r>
+      <w:r>
+        <w:t xml:space="preserve"> </w:t>
+      </w:r>
+      <w:r>
+        <w:t xml:space="preserve">(America/New_York, daylight-saving aware) everywhere, and writes timestamps with their UTC offset (e.g. </w:t>
       </w:r>
       <w:r>
         <w:rPr>
           <w:rStyle w:val="VerbatimChar"/>
         </w:rPr>
-        <w:t xml:space="preserve">max(5, 4 × MAD)</w:t>
+        <w:t xml:space="preserve">-04:00</w:t>
       </w:r>
       <w:r>
         <w:t xml:space="preserve">).</w:t>
@@ -4301,45 +3987,73 @@
         <w:t xml:space="preserve"> </w:t>
       </w:r>
       <w:r>
-        <w:t xml:space="preserve">On a 35-day recording the proximity reading while worn crept from 0 into the 50s as the battery discharged. The original test (</w:t>
+        <w:t xml:space="preserve">The study runs in Ontario. The offset keeps the repeated hour at the November change unambiguous, and durations across the change come out right.</w:t>
+      </w:r>
+    </w:p>
+    <w:p>
+      <w:pPr>
+        <w:numPr>
+          <w:ilvl w:val="0"/>
+          <w:numId w:val="1017"/>
+        </w:numPr>
+        <w:pStyle w:val="Compact"/>
+      </w:pPr>
+      <w:r>
+        <w:rPr>
+          <w:bCs/>
+          <w:b/>
+        </w:rPr>
+        <w:t xml:space="preserve">Recovery:</w:t>
+      </w:r>
+      <w:r>
+        <w:t xml:space="preserve"> </w:t>
+      </w:r>
+      <w:r>
+        <w:t xml:space="preserve">If a logger loses its start time, the elapsed times survive. The app detects such files and rebuilds the timestamps from a start time the user enters, during download or on the Data Analysis page.</w:t>
+      </w:r>
+    </w:p>
+    <w:p>
+      <w:pPr>
+        <w:numPr>
+          <w:ilvl w:val="0"/>
+          <w:numId w:val="1017"/>
+        </w:numPr>
+        <w:pStyle w:val="Compact"/>
+      </w:pPr>
+      <w:r>
+        <w:rPr>
+          <w:bCs/>
+          <w:b/>
+        </w:rPr>
+        <w:t xml:space="preserve">To change the zone:</w:t>
+      </w:r>
+      <w:r>
+        <w:t xml:space="preserve"> </w:t>
+      </w:r>
+      <w:r>
+        <w:t xml:space="preserve">edit</w:t>
+      </w:r>
+      <w:r>
+        <w:t xml:space="preserve"> </w:t>
       </w:r>
       <w:r>
         <w:rPr>
           <w:rStyle w:val="VerbatimChar"/>
         </w:rPr>
-        <w:t xml:space="preserve">prox == 0</w:t>
-      </w:r>
-      <w:r>
-        <w:t xml:space="preserve">) stopped working after about 11 days, and wear was missed from then on.</w:t>
-      </w:r>
-    </w:p>
-    <w:bookmarkEnd w:id="45"/>
-    <w:bookmarkStart w:id="46" w:name="thresholds-are-empirical"/>
-    <w:p>
-      <w:pPr>
-        <w:pStyle w:val="Heading2"/>
-      </w:pPr>
-      <w:r>
-        <w:t xml:space="preserve">5.4 Thresholds are empirical</w:t>
-      </w:r>
-    </w:p>
-    <w:p>
-      <w:pPr>
-        <w:pStyle w:val="FirstParagraph"/>
-      </w:pPr>
-      <w:r>
-        <w:t xml:space="preserve">All thresholds were set by inspecting a small number of recordings. There is no ground truth yet; Appendix B describes how to get one.</w:t>
-      </w:r>
-    </w:p>
-    <w:bookmarkEnd w:id="46"/>
-    <w:bookmarkEnd w:id="47"/>
-    <w:bookmarkStart w:id="48" w:name="time-handling"/>
+        <w:t xml:space="preserve">timezone_config.py</w:t>
+      </w:r>
+      <w:r>
+        <w:t xml:space="preserve">.</w:t>
+      </w:r>
+    </w:p>
+    <w:bookmarkEnd w:id="49"/>
+    <w:bookmarkStart w:id="50" w:name="desktop-application"/>
     <w:p>
       <w:pPr>
         <w:pStyle w:val="Heading1"/>
       </w:pPr>
       <w:r>
-        <w:t xml:space="preserve">6. Time handling</w:t>
+        <w:t xml:space="preserve">7. Desktop application</w:t>
       </w:r>
     </w:p>
     <w:p>
@@ -4355,38 +4069,28 @@
           <w:bCs/>
           <w:b/>
         </w:rPr>
-        <w:t xml:space="preserve">Design Decision:</w:t>
-      </w:r>
-      <w:r>
-        <w:t xml:space="preserve"> </w:t>
-      </w:r>
-      <w:r>
-        <w:t xml:space="preserve">The logger knows only UTC epoch seconds. The app asks for and shows</w:t>
-      </w:r>
-      <w:r>
-        <w:t xml:space="preserve"> </w:t>
-      </w:r>
-      <w:r>
-        <w:rPr>
-          <w:bCs/>
-          <w:b/>
-        </w:rPr>
-        <w:t xml:space="preserve">Eastern time</w:t>
-      </w:r>
-      <w:r>
-        <w:t xml:space="preserve"> </w:t>
-      </w:r>
-      <w:r>
-        <w:t xml:space="preserve">(America/New_York, daylight-saving aware) everywhere, and writes timestamps with their UTC offset (e.g. </w:t>
+        <w:t xml:space="preserve">Browser-based interface (Dash + Flask-SocketIO).</w:t>
+      </w:r>
+      <w:r>
+        <w:t xml:space="preserve"> </w:t>
+      </w:r>
+      <w:r>
+        <w:t xml:space="preserve">Plotly/Dash provide the charts and tables; the app runs a local server on</w:t>
+      </w:r>
+      <w:r>
+        <w:t xml:space="preserve"> </w:t>
       </w:r>
       <w:r>
         <w:rPr>
           <w:rStyle w:val="VerbatimChar"/>
         </w:rPr>
-        <w:t xml:space="preserve">-04:00</w:t>
-      </w:r>
-      <w:r>
-        <w:t xml:space="preserve">).</w:t>
+        <w:t xml:space="preserve">127.0.0.1:8050</w:t>
+      </w:r>
+      <w:r>
+        <w:t xml:space="preserve"> </w:t>
+      </w:r>
+      <w:r>
+        <w:t xml:space="preserve">and opens the browser.</w:t>
       </w:r>
     </w:p>
     <w:p>
@@ -4402,13 +4106,13 @@
           <w:bCs/>
           <w:b/>
         </w:rPr>
-        <w:t xml:space="preserve">Why:</w:t>
-      </w:r>
-      <w:r>
-        <w:t xml:space="preserve"> </w:t>
-      </w:r>
-      <w:r>
-        <w:t xml:space="preserve">The study runs in Ontario. The offset keeps the repeated hour at the November change unambiguous, and durations across the change come out right. Plotly is given wall-clock times so the charts show Eastern time whatever the browser’s own time zone.</w:t>
+        <w:t xml:space="preserve">Heartbeat shutdown.</w:t>
+      </w:r>
+      <w:r>
+        <w:t xml:space="preserve"> </w:t>
+      </w:r>
+      <w:r>
+        <w:t xml:space="preserve">The page sends a heartbeat every 5 s. With none for 5 minutes, the server warns the page and exits, so closing the tab doesn’t leave a hidden server holding the serial port for data privacy.</w:t>
       </w:r>
     </w:p>
     <w:p>
@@ -4424,13 +4128,13 @@
           <w:bCs/>
           <w:b/>
         </w:rPr>
-        <w:t xml:space="preserve">Recovery:</w:t>
-      </w:r>
-      <w:r>
-        <w:t xml:space="preserve"> </w:t>
-      </w:r>
-      <w:r>
-        <w:t xml:space="preserve">If a logger loses its start time, the elapsed times survive. The app detects such files and rebuilds the timestamps from a start time the user enters, during download or on the Data Analysis page.</w:t>
+        <w:t xml:space="preserve">Works offline.</w:t>
+      </w:r>
+      <w:r>
+        <w:t xml:space="preserve"> </w:t>
+      </w:r>
+      <w:r>
+        <w:t xml:space="preserve">All required assets are packaged, allowing the application to be usable in offline conditions as well.</w:t>
       </w:r>
     </w:p>
     <w:p>
@@ -4446,13 +4150,13 @@
           <w:bCs/>
           <w:b/>
         </w:rPr>
-        <w:t xml:space="preserve">To change the zone:</w:t>
-      </w:r>
-      <w:r>
-        <w:t xml:space="preserve"> </w:t>
-      </w:r>
-      <w:r>
-        <w:t xml:space="preserve">edit</w:t>
+        <w:t xml:space="preserve">Automated releases.</w:t>
+      </w:r>
+      <w:r>
+        <w:t xml:space="preserve"> </w:t>
+      </w:r>
+      <w:r>
+        <w:t xml:space="preserve">GitHub Actions builds stand-alone Windows and macOS programs on each</w:t>
       </w:r>
       <w:r>
         <w:t xml:space="preserve"> </w:t>
@@ -4461,27 +4165,20 @@
         <w:rPr>
           <w:rStyle w:val="VerbatimChar"/>
         </w:rPr>
-        <w:t xml:space="preserve">timezone_config.py</w:t>
-      </w:r>
-      <w:r>
-        <w:t xml:space="preserve">.</w:t>
-      </w:r>
-    </w:p>
-    <w:bookmarkEnd w:id="48"/>
-    <w:bookmarkStart w:id="49" w:name="desktop-app"/>
-    <w:p>
-      <w:pPr>
-        <w:pStyle w:val="Heading1"/>
-      </w:pPr>
-      <w:r>
-        <w:t xml:space="preserve">7. Desktop app</w:t>
+        <w:t xml:space="preserve">v*</w:t>
+      </w:r>
+      <w:r>
+        <w:t xml:space="preserve"> </w:t>
+      </w:r>
+      <w:r>
+        <w:t xml:space="preserve">tag, with Python included, so staff need no Python (SOP Appendix B).</w:t>
       </w:r>
     </w:p>
     <w:p>
       <w:pPr>
         <w:numPr>
           <w:ilvl w:val="0"/>
-          <w:numId w:val="1019"/>
+          <w:numId w:val="1018"/>
         </w:numPr>
         <w:pStyle w:val="Compact"/>
       </w:pPr>
@@ -4490,13 +4187,13 @@
           <w:bCs/>
           <w:b/>
         </w:rPr>
-        <w:t xml:space="preserve">Browser-based interface (Dash + Flask-SocketIO).</w:t>
-      </w:r>
-      <w:r>
-        <w:t xml:space="preserve"> </w:t>
-      </w:r>
-      <w:r>
-        <w:t xml:space="preserve">Plotly/Dash provide the charts and tables; the app runs a local server on</w:t>
+        <w:t xml:space="preserve">Participant IDs.</w:t>
+      </w:r>
+      <w:r>
+        <w:t xml:space="preserve"> </w:t>
+      </w:r>
+      <w:r>
+        <w:t xml:space="preserve">Letters, digits,</w:t>
       </w:r>
       <w:r>
         <w:t xml:space="preserve"> </w:t>
@@ -4505,57 +4202,13 @@
         <w:rPr>
           <w:rStyle w:val="VerbatimChar"/>
         </w:rPr>
-        <w:t xml:space="preserve">127.0.0.1:8050</w:t>
-      </w:r>
-      <w:r>
-        <w:t xml:space="preserve"> </w:t>
-      </w:r>
-      <w:r>
-        <w:t xml:space="preserve">and opens the browser.</w:t>
-      </w:r>
-    </w:p>
-    <w:p>
-      <w:pPr>
-        <w:numPr>
-          <w:ilvl w:val="0"/>
-          <w:numId w:val="1019"/>
-        </w:numPr>
-        <w:pStyle w:val="Compact"/>
-      </w:pPr>
-      <w:r>
-        <w:rPr>
-          <w:bCs/>
-          <w:b/>
-        </w:rPr>
-        <w:t xml:space="preserve">Heartbeat shutdown.</w:t>
-      </w:r>
-      <w:r>
-        <w:t xml:space="preserve"> </w:t>
-      </w:r>
-      <w:r>
-        <w:t xml:space="preserve">The page sends a heartbeat every 5 s. With none for 5 minutes, the server warns the page and exits, so closing the tab doesn’t leave a hidden server holding the serial port.</w:t>
-      </w:r>
-    </w:p>
-    <w:p>
-      <w:pPr>
-        <w:numPr>
-          <w:ilvl w:val="0"/>
-          <w:numId w:val="1019"/>
-        </w:numPr>
-        <w:pStyle w:val="Compact"/>
-      </w:pPr>
-      <w:r>
-        <w:rPr>
-          <w:bCs/>
-          <w:b/>
-        </w:rPr>
-        <w:t xml:space="preserve">Works offline.</w:t>
-      </w:r>
-      <w:r>
-        <w:t xml:space="preserve"> </w:t>
-      </w:r>
-      <w:r>
-        <w:t xml:space="preserve">Fonts, theme and icons are bundled under</w:t>
+        <w:t xml:space="preserve">-</w:t>
+      </w:r>
+      <w:r>
+        <w:t xml:space="preserve"> </w:t>
+      </w:r>
+      <w:r>
+        <w:t xml:space="preserve">and</w:t>
       </w:r>
       <w:r>
         <w:t xml:space="preserve"> </w:t>
@@ -4564,103 +4217,14 @@
         <w:rPr>
           <w:rStyle w:val="VerbatimChar"/>
         </w:rPr>
-        <w:t xml:space="preserve">assets/vendor/</w:t>
-      </w:r>
-      <w:r>
-        <w:t xml:space="preserve"> </w:t>
-      </w:r>
-      <w:r>
-        <w:t xml:space="preserve">instead of loaded from the internet, because clinic computers may have no connection.</w:t>
-      </w:r>
-    </w:p>
-    <w:p>
-      <w:pPr>
-        <w:numPr>
-          <w:ilvl w:val="0"/>
-          <w:numId w:val="1019"/>
-        </w:numPr>
-        <w:pStyle w:val="Compact"/>
-      </w:pPr>
-      <w:r>
-        <w:rPr>
-          <w:bCs/>
-          <w:b/>
-        </w:rPr>
-        <w:t xml:space="preserve">Automated releases.</w:t>
-      </w:r>
-      <w:r>
-        <w:t xml:space="preserve"> </w:t>
-      </w:r>
-      <w:r>
-        <w:t xml:space="preserve">GitHub Actions builds stand-alone Windows and macOS programs on each</w:t>
-      </w:r>
-      <w:r>
-        <w:t xml:space="preserve"> </w:t>
-      </w:r>
-      <w:r>
-        <w:rPr>
-          <w:rStyle w:val="VerbatimChar"/>
-        </w:rPr>
-        <w:t xml:space="preserve">v*</w:t>
-      </w:r>
-      <w:r>
-        <w:t xml:space="preserve"> </w:t>
-      </w:r>
-      <w:r>
-        <w:t xml:space="preserve">tag, with Python included, so staff need no Python (SOP Appendix B).</w:t>
-      </w:r>
-    </w:p>
-    <w:p>
-      <w:pPr>
-        <w:numPr>
-          <w:ilvl w:val="0"/>
-          <w:numId w:val="1019"/>
-        </w:numPr>
-        <w:pStyle w:val="Compact"/>
-      </w:pPr>
-      <w:r>
-        <w:rPr>
-          <w:bCs/>
-          <w:b/>
-        </w:rPr>
-        <w:t xml:space="preserve">Participant IDs.</w:t>
-      </w:r>
-      <w:r>
-        <w:t xml:space="preserve"> </w:t>
-      </w:r>
-      <w:r>
-        <w:t xml:space="preserve">Letters, digits,</w:t>
-      </w:r>
-      <w:r>
-        <w:t xml:space="preserve"> </w:t>
-      </w:r>
-      <w:r>
-        <w:rPr>
-          <w:rStyle w:val="VerbatimChar"/>
-        </w:rPr>
-        <w:t xml:space="preserve">-</w:t>
-      </w:r>
-      <w:r>
-        <w:t xml:space="preserve"> </w:t>
-      </w:r>
-      <w:r>
-        <w:t xml:space="preserve">and</w:t>
-      </w:r>
-      <w:r>
-        <w:t xml:space="preserve"> </w:t>
-      </w:r>
-      <w:r>
-        <w:rPr>
-          <w:rStyle w:val="VerbatimChar"/>
-        </w:rPr>
         <w:t xml:space="preserve">_</w:t>
       </w:r>
       <w:r>
         <w:t xml:space="preserve">, up to 15 characters: they go into the CSV header and often into file names, where commas or spaces would cause trouble.</w:t>
       </w:r>
     </w:p>
-    <w:bookmarkEnd w:id="49"/>
-    <w:bookmarkStart w:id="50" w:name="testing-and-validation-to-date"/>
+    <w:bookmarkEnd w:id="50"/>
+    <w:bookmarkStart w:id="51" w:name="testing-and-validation-to-date"/>
     <w:p>
       <w:pPr>
         <w:pStyle w:val="Heading1"/>
@@ -4756,7 +4320,7 @@
               <w:rPr>
                 <w:sz w:val="19"/>
               </w:rPr>
-              <w:t xml:space="preserve">Recordings up to ~36 days collected and analysed</w:t>
+              <w:t xml:space="preserve">Recordings up to ~36 days collected and analyzed</w:t>
             </w:r>
           </w:p>
         </w:tc>
@@ -4857,48 +4421,100 @@
           </w:p>
         </w:tc>
       </w:tr>
+    </w:tbl>
+    <w:bookmarkEnd w:id="51"/>
+    <w:bookmarkStart w:id="52" w:name="next-steps"/>
+    <w:p>
+      <w:pPr>
+        <w:pStyle w:val="Heading1"/>
+      </w:pPr>
+      <w:r>
+        <w:t xml:space="preserve">9. Next steps</w:t>
+      </w:r>
+    </w:p>
+    <w:p>
+      <w:pPr>
+        <w:pStyle w:val="FirstParagraph"/>
+      </w:pPr>
+      <w:r>
+        <w:t xml:space="preserve">What still needs testing, and the changes that should come next. §1.3 gives the recommended order.</w:t>
+      </w:r>
+    </w:p>
+    <w:tbl>
+      <w:tblPr>
+        <w:tblStyle w:val="Table"/>
+        <w:tblW w:type="pct" w:w="5000"/>
+        <w:tblLook w:firstRow="1" w:lastRow="0" w:firstColumn="0" w:lastColumn="0" w:noHBand="0" w:noVBand="0" w:val="0020"/>
+        <w:jc w:val="start"/>
+        <w:tblBorders>
+          <w:top w:val="single" w:sz="4" w:space="0" w:color="BFBFBF"/>
+          <w:left w:val="single" w:sz="4" w:space="0" w:color="BFBFBF"/>
+          <w:bottom w:val="single" w:sz="4" w:space="0" w:color="BFBFBF"/>
+          <w:right w:val="single" w:sz="4" w:space="0" w:color="BFBFBF"/>
+          <w:insideH w:val="single" w:sz="4" w:space="0" w:color="BFBFBF"/>
+          <w:insideV w:val="single" w:sz="4" w:space="0" w:color="BFBFBF"/>
+        </w:tblBorders>
+      </w:tblPr>
+      <w:tblGrid>
+        <w:gridCol w:w="2184"/>
+        <w:gridCol w:w="2184"/>
+        <w:gridCol w:w="3550"/>
+      </w:tblGrid>
       <w:tr>
-        <w:tc>
-          <w:tcPr/>
-          <w:p>
-            <w:pPr>
-              <w:pStyle w:val="Compact"/>
-              <w:jc w:val="left"/>
-            </w:pPr>
-            <w:r>
-              <w:rPr>
-                <w:sz w:val="19"/>
-              </w:rPr>
-              <w:t xml:space="preserve">Battery life</w:t>
-            </w:r>
-          </w:p>
-        </w:tc>
-        <w:tc>
-          <w:tcPr/>
-          <w:p>
-            <w:pPr>
-              <w:pStyle w:val="Compact"/>
-              <w:jc w:val="left"/>
-            </w:pPr>
-            <w:r>
-              <w:rPr>
-                <w:bCs/>
+        <w:trPr>
+          <w:tblHeader w:val="true"/>
+        </w:trPr>
+        <w:tc>
+          <w:tcPr>
+            <w:shd w:val="clear" w:color="auto" w:fill="DCE6F1"/>
+          </w:tcPr>
+          <w:p>
+            <w:pPr>
+              <w:pStyle w:val="Compact"/>
+              <w:jc w:val="left"/>
+            </w:pPr>
+            <w:r>
+              <w:rPr>
                 <w:b/>
                 <w:sz w:val="19"/>
               </w:rPr>
-              <w:t xml:space="preserve">Not measured</w:t>
-            </w:r>
-            <w:r>
-              <w:rPr>
-                <w:sz w:val="19"/>
-              </w:rPr>
-              <w:t xml:space="preserve"> </w:t>
-            </w:r>
-            <w:r>
-              <w:rPr>
-                <w:sz w:val="19"/>
-              </w:rPr>
-              <w:t xml:space="preserve">(§1.2)</w:t>
+              <w:t xml:space="preserve">Item</w:t>
+            </w:r>
+          </w:p>
+        </w:tc>
+        <w:tc>
+          <w:tcPr>
+            <w:shd w:val="clear" w:color="auto" w:fill="DCE6F1"/>
+          </w:tcPr>
+          <w:p>
+            <w:pPr>
+              <w:pStyle w:val="Compact"/>
+              <w:jc w:val="left"/>
+            </w:pPr>
+            <w:r>
+              <w:rPr>
+                <w:b/>
+                <w:sz w:val="19"/>
+              </w:rPr>
+              <w:t xml:space="preserve">Status</w:t>
+            </w:r>
+          </w:p>
+        </w:tc>
+        <w:tc>
+          <w:tcPr>
+            <w:shd w:val="clear" w:color="auto" w:fill="DCE6F1"/>
+          </w:tcPr>
+          <w:p>
+            <w:pPr>
+              <w:pStyle w:val="Compact"/>
+              <w:jc w:val="left"/>
+            </w:pPr>
+            <w:r>
+              <w:rPr>
+                <w:b/>
+                <w:sz w:val="19"/>
+              </w:rPr>
+              <w:t xml:space="preserve">What to do</w:t>
             </w:r>
           </w:p>
         </w:tc>
@@ -4915,30 +4531,37 @@
               <w:rPr>
                 <w:sz w:val="19"/>
               </w:rPr>
-              <w:t xml:space="preserve">Storage bound (~52 d)</w:t>
-            </w:r>
-          </w:p>
-        </w:tc>
-        <w:tc>
-          <w:tcPr/>
-          <w:p>
-            <w:pPr>
-              <w:pStyle w:val="Compact"/>
-              <w:jc w:val="left"/>
-            </w:pPr>
-            <w:r>
-              <w:rPr>
-                <w:bCs/>
-                <w:b/>
-                <w:sz w:val="19"/>
-              </w:rPr>
-              <w:t xml:space="preserve">Predicted from code</w:t>
-            </w:r>
-            <w:r>
-              <w:rPr>
-                <w:sz w:val="19"/>
-              </w:rPr>
-              <w:t xml:space="preserve">, not bench-tested (§1.2)</w:t>
+              <w:t xml:space="preserve">Battery life</w:t>
+            </w:r>
+          </w:p>
+        </w:tc>
+        <w:tc>
+          <w:tcPr/>
+          <w:p>
+            <w:pPr>
+              <w:pStyle w:val="Compact"/>
+              <w:jc w:val="left"/>
+            </w:pPr>
+            <w:r>
+              <w:rPr>
+                <w:sz w:val="19"/>
+              </w:rPr>
+              <w:t xml:space="preserve">Not measured</w:t>
+            </w:r>
+          </w:p>
+        </w:tc>
+        <w:tc>
+          <w:tcPr/>
+          <w:p>
+            <w:pPr>
+              <w:pStyle w:val="Compact"/>
+              <w:jc w:val="left"/>
+            </w:pPr>
+            <w:r>
+              <w:rPr>
+                <w:sz w:val="19"/>
+              </w:rPr>
+              <w:t xml:space="preserve">One logger on the bench for a full month or until the battery dies (§1.3)</w:t>
             </w:r>
           </w:p>
         </w:tc>
@@ -4955,36 +4578,37 @@
               <w:rPr>
                 <w:sz w:val="19"/>
               </w:rPr>
-              <w:t xml:space="preserve">Wear-detection accuracy</w:t>
-            </w:r>
-          </w:p>
-        </w:tc>
-        <w:tc>
-          <w:tcPr/>
-          <w:p>
-            <w:pPr>
-              <w:pStyle w:val="Compact"/>
-              <w:jc w:val="left"/>
-            </w:pPr>
-            <w:r>
-              <w:rPr>
-                <w:bCs/>
-                <w:b/>
-                <w:sz w:val="19"/>
-              </w:rPr>
-              <w:t xml:space="preserve">Not validated</w:t>
-            </w:r>
-            <w:r>
-              <w:rPr>
-                <w:sz w:val="19"/>
-              </w:rPr>
-              <w:t xml:space="preserve"> </w:t>
-            </w:r>
-            <w:r>
-              <w:rPr>
-                <w:sz w:val="19"/>
-              </w:rPr>
-              <w:t xml:space="preserve">against ground truth (§1.2)</w:t>
+              <w:t xml:space="preserve">Storage bound (~52 d)</w:t>
+            </w:r>
+          </w:p>
+        </w:tc>
+        <w:tc>
+          <w:tcPr/>
+          <w:p>
+            <w:pPr>
+              <w:pStyle w:val="Compact"/>
+              <w:jc w:val="left"/>
+            </w:pPr>
+            <w:r>
+              <w:rPr>
+                <w:sz w:val="19"/>
+              </w:rPr>
+              <w:t xml:space="preserve">Predicted from code</w:t>
+            </w:r>
+          </w:p>
+        </w:tc>
+        <w:tc>
+          <w:tcPr/>
+          <w:p>
+            <w:pPr>
+              <w:pStyle w:val="Compact"/>
+              <w:jc w:val="left"/>
+            </w:pPr>
+            <w:r>
+              <w:rPr>
+                <w:sz w:val="19"/>
+              </w:rPr>
+              <w:t xml:space="preserve">1-second-interval test (§1.2), then the firmware fix (Appendix A.3)</w:t>
             </w:r>
           </w:p>
         </w:tc>
@@ -5014,17 +4638,24 @@
             </w:pPr>
             <w:r>
               <w:rPr>
-                <w:bCs/>
-                <w:b/>
                 <w:sz w:val="19"/>
               </w:rPr>
               <w:t xml:space="preserve">Predicted from code</w:t>
             </w:r>
-            <w:r>
-              <w:rPr>
-                <w:sz w:val="19"/>
-              </w:rPr>
-              <w:t xml:space="preserve">, not bench-tested (§4.4)</w:t>
+          </w:p>
+        </w:tc>
+        <w:tc>
+          <w:tcPr/>
+          <w:p>
+            <w:pPr>
+              <w:pStyle w:val="Compact"/>
+              <w:jc w:val="left"/>
+            </w:pPr>
+            <w:r>
+              <w:rPr>
+                <w:sz w:val="19"/>
+              </w:rPr>
+              <w:t xml:space="preserve">Wrap-safe sleep and an offset test across the wrap (Appendix A.3)</w:t>
             </w:r>
           </w:p>
         </w:tc>
@@ -5041,6 +4672,53 @@
               <w:rPr>
                 <w:sz w:val="19"/>
               </w:rPr>
+              <w:t xml:space="preserve">Wear-detection accuracy</w:t>
+            </w:r>
+          </w:p>
+        </w:tc>
+        <w:tc>
+          <w:tcPr/>
+          <w:p>
+            <w:pPr>
+              <w:pStyle w:val="Compact"/>
+              <w:jc w:val="left"/>
+            </w:pPr>
+            <w:r>
+              <w:rPr>
+                <w:sz w:val="19"/>
+              </w:rPr>
+              <w:t xml:space="preserve">Not validated against ground truth</w:t>
+            </w:r>
+          </w:p>
+        </w:tc>
+        <w:tc>
+          <w:tcPr/>
+          <w:p>
+            <w:pPr>
+              <w:pStyle w:val="Compact"/>
+              <w:jc w:val="left"/>
+            </w:pPr>
+            <w:r>
+              <w:rPr>
+                <w:sz w:val="19"/>
+              </w:rPr>
+              <w:t xml:space="preserve">Collect ground truth and re-tune, including long-wear handling (Appendix B)</w:t>
+            </w:r>
+          </w:p>
+        </w:tc>
+      </w:tr>
+      <w:tr>
+        <w:tc>
+          <w:tcPr/>
+          <w:p>
+            <w:pPr>
+              <w:pStyle w:val="Compact"/>
+              <w:jc w:val="left"/>
+            </w:pPr>
+            <w:r>
+              <w:rPr>
+                <w:sz w:val="19"/>
+              </w:rPr>
               <w:t xml:space="preserve">Clock drift</w:t>
             </w:r>
           </w:p>
@@ -5057,19 +4735,128 @@
                 <w:sz w:val="19"/>
               </w:rPr>
               <w:t xml:space="preserve">Not measured; expected negligible (§4.4)</w:t>
+            </w:r>
+          </w:p>
+        </w:tc>
+        <w:tc>
+          <w:tcPr/>
+          <w:p>
+            <w:pPr>
+              <w:pStyle w:val="Compact"/>
+              <w:jc w:val="left"/>
+            </w:pPr>
+            <w:r>
+              <w:rPr>
+                <w:sz w:val="19"/>
+              </w:rPr>
+              <w:t xml:space="preserve">Compare the end-of-deployment power-cycle time with the last timestamp (§1.3)</w:t>
+            </w:r>
+          </w:p>
+        </w:tc>
+      </w:tr>
+      <w:tr>
+        <w:tc>
+          <w:tcPr/>
+          <w:p>
+            <w:pPr>
+              <w:pStyle w:val="Compact"/>
+              <w:jc w:val="left"/>
+            </w:pPr>
+            <w:r>
+              <w:rPr>
+                <w:sz w:val="19"/>
+              </w:rPr>
+              <w:t xml:space="preserve">Firmware robustness</w:t>
+            </w:r>
+          </w:p>
+        </w:tc>
+        <w:tc>
+          <w:tcPr/>
+          <w:p>
+            <w:pPr>
+              <w:pStyle w:val="Compact"/>
+              <w:jc w:val="left"/>
+            </w:pPr>
+            <w:r>
+              <w:rPr>
+                <w:sz w:val="19"/>
+              </w:rPr>
+              <w:t xml:space="preserve">Not started</w:t>
+            </w:r>
+          </w:p>
+        </w:tc>
+        <w:tc>
+          <w:tcPr/>
+          <w:p>
+            <w:pPr>
+              <w:pStyle w:val="Compact"/>
+              <w:jc w:val="left"/>
+            </w:pPr>
+            <w:r>
+              <w:rPr>
+                <w:sz w:val="19"/>
+              </w:rPr>
+              <w:t xml:space="preserve">Start collection at Initialize; optionally, choose idle/collection by USB presence (Appendix A)</w:t>
+            </w:r>
+          </w:p>
+        </w:tc>
+      </w:tr>
+      <w:tr>
+        <w:tc>
+          <w:tcPr/>
+          <w:p>
+            <w:pPr>
+              <w:pStyle w:val="Compact"/>
+              <w:jc w:val="left"/>
+            </w:pPr>
+            <w:r>
+              <w:rPr>
+                <w:sz w:val="19"/>
+              </w:rPr>
+              <w:t xml:space="preserve">Battery monitoring</w:t>
+            </w:r>
+          </w:p>
+        </w:tc>
+        <w:tc>
+          <w:tcPr/>
+          <w:p>
+            <w:pPr>
+              <w:pStyle w:val="Compact"/>
+              <w:jc w:val="left"/>
+            </w:pPr>
+            <w:r>
+              <w:rPr>
+                <w:sz w:val="19"/>
+              </w:rPr>
+              <w:t xml:space="preserve">Not started</w:t>
+            </w:r>
+          </w:p>
+        </w:tc>
+        <w:tc>
+          <w:tcPr/>
+          <w:p>
+            <w:pPr>
+              <w:pStyle w:val="Compact"/>
+              <w:jc w:val="left"/>
+            </w:pPr>
+            <w:r>
+              <w:rPr>
+                <w:sz w:val="19"/>
+              </w:rPr>
+              <w:t xml:space="preserve">Log the battery voltage with each reading, so a dying battery shows in the data</w:t>
             </w:r>
           </w:p>
         </w:tc>
       </w:tr>
     </w:tbl>
-    <w:bookmarkEnd w:id="50"/>
-    <w:bookmarkStart w:id="51" w:name="directions-to-explore"/>
+    <w:bookmarkEnd w:id="52"/>
+    <w:bookmarkStart w:id="53" w:name="directions-to-explore"/>
     <w:p>
       <w:pPr>
         <w:pStyle w:val="Heading1"/>
       </w:pPr>
       <w:r>
-        <w:t xml:space="preserve">9. Directions to explore</w:t>
+        <w:t xml:space="preserve">10. Directions to explore</w:t>
       </w:r>
     </w:p>
     <w:tbl>
@@ -5144,22 +4931,22 @@
               <w:rPr>
                 <w:sz w:val="19"/>
               </w:rPr>
-              <w:t xml:space="preserve">A. Firmware robustness</w:t>
-            </w:r>
-          </w:p>
-        </w:tc>
-        <w:tc>
-          <w:tcPr/>
-          <w:p>
-            <w:pPr>
-              <w:pStyle w:val="Compact"/>
-              <w:jc w:val="left"/>
-            </w:pPr>
-            <w:r>
-              <w:rPr>
-                <w:sz w:val="19"/>
-              </w:rPr>
-              <w:t xml:space="preserve">Wrap-safe timing, the storage bound, and starting collection at Initialize; optionally, choosing idle/collection by USB presence (Appendix A)</w:t>
+              <w:t xml:space="preserve">Wireless download</w:t>
+            </w:r>
+          </w:p>
+        </w:tc>
+        <w:tc>
+          <w:tcPr/>
+          <w:p>
+            <w:pPr>
+              <w:pStyle w:val="Compact"/>
+              <w:jc w:val="left"/>
+            </w:pPr>
+            <w:r>
+              <w:rPr>
+                <w:sz w:val="19"/>
+              </w:rPr>
+              <w:t xml:space="preserve">Use the board’s Bluetooth to download without opening the splint; adds power and pairing complexity</w:t>
             </w:r>
           </w:p>
         </w:tc>
@@ -5176,22 +4963,22 @@
               <w:rPr>
                 <w:sz w:val="19"/>
               </w:rPr>
-              <w:t xml:space="preserve">B. Ground truth and re-tuning</w:t>
-            </w:r>
-          </w:p>
-        </w:tc>
-        <w:tc>
-          <w:tcPr/>
-          <w:p>
-            <w:pPr>
-              <w:pStyle w:val="Compact"/>
-              <w:jc w:val="left"/>
-            </w:pPr>
-            <w:r>
-              <w:rPr>
-                <w:sz w:val="19"/>
-              </w:rPr>
-              <w:t xml:space="preserve">Wear diary or reference sensor on a few deployments; re-tune and fix long-wear handling (Appendix B)</w:t>
+              <w:t xml:space="preserve">Real-time clock</w:t>
+            </w:r>
+          </w:p>
+        </w:tc>
+        <w:tc>
+          <w:tcPr/>
+          <w:p>
+            <w:pPr>
+              <w:pStyle w:val="Compact"/>
+              <w:jc w:val="left"/>
+            </w:pPr>
+            <w:r>
+              <w:rPr>
+                <w:sz w:val="19"/>
+              </w:rPr>
+              <w:t xml:space="preserve">An external RTC would remove the start-time dependence on power-on and the rollover limit</w:t>
             </w:r>
           </w:p>
         </w:tc>
@@ -5208,93 +4995,29 @@
               <w:rPr>
                 <w:sz w:val="19"/>
               </w:rPr>
-              <w:t xml:space="preserve">C. Battery monitoring</w:t>
-            </w:r>
-          </w:p>
-        </w:tc>
-        <w:tc>
-          <w:tcPr/>
-          <w:p>
-            <w:pPr>
-              <w:pStyle w:val="Compact"/>
-              <w:jc w:val="left"/>
-            </w:pPr>
-            <w:r>
-              <w:rPr>
-                <w:sz w:val="19"/>
-              </w:rPr>
-              <w:t xml:space="preserve">Log the battery voltage with each reading, so a dying battery shows in the data</w:t>
-            </w:r>
-          </w:p>
-        </w:tc>
-      </w:tr>
-      <w:tr>
-        <w:tc>
-          <w:tcPr/>
-          <w:p>
-            <w:pPr>
-              <w:pStyle w:val="Compact"/>
-              <w:jc w:val="left"/>
-            </w:pPr>
-            <w:r>
-              <w:rPr>
-                <w:sz w:val="19"/>
-              </w:rPr>
-              <w:t xml:space="preserve">D. Wireless download</w:t>
-            </w:r>
-          </w:p>
-        </w:tc>
-        <w:tc>
-          <w:tcPr/>
-          <w:p>
-            <w:pPr>
-              <w:pStyle w:val="Compact"/>
-              <w:jc w:val="left"/>
-            </w:pPr>
-            <w:r>
-              <w:rPr>
-                <w:sz w:val="19"/>
-              </w:rPr>
-              <w:t xml:space="preserve">Use the board’s Bluetooth to download without opening the splint; adds power and pairing complexity</w:t>
-            </w:r>
-          </w:p>
-        </w:tc>
-      </w:tr>
-      <w:tr>
-        <w:tc>
-          <w:tcPr/>
-          <w:p>
-            <w:pPr>
-              <w:pStyle w:val="Compact"/>
-              <w:jc w:val="left"/>
-            </w:pPr>
-            <w:r>
-              <w:rPr>
-                <w:sz w:val="19"/>
-              </w:rPr>
-              <w:t xml:space="preserve">E. Real-time clock</w:t>
-            </w:r>
-          </w:p>
-        </w:tc>
-        <w:tc>
-          <w:tcPr/>
-          <w:p>
-            <w:pPr>
-              <w:pStyle w:val="Compact"/>
-              <w:jc w:val="left"/>
-            </w:pPr>
-            <w:r>
-              <w:rPr>
-                <w:sz w:val="19"/>
-              </w:rPr>
-              <w:t xml:space="preserve">An external RTC would remove the start-time dependence on power-on and the rollover limit</w:t>
+              <w:t xml:space="preserve">Custom printed circuit board</w:t>
+            </w:r>
+          </w:p>
+        </w:tc>
+        <w:tc>
+          <w:tcPr/>
+          <w:p>
+            <w:pPr>
+              <w:pStyle w:val="Compact"/>
+              <w:jc w:val="left"/>
+            </w:pPr>
+            <w:r>
+              <w:rPr>
+                <w:sz w:val="19"/>
+              </w:rPr>
+              <w:t xml:space="preserve">Only the parts needed (microcontroller, temperature and proximity sensors, power regulation) on a board shaped for the splint: smaller, lower current, and better sensor placement against the skin. Needs hardware design and validation</w:t>
             </w:r>
           </w:p>
         </w:tc>
       </w:tr>
     </w:tbl>
-    <w:bookmarkEnd w:id="51"/>
-    <w:bookmarkStart w:id="56" w:name="appendix-a-firmware-robustness"/>
+    <w:bookmarkEnd w:id="53"/>
+    <w:bookmarkStart w:id="58" w:name="appendix-a-firmware-robustness"/>
     <w:p>
       <w:pPr>
         <w:pStyle w:val="Heading1"/>
@@ -5318,10 +5041,10 @@
         <w:t xml:space="preserve"> </w:t>
       </w:r>
       <w:r>
-        <w:t xml:space="preserve">Identified from the code (§1.2 item 1; §1.3). Not yet implemented.</w:t>
-      </w:r>
-    </w:p>
-    <w:bookmarkStart w:id="52" w:name="a.1-start-the-recording-at-initialize"/>
+        <w:t xml:space="preserve">Identified from the code (§1.2 item 1; §4.1; §4.4). Not yet implemented.</w:t>
+      </w:r>
+    </w:p>
+    <w:bookmarkStart w:id="54" w:name="a.1-start-the-recording-at-initialize"/>
     <w:p>
       <w:pPr>
         <w:pStyle w:val="Heading2"/>
@@ -5352,6 +5075,86 @@
       </w:r>
       <w:r>
         <w:t xml:space="preserve">power-on, so the start time is only right if it is powered on at the entered minute. Two ways to remove this:</w:t>
+      </w:r>
+    </w:p>
+    <w:p>
+      <w:pPr>
+        <w:numPr>
+          <w:ilvl w:val="0"/>
+          <w:numId w:val="1019"/>
+        </w:numPr>
+        <w:pStyle w:val="Compact"/>
+      </w:pPr>
+      <w:r>
+        <w:rPr>
+          <w:bCs/>
+          <w:b/>
+        </w:rPr>
+        <w:t xml:space="preserve">Start at Initialize, from the computer’s clock.</w:t>
+      </w:r>
+      <w:r>
+        <w:t xml:space="preserve"> </w:t>
+      </w:r>
+      <w:r>
+        <w:t xml:space="preserve">The app sends</w:t>
+      </w:r>
+      <w:r>
+        <w:t xml:space="preserve"> </w:t>
+      </w:r>
+      <w:r>
+        <w:t xml:space="preserve">“</w:t>
+      </w:r>
+      <w:r>
+        <w:t xml:space="preserve">now</w:t>
+      </w:r>
+      <w:r>
+        <w:t xml:space="preserve">”</w:t>
+      </w:r>
+      <w:r>
+        <w:t xml:space="preserve"> </w:t>
+      </w:r>
+      <w:r>
+        <w:t xml:space="preserve">and the logger starts collecting immediately (no power-down). The start time is then exact, but the scheduled start goes away.</w:t>
+      </w:r>
+    </w:p>
+    <w:p>
+      <w:pPr>
+        <w:numPr>
+          <w:ilvl w:val="0"/>
+          <w:numId w:val="1019"/>
+        </w:numPr>
+        <w:pStyle w:val="Compact"/>
+      </w:pPr>
+      <w:r>
+        <w:rPr>
+          <w:bCs/>
+          <w:b/>
+        </w:rPr>
+        <w:t xml:space="preserve">Keep the scheduled start, but count from Initialize.</w:t>
+      </w:r>
+      <w:r>
+        <w:t xml:space="preserve"> </w:t>
+      </w:r>
+      <w:r>
+        <w:t xml:space="preserve">The logger stays on in low power after Initialize and starts collecting when the entered start time arrives. Also exact, at the cost of a little battery between Initialize and the start. This keeps today’s workflow.</w:t>
+      </w:r>
+    </w:p>
+    <w:bookmarkEnd w:id="54"/>
+    <w:bookmarkStart w:id="55" w:name="X7067aa404fd0484d1413deb92c2ee6bdcfc5df0"/>
+    <w:p>
+      <w:pPr>
+        <w:pStyle w:val="Heading2"/>
+      </w:pPr>
+      <w:r>
+        <w:t xml:space="preserve">A.2 Idle vs. collection by USB presence (optional)</w:t>
+      </w:r>
+    </w:p>
+    <w:p>
+      <w:pPr>
+        <w:pStyle w:val="FirstParagraph"/>
+      </w:pPr>
+      <w:r>
+        <w:t xml:space="preserve">Choose the mode at power-up by whether USB power is present (the nRF52840 reports this), instead of toggling on every power-up:</w:t>
       </w:r>
     </w:p>
     <w:p>
@@ -5363,35 +5166,7 @@
         <w:pStyle w:val="Compact"/>
       </w:pPr>
       <w:r>
-        <w:rPr>
-          <w:bCs/>
-          <w:b/>
-        </w:rPr>
-        <w:t xml:space="preserve">Start at Initialize, from the computer’s clock.</w:t>
-      </w:r>
-      <w:r>
-        <w:t xml:space="preserve"> </w:t>
-      </w:r>
-      <w:r>
-        <w:t xml:space="preserve">The app sends</w:t>
-      </w:r>
-      <w:r>
-        <w:t xml:space="preserve"> </w:t>
-      </w:r>
-      <w:r>
-        <w:t xml:space="preserve">“</w:t>
-      </w:r>
-      <w:r>
-        <w:t xml:space="preserve">now</w:t>
-      </w:r>
-      <w:r>
-        <w:t xml:space="preserve">”</w:t>
-      </w:r>
-      <w:r>
-        <w:t xml:space="preserve"> </w:t>
-      </w:r>
-      <w:r>
-        <w:t xml:space="preserve">and the logger starts collecting immediately (no power-down). The start time is then exact, but the scheduled start goes away.</w:t>
+        <w:t xml:space="preserve">USB connected → idle, answer the app.</w:t>
       </w:r>
     </w:p>
     <w:p>
@@ -5403,35 +5178,41 @@
         <w:pStyle w:val="Compact"/>
       </w:pPr>
       <w:r>
+        <w:t xml:space="preserve">No USB → if initialized, start or</w:t>
+      </w:r>
+      <w:r>
+        <w:t xml:space="preserve"> </w:t>
+      </w:r>
+      <w:r>
         <w:rPr>
           <w:bCs/>
           <w:b/>
         </w:rPr>
-        <w:t xml:space="preserve">Keep the scheduled start, but count from Initialize.</w:t>
-      </w:r>
-      <w:r>
-        <w:t xml:space="preserve"> </w:t>
-      </w:r>
-      <w:r>
-        <w:t xml:space="preserve">The logger stays on in low power after Initialize and starts collecting when the entered start time arrives. Also exact, at the cost of a little battery between Initialize and the start. This keeps today’s workflow.</w:t>
-      </w:r>
-    </w:p>
-    <w:bookmarkEnd w:id="52"/>
-    <w:bookmarkStart w:id="53" w:name="X7067aa404fd0484d1413deb92c2ee6bdcfc5df0"/>
+        <w:t xml:space="preserve">resume</w:t>
+      </w:r>
+      <w:r>
+        <w:t xml:space="preserve"> </w:t>
+      </w:r>
+      <w:r>
+        <w:t xml:space="preserve">collection, appending after the last record.</w:t>
+      </w:r>
+    </w:p>
+    <w:p>
+      <w:pPr>
+        <w:pStyle w:val="FirstParagraph"/>
+      </w:pPr>
+      <w:r>
+        <w:t xml:space="preserve">This makes a reset during a deployment cost only a gap instead of the rest of the recording, and the logger no longer needs a power-cycle before download. Resuming needs the elapsed time to continue across the reset, e.g. by storing a reset counter and leaving a marker row in the data.</w:t>
+      </w:r>
+    </w:p>
+    <w:bookmarkEnd w:id="55"/>
+    <w:bookmarkStart w:id="56" w:name="a.3-timing-and-storage"/>
     <w:p>
       <w:pPr>
         <w:pStyle w:val="Heading2"/>
       </w:pPr>
       <w:r>
-        <w:t xml:space="preserve">A.2 Idle vs. collection by USB presence (optional)</w:t>
-      </w:r>
-    </w:p>
-    <w:p>
-      <w:pPr>
-        <w:pStyle w:val="FirstParagraph"/>
-      </w:pPr>
-      <w:r>
-        <w:t xml:space="preserve">Choose the mode at power-up by whether USB power is present (the nRF52840 reports this), instead of toggling on every power-up:</w:t>
+        <w:t xml:space="preserve">A.3 Timing and storage</w:t>
       </w:r>
     </w:p>
     <w:p>
@@ -5443,7 +5224,34 @@
         <w:pStyle w:val="Compact"/>
       </w:pPr>
       <w:r>
-        <w:t xml:space="preserve">USB connected → idle, answer the app.</w:t>
+        <w:t xml:space="preserve">Wrap-safe sleep:</w:t>
+      </w:r>
+      <w:r>
+        <w:t xml:space="preserve"> </w:t>
+      </w:r>
+      <w:r>
+        <w:rPr>
+          <w:rStyle w:val="VerbatimChar"/>
+        </w:rPr>
+        <w:t xml:space="preserve">if ((int32_t)(nextWakeTime - currentTime) &gt; 0)</w:t>
+      </w:r>
+      <w:r>
+        <w:t xml:space="preserve">. Test across the wrap with a temporary offset of about 2³² − 10 min added to</w:t>
+      </w:r>
+      <w:r>
+        <w:t xml:space="preserve"> </w:t>
+      </w:r>
+      <w:r>
+        <w:rPr>
+          <w:rStyle w:val="VerbatimChar"/>
+        </w:rPr>
+        <w:t xml:space="preserve">millis()</w:t>
+      </w:r>
+      <w:r>
+        <w:t xml:space="preserve"> </w:t>
+      </w:r>
+      <w:r>
+        <w:t xml:space="preserve">in the logging path.</w:t>
       </w:r>
     </w:p>
     <w:p>
@@ -5455,41 +5263,90 @@
         <w:pStyle w:val="Compact"/>
       </w:pPr>
       <w:r>
-        <w:t xml:space="preserve">No USB → if initialized, start or</w:t>
-      </w:r>
-      <w:r>
-        <w:t xml:space="preserve"> </w:t>
-      </w:r>
+        <w:t xml:space="preserve">Stop at</w:t>
+      </w:r>
+      <w:r>
+        <w:t xml:space="preserve"> </w:t>
+      </w:r>
+      <w:r>
+        <w:rPr>
+          <w:rStyle w:val="VerbatimChar"/>
+        </w:rPr>
+        <w:t xml:space="preserve">MAX_DATA_ENTRIES</w:t>
+      </w:r>
+      <w:r>
+        <w:t xml:space="preserve"> </w:t>
+      </w:r>
+      <w:r>
+        <w:t xml:space="preserve">in</w:t>
+      </w:r>
+      <w:r>
+        <w:t xml:space="preserve"> </w:t>
+      </w:r>
+      <w:r>
+        <w:rPr>
+          <w:rStyle w:val="VerbatimChar"/>
+        </w:rPr>
+        <w:t xml:space="preserve">saveTemperatureReading</w:t>
+      </w:r>
+      <w:r>
+        <w:t xml:space="preserve">, or erase all the pages that may be written.</w:t>
+      </w:r>
+    </w:p>
+    <w:bookmarkEnd w:id="56"/>
+    <w:bookmarkStart w:id="57" w:name="a.4-next-steps"/>
+    <w:p>
+      <w:pPr>
+        <w:pStyle w:val="Heading2"/>
+      </w:pPr>
+      <w:r>
+        <w:t xml:space="preserve">A.4 Next steps</w:t>
+      </w:r>
+    </w:p>
+    <w:p>
+      <w:pPr>
+        <w:pStyle w:val="FirstParagraph"/>
+      </w:pPr>
+      <w:r>
+        <w:t xml:space="preserve">Implement A.3 first (small, low risk), then A.1, bench-test for a full month, and update the SOP (§1.1, §6, §7).</w:t>
+      </w:r>
+    </w:p>
+    <w:bookmarkEnd w:id="57"/>
+    <w:bookmarkEnd w:id="58"/>
+    <w:bookmarkStart w:id="62" w:name="X1e46ee66dcce5645c2d432b6ebfb1a5d4d92f07"/>
+    <w:p>
+      <w:pPr>
+        <w:pStyle w:val="Heading1"/>
+      </w:pPr>
+      <w:r>
+        <w:t xml:space="preserve">Appendix B — Ground truth and re-tuning the detector</w:t>
+      </w:r>
+    </w:p>
+    <w:p>
+      <w:pPr>
+        <w:pStyle w:val="FirstParagraph"/>
+      </w:pPr>
       <w:r>
         <w:rPr>
           <w:bCs/>
           <w:b/>
         </w:rPr>
-        <w:t xml:space="preserve">resume</w:t>
-      </w:r>
-      <w:r>
-        <w:t xml:space="preserve"> </w:t>
-      </w:r>
-      <w:r>
-        <w:t xml:space="preserve">collection, appending after the last record.</w:t>
-      </w:r>
-    </w:p>
-    <w:p>
-      <w:pPr>
-        <w:pStyle w:val="FirstParagraph"/>
-      </w:pPr>
-      <w:r>
-        <w:t xml:space="preserve">This makes a reset during a deployment cost only a gap instead of the rest of the recording, and the logger no longer needs a power-cycle before download. Resuming needs the elapsed time to continue across the reset, e.g. by storing a reset counter and leaving a marker row in the data.</w:t>
-      </w:r>
-    </w:p>
-    <w:bookmarkEnd w:id="53"/>
-    <w:bookmarkStart w:id="54" w:name="a.3-timing-and-storage"/>
+        <w:t xml:space="preserve">Status:</w:t>
+      </w:r>
+      <w:r>
+        <w:t xml:space="preserve"> </w:t>
+      </w:r>
+      <w:r>
+        <w:t xml:space="preserve">Needed before wear times are reported as results.</w:t>
+      </w:r>
+    </w:p>
+    <w:bookmarkStart w:id="59" w:name="b.1-collecting-ground-truth"/>
     <w:p>
       <w:pPr>
         <w:pStyle w:val="Heading2"/>
       </w:pPr>
       <w:r>
-        <w:t xml:space="preserve">A.3 Timing and storage</w:t>
+        <w:t xml:space="preserve">B.1 Collecting ground truth</w:t>
       </w:r>
     </w:p>
     <w:p>
@@ -5501,34 +5358,17 @@
         <w:pStyle w:val="Compact"/>
       </w:pPr>
       <w:r>
-        <w:t xml:space="preserve">Wrap-safe sleep:</w:t>
-      </w:r>
-      <w:r>
-        <w:t xml:space="preserve"> </w:t>
-      </w:r>
-      <w:r>
-        <w:rPr>
-          <w:rStyle w:val="VerbatimChar"/>
-        </w:rPr>
-        <w:t xml:space="preserve">if ((int32_t)(nextWakeTime - currentTime) &gt; 0)</w:t>
-      </w:r>
-      <w:r>
-        <w:t xml:space="preserve">. Test across the wrap with a temporary offset of about 2³² − 10 min added to</w:t>
-      </w:r>
-      <w:r>
-        <w:t xml:space="preserve"> </w:t>
-      </w:r>
-      <w:r>
-        <w:rPr>
-          <w:rStyle w:val="VerbatimChar"/>
-        </w:rPr>
-        <w:t xml:space="preserve">millis()</w:t>
-      </w:r>
-      <w:r>
-        <w:t xml:space="preserve"> </w:t>
-      </w:r>
-      <w:r>
-        <w:t xml:space="preserve">in the logging path.</w:t>
+        <w:rPr>
+          <w:bCs/>
+          <w:b/>
+        </w:rPr>
+        <w:t xml:space="preserve">Wear diary:</w:t>
+      </w:r>
+      <w:r>
+        <w:t xml:space="preserve"> </w:t>
+      </w:r>
+      <w:r>
+        <w:t xml:space="preserve">the participant (or staff, in a supervised session) records on/off times. Cheap, but coarse and subject to the same recall bias the logger is meant to avoid.</w:t>
       </w:r>
     </w:p>
     <w:p>
@@ -5540,90 +5380,49 @@
         <w:pStyle w:val="Compact"/>
       </w:pPr>
       <w:r>
-        <w:t xml:space="preserve">Stop at</w:t>
-      </w:r>
-      <w:r>
-        <w:t xml:space="preserve"> </w:t>
-      </w:r>
-      <w:r>
-        <w:rPr>
-          <w:rStyle w:val="VerbatimChar"/>
-        </w:rPr>
-        <w:t xml:space="preserve">MAX_DATA_ENTRIES</w:t>
-      </w:r>
-      <w:r>
-        <w:t xml:space="preserve"> </w:t>
-      </w:r>
-      <w:r>
-        <w:t xml:space="preserve">in</w:t>
-      </w:r>
-      <w:r>
-        <w:t xml:space="preserve"> </w:t>
-      </w:r>
-      <w:r>
-        <w:rPr>
-          <w:rStyle w:val="VerbatimChar"/>
-        </w:rPr>
-        <w:t xml:space="preserve">saveTemperatureReading</w:t>
-      </w:r>
-      <w:r>
-        <w:t xml:space="preserve">, or erase all the pages that may be written.</w:t>
-      </w:r>
-    </w:p>
-    <w:bookmarkEnd w:id="54"/>
-    <w:bookmarkStart w:id="55" w:name="a.4-next-steps"/>
-    <w:p>
-      <w:pPr>
-        <w:pStyle w:val="Heading2"/>
-      </w:pPr>
-      <w:r>
-        <w:t xml:space="preserve">A.4 Next steps</w:t>
-      </w:r>
-    </w:p>
-    <w:p>
-      <w:pPr>
-        <w:pStyle w:val="FirstParagraph"/>
-      </w:pPr>
-      <w:r>
-        <w:t xml:space="preserve">Implement A.3 first (small, low risk), then A.1, bench-test for a full month, and update the SOP (§1.1, §6, §7).</w:t>
-      </w:r>
-    </w:p>
-    <w:bookmarkEnd w:id="55"/>
-    <w:bookmarkEnd w:id="56"/>
-    <w:bookmarkStart w:id="60" w:name="X1e46ee66dcce5645c2d432b6ebfb1a5d4d92f07"/>
-    <w:p>
-      <w:pPr>
-        <w:pStyle w:val="Heading1"/>
-      </w:pPr>
-      <w:r>
-        <w:t xml:space="preserve">Appendix B — Ground truth and re-tuning the detector</w:t>
-      </w:r>
-    </w:p>
-    <w:p>
-      <w:pPr>
-        <w:pStyle w:val="FirstParagraph"/>
-      </w:pPr>
-      <w:r>
         <w:rPr>
           <w:bCs/>
           <w:b/>
         </w:rPr>
-        <w:t xml:space="preserve">Status:</w:t>
-      </w:r>
-      <w:r>
-        <w:t xml:space="preserve"> </w:t>
-      </w:r>
-      <w:r>
-        <w:t xml:space="preserve">Needed before wear times are reported as results.</w:t>
-      </w:r>
-    </w:p>
-    <w:bookmarkStart w:id="57" w:name="b.1-collecting-ground-truth"/>
+        <w:t xml:space="preserve">Supervised sessions:</w:t>
+      </w:r>
+      <w:r>
+        <w:t xml:space="preserve"> </w:t>
+      </w:r>
+      <w:r>
+        <w:t xml:space="preserve">scripted on/off periods in the lab, including long continuous wear and confounders (warm room, splint left on a warm surface, covered but not worn).</w:t>
+      </w:r>
+    </w:p>
+    <w:p>
+      <w:pPr>
+        <w:numPr>
+          <w:ilvl w:val="0"/>
+          <w:numId w:val="1022"/>
+        </w:numPr>
+        <w:pStyle w:val="Compact"/>
+      </w:pPr>
+      <w:r>
+        <w:rPr>
+          <w:bCs/>
+          <w:b/>
+        </w:rPr>
+        <w:t xml:space="preserve">Reference sensor:</w:t>
+      </w:r>
+      <w:r>
+        <w:t xml:space="preserve"> </w:t>
+      </w:r>
+      <w:r>
+        <w:t xml:space="preserve">a second, independent sensor (e.g. a commercial temperature button logger on the skin side) for a few deployments.</w:t>
+      </w:r>
+    </w:p>
+    <w:bookmarkEnd w:id="59"/>
+    <w:bookmarkStart w:id="60" w:name="b.2-what-to-check"/>
     <w:p>
       <w:pPr>
         <w:pStyle w:val="Heading2"/>
       </w:pPr>
       <w:r>
-        <w:t xml:space="preserve">B.1 Collecting ground truth</w:t>
+        <w:t xml:space="preserve">B.2 What to check</w:t>
       </w:r>
     </w:p>
     <w:p>
@@ -5635,17 +5434,7 @@
         <w:pStyle w:val="Compact"/>
       </w:pPr>
       <w:r>
-        <w:rPr>
-          <w:bCs/>
-          <w:b/>
-        </w:rPr>
-        <w:t xml:space="preserve">Wear diary:</w:t>
-      </w:r>
-      <w:r>
-        <w:t xml:space="preserve"> </w:t>
-      </w:r>
-      <w:r>
-        <w:t xml:space="preserve">the participant (or staff, in a supervised session) records on/off times. Cheap, but coarse and subject to the same recall bias the logger is meant to avoid.</w:t>
+        <w:t xml:space="preserve">Per-event agreement (onset/offset within ±1 sample) and per-day wear minutes.</w:t>
       </w:r>
     </w:p>
     <w:p>
@@ -5661,13 +5450,13 @@
           <w:bCs/>
           <w:b/>
         </w:rPr>
-        <w:t xml:space="preserve">Supervised sessions:</w:t>
-      </w:r>
-      <w:r>
-        <w:t xml:space="preserve"> </w:t>
-      </w:r>
-      <w:r>
-        <w:t xml:space="preserve">scripted on/off periods in the lab, including long continuous wear and confounders (warm room, splint left on a warm surface, covered but not worn).</w:t>
+        <w:t xml:space="preserve">Long wear:</w:t>
+      </w:r>
+      <w:r>
+        <w:t xml:space="preserve"> </w:t>
+      </w:r>
+      <w:r>
+        <w:t xml:space="preserve">whether overnight wear is split or cut short (§5.1). Possible fixes: a longer baseline window, freezing the baseline while an event is in progress, or requiring two consecutive cooling samples before ending an event.</w:t>
       </w:r>
     </w:p>
     <w:p>
@@ -5679,82 +5468,16 @@
         <w:pStyle w:val="Compact"/>
       </w:pPr>
       <w:r>
-        <w:rPr>
-          <w:bCs/>
-          <w:b/>
-        </w:rPr>
-        <w:t xml:space="preserve">Reference sensor:</w:t>
-      </w:r>
-      <w:r>
-        <w:t xml:space="preserve"> </w:t>
-      </w:r>
-      <w:r>
-        <w:t xml:space="preserve">a second, independent sensor (e.g. a commercial temperature button logger on the skin side) for a few deployments.</w:t>
-      </w:r>
-    </w:p>
-    <w:bookmarkEnd w:id="57"/>
-    <w:bookmarkStart w:id="58" w:name="b.2-what-to-check"/>
+        <w:t xml:space="preserve">False positives in warm environments, and false negatives with a loose splint.</w:t>
+      </w:r>
+    </w:p>
+    <w:bookmarkEnd w:id="60"/>
+    <w:bookmarkStart w:id="61" w:name="b.3-next-steps"/>
     <w:p>
       <w:pPr>
         <w:pStyle w:val="Heading2"/>
       </w:pPr>
       <w:r>
-        <w:t xml:space="preserve">B.2 What to check</w:t>
-      </w:r>
-    </w:p>
-    <w:p>
-      <w:pPr>
-        <w:numPr>
-          <w:ilvl w:val="0"/>
-          <w:numId w:val="1024"/>
-        </w:numPr>
-        <w:pStyle w:val="Compact"/>
-      </w:pPr>
-      <w:r>
-        <w:t xml:space="preserve">Per-event agreement (onset/offset within ±1 sample) and per-day wear minutes.</w:t>
-      </w:r>
-    </w:p>
-    <w:p>
-      <w:pPr>
-        <w:numPr>
-          <w:ilvl w:val="0"/>
-          <w:numId w:val="1024"/>
-        </w:numPr>
-        <w:pStyle w:val="Compact"/>
-      </w:pPr>
-      <w:r>
-        <w:rPr>
-          <w:bCs/>
-          <w:b/>
-        </w:rPr>
-        <w:t xml:space="preserve">Long wear:</w:t>
-      </w:r>
-      <w:r>
-        <w:t xml:space="preserve"> </w:t>
-      </w:r>
-      <w:r>
-        <w:t xml:space="preserve">whether overnight wear is split or cut short (§5.1). Possible fixes: a longer baseline window, freezing the baseline while an event is in progress, or requiring two consecutive cooling samples before ending an event.</w:t>
-      </w:r>
-    </w:p>
-    <w:p>
-      <w:pPr>
-        <w:numPr>
-          <w:ilvl w:val="0"/>
-          <w:numId w:val="1024"/>
-        </w:numPr>
-        <w:pStyle w:val="Compact"/>
-      </w:pPr>
-      <w:r>
-        <w:t xml:space="preserve">False positives in warm environments, and false negatives with a loose splint.</w:t>
-      </w:r>
-    </w:p>
-    <w:bookmarkEnd w:id="58"/>
-    <w:bookmarkStart w:id="59" w:name="b.3-next-steps"/>
-    <w:p>
-      <w:pPr>
-        <w:pStyle w:val="Heading2"/>
-      </w:pPr>
-      <w:r>
         <w:t xml:space="preserve">B.3 Next steps</w:t>
       </w:r>
     </w:p>
@@ -5811,8 +5534,8 @@
         <w:t xml:space="preserve">§4.</w:t>
       </w:r>
     </w:p>
-    <w:bookmarkEnd w:id="59"/>
-    <w:bookmarkEnd w:id="60"/>
+    <w:bookmarkEnd w:id="61"/>
+    <w:bookmarkEnd w:id="62"/>
     <w:sectPr/>
   </w:body>
 </w:document>
@@ -6204,9 +5927,6 @@
     <w:abstractNumId w:val="991"/>
   </w:num>
   <w:num w:numId="1023">
-    <w:abstractNumId w:val="991"/>
-  </w:num>
-  <w:num w:numId="1024">
     <w:abstractNumId w:val="991"/>
   </w:num>
 </w:numbering>

</xml_diff>

<commit_message>
Handover: gather all next steps into §1.2
One prioritised table (item, status, what to do, details) replaces the
old §1.2 open items, §1.3 recommended steps, §9 next-steps table and the
appendix A.4/B.3 lists. Design sections and appendices now point to
§1.2; §1 and §9 renumbered.

Co-Authored-By: Claude Opus 5.5 <noreply@anthropic.com>
Claude-Session: https://claude.ai/code/session_01Ue3sWJSFRo3Bxhe8SfexR3
</commit_message>
<xml_diff>
--- a/docs/Project_Handover.docx
+++ b/docs/Project_Handover.docx
@@ -211,7 +211,7 @@
         <w:t xml:space="preserve"> </w:t>
       </w:r>
       <w:r>
-        <w:t xml:space="preserve">the state of the project at transition, open items, what to do next, and who to contact. Read this first.</w:t>
+        <w:t xml:space="preserve">the state of the project at transition, all next steps in one place, and who to contact. Read this first.</w:t>
       </w:r>
     </w:p>
     <w:p>
@@ -249,13 +249,13 @@
           <w:bCs/>
           <w:b/>
         </w:rPr>
-        <w:t xml:space="preserve">Testing, next steps and future directions (§8–§10):</w:t>
-      </w:r>
-      <w:r>
-        <w:t xml:space="preserve"> </w:t>
-      </w:r>
-      <w:r>
-        <w:t xml:space="preserve">what has been verified so far, what still needs testing or building, and the areas to explore.</w:t>
+        <w:t xml:space="preserve">Testing and future directions (§8–§9):</w:t>
+      </w:r>
+      <w:r>
+        <w:t xml:space="preserve"> </w:t>
+      </w:r>
+      <w:r>
+        <w:t xml:space="preserve">what has been verified so far, and the areas to explore.</w:t>
       </w:r>
     </w:p>
     <w:p>
@@ -285,7 +285,7 @@
         <w:pStyle w:val="FirstParagraph"/>
       </w:pPr>
       <w:r>
-        <w:t xml:space="preserve">Companion documents are listed in §1.4, and technical terms are explained under</w:t>
+        <w:t xml:space="preserve">Companion documents are listed in §1.3, and technical terms are explained under</w:t>
       </w:r>
       <w:r>
         <w:t xml:space="preserve"> </w:t>
@@ -517,7 +517,7 @@
               <w:rPr>
                 <w:sz w:val="19"/>
               </w:rPr>
-              <w:t xml:space="preserve">§1.2, §1.3, §8–§10 and Appendices A–B</w:t>
+              <w:t xml:space="preserve">§1.2 (next steps), then §8, §9 and Appendices A–B</w:t>
             </w:r>
           </w:p>
         </w:tc>
@@ -556,7 +556,7 @@
       </w:tr>
     </w:tbl>
     <w:bookmarkEnd w:id="20"/>
-    <w:bookmarkStart w:id="26" w:name="state-at-transition-october-2026"/>
+    <w:bookmarkStart w:id="25" w:name="state-at-transition-october-2026"/>
     <w:p>
       <w:pPr>
         <w:pStyle w:val="Heading1"/>
@@ -725,246 +725,596 @@
       </w:r>
     </w:p>
     <w:bookmarkEnd w:id="21"/>
-    <w:bookmarkStart w:id="22" w:name="open-items-need-testing"/>
+    <w:bookmarkStart w:id="22" w:name="next-steps"/>
     <w:p>
       <w:pPr>
         <w:pStyle w:val="Heading2"/>
       </w:pPr>
       <w:r>
-        <w:t xml:space="preserve">1.2 Open items (need testing)</w:t>
-      </w:r>
-    </w:p>
-    <w:p>
-      <w:pPr>
-        <w:numPr>
-          <w:ilvl w:val="0"/>
-          <w:numId w:val="1003"/>
-        </w:numPr>
-        <w:pStyle w:val="Compact"/>
-      </w:pPr>
-      <w:r>
-        <w:rPr>
-          <w:bCs/>
-          <w:b/>
-        </w:rPr>
-        <w:t xml:space="preserve">Storage bound not enforced.</w:t>
-      </w:r>
-      <w:r>
-        <w:t xml:space="preserve"> </w:t>
-      </w:r>
-      <w:r>
-        <w:rPr>
-          <w:rStyle w:val="VerbatimChar"/>
-        </w:rPr>
-        <w:t xml:space="preserve">saveTemperatureReading</w:t>
-      </w:r>
-      <w:r>
-        <w:t xml:space="preserve"> </w:t>
-      </w:r>
-      <w:r>
-        <w:t xml:space="preserve">checks against the whole flash rather than</w:t>
-      </w:r>
-      <w:r>
-        <w:t xml:space="preserve"> </w:t>
-      </w:r>
-      <w:r>
-        <w:rPr>
-          <w:rStyle w:val="VerbatimChar"/>
-        </w:rPr>
-        <w:t xml:space="preserve">MAX_DATA_ENTRIES</w:t>
-      </w:r>
-      <w:r>
-        <w:t xml:space="preserve"> </w:t>
-      </w:r>
-      <w:r>
-        <w:t xml:space="preserve">(15 000). Records beyond about 52 days go into pages that were never erased and are never downloaded.</w:t>
-      </w:r>
-      <w:r>
-        <w:t xml:space="preserve"> </w:t>
-      </w:r>
-      <w:r>
-        <w:rPr>
-          <w:iCs/>
-          <w:i/>
-        </w:rPr>
-        <w:t xml:space="preserve">Test:</w:t>
-      </w:r>
-      <w:r>
-        <w:t xml:space="preserve"> </w:t>
-      </w:r>
-      <w:r>
-        <w:t xml:space="preserve">initialize a logger with a 1-second interval (a temporary change to</w:t>
-      </w:r>
-      <w:r>
-        <w:t xml:space="preserve"> </w:t>
-      </w:r>
-      <w:r>
-        <w:rPr>
-          <w:rStyle w:val="VerbatimChar"/>
-        </w:rPr>
-        <w:t xml:space="preserve">WAKEUP_INTERVAL_SECONDS</w:t>
-      </w:r>
-      <w:r>
-        <w:t xml:space="preserve"> </w:t>
-      </w:r>
-      <w:r>
-        <w:t xml:space="preserve">in</w:t>
-      </w:r>
-      <w:r>
-        <w:t xml:space="preserve"> </w:t>
-      </w:r>
-      <w:r>
-        <w:rPr>
-          <w:rStyle w:val="VerbatimChar"/>
-        </w:rPr>
-        <w:t xml:space="preserve">arduino.py</w:t>
-      </w:r>
-      <w:r>
-        <w:t xml:space="preserve">; no firmware change needed) and leave it collecting for 5 hours, well past 15 000 records. The download should stop at exactly 15 000 rows, which confirms the later readings are silently lost. After the fix, the logger should stop cleanly at 15 000.</w:t>
-      </w:r>
-    </w:p>
-    <w:p>
-      <w:pPr>
-        <w:numPr>
-          <w:ilvl w:val="0"/>
-          <w:numId w:val="1003"/>
-        </w:numPr>
-        <w:pStyle w:val="Compact"/>
-      </w:pPr>
-      <w:r>
-        <w:rPr>
-          <w:bCs/>
-          <w:b/>
-        </w:rPr>
-        <w:t xml:space="preserve">Battery life not measured</w:t>
-      </w:r>
-      <w:r>
-        <w:t xml:space="preserve"> </w:t>
-      </w:r>
-      <w:r>
-        <w:t xml:space="preserve">over a full deployment. Resting current was below about 750 µA on the bench.</w:t>
-      </w:r>
-      <w:r>
-        <w:t xml:space="preserve"> </w:t>
-      </w:r>
-      <w:r>
-        <w:rPr>
-          <w:iCs/>
-          <w:i/>
-        </w:rPr>
-        <w:t xml:space="preserve">Test:</w:t>
-      </w:r>
-      <w:r>
-        <w:t xml:space="preserve"> </w:t>
-      </w:r>
-      <w:r>
-        <w:t xml:space="preserve">see §1.3 step 2.</w:t>
-      </w:r>
-    </w:p>
-    <w:p>
-      <w:pPr>
-        <w:numPr>
-          <w:ilvl w:val="0"/>
-          <w:numId w:val="1003"/>
-        </w:numPr>
-        <w:pStyle w:val="Compact"/>
-      </w:pPr>
-      <w:r>
-        <w:rPr>
-          <w:bCs/>
-          <w:b/>
-        </w:rPr>
-        <w:t xml:space="preserve">Wear-detection thresholds not validated.</w:t>
-      </w:r>
-      <w:r>
-        <w:t xml:space="preserve"> </w:t>
-      </w:r>
-      <w:r>
-        <w:t xml:space="preserve">They were tuned by eye on a small number of recordings, with no ground-truth record of when the splint was actually worn (§5.4).</w:t>
-      </w:r>
-      <w:r>
-        <w:t xml:space="preserve"> </w:t>
-      </w:r>
-      <w:r>
-        <w:rPr>
-          <w:iCs/>
-          <w:i/>
-        </w:rPr>
-        <w:t xml:space="preserve">Test:</w:t>
-      </w:r>
-      <w:r>
-        <w:t xml:space="preserve"> </w:t>
-      </w:r>
-      <w:r>
-        <w:t xml:space="preserve">Appendix B.</w:t>
-      </w:r>
-    </w:p>
+        <w:t xml:space="preserve">1.2 Next steps</w:t>
+      </w:r>
+    </w:p>
+    <w:p>
+      <w:pPr>
+        <w:pStyle w:val="FirstParagraph"/>
+      </w:pPr>
+      <w:r>
+        <w:t xml:space="preserve">All remaining work, in recommended order. The design sections (§3–§7) explain why each item exists, and the appendices give the technical detail.</w:t>
+      </w:r>
+    </w:p>
+    <w:tbl>
+      <w:tblPr>
+        <w:tblStyle w:val="Table"/>
+        <w:tblW w:type="pct" w:w="5000"/>
+        <w:tblLook w:firstRow="1" w:lastRow="0" w:firstColumn="0" w:lastColumn="0" w:noHBand="0" w:noVBand="0" w:val="0020"/>
+        <w:jc w:val="start"/>
+        <w:tblBorders>
+          <w:top w:val="single" w:sz="4" w:space="0" w:color="BFBFBF"/>
+          <w:left w:val="single" w:sz="4" w:space="0" w:color="BFBFBF"/>
+          <w:bottom w:val="single" w:sz="4" w:space="0" w:color="BFBFBF"/>
+          <w:right w:val="single" w:sz="4" w:space="0" w:color="BFBFBF"/>
+          <w:insideH w:val="single" w:sz="4" w:space="0" w:color="BFBFBF"/>
+          <w:insideV w:val="single" w:sz="4" w:space="0" w:color="BFBFBF"/>
+        </w:tblBorders>
+      </w:tblPr>
+      <w:tblGrid>
+        <w:gridCol w:w="1638"/>
+        <w:gridCol w:w="1638"/>
+        <w:gridCol w:w="3550"/>
+        <w:gridCol w:w="1092"/>
+      </w:tblGrid>
+      <w:tr>
+        <w:trPr>
+          <w:tblHeader w:val="true"/>
+        </w:trPr>
+        <w:tc>
+          <w:tcPr>
+            <w:shd w:val="clear" w:color="auto" w:fill="DCE6F1"/>
+          </w:tcPr>
+          <w:p>
+            <w:pPr>
+              <w:pStyle w:val="Compact"/>
+              <w:jc w:val="left"/>
+            </w:pPr>
+            <w:r>
+              <w:rPr>
+                <w:b/>
+                <w:sz w:val="19"/>
+              </w:rPr>
+              <w:t xml:space="preserve">Item</w:t>
+            </w:r>
+          </w:p>
+        </w:tc>
+        <w:tc>
+          <w:tcPr>
+            <w:shd w:val="clear" w:color="auto" w:fill="DCE6F1"/>
+          </w:tcPr>
+          <w:p>
+            <w:pPr>
+              <w:pStyle w:val="Compact"/>
+              <w:jc w:val="left"/>
+            </w:pPr>
+            <w:r>
+              <w:rPr>
+                <w:b/>
+                <w:sz w:val="19"/>
+              </w:rPr>
+              <w:t xml:space="preserve">Status</w:t>
+            </w:r>
+          </w:p>
+        </w:tc>
+        <w:tc>
+          <w:tcPr>
+            <w:shd w:val="clear" w:color="auto" w:fill="DCE6F1"/>
+          </w:tcPr>
+          <w:p>
+            <w:pPr>
+              <w:pStyle w:val="Compact"/>
+              <w:jc w:val="left"/>
+            </w:pPr>
+            <w:r>
+              <w:rPr>
+                <w:b/>
+                <w:sz w:val="19"/>
+              </w:rPr>
+              <w:t xml:space="preserve">What to do</w:t>
+            </w:r>
+          </w:p>
+        </w:tc>
+        <w:tc>
+          <w:tcPr>
+            <w:shd w:val="clear" w:color="auto" w:fill="DCE6F1"/>
+          </w:tcPr>
+          <w:p>
+            <w:pPr>
+              <w:pStyle w:val="Compact"/>
+              <w:jc w:val="left"/>
+            </w:pPr>
+            <w:r>
+              <w:rPr>
+                <w:b/>
+                <w:sz w:val="19"/>
+              </w:rPr>
+              <w:t xml:space="preserve">Details</w:t>
+            </w:r>
+          </w:p>
+        </w:tc>
+      </w:tr>
+      <w:tr>
+        <w:tc>
+          <w:tcPr/>
+          <w:p>
+            <w:pPr>
+              <w:pStyle w:val="Compact"/>
+              <w:jc w:val="left"/>
+            </w:pPr>
+            <w:r>
+              <w:rPr>
+                <w:sz w:val="19"/>
+              </w:rPr>
+              <w:t xml:space="preserve">1. Firmware fixes: wrap-safe sleep, storage limit, start collection at Initialize</w:t>
+            </w:r>
+          </w:p>
+        </w:tc>
+        <w:tc>
+          <w:tcPr/>
+          <w:p>
+            <w:pPr>
+              <w:pStyle w:val="Compact"/>
+              <w:jc w:val="left"/>
+            </w:pPr>
+            <w:r>
+              <w:rPr>
+                <w:sz w:val="19"/>
+              </w:rPr>
+              <w:t xml:space="preserve">Predicted from code; not bench-tested</w:t>
+            </w:r>
+          </w:p>
+        </w:tc>
+        <w:tc>
+          <w:tcPr/>
+          <w:p>
+            <w:pPr>
+              <w:pStyle w:val="Compact"/>
+              <w:jc w:val="left"/>
+            </w:pPr>
+            <w:r>
+              <w:rPr>
+                <w:sz w:val="19"/>
+              </w:rPr>
+              <w:t xml:space="preserve">First confirm the storage issue: initialize a logger with a 1-second interval (temporary change to</w:t>
+            </w:r>
+            <w:r>
+              <w:rPr>
+                <w:sz w:val="19"/>
+              </w:rPr>
+              <w:t xml:space="preserve"> </w:t>
+            </w:r>
+            <w:r>
+              <w:rPr>
+                <w:rStyle w:val="VerbatimChar"/>
+                <w:sz w:val="19"/>
+              </w:rPr>
+              <w:t xml:space="preserve">WAKEUP_INTERVAL_SECONDS</w:t>
+            </w:r>
+            <w:r>
+              <w:rPr>
+                <w:sz w:val="19"/>
+              </w:rPr>
+              <w:t xml:space="preserve"> </w:t>
+            </w:r>
+            <w:r>
+              <w:rPr>
+                <w:sz w:val="19"/>
+              </w:rPr>
+              <w:t xml:space="preserve">in</w:t>
+            </w:r>
+            <w:r>
+              <w:rPr>
+                <w:sz w:val="19"/>
+              </w:rPr>
+              <w:t xml:space="preserve"> </w:t>
+            </w:r>
+            <w:r>
+              <w:rPr>
+                <w:rStyle w:val="VerbatimChar"/>
+                <w:sz w:val="19"/>
+              </w:rPr>
+              <w:t xml:space="preserve">arduino.py</w:t>
+            </w:r>
+            <w:r>
+              <w:rPr>
+                <w:sz w:val="19"/>
+              </w:rPr>
+              <w:t xml:space="preserve">) and leave it for 5 hours; the download should stop at exactly 15 000 rows. Then fix wrap-safe sleep and the storage limit (small, low risk), then start collection at Initialize, in one firmware release. Bench-test for a full month, re-flash loggers after downloading their data, and update the SOP.</w:t>
+            </w:r>
+          </w:p>
+        </w:tc>
+        <w:tc>
+          <w:tcPr/>
+          <w:p>
+            <w:pPr>
+              <w:pStyle w:val="Compact"/>
+              <w:jc w:val="left"/>
+            </w:pPr>
+            <w:r>
+              <w:rPr>
+                <w:sz w:val="19"/>
+              </w:rPr>
+              <w:t xml:space="preserve">Appendix A; §4.4</w:t>
+            </w:r>
+          </w:p>
+        </w:tc>
+      </w:tr>
+      <w:tr>
+        <w:tc>
+          <w:tcPr/>
+          <w:p>
+            <w:pPr>
+              <w:pStyle w:val="Compact"/>
+              <w:jc w:val="left"/>
+            </w:pPr>
+            <w:r>
+              <w:rPr>
+                <w:sz w:val="19"/>
+              </w:rPr>
+              <w:t xml:space="preserve">2. Battery life</w:t>
+            </w:r>
+          </w:p>
+        </w:tc>
+        <w:tc>
+          <w:tcPr/>
+          <w:p>
+            <w:pPr>
+              <w:pStyle w:val="Compact"/>
+              <w:jc w:val="left"/>
+            </w:pPr>
+            <w:r>
+              <w:rPr>
+                <w:sz w:val="19"/>
+              </w:rPr>
+              <w:t xml:space="preserve">Not measured; resting current below ~750 µA</w:t>
+            </w:r>
+          </w:p>
+        </w:tc>
+        <w:tc>
+          <w:tcPr/>
+          <w:p>
+            <w:pPr>
+              <w:pStyle w:val="Compact"/>
+              <w:jc w:val="left"/>
+            </w:pPr>
+            <w:r>
+              <w:rPr>
+                <w:sz w:val="19"/>
+              </w:rPr>
+              <w:t xml:space="preserve">One logger on the bench for a full month or until the battery dies, which is the duration of expected battery life.</w:t>
+            </w:r>
+          </w:p>
+        </w:tc>
+        <w:tc>
+          <w:tcPr/>
+          <w:p>
+            <w:pPr>
+              <w:pStyle w:val="Compact"/>
+              <w:jc w:val="left"/>
+            </w:pPr>
+            <w:r>
+              <w:rPr>
+                <w:sz w:val="19"/>
+              </w:rPr>
+              <w:t xml:space="preserve">§4.3</w:t>
+            </w:r>
+          </w:p>
+        </w:tc>
+      </w:tr>
+      <w:tr>
+        <w:tc>
+          <w:tcPr/>
+          <w:p>
+            <w:pPr>
+              <w:pStyle w:val="Compact"/>
+              <w:jc w:val="left"/>
+            </w:pPr>
+            <w:r>
+              <w:rPr>
+                <w:sz w:val="19"/>
+              </w:rPr>
+              <w:t xml:space="preserve">3. Wear-detection accuracy</w:t>
+            </w:r>
+          </w:p>
+        </w:tc>
+        <w:tc>
+          <w:tcPr/>
+          <w:p>
+            <w:pPr>
+              <w:pStyle w:val="Compact"/>
+              <w:jc w:val="left"/>
+            </w:pPr>
+            <w:r>
+              <w:rPr>
+                <w:sz w:val="19"/>
+              </w:rPr>
+              <w:t xml:space="preserve">Not validated against ground truth</w:t>
+            </w:r>
+          </w:p>
+        </w:tc>
+        <w:tc>
+          <w:tcPr/>
+          <w:p>
+            <w:pPr>
+              <w:pStyle w:val="Compact"/>
+              <w:jc w:val="left"/>
+            </w:pPr>
+            <w:r>
+              <w:rPr>
+                <w:sz w:val="19"/>
+              </w:rPr>
+              <w:t xml:space="preserve">Collect ground truth on a few deployments (wear diary or reference sensor), check overnight wear especially, and re-tune the thresholds. Add each labelled recording to</w:t>
+            </w:r>
+            <w:r>
+              <w:rPr>
+                <w:sz w:val="19"/>
+              </w:rPr>
+              <w:t xml:space="preserve"> </w:t>
+            </w:r>
+            <w:r>
+              <w:rPr>
+                <w:rStyle w:val="VerbatimChar"/>
+                <w:sz w:val="19"/>
+              </w:rPr>
+              <w:t xml:space="preserve">tests/</w:t>
+            </w:r>
+            <w:r>
+              <w:rPr>
+                <w:sz w:val="19"/>
+              </w:rPr>
+              <w:t xml:space="preserve"> </w:t>
+            </w:r>
+            <w:r>
+              <w:rPr>
+                <w:sz w:val="19"/>
+              </w:rPr>
+              <w:t xml:space="preserve">as a regression case and record the new values in</w:t>
+            </w:r>
+            <w:r>
+              <w:rPr>
+                <w:sz w:val="19"/>
+              </w:rPr>
+              <w:t xml:space="preserve"> </w:t>
+            </w:r>
+            <w:r>
+              <w:rPr>
+                <w:rStyle w:val="VerbatimChar"/>
+                <w:sz w:val="19"/>
+              </w:rPr>
+              <w:t xml:space="preserve">HANDOFF.md</w:t>
+            </w:r>
+            <w:r>
+              <w:rPr>
+                <w:sz w:val="19"/>
+              </w:rPr>
+              <w:t xml:space="preserve"> </w:t>
+            </w:r>
+            <w:r>
+              <w:rPr>
+                <w:sz w:val="19"/>
+              </w:rPr>
+              <w:t xml:space="preserve">§4.</w:t>
+            </w:r>
+          </w:p>
+        </w:tc>
+        <w:tc>
+          <w:tcPr/>
+          <w:p>
+            <w:pPr>
+              <w:pStyle w:val="Compact"/>
+              <w:jc w:val="left"/>
+            </w:pPr>
+            <w:r>
+              <w:rPr>
+                <w:sz w:val="19"/>
+              </w:rPr>
+              <w:t xml:space="preserve">Appendix B; §5.1, §5.4</w:t>
+            </w:r>
+          </w:p>
+        </w:tc>
+      </w:tr>
+      <w:tr>
+        <w:tc>
+          <w:tcPr/>
+          <w:p>
+            <w:pPr>
+              <w:pStyle w:val="Compact"/>
+              <w:jc w:val="left"/>
+            </w:pPr>
+            <w:r>
+              <w:rPr>
+                <w:sz w:val="19"/>
+              </w:rPr>
+              <w:t xml:space="preserve">4. Clock drift</w:t>
+            </w:r>
+          </w:p>
+        </w:tc>
+        <w:tc>
+          <w:tcPr/>
+          <w:p>
+            <w:pPr>
+              <w:pStyle w:val="Compact"/>
+              <w:jc w:val="left"/>
+            </w:pPr>
+            <w:r>
+              <w:rPr>
+                <w:sz w:val="19"/>
+              </w:rPr>
+              <w:t xml:space="preserve">Not measured; expected negligible</w:t>
+            </w:r>
+          </w:p>
+        </w:tc>
+        <w:tc>
+          <w:tcPr/>
+          <w:p>
+            <w:pPr>
+              <w:pStyle w:val="Compact"/>
+              <w:jc w:val="left"/>
+            </w:pPr>
+            <w:r>
+              <w:rPr>
+                <w:sz w:val="19"/>
+              </w:rPr>
+              <w:t xml:space="preserve">At the end of each deployment, note the real time of the power-cycle and compare it with the last timestamp in the file. They should agree within one interval (5 minutes); a larger gap shows drift or a late power-on.</w:t>
+            </w:r>
+          </w:p>
+        </w:tc>
+        <w:tc>
+          <w:tcPr/>
+          <w:p>
+            <w:pPr>
+              <w:pStyle w:val="Compact"/>
+              <w:jc w:val="left"/>
+            </w:pPr>
+            <w:r>
+              <w:rPr>
+                <w:sz w:val="19"/>
+              </w:rPr>
+              <w:t xml:space="preserve">§4.4</w:t>
+            </w:r>
+          </w:p>
+        </w:tc>
+      </w:tr>
+      <w:tr>
+        <w:tc>
+          <w:tcPr/>
+          <w:p>
+            <w:pPr>
+              <w:pStyle w:val="Compact"/>
+              <w:jc w:val="left"/>
+            </w:pPr>
+            <w:r>
+              <w:rPr>
+                <w:sz w:val="19"/>
+              </w:rPr>
+              <w:t xml:space="preserve">5. Battery monitoring</w:t>
+            </w:r>
+          </w:p>
+        </w:tc>
+        <w:tc>
+          <w:tcPr/>
+          <w:p>
+            <w:pPr>
+              <w:pStyle w:val="Compact"/>
+              <w:jc w:val="left"/>
+            </w:pPr>
+            <w:r>
+              <w:rPr>
+                <w:sz w:val="19"/>
+              </w:rPr>
+              <w:t xml:space="preserve">Not started</w:t>
+            </w:r>
+          </w:p>
+        </w:tc>
+        <w:tc>
+          <w:tcPr/>
+          <w:p>
+            <w:pPr>
+              <w:pStyle w:val="Compact"/>
+              <w:jc w:val="left"/>
+            </w:pPr>
+            <w:r>
+              <w:rPr>
+                <w:sz w:val="19"/>
+              </w:rPr>
+              <w:t xml:space="preserve">Log the battery voltage with each reading, so a dying battery shows in the data.</w:t>
+            </w:r>
+          </w:p>
+        </w:tc>
+        <w:tc>
+          <w:tcPr/>
+          <w:p>
+            <w:pPr>
+              <w:pStyle w:val="Compact"/>
+              <w:jc w:val="left"/>
+            </w:pPr>
+            <w:r>
+              <w:rPr>
+                <w:sz w:val="19"/>
+              </w:rPr>
+              <w:t xml:space="preserve">–</w:t>
+            </w:r>
+          </w:p>
+        </w:tc>
+      </w:tr>
+      <w:tr>
+        <w:tc>
+          <w:tcPr/>
+          <w:p>
+            <w:pPr>
+              <w:pStyle w:val="Compact"/>
+              <w:jc w:val="left"/>
+            </w:pPr>
+            <w:r>
+              <w:rPr>
+                <w:sz w:val="19"/>
+              </w:rPr>
+              <w:t xml:space="preserve">6. Mode by USB presence (optional)</w:t>
+            </w:r>
+          </w:p>
+        </w:tc>
+        <w:tc>
+          <w:tcPr/>
+          <w:p>
+            <w:pPr>
+              <w:pStyle w:val="Compact"/>
+              <w:jc w:val="left"/>
+            </w:pPr>
+            <w:r>
+              <w:rPr>
+                <w:sz w:val="19"/>
+              </w:rPr>
+              <w:t xml:space="preserve">Not started</w:t>
+            </w:r>
+          </w:p>
+        </w:tc>
+        <w:tc>
+          <w:tcPr/>
+          <w:p>
+            <w:pPr>
+              <w:pStyle w:val="Compact"/>
+              <w:jc w:val="left"/>
+            </w:pPr>
+            <w:r>
+              <w:rPr>
+                <w:sz w:val="19"/>
+              </w:rPr>
+              <w:t xml:space="preserve">Choose idle or collection at power-up by whether USB is connected, so a reset during a deployment costs only a gap.</w:t>
+            </w:r>
+          </w:p>
+        </w:tc>
+        <w:tc>
+          <w:tcPr/>
+          <w:p>
+            <w:pPr>
+              <w:pStyle w:val="Compact"/>
+              <w:jc w:val="left"/>
+            </w:pPr>
+            <w:r>
+              <w:rPr>
+                <w:sz w:val="19"/>
+              </w:rPr>
+              <w:t xml:space="preserve">Appendix A.2; §4.1</w:t>
+            </w:r>
+          </w:p>
+        </w:tc>
+      </w:tr>
+    </w:tbl>
     <w:bookmarkEnd w:id="22"/>
-    <w:bookmarkStart w:id="23" w:name="recommended-next-steps"/>
+    <w:bookmarkStart w:id="23" w:name="documents-files-reference"/>
     <w:p>
       <w:pPr>
         <w:pStyle w:val="Heading2"/>
       </w:pPr>
       <w:r>
-        <w:t xml:space="preserve">1.3 Recommended next steps</w:t>
-      </w:r>
-    </w:p>
-    <w:p>
-      <w:pPr>
-        <w:numPr>
-          <w:ilvl w:val="0"/>
-          <w:numId w:val="1004"/>
-        </w:numPr>
-        <w:pStyle w:val="Compact"/>
-      </w:pPr>
-      <w:r>
-        <w:t xml:space="preserve">Fix the firmware issues together, in one firmware release (Appendix A): wrap-safe sleep (§4.4), the storage bound (§1.2), and, ideally, starting the recording at Initialize (§4.4). Upload the updated firmware and bench test.</w:t>
-      </w:r>
-    </w:p>
-    <w:p>
-      <w:pPr>
-        <w:numPr>
-          <w:ilvl w:val="0"/>
-          <w:numId w:val="1004"/>
-        </w:numPr>
-        <w:pStyle w:val="Compact"/>
-      </w:pPr>
-      <w:r>
-        <w:t xml:space="preserve">Measure full battery life: one logger on the bench for a full month or until the battery dies, which is the duration of expected battery life.</w:t>
-      </w:r>
-    </w:p>
-    <w:p>
-      <w:pPr>
-        <w:numPr>
-          <w:ilvl w:val="0"/>
-          <w:numId w:val="1004"/>
-        </w:numPr>
-        <w:pStyle w:val="Compact"/>
-      </w:pPr>
-      <w:r>
-        <w:t xml:space="preserve">Collect ground truth (Appendix B): a few deployments with a wear diary or a second reference sensor. Use them to check the detection algorithm, especially on overnight wear (§5.1), and re-tune the thresholds.</w:t>
-      </w:r>
-    </w:p>
-    <w:p>
-      <w:pPr>
-        <w:numPr>
-          <w:ilvl w:val="0"/>
-          <w:numId w:val="1004"/>
-        </w:numPr>
-        <w:pStyle w:val="Compact"/>
-      </w:pPr>
-      <w:r>
-        <w:t xml:space="preserve">At the end of each deployment, note the real time of the power-cycle and compare it with the last timestamp in the file. They should agree to within one interval (5 minutes); a larger gap shows clock drift or a late power-on. This costs nothing and replaces a dedicated drift test.</w:t>
-      </w:r>
-    </w:p>
-    <w:bookmarkEnd w:id="23"/>
-    <w:bookmarkStart w:id="24" w:name="documents-files-reference"/>
-    <w:p>
-      <w:pPr>
-        <w:pStyle w:val="Heading2"/>
-      </w:pPr>
-      <w:r>
-        <w:t xml:space="preserve">1.4 Documents &amp; files reference</w:t>
+        <w:t xml:space="preserve">1.3 Documents &amp; files reference</w:t>
       </w:r>
     </w:p>
     <w:tbl>
@@ -1788,21 +2138,21 @@
         </w:tc>
       </w:tr>
     </w:tbl>
-    <w:bookmarkEnd w:id="24"/>
-    <w:bookmarkStart w:id="25" w:name="handover-logistics"/>
+    <w:bookmarkEnd w:id="23"/>
+    <w:bookmarkStart w:id="24" w:name="handover-logistics"/>
     <w:p>
       <w:pPr>
         <w:pStyle w:val="Heading2"/>
       </w:pPr>
       <w:r>
-        <w:t xml:space="preserve">1.5 Handover logistics</w:t>
+        <w:t xml:space="preserve">1.4 Handover logistics</w:t>
       </w:r>
     </w:p>
     <w:p>
       <w:pPr>
         <w:numPr>
           <w:ilvl w:val="0"/>
-          <w:numId w:val="1005"/>
+          <w:numId w:val="1003"/>
         </w:numPr>
         <w:pStyle w:val="Compact"/>
       </w:pPr>
@@ -1824,7 +2174,7 @@
       <w:pPr>
         <w:numPr>
           <w:ilvl w:val="0"/>
-          <w:numId w:val="1005"/>
+          <w:numId w:val="1003"/>
         </w:numPr>
         <w:pStyle w:val="Compact"/>
       </w:pPr>
@@ -1846,7 +2196,7 @@
       <w:pPr>
         <w:numPr>
           <w:ilvl w:val="0"/>
-          <w:numId w:val="1005"/>
+          <w:numId w:val="1003"/>
         </w:numPr>
         <w:pStyle w:val="Compact"/>
       </w:pPr>
@@ -1864,9 +2214,9 @@
         <w:t xml:space="preserve">reach out to Jamie Kim (jamiejmkim.jmk@gmail.com).</w:t>
       </w:r>
     </w:p>
+    <w:bookmarkEnd w:id="24"/>
     <w:bookmarkEnd w:id="25"/>
-    <w:bookmarkEnd w:id="26"/>
-    <w:bookmarkStart w:id="27" w:name="key-terms"/>
+    <w:bookmarkStart w:id="26" w:name="key-terms"/>
     <w:p>
       <w:pPr>
         <w:pStyle w:val="Heading1"/>
@@ -2541,8 +2891,8 @@
         </w:tc>
       </w:tr>
     </w:tbl>
-    <w:bookmarkEnd w:id="27"/>
-    <w:bookmarkStart w:id="28" w:name="problem-and-goals"/>
+    <w:bookmarkEnd w:id="26"/>
+    <w:bookmarkStart w:id="27" w:name="problem-and-goals"/>
     <w:p>
       <w:pPr>
         <w:pStyle w:val="Heading1"/>
@@ -2782,8 +3132,8 @@
         <w:t xml:space="preserve">wear detection from body heat and sensor covering, at 5-minute resolution, for deployments of up to about a month.</w:t>
       </w:r>
     </w:p>
-    <w:bookmarkEnd w:id="28"/>
-    <w:bookmarkStart w:id="34" w:name="system-architecture"/>
+    <w:bookmarkEnd w:id="27"/>
+    <w:bookmarkStart w:id="33" w:name="system-architecture"/>
     <w:p>
       <w:pPr>
         <w:pStyle w:val="Heading1"/>
@@ -2809,18 +3159,18 @@
           <wp:inline>
             <wp:extent cx="5334000" cy="3200400"/>
             <wp:effectExtent b="0" l="0" r="0" t="0"/>
-            <wp:docPr descr="Figure 1. The logger’s states and what triggers each change." title="" id="30" name="Picture"/>
+            <wp:docPr descr="Figure 1. The logger’s states and what triggers each change." title="" id="29" name="Picture"/>
             <a:graphic>
               <a:graphicData uri="http://schemas.openxmlformats.org/drawingml/2006/picture">
                 <pic:pic>
                   <pic:nvPicPr>
-                    <pic:cNvPr descr="images/device_lifecycle.png" id="31" name="Picture"/>
+                    <pic:cNvPr descr="images/device_lifecycle.png" id="30" name="Picture"/>
                     <pic:cNvPicPr>
                       <a:picLocks noChangeArrowheads="1" noChangeAspect="1"/>
                     </pic:cNvPicPr>
                   </pic:nvPicPr>
                   <pic:blipFill>
-                    <a:blip r:embed="rId29"/>
+                    <a:blip r:embed="rId28"/>
                     <a:stretch>
                       <a:fillRect/>
                     </a:stretch>
@@ -2855,13 +3205,175 @@
         <w:t xml:space="preserve">Figure 1. The logger’s states and what triggers each change.</w:t>
       </w:r>
     </w:p>
-    <w:bookmarkStart w:id="32" w:name="X4d76758aa6b0c38cffa934231f019fecf83cf94"/>
+    <w:bookmarkStart w:id="31" w:name="X4d76758aa6b0c38cffa934231f019fecf83cf94"/>
     <w:p>
       <w:pPr>
         <w:pStyle w:val="Heading2"/>
       </w:pPr>
       <w:r>
         <w:t xml:space="preserve">3.1 Record on the device, analyze on the computer</w:t>
+      </w:r>
+    </w:p>
+    <w:p>
+      <w:pPr>
+        <w:numPr>
+          <w:ilvl w:val="0"/>
+          <w:numId w:val="1004"/>
+        </w:numPr>
+        <w:pStyle w:val="Compact"/>
+      </w:pPr>
+      <w:r>
+        <w:rPr>
+          <w:bCs/>
+          <w:b/>
+        </w:rPr>
+        <w:t xml:space="preserve">Design Decision:</w:t>
+      </w:r>
+      <w:r>
+        <w:t xml:space="preserve"> </w:t>
+      </w:r>
+      <w:r>
+        <w:t xml:space="preserve">The logger only measures and stores. All interpretation (time zones, wear detection, summaries) happens in the app.</w:t>
+      </w:r>
+    </w:p>
+    <w:p>
+      <w:pPr>
+        <w:numPr>
+          <w:ilvl w:val="0"/>
+          <w:numId w:val="1004"/>
+        </w:numPr>
+        <w:pStyle w:val="Compact"/>
+      </w:pPr>
+      <w:r>
+        <w:rPr>
+          <w:bCs/>
+          <w:b/>
+        </w:rPr>
+        <w:t xml:space="preserve">Why:</w:t>
+      </w:r>
+      <w:r>
+        <w:t xml:space="preserve"> </w:t>
+      </w:r>
+      <w:r>
+        <w:t xml:space="preserve">This enables fine-tuning the detection algorithm as raw recordings are preserved. It also keeps the firmware small and simple, ideal for low power mode operation.</w:t>
+      </w:r>
+    </w:p>
+    <w:p>
+      <w:pPr>
+        <w:numPr>
+          <w:ilvl w:val="0"/>
+          <w:numId w:val="1004"/>
+        </w:numPr>
+        <w:pStyle w:val="Compact"/>
+      </w:pPr>
+      <w:r>
+        <w:rPr>
+          <w:bCs/>
+          <w:b/>
+        </w:rPr>
+        <w:t xml:space="preserve">Alternatives:</w:t>
+      </w:r>
+      <w:r>
+        <w:t xml:space="preserve"> </w:t>
+      </w:r>
+      <w:r>
+        <w:t xml:space="preserve">Detecting wear on the board; streaming over Bluetooth to a phone (needs the patient’s phone and consumes more power).</w:t>
+      </w:r>
+    </w:p>
+    <w:bookmarkEnd w:id="31"/>
+    <w:bookmarkStart w:id="32" w:name="hardware"/>
+    <w:p>
+      <w:pPr>
+        <w:pStyle w:val="Heading2"/>
+      </w:pPr>
+      <w:r>
+        <w:t xml:space="preserve">3.2 Hardware</w:t>
+      </w:r>
+    </w:p>
+    <w:p>
+      <w:pPr>
+        <w:numPr>
+          <w:ilvl w:val="0"/>
+          <w:numId w:val="1005"/>
+        </w:numPr>
+        <w:pStyle w:val="Compact"/>
+      </w:pPr>
+      <w:r>
+        <w:rPr>
+          <w:bCs/>
+          <w:b/>
+        </w:rPr>
+        <w:t xml:space="preserve">Design Decision:</w:t>
+      </w:r>
+      <w:r>
+        <w:t xml:space="preserve"> </w:t>
+      </w:r>
+      <w:r>
+        <w:t xml:space="preserve">Arduino Nano 33 BLE Sense, using its built-in HS300x temperature and APDS9960 proximity sensors.</w:t>
+      </w:r>
+    </w:p>
+    <w:p>
+      <w:pPr>
+        <w:numPr>
+          <w:ilvl w:val="0"/>
+          <w:numId w:val="1005"/>
+        </w:numPr>
+        <w:pStyle w:val="Compact"/>
+      </w:pPr>
+      <w:r>
+        <w:rPr>
+          <w:bCs/>
+          <w:b/>
+        </w:rPr>
+        <w:t xml:space="preserve">Why:</w:t>
+      </w:r>
+      <w:r>
+        <w:t xml:space="preserve"> </w:t>
+      </w:r>
+      <w:r>
+        <w:t xml:space="preserve">Both sensors are already on the board, so there is no extra wiring. The nRF52840 has enough flash for a month of readings and can be put into a low-power state. The board also has Bluetooth available if pursuing a wireless version in future.</w:t>
+      </w:r>
+    </w:p>
+    <w:p>
+      <w:pPr>
+        <w:numPr>
+          <w:ilvl w:val="0"/>
+          <w:numId w:val="1005"/>
+        </w:numPr>
+        <w:pStyle w:val="Compact"/>
+      </w:pPr>
+      <w:r>
+        <w:rPr>
+          <w:bCs/>
+          <w:b/>
+        </w:rPr>
+        <w:t xml:space="preserve">Trade-off:</w:t>
+      </w:r>
+      <w:r>
+        <w:t xml:space="preserve"> </w:t>
+      </w:r>
+      <w:r>
+        <w:t xml:space="preserve">The board is larger and draws more current than a custom designed printed circuit board.</w:t>
+      </w:r>
+    </w:p>
+    <w:bookmarkEnd w:id="32"/>
+    <w:bookmarkEnd w:id="33"/>
+    <w:bookmarkStart w:id="42" w:name="firmware"/>
+    <w:p>
+      <w:pPr>
+        <w:pStyle w:val="Heading1"/>
+      </w:pPr>
+      <w:r>
+        <w:t xml:space="preserve">4. Firmware</w:t>
+      </w:r>
+    </w:p>
+    <w:bookmarkStart w:id="34" w:name="mode-chosen-by-power-up"/>
+    <w:p>
+      <w:pPr>
+        <w:pStyle w:val="Heading2"/>
+      </w:pPr>
+      <w:r>
+        <w:t xml:space="preserve">4.1 Mode chosen by power-up</w:t>
       </w:r>
     </w:p>
     <w:p>
@@ -2883,7 +3395,7 @@
         <w:t xml:space="preserve"> </w:t>
       </w:r>
       <w:r>
-        <w:t xml:space="preserve">The logger only measures and stores. All interpretation (time zones, wear detection, summaries) happens in the app.</w:t>
+        <w:t xml:space="preserve">The logger keeps a mode flag in flash and changes it on every power-up: an initialized logger with no data starts collecting; a collecting logger becomes idle (Figure 1).</w:t>
       </w:r>
     </w:p>
     <w:p>
@@ -2905,7 +3417,25 @@
         <w:t xml:space="preserve"> </w:t>
       </w:r>
       <w:r>
-        <w:t xml:space="preserve">This enables fine-tuning the detection algorithm as raw recordings are preserved. It also keeps the firmware small and simple, ideal for low power mode operation.</w:t>
+        <w:t xml:space="preserve">During collection USB is switched off to save power, so the computer can’t send a</w:t>
+      </w:r>
+      <w:r>
+        <w:t xml:space="preserve"> </w:t>
+      </w:r>
+      <w:r>
+        <w:t xml:space="preserve">“</w:t>
+      </w:r>
+      <w:r>
+        <w:t xml:space="preserve">stop</w:t>
+      </w:r>
+      <w:r>
+        <w:t xml:space="preserve">”</w:t>
+      </w:r>
+      <w:r>
+        <w:t xml:space="preserve"> </w:t>
+      </w:r>
+      <w:r>
+        <w:t xml:space="preserve">command. Power-cycling is the only control available without extra buttons.</w:t>
       </w:r>
     </w:p>
     <w:p>
@@ -2921,23 +3451,23 @@
           <w:bCs/>
           <w:b/>
         </w:rPr>
-        <w:t xml:space="preserve">Alternatives:</w:t>
-      </w:r>
-      <w:r>
-        <w:t xml:space="preserve"> </w:t>
-      </w:r>
-      <w:r>
-        <w:t xml:space="preserve">Detecting wear on the board; streaming over Bluetooth to a phone (needs the patient’s phone and consumes more power).</w:t>
-      </w:r>
-    </w:p>
-    <w:bookmarkEnd w:id="32"/>
-    <w:bookmarkStart w:id="33" w:name="hardware"/>
+        <w:t xml:space="preserve">Limitation:</w:t>
+      </w:r>
+      <w:r>
+        <w:t xml:space="preserve"> </w:t>
+      </w:r>
+      <w:r>
+        <w:t xml:space="preserve">The logger can’t be seen by the app while collecting; power-cycle it first. Any reset or power loss during collection also counts as a power-up, so the recording ends there: the data so far is kept, but nothing more is recorded. An alternative is §1.2 item 6.</w:t>
+      </w:r>
+    </w:p>
+    <w:bookmarkEnd w:id="34"/>
+    <w:bookmarkStart w:id="35" w:name="settings-stored-twice-ab-with-a-checksum"/>
     <w:p>
       <w:pPr>
         <w:pStyle w:val="Heading2"/>
       </w:pPr>
       <w:r>
-        <w:t xml:space="preserve">3.2 Hardware</w:t>
+        <w:t xml:space="preserve">4.2 Settings stored twice (A/B), with a checksum</w:t>
       </w:r>
     </w:p>
     <w:p>
@@ -2959,7 +3489,23 @@
         <w:t xml:space="preserve"> </w:t>
       </w:r>
       <w:r>
-        <w:t xml:space="preserve">Arduino Nano 33 BLE Sense, using its built-in HS300x temperature and APDS9960 proximity sensors.</w:t>
+        <w:t xml:space="preserve">The settings (start time, interval, participant ID, mode) are kept in two flash pages. Each save writes to the page</w:t>
+      </w:r>
+      <w:r>
+        <w:t xml:space="preserve"> </w:t>
+      </w:r>
+      <w:r>
+        <w:rPr>
+          <w:iCs/>
+          <w:i/>
+        </w:rPr>
+        <w:t xml:space="preserve">not</w:t>
+      </w:r>
+      <w:r>
+        <w:t xml:space="preserve"> </w:t>
+      </w:r>
+      <w:r>
+        <w:t xml:space="preserve">holding the current copy, with a magic number, sequence number and CRC; on power-up the newest valid copy wins.</w:t>
       </w:r>
     </w:p>
     <w:p>
@@ -2981,7 +3527,7 @@
         <w:t xml:space="preserve"> </w:t>
       </w:r>
       <w:r>
-        <w:t xml:space="preserve">Both sensors are already on the board, so there is no extra wiring. The nRF52840 has enough flash for a month of readings and can be put into a low-power state. The board also has Bluetooth available if pursuing a wireless version in future.</w:t>
+        <w:t xml:space="preserve">The earlier single-page layout could be wiped by a reset during a save, losing the start time. The A/B layout always leaves one good copy.</w:t>
       </w:r>
     </w:p>
     <w:p>
@@ -2997,33 +3543,38 @@
           <w:bCs/>
           <w:b/>
         </w:rPr>
-        <w:t xml:space="preserve">Trade-off:</w:t>
-      </w:r>
-      <w:r>
-        <w:t xml:space="preserve"> </w:t>
-      </w:r>
-      <w:r>
-        <w:t xml:space="preserve">The board is larger and draws more current than a custom designed printed circuit board.</w:t>
-      </w:r>
-    </w:p>
-    <w:bookmarkEnd w:id="33"/>
-    <w:bookmarkEnd w:id="34"/>
-    <w:bookmarkStart w:id="43" w:name="firmware"/>
-    <w:p>
-      <w:pPr>
-        <w:pStyle w:val="Heading1"/>
-      </w:pPr>
-      <w:r>
-        <w:t xml:space="preserve">4. Firmware</w:t>
-      </w:r>
-    </w:p>
-    <w:bookmarkStart w:id="35" w:name="mode-chosen-by-power-up"/>
+        <w:t xml:space="preserve">Constraint:</w:t>
+      </w:r>
+      <w:r>
+        <w:t xml:space="preserve"> </w:t>
+      </w:r>
+      <w:r>
+        <w:t xml:space="preserve">Loggers flashed before this change hold settings the current firmware doesn’t recognize. They report</w:t>
+      </w:r>
+      <w:r>
+        <w:t xml:space="preserve"> </w:t>
+      </w:r>
+      <w:r>
+        <w:rPr>
+          <w:rStyle w:val="VerbatimChar"/>
+        </w:rPr>
+        <w:t xml:space="preserve">UNKNOWN</w:t>
+      </w:r>
+      <w:r>
+        <w:t xml:space="preserve"> </w:t>
+      </w:r>
+      <w:r>
+        <w:t xml:space="preserve">start times until re-initialized; these loggers will need to be updated to the latest firmware.</w:t>
+      </w:r>
+    </w:p>
+    <w:bookmarkEnd w:id="35"/>
+    <w:bookmarkStart w:id="36" w:name="low-power-by-switching-peripherals-off"/>
     <w:p>
       <w:pPr>
         <w:pStyle w:val="Heading2"/>
       </w:pPr>
       <w:r>
-        <w:t xml:space="preserve">4.1 Mode chosen by power-up</w:t>
+        <w:t xml:space="preserve">4.3 Low power by switching peripherals off</w:t>
       </w:r>
     </w:p>
     <w:p>
@@ -3045,7 +3596,19 @@
         <w:t xml:space="preserve"> </w:t>
       </w:r>
       <w:r>
-        <w:t xml:space="preserve">The logger keeps a mode flag in flash and changes it on every power-up: an initialized logger with no data starts collecting; a collecting logger becomes idle (Figure 1).</w:t>
+        <w:t xml:space="preserve">During collection the firmware disables USB, UART, the radio and other unused peripherals, and waits between readings with</w:t>
+      </w:r>
+      <w:r>
+        <w:t xml:space="preserve"> </w:t>
+      </w:r>
+      <w:r>
+        <w:rPr>
+          <w:rStyle w:val="VerbatimChar"/>
+        </w:rPr>
+        <w:t xml:space="preserve">delay()</w:t>
+      </w:r>
+      <w:r>
+        <w:t xml:space="preserve">. Resting current measured below about 750 µA.</w:t>
       </w:r>
     </w:p>
     <w:p>
@@ -3067,57 +3630,29 @@
         <w:t xml:space="preserve"> </w:t>
       </w:r>
       <w:r>
-        <w:t xml:space="preserve">During collection USB is switched off to save power, so the computer can’t send a</w:t>
-      </w:r>
-      <w:r>
-        <w:t xml:space="preserve"> </w:t>
-      </w:r>
-      <w:r>
-        <w:t xml:space="preserve">“</w:t>
-      </w:r>
-      <w:r>
-        <w:t xml:space="preserve">stop</w:t>
-      </w:r>
-      <w:r>
-        <w:t xml:space="preserve">”</w:t>
-      </w:r>
-      <w:r>
-        <w:t xml:space="preserve"> </w:t>
-      </w:r>
-      <w:r>
-        <w:t xml:space="preserve">command. Power-cycling is the only control available without extra buttons.</w:t>
-      </w:r>
-    </w:p>
-    <w:p>
-      <w:pPr>
-        <w:numPr>
-          <w:ilvl w:val="0"/>
-          <w:numId w:val="1008"/>
-        </w:numPr>
-        <w:pStyle w:val="Compact"/>
-      </w:pPr>
-      <w:r>
-        <w:rPr>
-          <w:bCs/>
-          <w:b/>
-        </w:rPr>
-        <w:t xml:space="preserve">Limitation:</w:t>
-      </w:r>
-      <w:r>
-        <w:t xml:space="preserve"> </w:t>
-      </w:r>
-      <w:r>
-        <w:t xml:space="preserve">The logger can’t be seen by the app while collecting; power-cycle it first. Any reset or power loss during collection also counts as a power-up, so the recording ends there: the data so far is kept, but nothing more is recorded. Appendix A.2 describes an alternative.</w:t>
-      </w:r>
-    </w:p>
-    <w:bookmarkEnd w:id="35"/>
-    <w:bookmarkStart w:id="36" w:name="settings-stored-twice-ab-with-a-checksum"/>
+        <w:t xml:space="preserve">A deeper sleep (RTC2 timer +</w:t>
+      </w:r>
+      <w:r>
+        <w:t xml:space="preserve"> </w:t>
+      </w:r>
+      <w:r>
+        <w:rPr>
+          <w:rStyle w:val="VerbatimChar"/>
+        </w:rPr>
+        <w:t xml:space="preserve">__WFI</w:t>
+      </w:r>
+      <w:r>
+        <w:t xml:space="preserve">) was tried, but the Arduino never woke up to resume collecting data once in deep sleep; it may still be worth revisiting to further optimize battery life.</w:t>
+      </w:r>
+    </w:p>
+    <w:bookmarkEnd w:id="36"/>
+    <w:bookmarkStart w:id="40" w:name="X411b90941db8c81d2e6ca52c8267385abd623de"/>
     <w:p>
       <w:pPr>
         <w:pStyle w:val="Heading2"/>
       </w:pPr>
       <w:r>
-        <w:t xml:space="preserve">4.2 Settings stored twice (A/B), with a checksum</w:t>
+        <w:t xml:space="preserve">4.4 Fixed 5-minute interval, elapsed-time records</w:t>
       </w:r>
     </w:p>
     <w:p>
@@ -3139,23 +3674,43 @@
         <w:t xml:space="preserve"> </w:t>
       </w:r>
       <w:r>
-        <w:t xml:space="preserve">The settings (start time, interval, participant ID, mode) are kept in two flash pages. Each save writes to the page</w:t>
-      </w:r>
-      <w:r>
-        <w:t xml:space="preserve"> </w:t>
-      </w:r>
-      <w:r>
-        <w:rPr>
-          <w:iCs/>
-          <w:i/>
-        </w:rPr>
-        <w:t xml:space="preserve">not</w:t>
-      </w:r>
-      <w:r>
-        <w:t xml:space="preserve"> </w:t>
-      </w:r>
-      <w:r>
-        <w:t xml:space="preserve">holding the current copy, with a magic number, sequence number and CRC; on power-up the newest valid copy wins.</w:t>
+        <w:t xml:space="preserve">One reading every 300 s (</w:t>
+      </w:r>
+      <w:r>
+        <w:rPr>
+          <w:rStyle w:val="VerbatimChar"/>
+        </w:rPr>
+        <w:t xml:space="preserve">WAKEUP_INTERVAL_SECONDS</w:t>
+      </w:r>
+      <w:r>
+        <w:t xml:space="preserve"> </w:t>
+      </w:r>
+      <w:r>
+        <w:t xml:space="preserve">in</w:t>
+      </w:r>
+      <w:r>
+        <w:t xml:space="preserve"> </w:t>
+      </w:r>
+      <w:r>
+        <w:rPr>
+          <w:rStyle w:val="VerbatimChar"/>
+        </w:rPr>
+        <w:t xml:space="preserve">arduino.py</w:t>
+      </w:r>
+      <w:r>
+        <w:t xml:space="preserve">, sent at Initialize). Each record stores seconds elapsed since collection started (from</w:t>
+      </w:r>
+      <w:r>
+        <w:t xml:space="preserve"> </w:t>
+      </w:r>
+      <w:r>
+        <w:rPr>
+          <w:rStyle w:val="VerbatimChar"/>
+        </w:rPr>
+        <w:t xml:space="preserve">millis()</w:t>
+      </w:r>
+      <w:r>
+        <w:t xml:space="preserve">), plus temperature and proximity, in 12 bytes; the app adds the start time.</w:t>
       </w:r>
     </w:p>
     <w:p>
@@ -3177,7 +3732,7 @@
         <w:t xml:space="preserve"> </w:t>
       </w:r>
       <w:r>
-        <w:t xml:space="preserve">The earlier single-page layout could be wiped by a reset during a save, losing the start time. The A/B layout always leaves one good copy.</w:t>
+        <w:t xml:space="preserve">The board has no real-time clock, so elapsed time is the simplest reliable record. 5 minutes resolves wear periods well enough for daily totals, and fits a month in flash. The analysis infers the real interval from the timestamps, so the interval can be changed without changing the analysis. Figure 2 shows how one reading is stored and downloaded.</w:t>
       </w:r>
     </w:p>
     <w:p>
@@ -3193,94 +3748,45 @@
           <w:bCs/>
           <w:b/>
         </w:rPr>
-        <w:t xml:space="preserve">Constraint:</w:t>
-      </w:r>
-      <w:r>
-        <w:t xml:space="preserve"> </w:t>
-      </w:r>
-      <w:r>
-        <w:t xml:space="preserve">Loggers flashed before this change hold settings the current firmware doesn’t recognize. They report</w:t>
-      </w:r>
-      <w:r>
-        <w:t xml:space="preserve"> </w:t>
-      </w:r>
-      <w:r>
-        <w:rPr>
-          <w:rStyle w:val="VerbatimChar"/>
-        </w:rPr>
-        <w:t xml:space="preserve">UNKNOWN</w:t>
-      </w:r>
-      <w:r>
-        <w:t xml:space="preserve"> </w:t>
-      </w:r>
-      <w:r>
-        <w:t xml:space="preserve">start times until re-initialized; these loggers will need to be updated to the latest firmware.</w:t>
-      </w:r>
-    </w:p>
-    <w:bookmarkEnd w:id="36"/>
-    <w:bookmarkStart w:id="37" w:name="low-power-by-switching-peripherals-off"/>
-    <w:p>
-      <w:pPr>
-        <w:pStyle w:val="Heading2"/>
-      </w:pPr>
-      <w:r>
-        <w:t xml:space="preserve">4.3 Low power by switching peripherals off</w:t>
+        <w:t xml:space="preserve">Limitations:</w:t>
       </w:r>
     </w:p>
     <w:p>
       <w:pPr>
         <w:numPr>
-          <w:ilvl w:val="0"/>
+          <w:ilvl w:val="1"/>
           <w:numId w:val="1010"/>
         </w:numPr>
         <w:pStyle w:val="Compact"/>
       </w:pPr>
       <w:r>
         <w:rPr>
-          <w:bCs/>
-          <w:b/>
-        </w:rPr>
-        <w:t xml:space="preserve">Design Decision:</w:t>
-      </w:r>
-      <w:r>
-        <w:t xml:space="preserve"> </w:t>
-      </w:r>
-      <w:r>
-        <w:t xml:space="preserve">During collection the firmware disables USB, UART, the radio and other unused peripherals, and waits between readings with</w:t>
-      </w:r>
-      <w:r>
-        <w:t xml:space="preserve"> </w:t>
-      </w:r>
-      <w:r>
-        <w:rPr>
-          <w:rStyle w:val="VerbatimChar"/>
-        </w:rPr>
-        <w:t xml:space="preserve">delay()</w:t>
-      </w:r>
-      <w:r>
-        <w:t xml:space="preserve">. Resting current measured below about 750 µA.</w:t>
+          <w:iCs/>
+          <w:i/>
+        </w:rPr>
+        <w:t xml:space="preserve">Start time.</w:t>
+      </w:r>
+      <w:r>
+        <w:t xml:space="preserve"> </w:t>
+      </w:r>
+      <w:r>
+        <w:t xml:space="preserve">Elapsed time counts from the power-on that starts collection, while the start time is the one typed into the app at Initialize. Any gap between the two shifts every timestamp by that amount, and nothing in the file shows it. Fix: §1.2 item 1.</w:t>
       </w:r>
     </w:p>
     <w:p>
       <w:pPr>
         <w:numPr>
-          <w:ilvl w:val="0"/>
+          <w:ilvl w:val="1"/>
           <w:numId w:val="1010"/>
         </w:numPr>
         <w:pStyle w:val="Compact"/>
       </w:pPr>
       <w:r>
         <w:rPr>
-          <w:bCs/>
-          <w:b/>
-        </w:rPr>
-        <w:t xml:space="preserve">Why:</w:t>
-      </w:r>
-      <w:r>
-        <w:t xml:space="preserve"> </w:t>
-      </w:r>
-      <w:r>
-        <w:t xml:space="preserve">A deeper sleep (RTC2 timer +</w:t>
+          <w:iCs/>
+          <w:i/>
+        </w:rPr>
+        <w:t xml:space="preserve">Rollover.</w:t>
       </w:r>
       <w:r>
         <w:t xml:space="preserve"> </w:t>
@@ -3289,206 +3795,50 @@
         <w:rPr>
           <w:rStyle w:val="VerbatimChar"/>
         </w:rPr>
-        <w:t xml:space="preserve">__WFI</w:t>
-      </w:r>
-      <w:r>
-        <w:t xml:space="preserve">) was tried, but the Arduino never woke up to resume collecting data once in deep sleep; it may still be worth revisiting to further optimize battery life.</w:t>
-      </w:r>
-    </w:p>
-    <w:bookmarkEnd w:id="37"/>
-    <w:bookmarkStart w:id="41" w:name="X411b90941db8c81d2e6ca52c8267385abd623de"/>
-    <w:p>
-      <w:pPr>
-        <w:pStyle w:val="Heading2"/>
-      </w:pPr>
-      <w:r>
-        <w:t xml:space="preserve">4.4 Fixed 5-minute interval, elapsed-time records</w:t>
+        <w:t xml:space="preserve">millis()</w:t>
+      </w:r>
+      <w:r>
+        <w:t xml:space="preserve"> </w:t>
+      </w:r>
+      <w:r>
+        <w:t xml:space="preserve">is 32-bit and wraps at about 49.7 days, and the sleep check</w:t>
+      </w:r>
+      <w:r>
+        <w:t xml:space="preserve"> </w:t>
+      </w:r>
+      <w:r>
+        <w:rPr>
+          <w:rStyle w:val="VerbatimChar"/>
+        </w:rPr>
+        <w:t xml:space="preserve">nextWakeTime &gt; currentTime</w:t>
+      </w:r>
+      <w:r>
+        <w:t xml:space="preserve"> </w:t>
+      </w:r>
+      <w:r>
+        <w:t xml:space="preserve">is not wrap-safe: expect a burst of readings, then a long gap. The stored elapsed times stay correct. Fix: §1.2 item 1; until then, keep deployments to about a month.</w:t>
       </w:r>
     </w:p>
     <w:p>
       <w:pPr>
         <w:numPr>
-          <w:ilvl w:val="0"/>
-          <w:numId w:val="1011"/>
+          <w:ilvl w:val="1"/>
+          <w:numId w:val="1010"/>
         </w:numPr>
         <w:pStyle w:val="Compact"/>
       </w:pPr>
       <w:r>
         <w:rPr>
-          <w:bCs/>
-          <w:b/>
-        </w:rPr>
-        <w:t xml:space="preserve">Design Decision:</w:t>
-      </w:r>
-      <w:r>
-        <w:t xml:space="preserve"> </w:t>
-      </w:r>
-      <w:r>
-        <w:t xml:space="preserve">One reading every 300 s (</w:t>
-      </w:r>
-      <w:r>
-        <w:rPr>
-          <w:rStyle w:val="VerbatimChar"/>
-        </w:rPr>
-        <w:t xml:space="preserve">WAKEUP_INTERVAL_SECONDS</w:t>
-      </w:r>
-      <w:r>
-        <w:t xml:space="preserve"> </w:t>
-      </w:r>
-      <w:r>
-        <w:t xml:space="preserve">in</w:t>
-      </w:r>
-      <w:r>
-        <w:t xml:space="preserve"> </w:t>
-      </w:r>
-      <w:r>
-        <w:rPr>
-          <w:rStyle w:val="VerbatimChar"/>
-        </w:rPr>
-        <w:t xml:space="preserve">arduino.py</w:t>
-      </w:r>
-      <w:r>
-        <w:t xml:space="preserve">, sent at Initialize). Each record stores seconds elapsed since collection started (from</w:t>
-      </w:r>
-      <w:r>
-        <w:t xml:space="preserve"> </w:t>
-      </w:r>
-      <w:r>
-        <w:rPr>
-          <w:rStyle w:val="VerbatimChar"/>
-        </w:rPr>
-        <w:t xml:space="preserve">millis()</w:t>
-      </w:r>
-      <w:r>
-        <w:t xml:space="preserve">), plus temperature and proximity, in 12 bytes; the app adds the start time.</w:t>
-      </w:r>
-    </w:p>
-    <w:p>
-      <w:pPr>
-        <w:numPr>
-          <w:ilvl w:val="0"/>
-          <w:numId w:val="1011"/>
-        </w:numPr>
-        <w:pStyle w:val="Compact"/>
-      </w:pPr>
-      <w:r>
-        <w:rPr>
-          <w:bCs/>
-          <w:b/>
-        </w:rPr>
-        <w:t xml:space="preserve">Why:</w:t>
-      </w:r>
-      <w:r>
-        <w:t xml:space="preserve"> </w:t>
-      </w:r>
-      <w:r>
-        <w:t xml:space="preserve">The board has no real-time clock, so elapsed time is the simplest reliable record. 5 minutes resolves wear periods well enough for daily totals, and fits a month in flash. The analysis infers the real interval from the timestamps, so the interval can be changed without changing the analysis. Figure 2 shows how one reading is stored and downloaded.</w:t>
-      </w:r>
-    </w:p>
-    <w:p>
-      <w:pPr>
-        <w:numPr>
-          <w:ilvl w:val="0"/>
-          <w:numId w:val="1011"/>
-        </w:numPr>
-        <w:pStyle w:val="Compact"/>
-      </w:pPr>
-      <w:r>
-        <w:rPr>
-          <w:bCs/>
-          <w:b/>
-        </w:rPr>
-        <w:t xml:space="preserve">Limitations:</w:t>
-      </w:r>
-    </w:p>
-    <w:p>
-      <w:pPr>
-        <w:numPr>
-          <w:ilvl w:val="1"/>
-          <w:numId w:val="1012"/>
-        </w:numPr>
-        <w:pStyle w:val="Compact"/>
-      </w:pPr>
-      <w:r>
-        <w:rPr>
           <w:iCs/>
           <w:i/>
         </w:rPr>
-        <w:t xml:space="preserve">Start time.</w:t>
-      </w:r>
-      <w:r>
-        <w:t xml:space="preserve"> </w:t>
-      </w:r>
-      <w:r>
-        <w:t xml:space="preserve">Elapsed time counts from the power-on that starts collection, while the start time is the one typed into the app at Initialize. Any gap between the two shifts every timestamp by that amount, and nothing in the file shows it. Appendix A.1 describes a fix.</w:t>
-      </w:r>
-    </w:p>
-    <w:p>
-      <w:pPr>
-        <w:numPr>
-          <w:ilvl w:val="1"/>
-          <w:numId w:val="1012"/>
-        </w:numPr>
-        <w:pStyle w:val="Compact"/>
-      </w:pPr>
-      <w:r>
-        <w:rPr>
-          <w:iCs/>
-          <w:i/>
-        </w:rPr>
-        <w:t xml:space="preserve">Rollover.</w:t>
-      </w:r>
-      <w:r>
-        <w:t xml:space="preserve"> </w:t>
-      </w:r>
-      <w:r>
-        <w:rPr>
-          <w:rStyle w:val="VerbatimChar"/>
-        </w:rPr>
-        <w:t xml:space="preserve">millis()</w:t>
-      </w:r>
-      <w:r>
-        <w:t xml:space="preserve"> </w:t>
-      </w:r>
-      <w:r>
-        <w:t xml:space="preserve">is 32-bit and wraps at about 49.7 days, and the sleep check</w:t>
-      </w:r>
-      <w:r>
-        <w:t xml:space="preserve"> </w:t>
-      </w:r>
-      <w:r>
-        <w:rPr>
-          <w:rStyle w:val="VerbatimChar"/>
-        </w:rPr>
-        <w:t xml:space="preserve">nextWakeTime &gt; currentTime</w:t>
-      </w:r>
-      <w:r>
-        <w:t xml:space="preserve"> </w:t>
-      </w:r>
-      <w:r>
-        <w:t xml:space="preserve">is not wrap-safe: expect a burst of readings, then a long gap. The stored elapsed times stay correct. Fix in Appendix A.3; until then, keep deployments to about a month.</w:t>
-      </w:r>
-    </w:p>
-    <w:p>
-      <w:pPr>
-        <w:numPr>
-          <w:ilvl w:val="1"/>
-          <w:numId w:val="1012"/>
-        </w:numPr>
-        <w:pStyle w:val="Compact"/>
-      </w:pPr>
-      <w:r>
-        <w:rPr>
-          <w:iCs/>
-          <w:i/>
-        </w:rPr>
         <w:t xml:space="preserve">Clock accuracy.</w:t>
       </w:r>
       <w:r>
         <w:t xml:space="preserve"> </w:t>
       </w:r>
       <w:r>
-        <w:t xml:space="preserve">Timestamps rely on the board’s oscillator, with no correction. With the board’s crystal (tens of ppm) the error is about 1–2 minutes a month, well under one interval; while this is not measured directly, it is a commonly known limitation of using onboard crystal (§1.3 step 4).</w:t>
+        <w:t xml:space="preserve">Timestamps rely on the board’s oscillator, with no correction. With the board’s crystal (tens of ppm) the error is about 1–2 minutes a month, well under one interval; while this is not measured directly, it is a commonly known limitation of using onboard crystal (check: §1.2 item 4).</w:t>
       </w:r>
     </w:p>
     <w:p>
@@ -3500,18 +3850,18 @@
           <wp:inline>
             <wp:extent cx="5334000" cy="2570321"/>
             <wp:effectExtent b="0" l="0" r="0" t="0"/>
-            <wp:docPr descr="Figure 2. One reading, from flash to the downloaded CSV." title="" id="39" name="Picture"/>
+            <wp:docPr descr="Figure 2. One reading, from flash to the downloaded CSV." title="" id="38" name="Picture"/>
             <a:graphic>
               <a:graphicData uri="http://schemas.openxmlformats.org/drawingml/2006/picture">
                 <pic:pic>
                   <pic:nvPicPr>
-                    <pic:cNvPr descr="images/data_row.png" id="40" name="Picture"/>
+                    <pic:cNvPr descr="images/data_row.png" id="39" name="Picture"/>
                     <pic:cNvPicPr>
                       <a:picLocks noChangeArrowheads="1" noChangeAspect="1"/>
                     </pic:cNvPicPr>
                   </pic:nvPicPr>
                   <pic:blipFill>
-                    <a:blip r:embed="rId38"/>
+                    <a:blip r:embed="rId37"/>
                     <a:stretch>
                       <a:fillRect/>
                     </a:stretch>
@@ -3546,14 +3896,207 @@
         <w:t xml:space="preserve">Figure 2. One reading, from flash to the downloaded CSV.</w:t>
       </w:r>
     </w:p>
+    <w:bookmarkEnd w:id="40"/>
+    <w:bookmarkStart w:id="41" w:name="robust-proximity-reads"/>
+    <w:p>
+      <w:pPr>
+        <w:pStyle w:val="Heading2"/>
+      </w:pPr>
+      <w:r>
+        <w:t xml:space="preserve">4.5 Robust proximity reads</w:t>
+      </w:r>
+    </w:p>
+    <w:p>
+      <w:pPr>
+        <w:numPr>
+          <w:ilvl w:val="0"/>
+          <w:numId w:val="1011"/>
+        </w:numPr>
+        <w:pStyle w:val="Compact"/>
+      </w:pPr>
+      <w:r>
+        <w:rPr>
+          <w:bCs/>
+          <w:b/>
+        </w:rPr>
+        <w:t xml:space="preserve">Design Decision:</w:t>
+      </w:r>
+      <w:r>
+        <w:t xml:space="preserve"> </w:t>
+      </w:r>
+      <w:r>
+        <w:t xml:space="preserve">Discard the first 2 proximity samples after the sensor wakes, and bound every wait with a timeout; a missing sensor logs</w:t>
+      </w:r>
+      <w:r>
+        <w:t xml:space="preserve"> </w:t>
+      </w:r>
+      <w:r>
+        <w:rPr>
+          <w:rStyle w:val="VerbatimChar"/>
+        </w:rPr>
+        <w:t xml:space="preserve">0</w:t>
+      </w:r>
+      <w:r>
+        <w:t xml:space="preserve">.</w:t>
+      </w:r>
+    </w:p>
+    <w:p>
+      <w:pPr>
+        <w:numPr>
+          <w:ilvl w:val="0"/>
+          <w:numId w:val="1011"/>
+        </w:numPr>
+        <w:pStyle w:val="Compact"/>
+      </w:pPr>
+      <w:r>
+        <w:rPr>
+          <w:bCs/>
+          <w:b/>
+        </w:rPr>
+        <w:t xml:space="preserve">Why:</w:t>
+      </w:r>
+      <w:r>
+        <w:t xml:space="preserve"> </w:t>
+      </w:r>
+      <w:r>
+        <w:t xml:space="preserve">The first samples after wake-up are unsettled, and an unbounded wait on a faulty sensor would freeze the logger for the rest of the deployment.</w:t>
+      </w:r>
+    </w:p>
     <w:bookmarkEnd w:id="41"/>
-    <w:bookmarkStart w:id="42" w:name="robust-proximity-reads"/>
+    <w:bookmarkEnd w:id="42"/>
+    <w:bookmarkStart w:id="47" w:name="wear-detection-algorithm"/>
+    <w:p>
+      <w:pPr>
+        <w:pStyle w:val="Heading1"/>
+      </w:pPr>
+      <w:r>
+        <w:t xml:space="preserve">5. Wear-detection algorithm</w:t>
+      </w:r>
+    </w:p>
+    <w:p>
+      <w:pPr>
+        <w:pStyle w:val="FirstParagraph"/>
+      </w:pPr>
+      <w:r>
+        <w:t xml:space="preserve">Full parameter table:</w:t>
+      </w:r>
+      <w:r>
+        <w:t xml:space="preserve"> </w:t>
+      </w:r>
+      <w:r>
+        <w:rPr>
+          <w:rStyle w:val="VerbatimChar"/>
+        </w:rPr>
+        <w:t xml:space="preserve">HANDOFF.md</w:t>
+      </w:r>
+      <w:r>
+        <w:t xml:space="preserve"> </w:t>
+      </w:r>
+      <w:r>
+        <w:t xml:space="preserve">§4.</w:t>
+      </w:r>
+    </w:p>
+    <w:bookmarkStart w:id="43" w:name="temperature-above-a-rolling-baseline"/>
     <w:p>
       <w:pPr>
         <w:pStyle w:val="Heading2"/>
       </w:pPr>
       <w:r>
-        <w:t xml:space="preserve">4.5 Robust proximity reads</w:t>
+        <w:t xml:space="preserve">5.1 Temperature above a rolling baseline</w:t>
+      </w:r>
+    </w:p>
+    <w:p>
+      <w:pPr>
+        <w:numPr>
+          <w:ilvl w:val="0"/>
+          <w:numId w:val="1012"/>
+        </w:numPr>
+        <w:pStyle w:val="Compact"/>
+      </w:pPr>
+      <w:r>
+        <w:rPr>
+          <w:bCs/>
+          <w:b/>
+        </w:rPr>
+        <w:t xml:space="preserve">Design Decision:</w:t>
+      </w:r>
+      <w:r>
+        <w:t xml:space="preserve"> </w:t>
+      </w:r>
+      <w:r>
+        <w:t xml:space="preserve">Take room temperature as the rolling minimum over about 2 hours, and look at the rise above it (delta). An event starts when the proximity sensor is covered, the temperature has risen over the last ~15 minutes, and either the jump is ≥ 0.8 °C in one sample or the rise is ≥ 3 °C. It ends when the proximity sensor is uncovered, or the temperature is falling fast (≥ 0.4 °C per sample) and is near baseline or below 80 % of the event’s peak rise.</w:t>
+      </w:r>
+    </w:p>
+    <w:p>
+      <w:pPr>
+        <w:numPr>
+          <w:ilvl w:val="0"/>
+          <w:numId w:val="1012"/>
+        </w:numPr>
+        <w:pStyle w:val="Compact"/>
+      </w:pPr>
+      <w:r>
+        <w:rPr>
+          <w:bCs/>
+          <w:b/>
+        </w:rPr>
+        <w:t xml:space="preserve">Why:</w:t>
+      </w:r>
+      <w:r>
+        <w:t xml:space="preserve"> </w:t>
+      </w:r>
+      <w:r>
+        <w:t xml:space="preserve">Room temperature changes over the day, so a fixed threshold would fail; the rolling minimum follows it. The 15-minute trend check stops cooling slopes from triggering false onsets.</w:t>
+      </w:r>
+    </w:p>
+    <w:p>
+      <w:pPr>
+        <w:numPr>
+          <w:ilvl w:val="0"/>
+          <w:numId w:val="1012"/>
+        </w:numPr>
+        <w:pStyle w:val="Compact"/>
+      </w:pPr>
+      <w:r>
+        <w:rPr>
+          <w:bCs/>
+          <w:b/>
+        </w:rPr>
+        <w:t xml:space="preserve">Limitation:</w:t>
+      </w:r>
+      <w:r>
+        <w:t xml:space="preserve"> </w:t>
+      </w:r>
+      <w:r>
+        <w:t xml:space="preserve">After about an hour of continuous wear the 2-hour window holds only</w:t>
+      </w:r>
+      <w:r>
+        <w:t xml:space="preserve"> </w:t>
+      </w:r>
+      <w:r>
+        <w:t xml:space="preserve">“</w:t>
+      </w:r>
+      <w:r>
+        <w:t xml:space="preserve">worn</w:t>
+      </w:r>
+      <w:r>
+        <w:t xml:space="preserve">”</w:t>
+      </w:r>
+      <w:r>
+        <w:t xml:space="preserve"> </w:t>
+      </w:r>
+      <w:r>
+        <w:t xml:space="preserve">samples, so the baseline rises to skin temperature and delta falls to about 0. From then on, a single drop of 0.4 °C between samples ends the event, and it cannot restart (that needs delta ≥ 3 °C or a jump ≥ 0.8 °C). On synthetic 8-hour overnight wear, noise with a standard deviation of 0.15 °C split the nights into short pieces; with 0.04 °C they were detected whole. Possible fixes are in Appendix B.2; validation is §1.2 item 3.</w:t>
+      </w:r>
+    </w:p>
+    <w:bookmarkEnd w:id="43"/>
+    <w:bookmarkStart w:id="44" w:name="proximity-as-a-gate"/>
+    <w:p>
+      <w:pPr>
+        <w:pStyle w:val="Heading2"/>
+      </w:pPr>
+      <w:r>
+        <w:t xml:space="preserve">5.2 Proximity as a gate</w:t>
       </w:r>
     </w:p>
     <w:p>
@@ -3575,19 +4118,22 @@
         <w:t xml:space="preserve"> </w:t>
       </w:r>
       <w:r>
-        <w:t xml:space="preserve">Discard the first 2 proximity samples after the sensor wakes, and bound every wait with a timeout; a missing sensor logs</w:t>
-      </w:r>
-      <w:r>
-        <w:t xml:space="preserve"> </w:t>
-      </w:r>
-      <w:r>
-        <w:rPr>
-          <w:rStyle w:val="VerbatimChar"/>
-        </w:rPr>
-        <w:t xml:space="preserve">0</w:t>
-      </w:r>
-      <w:r>
-        <w:t xml:space="preserve">.</w:t>
+        <w:t xml:space="preserve">Use the proximity sensor only to confirm</w:t>
+      </w:r>
+      <w:r>
+        <w:t xml:space="preserve"> </w:t>
+      </w:r>
+      <w:r>
+        <w:t xml:space="preserve">“</w:t>
+      </w:r>
+      <w:r>
+        <w:t xml:space="preserve">covered</w:t>
+      </w:r>
+      <w:r>
+        <w:t xml:space="preserve">”</w:t>
+      </w:r>
+      <w:r>
+        <w:t xml:space="preserve">, not to detect wear on its own.</w:t>
       </w:r>
     </w:p>
     <w:p>
@@ -3609,50 +4155,29 @@
         <w:t xml:space="preserve"> </w:t>
       </w:r>
       <w:r>
-        <w:t xml:space="preserve">The first samples after wake-up are unsettled, and an unbounded wait on a faulty sensor would freeze the logger for the rest of the deployment.</w:t>
-      </w:r>
-    </w:p>
-    <w:bookmarkEnd w:id="42"/>
-    <w:bookmarkEnd w:id="43"/>
-    <w:bookmarkStart w:id="48" w:name="wear-detection-algorithm"/>
-    <w:p>
-      <w:pPr>
-        <w:pStyle w:val="Heading1"/>
-      </w:pPr>
-      <w:r>
-        <w:t xml:space="preserve">5. Wear-detection algorithm</w:t>
-      </w:r>
-    </w:p>
-    <w:p>
-      <w:pPr>
-        <w:pStyle w:val="FirstParagraph"/>
-      </w:pPr>
-      <w:r>
-        <w:t xml:space="preserve">Full parameter table:</w:t>
-      </w:r>
-      <w:r>
-        <w:t xml:space="preserve"> </w:t>
-      </w:r>
-      <w:r>
-        <w:rPr>
-          <w:rStyle w:val="VerbatimChar"/>
-        </w:rPr>
-        <w:t xml:space="preserve">HANDOFF.md</w:t>
-      </w:r>
-      <w:r>
-        <w:t xml:space="preserve"> </w:t>
-      </w:r>
-      <w:r>
-        <w:t xml:space="preserve">§4.</w:t>
-      </w:r>
-    </w:p>
-    <w:bookmarkStart w:id="44" w:name="temperature-above-a-rolling-baseline"/>
+        <w:t xml:space="preserve">Temperature alone can’t tell wear from a warm environment (e.g. the splint left on a radiator or in the sun); the covered sensor rules those out.</w:t>
+      </w:r>
+    </w:p>
+    <w:bookmarkEnd w:id="44"/>
+    <w:bookmarkStart w:id="45" w:name="drift-invariant-covered"/>
     <w:p>
       <w:pPr>
         <w:pStyle w:val="Heading2"/>
       </w:pPr>
       <w:r>
-        <w:t xml:space="preserve">5.1 Temperature above a rolling baseline</w:t>
+        <w:t xml:space="preserve">5.3 Drift-invariant</w:t>
+      </w:r>
+      <w:r>
+        <w:t xml:space="preserve"> </w:t>
+      </w:r>
+      <w:r>
+        <w:t xml:space="preserve">“</w:t>
+      </w:r>
+      <w:r>
+        <w:t xml:space="preserve">covered</w:t>
+      </w:r>
+      <w:r>
+        <w:t xml:space="preserve">”</w:t>
       </w:r>
     </w:p>
     <w:p>
@@ -3674,7 +4199,16 @@
         <w:t xml:space="preserve"> </w:t>
       </w:r>
       <w:r>
-        <w:t xml:space="preserve">Take room temperature as the rolling minimum over about 2 hours, and look at the rise above it (delta). An event starts when the proximity sensor is covered, the temperature has risen over the last ~15 minutes, and either the jump is ≥ 0.8 °C in one sample or the rise is ≥ 3 °C. It ends when the proximity sensor is uncovered, or the temperature is falling fast (≥ 0.4 °C per sample) and is near baseline or below 80 % of the event’s peak rise.</w:t>
+        <w:t xml:space="preserve">Track the proximity floor as the rolling 10th percentile over about a day, subtract it, and call the sensor covered when the remainder is within the noise (</w:t>
+      </w:r>
+      <w:r>
+        <w:rPr>
+          <w:rStyle w:val="VerbatimChar"/>
+        </w:rPr>
+        <w:t xml:space="preserve">max(5, 4 × MAD)</w:t>
+      </w:r>
+      <w:r>
+        <w:t xml:space="preserve">, where MAD is the median absolute deviation).</w:t>
       </w:r>
     </w:p>
     <w:p>
@@ -3696,57 +4230,45 @@
         <w:t xml:space="preserve"> </w:t>
       </w:r>
       <w:r>
-        <w:t xml:space="preserve">Room temperature changes over the day, so a fixed threshold would fail; the rolling minimum follows it. The 15-minute trend check stops cooling slopes from triggering false onsets.</w:t>
-      </w:r>
-    </w:p>
-    <w:p>
-      <w:pPr>
-        <w:numPr>
-          <w:ilvl w:val="0"/>
-          <w:numId w:val="1014"/>
-        </w:numPr>
-        <w:pStyle w:val="Compact"/>
-      </w:pPr>
-      <w:r>
-        <w:rPr>
-          <w:bCs/>
-          <w:b/>
-        </w:rPr>
-        <w:t xml:space="preserve">Limitation:</w:t>
-      </w:r>
-      <w:r>
-        <w:t xml:space="preserve"> </w:t>
-      </w:r>
-      <w:r>
-        <w:t xml:space="preserve">After about an hour of continuous wear the 2-hour window holds only</w:t>
-      </w:r>
-      <w:r>
-        <w:t xml:space="preserve"> </w:t>
-      </w:r>
-      <w:r>
-        <w:t xml:space="preserve">“</w:t>
-      </w:r>
-      <w:r>
-        <w:t xml:space="preserve">worn</w:t>
-      </w:r>
-      <w:r>
-        <w:t xml:space="preserve">”</w:t>
-      </w:r>
-      <w:r>
-        <w:t xml:space="preserve"> </w:t>
-      </w:r>
-      <w:r>
-        <w:t xml:space="preserve">samples, so the baseline rises to skin temperature and delta falls to about 0. From then on, a single drop of 0.4 °C between samples ends the event, and it cannot restart (that needs delta ≥ 3 °C or a jump ≥ 0.8 °C). On synthetic 8-hour overnight wear, noise with a standard deviation of 0.15 °C split the nights into short pieces; with 0.04 °C they were detected whole. Possible fixes are in Appendix B.2.</w:t>
-      </w:r>
-    </w:p>
-    <w:bookmarkEnd w:id="44"/>
-    <w:bookmarkStart w:id="45" w:name="proximity-as-a-gate"/>
+        <w:t xml:space="preserve">On a 35-day recording the proximity reading while worn crept from 0 into the 50s as the battery discharged. The original test (</w:t>
+      </w:r>
+      <w:r>
+        <w:rPr>
+          <w:rStyle w:val="VerbatimChar"/>
+        </w:rPr>
+        <w:t xml:space="preserve">prox == 0</w:t>
+      </w:r>
+      <w:r>
+        <w:t xml:space="preserve">) stopped working after about 11 days, and wear was missed from then on.</w:t>
+      </w:r>
+    </w:p>
+    <w:bookmarkEnd w:id="45"/>
+    <w:bookmarkStart w:id="46" w:name="thresholds-are-empirical"/>
     <w:p>
       <w:pPr>
         <w:pStyle w:val="Heading2"/>
       </w:pPr>
       <w:r>
-        <w:t xml:space="preserve">5.2 Proximity as a gate</w:t>
+        <w:t xml:space="preserve">5.4 Thresholds are empirical</w:t>
+      </w:r>
+    </w:p>
+    <w:p>
+      <w:pPr>
+        <w:pStyle w:val="FirstParagraph"/>
+      </w:pPr>
+      <w:r>
+        <w:t xml:space="preserve">All thresholds were set by inspecting a small number of recordings. A finer tuning may be required based on the larger sample data. Appendix B describes further on how.</w:t>
+      </w:r>
+    </w:p>
+    <w:bookmarkEnd w:id="46"/>
+    <w:bookmarkEnd w:id="47"/>
+    <w:bookmarkStart w:id="48" w:name="time-handling"/>
+    <w:p>
+      <w:pPr>
+        <w:pStyle w:val="Heading1"/>
+      </w:pPr>
+      <w:r>
+        <w:t xml:space="preserve">6. Time handling</w:t>
       </w:r>
     </w:p>
     <w:p>
@@ -3768,22 +4290,32 @@
         <w:t xml:space="preserve"> </w:t>
       </w:r>
       <w:r>
-        <w:t xml:space="preserve">Use the proximity sensor only to confirm</w:t>
-      </w:r>
-      <w:r>
-        <w:t xml:space="preserve"> </w:t>
-      </w:r>
-      <w:r>
-        <w:t xml:space="preserve">“</w:t>
-      </w:r>
-      <w:r>
-        <w:t xml:space="preserve">covered</w:t>
-      </w:r>
-      <w:r>
-        <w:t xml:space="preserve">”</w:t>
-      </w:r>
-      <w:r>
-        <w:t xml:space="preserve">, not to detect wear on its own.</w:t>
+        <w:t xml:space="preserve">The logger knows only UTC epoch seconds. The app asks for and shows</w:t>
+      </w:r>
+      <w:r>
+        <w:t xml:space="preserve"> </w:t>
+      </w:r>
+      <w:r>
+        <w:rPr>
+          <w:bCs/>
+          <w:b/>
+        </w:rPr>
+        <w:t xml:space="preserve">Eastern time</w:t>
+      </w:r>
+      <w:r>
+        <w:t xml:space="preserve"> </w:t>
+      </w:r>
+      <w:r>
+        <w:t xml:space="preserve">(America/New_York, daylight-saving aware) everywhere, and writes timestamps with their UTC offset (e.g. </w:t>
+      </w:r>
+      <w:r>
+        <w:rPr>
+          <w:rStyle w:val="VerbatimChar"/>
+        </w:rPr>
+        <w:t xml:space="preserve">-04:00</w:t>
+      </w:r>
+      <w:r>
+        <w:t xml:space="preserve">).</w:t>
       </w:r>
     </w:p>
     <w:p>
@@ -3805,29 +4337,73 @@
         <w:t xml:space="preserve"> </w:t>
       </w:r>
       <w:r>
-        <w:t xml:space="preserve">Temperature alone can’t tell wear from a warm environment (e.g. the splint left on a radiator or in the sun); the covered sensor rules those out.</w:t>
-      </w:r>
-    </w:p>
-    <w:bookmarkEnd w:id="45"/>
-    <w:bookmarkStart w:id="46" w:name="drift-invariant-covered"/>
-    <w:p>
-      <w:pPr>
-        <w:pStyle w:val="Heading2"/>
-      </w:pPr>
-      <w:r>
-        <w:t xml:space="preserve">5.3 Drift-invariant</w:t>
-      </w:r>
-      <w:r>
-        <w:t xml:space="preserve"> </w:t>
-      </w:r>
-      <w:r>
-        <w:t xml:space="preserve">“</w:t>
-      </w:r>
-      <w:r>
-        <w:t xml:space="preserve">covered</w:t>
-      </w:r>
-      <w:r>
-        <w:t xml:space="preserve">”</w:t>
+        <w:t xml:space="preserve">The study runs in Ontario. The offset keeps the repeated hour at the November change unambiguous, and durations across the change come out right.</w:t>
+      </w:r>
+    </w:p>
+    <w:p>
+      <w:pPr>
+        <w:numPr>
+          <w:ilvl w:val="0"/>
+          <w:numId w:val="1015"/>
+        </w:numPr>
+        <w:pStyle w:val="Compact"/>
+      </w:pPr>
+      <w:r>
+        <w:rPr>
+          <w:bCs/>
+          <w:b/>
+        </w:rPr>
+        <w:t xml:space="preserve">Recovery:</w:t>
+      </w:r>
+      <w:r>
+        <w:t xml:space="preserve"> </w:t>
+      </w:r>
+      <w:r>
+        <w:t xml:space="preserve">If a logger loses its start time, the elapsed times survive. The app detects such files and rebuilds the timestamps from a start time the user enters, during download or on the Data Analysis page.</w:t>
+      </w:r>
+    </w:p>
+    <w:p>
+      <w:pPr>
+        <w:numPr>
+          <w:ilvl w:val="0"/>
+          <w:numId w:val="1015"/>
+        </w:numPr>
+        <w:pStyle w:val="Compact"/>
+      </w:pPr>
+      <w:r>
+        <w:rPr>
+          <w:bCs/>
+          <w:b/>
+        </w:rPr>
+        <w:t xml:space="preserve">To change the zone:</w:t>
+      </w:r>
+      <w:r>
+        <w:t xml:space="preserve"> </w:t>
+      </w:r>
+      <w:r>
+        <w:t xml:space="preserve">edit</w:t>
+      </w:r>
+      <w:r>
+        <w:t xml:space="preserve"> </w:t>
+      </w:r>
+      <w:r>
+        <w:rPr>
+          <w:rStyle w:val="VerbatimChar"/>
+        </w:rPr>
+        <w:t xml:space="preserve">timezone_config.py</w:t>
+      </w:r>
+      <w:r>
+        <w:t xml:space="preserve">.</w:t>
+      </w:r>
+    </w:p>
+    <w:bookmarkEnd w:id="48"/>
+    <w:bookmarkStart w:id="49" w:name="desktop-application"/>
+    <w:p>
+      <w:pPr>
+        <w:pStyle w:val="Heading1"/>
+      </w:pPr>
+      <w:r>
+        <w:t xml:space="preserve">7. Desktop application</w:t>
       </w:r>
     </w:p>
     <w:p>
@@ -3843,22 +4419,28 @@
           <w:bCs/>
           <w:b/>
         </w:rPr>
-        <w:t xml:space="preserve">Design Decision:</w:t>
-      </w:r>
-      <w:r>
-        <w:t xml:space="preserve"> </w:t>
-      </w:r>
-      <w:r>
-        <w:t xml:space="preserve">Track the proximity floor as the rolling 10th percentile over about a day, subtract it, and call the sensor covered when the remainder is within the noise (</w:t>
+        <w:t xml:space="preserve">Browser-based interface (Dash + Flask-SocketIO).</w:t>
+      </w:r>
+      <w:r>
+        <w:t xml:space="preserve"> </w:t>
+      </w:r>
+      <w:r>
+        <w:t xml:space="preserve">Plotly/Dash provide the charts and tables; the app runs a local server on</w:t>
+      </w:r>
+      <w:r>
+        <w:t xml:space="preserve"> </w:t>
       </w:r>
       <w:r>
         <w:rPr>
           <w:rStyle w:val="VerbatimChar"/>
         </w:rPr>
-        <w:t xml:space="preserve">max(5, 4 × MAD)</w:t>
-      </w:r>
-      <w:r>
-        <w:t xml:space="preserve">, where MAD is the median absolute deviation).</w:t>
+        <w:t xml:space="preserve">127.0.0.1:8050</w:t>
+      </w:r>
+      <w:r>
+        <w:t xml:space="preserve"> </w:t>
+      </w:r>
+      <w:r>
+        <w:t xml:space="preserve">and opens the browser.</w:t>
       </w:r>
     </w:p>
     <w:p>
@@ -3874,58 +4456,20 @@
           <w:bCs/>
           <w:b/>
         </w:rPr>
-        <w:t xml:space="preserve">Why:</w:t>
-      </w:r>
-      <w:r>
-        <w:t xml:space="preserve"> </w:t>
-      </w:r>
-      <w:r>
-        <w:t xml:space="preserve">On a 35-day recording the proximity reading while worn crept from 0 into the 50s as the battery discharged. The original test (</w:t>
-      </w:r>
-      <w:r>
-        <w:rPr>
-          <w:rStyle w:val="VerbatimChar"/>
-        </w:rPr>
-        <w:t xml:space="preserve">prox == 0</w:t>
-      </w:r>
-      <w:r>
-        <w:t xml:space="preserve">) stopped working after about 11 days, and wear was missed from then on.</w:t>
-      </w:r>
-    </w:p>
-    <w:bookmarkEnd w:id="46"/>
-    <w:bookmarkStart w:id="47" w:name="thresholds-are-empirical"/>
-    <w:p>
-      <w:pPr>
-        <w:pStyle w:val="Heading2"/>
-      </w:pPr>
-      <w:r>
-        <w:t xml:space="preserve">5.4 Thresholds are empirical</w:t>
-      </w:r>
-    </w:p>
-    <w:p>
-      <w:pPr>
-        <w:pStyle w:val="FirstParagraph"/>
-      </w:pPr>
-      <w:r>
-        <w:t xml:space="preserve">All thresholds were set by inspecting a small number of recordings. A finer tuning may be required based on the larger sample data. Appendix B describes further on how.</w:t>
-      </w:r>
-    </w:p>
-    <w:bookmarkEnd w:id="47"/>
-    <w:bookmarkEnd w:id="48"/>
-    <w:bookmarkStart w:id="49" w:name="time-handling"/>
-    <w:p>
-      <w:pPr>
-        <w:pStyle w:val="Heading1"/>
-      </w:pPr>
-      <w:r>
-        <w:t xml:space="preserve">6. Time handling</w:t>
+        <w:t xml:space="preserve">Heartbeat shutdown.</w:t>
+      </w:r>
+      <w:r>
+        <w:t xml:space="preserve"> </w:t>
+      </w:r>
+      <w:r>
+        <w:t xml:space="preserve">The page sends a heartbeat every 5 s. With none for 5 minutes, the server warns the page and exits, so closing the tab doesn’t leave a hidden server holding the serial port for data privacy.</w:t>
       </w:r>
     </w:p>
     <w:p>
       <w:pPr>
         <w:numPr>
           <w:ilvl w:val="0"/>
-          <w:numId w:val="1017"/>
+          <w:numId w:val="1016"/>
         </w:numPr>
         <w:pStyle w:val="Compact"/>
       </w:pPr>
@@ -3934,45 +4478,57 @@
           <w:bCs/>
           <w:b/>
         </w:rPr>
-        <w:t xml:space="preserve">Design Decision:</w:t>
-      </w:r>
-      <w:r>
-        <w:t xml:space="preserve"> </w:t>
-      </w:r>
-      <w:r>
-        <w:t xml:space="preserve">The logger knows only UTC epoch seconds. The app asks for and shows</w:t>
-      </w:r>
-      <w:r>
-        <w:t xml:space="preserve"> </w:t>
-      </w:r>
+        <w:t xml:space="preserve">Works offline.</w:t>
+      </w:r>
+      <w:r>
+        <w:t xml:space="preserve"> </w:t>
+      </w:r>
+      <w:r>
+        <w:t xml:space="preserve">All required assets are packaged, allowing the application to be usable in offline conditions as well.</w:t>
+      </w:r>
+    </w:p>
+    <w:p>
+      <w:pPr>
+        <w:numPr>
+          <w:ilvl w:val="0"/>
+          <w:numId w:val="1016"/>
+        </w:numPr>
+        <w:pStyle w:val="Compact"/>
+      </w:pPr>
       <w:r>
         <w:rPr>
           <w:bCs/>
           <w:b/>
         </w:rPr>
-        <w:t xml:space="preserve">Eastern time</w:t>
-      </w:r>
-      <w:r>
-        <w:t xml:space="preserve"> </w:t>
-      </w:r>
-      <w:r>
-        <w:t xml:space="preserve">(America/New_York, daylight-saving aware) everywhere, and writes timestamps with their UTC offset (e.g. </w:t>
+        <w:t xml:space="preserve">Automated releases.</w:t>
+      </w:r>
+      <w:r>
+        <w:t xml:space="preserve"> </w:t>
+      </w:r>
+      <w:r>
+        <w:t xml:space="preserve">GitHub Actions builds stand-alone Windows and macOS programs on each</w:t>
+      </w:r>
+      <w:r>
+        <w:t xml:space="preserve"> </w:t>
       </w:r>
       <w:r>
         <w:rPr>
           <w:rStyle w:val="VerbatimChar"/>
         </w:rPr>
-        <w:t xml:space="preserve">-04:00</w:t>
-      </w:r>
-      <w:r>
-        <w:t xml:space="preserve">).</w:t>
+        <w:t xml:space="preserve">v*</w:t>
+      </w:r>
+      <w:r>
+        <w:t xml:space="preserve"> </w:t>
+      </w:r>
+      <w:r>
+        <w:t xml:space="preserve">tag, with Python included, so staff need no Python (SOP Appendix B).</w:t>
       </w:r>
     </w:p>
     <w:p>
       <w:pPr>
         <w:numPr>
           <w:ilvl w:val="0"/>
-          <w:numId w:val="1017"/>
+          <w:numId w:val="1016"/>
         </w:numPr>
         <w:pStyle w:val="Compact"/>
       </w:pPr>
@@ -3981,57 +4537,13 @@
           <w:bCs/>
           <w:b/>
         </w:rPr>
-        <w:t xml:space="preserve">Why:</w:t>
-      </w:r>
-      <w:r>
-        <w:t xml:space="preserve"> </w:t>
-      </w:r>
-      <w:r>
-        <w:t xml:space="preserve">The study runs in Ontario. The offset keeps the repeated hour at the November change unambiguous, and durations across the change come out right.</w:t>
-      </w:r>
-    </w:p>
-    <w:p>
-      <w:pPr>
-        <w:numPr>
-          <w:ilvl w:val="0"/>
-          <w:numId w:val="1017"/>
-        </w:numPr>
-        <w:pStyle w:val="Compact"/>
-      </w:pPr>
-      <w:r>
-        <w:rPr>
-          <w:bCs/>
-          <w:b/>
-        </w:rPr>
-        <w:t xml:space="preserve">Recovery:</w:t>
-      </w:r>
-      <w:r>
-        <w:t xml:space="preserve"> </w:t>
-      </w:r>
-      <w:r>
-        <w:t xml:space="preserve">If a logger loses its start time, the elapsed times survive. The app detects such files and rebuilds the timestamps from a start time the user enters, during download or on the Data Analysis page.</w:t>
-      </w:r>
-    </w:p>
-    <w:p>
-      <w:pPr>
-        <w:numPr>
-          <w:ilvl w:val="0"/>
-          <w:numId w:val="1017"/>
-        </w:numPr>
-        <w:pStyle w:val="Compact"/>
-      </w:pPr>
-      <w:r>
-        <w:rPr>
-          <w:bCs/>
-          <w:b/>
-        </w:rPr>
-        <w:t xml:space="preserve">To change the zone:</w:t>
-      </w:r>
-      <w:r>
-        <w:t xml:space="preserve"> </w:t>
-      </w:r>
-      <w:r>
-        <w:t xml:space="preserve">edit</w:t>
+        <w:t xml:space="preserve">Participant IDs.</w:t>
+      </w:r>
+      <w:r>
+        <w:t xml:space="preserve"> </w:t>
+      </w:r>
+      <w:r>
+        <w:t xml:space="preserve">Letters, digits,</w:t>
       </w:r>
       <w:r>
         <w:t xml:space="preserve"> </w:t>
@@ -4040,191 +4552,29 @@
         <w:rPr>
           <w:rStyle w:val="VerbatimChar"/>
         </w:rPr>
-        <w:t xml:space="preserve">timezone_config.py</w:t>
-      </w:r>
-      <w:r>
-        <w:t xml:space="preserve">.</w:t>
+        <w:t xml:space="preserve">-</w:t>
+      </w:r>
+      <w:r>
+        <w:t xml:space="preserve"> </w:t>
+      </w:r>
+      <w:r>
+        <w:t xml:space="preserve">and</w:t>
+      </w:r>
+      <w:r>
+        <w:t xml:space="preserve"> </w:t>
+      </w:r>
+      <w:r>
+        <w:rPr>
+          <w:rStyle w:val="VerbatimChar"/>
+        </w:rPr>
+        <w:t xml:space="preserve">_</w:t>
+      </w:r>
+      <w:r>
+        <w:t xml:space="preserve">, up to 15 characters: they go into the CSV header and often into file names, where commas or spaces would cause trouble.</w:t>
       </w:r>
     </w:p>
     <w:bookmarkEnd w:id="49"/>
-    <w:bookmarkStart w:id="50" w:name="desktop-application"/>
-    <w:p>
-      <w:pPr>
-        <w:pStyle w:val="Heading1"/>
-      </w:pPr>
-      <w:r>
-        <w:t xml:space="preserve">7. Desktop application</w:t>
-      </w:r>
-    </w:p>
-    <w:p>
-      <w:pPr>
-        <w:numPr>
-          <w:ilvl w:val="0"/>
-          <w:numId w:val="1018"/>
-        </w:numPr>
-        <w:pStyle w:val="Compact"/>
-      </w:pPr>
-      <w:r>
-        <w:rPr>
-          <w:bCs/>
-          <w:b/>
-        </w:rPr>
-        <w:t xml:space="preserve">Browser-based interface (Dash + Flask-SocketIO).</w:t>
-      </w:r>
-      <w:r>
-        <w:t xml:space="preserve"> </w:t>
-      </w:r>
-      <w:r>
-        <w:t xml:space="preserve">Plotly/Dash provide the charts and tables; the app runs a local server on</w:t>
-      </w:r>
-      <w:r>
-        <w:t xml:space="preserve"> </w:t>
-      </w:r>
-      <w:r>
-        <w:rPr>
-          <w:rStyle w:val="VerbatimChar"/>
-        </w:rPr>
-        <w:t xml:space="preserve">127.0.0.1:8050</w:t>
-      </w:r>
-      <w:r>
-        <w:t xml:space="preserve"> </w:t>
-      </w:r>
-      <w:r>
-        <w:t xml:space="preserve">and opens the browser.</w:t>
-      </w:r>
-    </w:p>
-    <w:p>
-      <w:pPr>
-        <w:numPr>
-          <w:ilvl w:val="0"/>
-          <w:numId w:val="1018"/>
-        </w:numPr>
-        <w:pStyle w:val="Compact"/>
-      </w:pPr>
-      <w:r>
-        <w:rPr>
-          <w:bCs/>
-          <w:b/>
-        </w:rPr>
-        <w:t xml:space="preserve">Heartbeat shutdown.</w:t>
-      </w:r>
-      <w:r>
-        <w:t xml:space="preserve"> </w:t>
-      </w:r>
-      <w:r>
-        <w:t xml:space="preserve">The page sends a heartbeat every 5 s. With none for 5 minutes, the server warns the page and exits, so closing the tab doesn’t leave a hidden server holding the serial port for data privacy.</w:t>
-      </w:r>
-    </w:p>
-    <w:p>
-      <w:pPr>
-        <w:numPr>
-          <w:ilvl w:val="0"/>
-          <w:numId w:val="1018"/>
-        </w:numPr>
-        <w:pStyle w:val="Compact"/>
-      </w:pPr>
-      <w:r>
-        <w:rPr>
-          <w:bCs/>
-          <w:b/>
-        </w:rPr>
-        <w:t xml:space="preserve">Works offline.</w:t>
-      </w:r>
-      <w:r>
-        <w:t xml:space="preserve"> </w:t>
-      </w:r>
-      <w:r>
-        <w:t xml:space="preserve">All required assets are packaged, allowing the application to be usable in offline conditions as well.</w:t>
-      </w:r>
-    </w:p>
-    <w:p>
-      <w:pPr>
-        <w:numPr>
-          <w:ilvl w:val="0"/>
-          <w:numId w:val="1018"/>
-        </w:numPr>
-        <w:pStyle w:val="Compact"/>
-      </w:pPr>
-      <w:r>
-        <w:rPr>
-          <w:bCs/>
-          <w:b/>
-        </w:rPr>
-        <w:t xml:space="preserve">Automated releases.</w:t>
-      </w:r>
-      <w:r>
-        <w:t xml:space="preserve"> </w:t>
-      </w:r>
-      <w:r>
-        <w:t xml:space="preserve">GitHub Actions builds stand-alone Windows and macOS programs on each</w:t>
-      </w:r>
-      <w:r>
-        <w:t xml:space="preserve"> </w:t>
-      </w:r>
-      <w:r>
-        <w:rPr>
-          <w:rStyle w:val="VerbatimChar"/>
-        </w:rPr>
-        <w:t xml:space="preserve">v*</w:t>
-      </w:r>
-      <w:r>
-        <w:t xml:space="preserve"> </w:t>
-      </w:r>
-      <w:r>
-        <w:t xml:space="preserve">tag, with Python included, so staff need no Python (SOP Appendix B).</w:t>
-      </w:r>
-    </w:p>
-    <w:p>
-      <w:pPr>
-        <w:numPr>
-          <w:ilvl w:val="0"/>
-          <w:numId w:val="1018"/>
-        </w:numPr>
-        <w:pStyle w:val="Compact"/>
-      </w:pPr>
-      <w:r>
-        <w:rPr>
-          <w:bCs/>
-          <w:b/>
-        </w:rPr>
-        <w:t xml:space="preserve">Participant IDs.</w:t>
-      </w:r>
-      <w:r>
-        <w:t xml:space="preserve"> </w:t>
-      </w:r>
-      <w:r>
-        <w:t xml:space="preserve">Letters, digits,</w:t>
-      </w:r>
-      <w:r>
-        <w:t xml:space="preserve"> </w:t>
-      </w:r>
-      <w:r>
-        <w:rPr>
-          <w:rStyle w:val="VerbatimChar"/>
-        </w:rPr>
-        <w:t xml:space="preserve">-</w:t>
-      </w:r>
-      <w:r>
-        <w:t xml:space="preserve"> </w:t>
-      </w:r>
-      <w:r>
-        <w:t xml:space="preserve">and</w:t>
-      </w:r>
-      <w:r>
-        <w:t xml:space="preserve"> </w:t>
-      </w:r>
-      <w:r>
-        <w:rPr>
-          <w:rStyle w:val="VerbatimChar"/>
-        </w:rPr>
-        <w:t xml:space="preserve">_</w:t>
-      </w:r>
-      <w:r>
-        <w:t xml:space="preserve">, up to 15 characters: they go into the CSV header and often into file names, where commas or spaces would cause trouble.</w:t>
-      </w:r>
-    </w:p>
-    <w:bookmarkEnd w:id="50"/>
-    <w:bookmarkStart w:id="51" w:name="testing-and-validation-to-date"/>
+    <w:bookmarkStart w:id="50" w:name="testing-and-validation-to-date"/>
     <w:p>
       <w:pPr>
         <w:pStyle w:val="Heading1"/>
@@ -4422,441 +4772,14 @@
         </w:tc>
       </w:tr>
     </w:tbl>
-    <w:bookmarkEnd w:id="51"/>
-    <w:bookmarkStart w:id="52" w:name="next-steps"/>
+    <w:bookmarkEnd w:id="50"/>
+    <w:bookmarkStart w:id="51" w:name="directions-to-explore"/>
     <w:p>
       <w:pPr>
         <w:pStyle w:val="Heading1"/>
       </w:pPr>
       <w:r>
-        <w:t xml:space="preserve">9. Next steps</w:t>
-      </w:r>
-    </w:p>
-    <w:p>
-      <w:pPr>
-        <w:pStyle w:val="FirstParagraph"/>
-      </w:pPr>
-      <w:r>
-        <w:t xml:space="preserve">What still needs testing, and the changes that should come next. §1.3 gives the recommended order.</w:t>
-      </w:r>
-    </w:p>
-    <w:tbl>
-      <w:tblPr>
-        <w:tblStyle w:val="Table"/>
-        <w:tblW w:type="pct" w:w="5000"/>
-        <w:tblLook w:firstRow="1" w:lastRow="0" w:firstColumn="0" w:lastColumn="0" w:noHBand="0" w:noVBand="0" w:val="0020"/>
-        <w:jc w:val="start"/>
-        <w:tblBorders>
-          <w:top w:val="single" w:sz="4" w:space="0" w:color="BFBFBF"/>
-          <w:left w:val="single" w:sz="4" w:space="0" w:color="BFBFBF"/>
-          <w:bottom w:val="single" w:sz="4" w:space="0" w:color="BFBFBF"/>
-          <w:right w:val="single" w:sz="4" w:space="0" w:color="BFBFBF"/>
-          <w:insideH w:val="single" w:sz="4" w:space="0" w:color="BFBFBF"/>
-          <w:insideV w:val="single" w:sz="4" w:space="0" w:color="BFBFBF"/>
-        </w:tblBorders>
-      </w:tblPr>
-      <w:tblGrid>
-        <w:gridCol w:w="2184"/>
-        <w:gridCol w:w="2184"/>
-        <w:gridCol w:w="3550"/>
-      </w:tblGrid>
-      <w:tr>
-        <w:trPr>
-          <w:tblHeader w:val="true"/>
-        </w:trPr>
-        <w:tc>
-          <w:tcPr>
-            <w:shd w:val="clear" w:color="auto" w:fill="DCE6F1"/>
-          </w:tcPr>
-          <w:p>
-            <w:pPr>
-              <w:pStyle w:val="Compact"/>
-              <w:jc w:val="left"/>
-            </w:pPr>
-            <w:r>
-              <w:rPr>
-                <w:b/>
-                <w:sz w:val="19"/>
-              </w:rPr>
-              <w:t xml:space="preserve">Item</w:t>
-            </w:r>
-          </w:p>
-        </w:tc>
-        <w:tc>
-          <w:tcPr>
-            <w:shd w:val="clear" w:color="auto" w:fill="DCE6F1"/>
-          </w:tcPr>
-          <w:p>
-            <w:pPr>
-              <w:pStyle w:val="Compact"/>
-              <w:jc w:val="left"/>
-            </w:pPr>
-            <w:r>
-              <w:rPr>
-                <w:b/>
-                <w:sz w:val="19"/>
-              </w:rPr>
-              <w:t xml:space="preserve">Status</w:t>
-            </w:r>
-          </w:p>
-        </w:tc>
-        <w:tc>
-          <w:tcPr>
-            <w:shd w:val="clear" w:color="auto" w:fill="DCE6F1"/>
-          </w:tcPr>
-          <w:p>
-            <w:pPr>
-              <w:pStyle w:val="Compact"/>
-              <w:jc w:val="left"/>
-            </w:pPr>
-            <w:r>
-              <w:rPr>
-                <w:b/>
-                <w:sz w:val="19"/>
-              </w:rPr>
-              <w:t xml:space="preserve">What to do</w:t>
-            </w:r>
-          </w:p>
-        </w:tc>
-      </w:tr>
-      <w:tr>
-        <w:tc>
-          <w:tcPr/>
-          <w:p>
-            <w:pPr>
-              <w:pStyle w:val="Compact"/>
-              <w:jc w:val="left"/>
-            </w:pPr>
-            <w:r>
-              <w:rPr>
-                <w:sz w:val="19"/>
-              </w:rPr>
-              <w:t xml:space="preserve">Battery life</w:t>
-            </w:r>
-          </w:p>
-        </w:tc>
-        <w:tc>
-          <w:tcPr/>
-          <w:p>
-            <w:pPr>
-              <w:pStyle w:val="Compact"/>
-              <w:jc w:val="left"/>
-            </w:pPr>
-            <w:r>
-              <w:rPr>
-                <w:sz w:val="19"/>
-              </w:rPr>
-              <w:t xml:space="preserve">Not measured</w:t>
-            </w:r>
-          </w:p>
-        </w:tc>
-        <w:tc>
-          <w:tcPr/>
-          <w:p>
-            <w:pPr>
-              <w:pStyle w:val="Compact"/>
-              <w:jc w:val="left"/>
-            </w:pPr>
-            <w:r>
-              <w:rPr>
-                <w:sz w:val="19"/>
-              </w:rPr>
-              <w:t xml:space="preserve">One logger on the bench for a full month or until the battery dies (§1.3)</w:t>
-            </w:r>
-          </w:p>
-        </w:tc>
-      </w:tr>
-      <w:tr>
-        <w:tc>
-          <w:tcPr/>
-          <w:p>
-            <w:pPr>
-              <w:pStyle w:val="Compact"/>
-              <w:jc w:val="left"/>
-            </w:pPr>
-            <w:r>
-              <w:rPr>
-                <w:sz w:val="19"/>
-              </w:rPr>
-              <w:t xml:space="preserve">Storage bound (~52 d)</w:t>
-            </w:r>
-          </w:p>
-        </w:tc>
-        <w:tc>
-          <w:tcPr/>
-          <w:p>
-            <w:pPr>
-              <w:pStyle w:val="Compact"/>
-              <w:jc w:val="left"/>
-            </w:pPr>
-            <w:r>
-              <w:rPr>
-                <w:sz w:val="19"/>
-              </w:rPr>
-              <w:t xml:space="preserve">Predicted from code</w:t>
-            </w:r>
-          </w:p>
-        </w:tc>
-        <w:tc>
-          <w:tcPr/>
-          <w:p>
-            <w:pPr>
-              <w:pStyle w:val="Compact"/>
-              <w:jc w:val="left"/>
-            </w:pPr>
-            <w:r>
-              <w:rPr>
-                <w:sz w:val="19"/>
-              </w:rPr>
-              <w:t xml:space="preserve">1-second-interval test (§1.2), then the firmware fix (Appendix A.3)</w:t>
-            </w:r>
-          </w:p>
-        </w:tc>
-      </w:tr>
-      <w:tr>
-        <w:tc>
-          <w:tcPr/>
-          <w:p>
-            <w:pPr>
-              <w:pStyle w:val="Compact"/>
-              <w:jc w:val="left"/>
-            </w:pPr>
-            <w:r>
-              <w:rPr>
-                <w:sz w:val="19"/>
-              </w:rPr>
-              <w:t xml:space="preserve">Clock rollover (~49.7 d)</w:t>
-            </w:r>
-          </w:p>
-        </w:tc>
-        <w:tc>
-          <w:tcPr/>
-          <w:p>
-            <w:pPr>
-              <w:pStyle w:val="Compact"/>
-              <w:jc w:val="left"/>
-            </w:pPr>
-            <w:r>
-              <w:rPr>
-                <w:sz w:val="19"/>
-              </w:rPr>
-              <w:t xml:space="preserve">Predicted from code</w:t>
-            </w:r>
-          </w:p>
-        </w:tc>
-        <w:tc>
-          <w:tcPr/>
-          <w:p>
-            <w:pPr>
-              <w:pStyle w:val="Compact"/>
-              <w:jc w:val="left"/>
-            </w:pPr>
-            <w:r>
-              <w:rPr>
-                <w:sz w:val="19"/>
-              </w:rPr>
-              <w:t xml:space="preserve">Wrap-safe sleep and an offset test across the wrap (Appendix A.3)</w:t>
-            </w:r>
-          </w:p>
-        </w:tc>
-      </w:tr>
-      <w:tr>
-        <w:tc>
-          <w:tcPr/>
-          <w:p>
-            <w:pPr>
-              <w:pStyle w:val="Compact"/>
-              <w:jc w:val="left"/>
-            </w:pPr>
-            <w:r>
-              <w:rPr>
-                <w:sz w:val="19"/>
-              </w:rPr>
-              <w:t xml:space="preserve">Wear-detection accuracy</w:t>
-            </w:r>
-          </w:p>
-        </w:tc>
-        <w:tc>
-          <w:tcPr/>
-          <w:p>
-            <w:pPr>
-              <w:pStyle w:val="Compact"/>
-              <w:jc w:val="left"/>
-            </w:pPr>
-            <w:r>
-              <w:rPr>
-                <w:sz w:val="19"/>
-              </w:rPr>
-              <w:t xml:space="preserve">Not validated against ground truth</w:t>
-            </w:r>
-          </w:p>
-        </w:tc>
-        <w:tc>
-          <w:tcPr/>
-          <w:p>
-            <w:pPr>
-              <w:pStyle w:val="Compact"/>
-              <w:jc w:val="left"/>
-            </w:pPr>
-            <w:r>
-              <w:rPr>
-                <w:sz w:val="19"/>
-              </w:rPr>
-              <w:t xml:space="preserve">Collect ground truth and re-tune, including long-wear handling (Appendix B)</w:t>
-            </w:r>
-          </w:p>
-        </w:tc>
-      </w:tr>
-      <w:tr>
-        <w:tc>
-          <w:tcPr/>
-          <w:p>
-            <w:pPr>
-              <w:pStyle w:val="Compact"/>
-              <w:jc w:val="left"/>
-            </w:pPr>
-            <w:r>
-              <w:rPr>
-                <w:sz w:val="19"/>
-              </w:rPr>
-              <w:t xml:space="preserve">Clock drift</w:t>
-            </w:r>
-          </w:p>
-        </w:tc>
-        <w:tc>
-          <w:tcPr/>
-          <w:p>
-            <w:pPr>
-              <w:pStyle w:val="Compact"/>
-              <w:jc w:val="left"/>
-            </w:pPr>
-            <w:r>
-              <w:rPr>
-                <w:sz w:val="19"/>
-              </w:rPr>
-              <w:t xml:space="preserve">Not measured; expected negligible (§4.4)</w:t>
-            </w:r>
-          </w:p>
-        </w:tc>
-        <w:tc>
-          <w:tcPr/>
-          <w:p>
-            <w:pPr>
-              <w:pStyle w:val="Compact"/>
-              <w:jc w:val="left"/>
-            </w:pPr>
-            <w:r>
-              <w:rPr>
-                <w:sz w:val="19"/>
-              </w:rPr>
-              <w:t xml:space="preserve">Compare the end-of-deployment power-cycle time with the last timestamp (§1.3)</w:t>
-            </w:r>
-          </w:p>
-        </w:tc>
-      </w:tr>
-      <w:tr>
-        <w:tc>
-          <w:tcPr/>
-          <w:p>
-            <w:pPr>
-              <w:pStyle w:val="Compact"/>
-              <w:jc w:val="left"/>
-            </w:pPr>
-            <w:r>
-              <w:rPr>
-                <w:sz w:val="19"/>
-              </w:rPr>
-              <w:t xml:space="preserve">Firmware robustness</w:t>
-            </w:r>
-          </w:p>
-        </w:tc>
-        <w:tc>
-          <w:tcPr/>
-          <w:p>
-            <w:pPr>
-              <w:pStyle w:val="Compact"/>
-              <w:jc w:val="left"/>
-            </w:pPr>
-            <w:r>
-              <w:rPr>
-                <w:sz w:val="19"/>
-              </w:rPr>
-              <w:t xml:space="preserve">Not started</w:t>
-            </w:r>
-          </w:p>
-        </w:tc>
-        <w:tc>
-          <w:tcPr/>
-          <w:p>
-            <w:pPr>
-              <w:pStyle w:val="Compact"/>
-              <w:jc w:val="left"/>
-            </w:pPr>
-            <w:r>
-              <w:rPr>
-                <w:sz w:val="19"/>
-              </w:rPr>
-              <w:t xml:space="preserve">Start collection at Initialize; optionally, choose idle/collection by USB presence (Appendix A)</w:t>
-            </w:r>
-          </w:p>
-        </w:tc>
-      </w:tr>
-      <w:tr>
-        <w:tc>
-          <w:tcPr/>
-          <w:p>
-            <w:pPr>
-              <w:pStyle w:val="Compact"/>
-              <w:jc w:val="left"/>
-            </w:pPr>
-            <w:r>
-              <w:rPr>
-                <w:sz w:val="19"/>
-              </w:rPr>
-              <w:t xml:space="preserve">Battery monitoring</w:t>
-            </w:r>
-          </w:p>
-        </w:tc>
-        <w:tc>
-          <w:tcPr/>
-          <w:p>
-            <w:pPr>
-              <w:pStyle w:val="Compact"/>
-              <w:jc w:val="left"/>
-            </w:pPr>
-            <w:r>
-              <w:rPr>
-                <w:sz w:val="19"/>
-              </w:rPr>
-              <w:t xml:space="preserve">Not started</w:t>
-            </w:r>
-          </w:p>
-        </w:tc>
-        <w:tc>
-          <w:tcPr/>
-          <w:p>
-            <w:pPr>
-              <w:pStyle w:val="Compact"/>
-              <w:jc w:val="left"/>
-            </w:pPr>
-            <w:r>
-              <w:rPr>
-                <w:sz w:val="19"/>
-              </w:rPr>
-              <w:t xml:space="preserve">Log the battery voltage with each reading, so a dying battery shows in the data</w:t>
-            </w:r>
-          </w:p>
-        </w:tc>
-      </w:tr>
-    </w:tbl>
-    <w:bookmarkEnd w:id="52"/>
-    <w:bookmarkStart w:id="53" w:name="directions-to-explore"/>
-    <w:p>
-      <w:pPr>
-        <w:pStyle w:val="Heading1"/>
-      </w:pPr>
-      <w:r>
-        <w:t xml:space="preserve">10. Directions to explore</w:t>
+        <w:t xml:space="preserve">9. Directions to explore</w:t>
       </w:r>
     </w:p>
     <w:tbl>
@@ -5016,8 +4939,8 @@
         </w:tc>
       </w:tr>
     </w:tbl>
-    <w:bookmarkEnd w:id="53"/>
-    <w:bookmarkStart w:id="58" w:name="appendix-a-firmware-robustness"/>
+    <w:bookmarkEnd w:id="51"/>
+    <w:bookmarkStart w:id="55" w:name="appendix-a-firmware-robustness"/>
     <w:p>
       <w:pPr>
         <w:pStyle w:val="Heading1"/>
@@ -5041,10 +4964,10 @@
         <w:t xml:space="preserve"> </w:t>
       </w:r>
       <w:r>
-        <w:t xml:space="preserve">Identified from the code (§1.2 item 1; §4.1; §4.4). Not yet implemented.</w:t>
-      </w:r>
-    </w:p>
-    <w:bookmarkStart w:id="54" w:name="a.1-start-the-recording-at-initialize"/>
+        <w:t xml:space="preserve">Explained in §4.1 and §4.4; scheduled as §1.2 items 1 and 6. Not yet implemented.</w:t>
+      </w:r>
+    </w:p>
+    <w:bookmarkStart w:id="52" w:name="a.1-start-the-recording-at-initialize"/>
     <w:p>
       <w:pPr>
         <w:pStyle w:val="Heading2"/>
@@ -5075,6 +4998,144 @@
       </w:r>
       <w:r>
         <w:t xml:space="preserve">power-on, so the start time is only right if it is powered on at the entered minute. Two ways to remove this:</w:t>
+      </w:r>
+    </w:p>
+    <w:p>
+      <w:pPr>
+        <w:numPr>
+          <w:ilvl w:val="0"/>
+          <w:numId w:val="1017"/>
+        </w:numPr>
+        <w:pStyle w:val="Compact"/>
+      </w:pPr>
+      <w:r>
+        <w:rPr>
+          <w:bCs/>
+          <w:b/>
+        </w:rPr>
+        <w:t xml:space="preserve">Start at Initialize, from the computer’s clock.</w:t>
+      </w:r>
+      <w:r>
+        <w:t xml:space="preserve"> </w:t>
+      </w:r>
+      <w:r>
+        <w:t xml:space="preserve">The app sends</w:t>
+      </w:r>
+      <w:r>
+        <w:t xml:space="preserve"> </w:t>
+      </w:r>
+      <w:r>
+        <w:t xml:space="preserve">“</w:t>
+      </w:r>
+      <w:r>
+        <w:t xml:space="preserve">now</w:t>
+      </w:r>
+      <w:r>
+        <w:t xml:space="preserve">”</w:t>
+      </w:r>
+      <w:r>
+        <w:t xml:space="preserve"> </w:t>
+      </w:r>
+      <w:r>
+        <w:t xml:space="preserve">and the logger starts collecting immediately (no power-down). The start time is then exact, but the scheduled start goes away.</w:t>
+      </w:r>
+    </w:p>
+    <w:p>
+      <w:pPr>
+        <w:numPr>
+          <w:ilvl w:val="0"/>
+          <w:numId w:val="1017"/>
+        </w:numPr>
+        <w:pStyle w:val="Compact"/>
+      </w:pPr>
+      <w:r>
+        <w:rPr>
+          <w:bCs/>
+          <w:b/>
+        </w:rPr>
+        <w:t xml:space="preserve">Keep the scheduled start, but count from Initialize.</w:t>
+      </w:r>
+      <w:r>
+        <w:t xml:space="preserve"> </w:t>
+      </w:r>
+      <w:r>
+        <w:t xml:space="preserve">The logger stays on in low power after Initialize and starts collecting when the entered start time arrives. Also exact, at the cost of a little battery between Initialize and the start. This keeps today’s workflow.</w:t>
+      </w:r>
+    </w:p>
+    <w:bookmarkEnd w:id="52"/>
+    <w:bookmarkStart w:id="53" w:name="X7067aa404fd0484d1413deb92c2ee6bdcfc5df0"/>
+    <w:p>
+      <w:pPr>
+        <w:pStyle w:val="Heading2"/>
+      </w:pPr>
+      <w:r>
+        <w:t xml:space="preserve">A.2 Idle vs. collection by USB presence (optional)</w:t>
+      </w:r>
+    </w:p>
+    <w:p>
+      <w:pPr>
+        <w:pStyle w:val="FirstParagraph"/>
+      </w:pPr>
+      <w:r>
+        <w:t xml:space="preserve">Choose the mode at power-up by whether USB power is present (the nRF52840 reports this), instead of toggling on every power-up:</w:t>
+      </w:r>
+    </w:p>
+    <w:p>
+      <w:pPr>
+        <w:numPr>
+          <w:ilvl w:val="0"/>
+          <w:numId w:val="1018"/>
+        </w:numPr>
+        <w:pStyle w:val="Compact"/>
+      </w:pPr>
+      <w:r>
+        <w:t xml:space="preserve">USB connected → idle, answer the app.</w:t>
+      </w:r>
+    </w:p>
+    <w:p>
+      <w:pPr>
+        <w:numPr>
+          <w:ilvl w:val="0"/>
+          <w:numId w:val="1018"/>
+        </w:numPr>
+        <w:pStyle w:val="Compact"/>
+      </w:pPr>
+      <w:r>
+        <w:t xml:space="preserve">No USB → if initialized, start or</w:t>
+      </w:r>
+      <w:r>
+        <w:t xml:space="preserve"> </w:t>
+      </w:r>
+      <w:r>
+        <w:rPr>
+          <w:bCs/>
+          <w:b/>
+        </w:rPr>
+        <w:t xml:space="preserve">resume</w:t>
+      </w:r>
+      <w:r>
+        <w:t xml:space="preserve"> </w:t>
+      </w:r>
+      <w:r>
+        <w:t xml:space="preserve">collection, appending after the last record.</w:t>
+      </w:r>
+    </w:p>
+    <w:p>
+      <w:pPr>
+        <w:pStyle w:val="FirstParagraph"/>
+      </w:pPr>
+      <w:r>
+        <w:t xml:space="preserve">This makes a reset during a deployment cost only a gap instead of the rest of the recording, and the logger no longer needs a power-cycle before download. Resuming needs the elapsed time to continue across the reset, e.g. by storing a reset counter and leaving a marker row in the data.</w:t>
+      </w:r>
+    </w:p>
+    <w:bookmarkEnd w:id="53"/>
+    <w:bookmarkStart w:id="54" w:name="a.3-timing-and-storage"/>
+    <w:p>
+      <w:pPr>
+        <w:pStyle w:val="Heading2"/>
+      </w:pPr>
+      <w:r>
+        <w:t xml:space="preserve">A.3 Timing and storage</w:t>
       </w:r>
     </w:p>
     <w:p>
@@ -5086,35 +5147,34 @@
         <w:pStyle w:val="Compact"/>
       </w:pPr>
       <w:r>
-        <w:rPr>
-          <w:bCs/>
-          <w:b/>
-        </w:rPr>
-        <w:t xml:space="preserve">Start at Initialize, from the computer’s clock.</w:t>
-      </w:r>
-      <w:r>
-        <w:t xml:space="preserve"> </w:t>
-      </w:r>
-      <w:r>
-        <w:t xml:space="preserve">The app sends</w:t>
-      </w:r>
-      <w:r>
-        <w:t xml:space="preserve"> </w:t>
-      </w:r>
-      <w:r>
-        <w:t xml:space="preserve">“</w:t>
-      </w:r>
-      <w:r>
-        <w:t xml:space="preserve">now</w:t>
-      </w:r>
-      <w:r>
-        <w:t xml:space="preserve">”</w:t>
-      </w:r>
-      <w:r>
-        <w:t xml:space="preserve"> </w:t>
-      </w:r>
-      <w:r>
-        <w:t xml:space="preserve">and the logger starts collecting immediately (no power-down). The start time is then exact, but the scheduled start goes away.</w:t>
+        <w:t xml:space="preserve">Wrap-safe sleep:</w:t>
+      </w:r>
+      <w:r>
+        <w:t xml:space="preserve"> </w:t>
+      </w:r>
+      <w:r>
+        <w:rPr>
+          <w:rStyle w:val="VerbatimChar"/>
+        </w:rPr>
+        <w:t xml:space="preserve">if ((int32_t)(nextWakeTime - currentTime) &gt; 0)</w:t>
+      </w:r>
+      <w:r>
+        <w:t xml:space="preserve">. Test across the wrap with a temporary offset of about 2³² − 10 min added to</w:t>
+      </w:r>
+      <w:r>
+        <w:t xml:space="preserve"> </w:t>
+      </w:r>
+      <w:r>
+        <w:rPr>
+          <w:rStyle w:val="VerbatimChar"/>
+        </w:rPr>
+        <w:t xml:space="preserve">millis()</w:t>
+      </w:r>
+      <w:r>
+        <w:t xml:space="preserve"> </w:t>
+      </w:r>
+      <w:r>
+        <w:t xml:space="preserve">in the logging path.</w:t>
       </w:r>
     </w:p>
     <w:p>
@@ -5126,35 +5186,72 @@
         <w:pStyle w:val="Compact"/>
       </w:pPr>
       <w:r>
+        <w:t xml:space="preserve">Stop at</w:t>
+      </w:r>
+      <w:r>
+        <w:t xml:space="preserve"> </w:t>
+      </w:r>
+      <w:r>
+        <w:rPr>
+          <w:rStyle w:val="VerbatimChar"/>
+        </w:rPr>
+        <w:t xml:space="preserve">MAX_DATA_ENTRIES</w:t>
+      </w:r>
+      <w:r>
+        <w:t xml:space="preserve"> </w:t>
+      </w:r>
+      <w:r>
+        <w:t xml:space="preserve">in</w:t>
+      </w:r>
+      <w:r>
+        <w:t xml:space="preserve"> </w:t>
+      </w:r>
+      <w:r>
+        <w:rPr>
+          <w:rStyle w:val="VerbatimChar"/>
+        </w:rPr>
+        <w:t xml:space="preserve">saveTemperatureReading</w:t>
+      </w:r>
+      <w:r>
+        <w:t xml:space="preserve">, or erase all the pages that may be written.</w:t>
+      </w:r>
+    </w:p>
+    <w:bookmarkEnd w:id="54"/>
+    <w:bookmarkEnd w:id="55"/>
+    <w:bookmarkStart w:id="58" w:name="X1e46ee66dcce5645c2d432b6ebfb1a5d4d92f07"/>
+    <w:p>
+      <w:pPr>
+        <w:pStyle w:val="Heading1"/>
+      </w:pPr>
+      <w:r>
+        <w:t xml:space="preserve">Appendix B — Ground truth and re-tuning the detector</w:t>
+      </w:r>
+    </w:p>
+    <w:p>
+      <w:pPr>
+        <w:pStyle w:val="FirstParagraph"/>
+      </w:pPr>
+      <w:r>
         <w:rPr>
           <w:bCs/>
           <w:b/>
         </w:rPr>
-        <w:t xml:space="preserve">Keep the scheduled start, but count from Initialize.</w:t>
-      </w:r>
-      <w:r>
-        <w:t xml:space="preserve"> </w:t>
-      </w:r>
-      <w:r>
-        <w:t xml:space="preserve">The logger stays on in low power after Initialize and starts collecting when the entered start time arrives. Also exact, at the cost of a little battery between Initialize and the start. This keeps today’s workflow.</w:t>
-      </w:r>
-    </w:p>
-    <w:bookmarkEnd w:id="54"/>
-    <w:bookmarkStart w:id="55" w:name="X7067aa404fd0484d1413deb92c2ee6bdcfc5df0"/>
+        <w:t xml:space="preserve">Status:</w:t>
+      </w:r>
+      <w:r>
+        <w:t xml:space="preserve"> </w:t>
+      </w:r>
+      <w:r>
+        <w:t xml:space="preserve">Needed before wear times are reported as results; scheduled as §1.2 item 3.</w:t>
+      </w:r>
+    </w:p>
+    <w:bookmarkStart w:id="56" w:name="b.1-collecting-ground-truth"/>
     <w:p>
       <w:pPr>
         <w:pStyle w:val="Heading2"/>
       </w:pPr>
       <w:r>
-        <w:t xml:space="preserve">A.2 Idle vs. collection by USB presence (optional)</w:t>
-      </w:r>
-    </w:p>
-    <w:p>
-      <w:pPr>
-        <w:pStyle w:val="FirstParagraph"/>
-      </w:pPr>
-      <w:r>
-        <w:t xml:space="preserve">Choose the mode at power-up by whether USB power is present (the nRF52840 reports this), instead of toggling on every power-up:</w:t>
+        <w:t xml:space="preserve">B.1 Collecting ground truth</w:t>
       </w:r>
     </w:p>
     <w:p>
@@ -5166,7 +5263,17 @@
         <w:pStyle w:val="Compact"/>
       </w:pPr>
       <w:r>
-        <w:t xml:space="preserve">USB connected → idle, answer the app.</w:t>
+        <w:rPr>
+          <w:bCs/>
+          <w:b/>
+        </w:rPr>
+        <w:t xml:space="preserve">Wear diary:</w:t>
+      </w:r>
+      <w:r>
+        <w:t xml:space="preserve"> </w:t>
+      </w:r>
+      <w:r>
+        <w:t xml:space="preserve">the participant (or staff, in a supervised session) records on/off times. Cheap, but coarse and subject to the same recall bias the logger is meant to avoid.</w:t>
       </w:r>
     </w:p>
     <w:p>
@@ -5178,41 +5285,49 @@
         <w:pStyle w:val="Compact"/>
       </w:pPr>
       <w:r>
-        <w:t xml:space="preserve">No USB → if initialized, start or</w:t>
-      </w:r>
-      <w:r>
-        <w:t xml:space="preserve"> </w:t>
-      </w:r>
-      <w:r>
         <w:rPr>
           <w:bCs/>
           <w:b/>
         </w:rPr>
-        <w:t xml:space="preserve">resume</w:t>
-      </w:r>
-      <w:r>
-        <w:t xml:space="preserve"> </w:t>
-      </w:r>
-      <w:r>
-        <w:t xml:space="preserve">collection, appending after the last record.</w:t>
-      </w:r>
-    </w:p>
-    <w:p>
-      <w:pPr>
-        <w:pStyle w:val="FirstParagraph"/>
-      </w:pPr>
-      <w:r>
-        <w:t xml:space="preserve">This makes a reset during a deployment cost only a gap instead of the rest of the recording, and the logger no longer needs a power-cycle before download. Resuming needs the elapsed time to continue across the reset, e.g. by storing a reset counter and leaving a marker row in the data.</w:t>
-      </w:r>
-    </w:p>
-    <w:bookmarkEnd w:id="55"/>
-    <w:bookmarkStart w:id="56" w:name="a.3-timing-and-storage"/>
+        <w:t xml:space="preserve">Supervised sessions:</w:t>
+      </w:r>
+      <w:r>
+        <w:t xml:space="preserve"> </w:t>
+      </w:r>
+      <w:r>
+        <w:t xml:space="preserve">scripted on/off periods in the lab, including long continuous wear and confounders (warm room, splint left on a warm surface, covered but not worn).</w:t>
+      </w:r>
+    </w:p>
+    <w:p>
+      <w:pPr>
+        <w:numPr>
+          <w:ilvl w:val="0"/>
+          <w:numId w:val="1020"/>
+        </w:numPr>
+        <w:pStyle w:val="Compact"/>
+      </w:pPr>
+      <w:r>
+        <w:rPr>
+          <w:bCs/>
+          <w:b/>
+        </w:rPr>
+        <w:t xml:space="preserve">Reference sensor:</w:t>
+      </w:r>
+      <w:r>
+        <w:t xml:space="preserve"> </w:t>
+      </w:r>
+      <w:r>
+        <w:t xml:space="preserve">a second, independent sensor (e.g. a commercial temperature button logger on the skin side) for a few deployments.</w:t>
+      </w:r>
+    </w:p>
+    <w:bookmarkEnd w:id="56"/>
+    <w:bookmarkStart w:id="57" w:name="b.2-what-to-check"/>
     <w:p>
       <w:pPr>
         <w:pStyle w:val="Heading2"/>
       </w:pPr>
       <w:r>
-        <w:t xml:space="preserve">A.3 Timing and storage</w:t>
+        <w:t xml:space="preserve">B.2 What to check</w:t>
       </w:r>
     </w:p>
     <w:p>
@@ -5224,34 +5339,7 @@
         <w:pStyle w:val="Compact"/>
       </w:pPr>
       <w:r>
-        <w:t xml:space="preserve">Wrap-safe sleep:</w:t>
-      </w:r>
-      <w:r>
-        <w:t xml:space="preserve"> </w:t>
-      </w:r>
-      <w:r>
-        <w:rPr>
-          <w:rStyle w:val="VerbatimChar"/>
-        </w:rPr>
-        <w:t xml:space="preserve">if ((int32_t)(nextWakeTime - currentTime) &gt; 0)</w:t>
-      </w:r>
-      <w:r>
-        <w:t xml:space="preserve">. Test across the wrap with a temporary offset of about 2³² − 10 min added to</w:t>
-      </w:r>
-      <w:r>
-        <w:t xml:space="preserve"> </w:t>
-      </w:r>
-      <w:r>
-        <w:rPr>
-          <w:rStyle w:val="VerbatimChar"/>
-        </w:rPr>
-        <w:t xml:space="preserve">millis()</w:t>
-      </w:r>
-      <w:r>
-        <w:t xml:space="preserve"> </w:t>
-      </w:r>
-      <w:r>
-        <w:t xml:space="preserve">in the logging path.</w:t>
+        <w:t xml:space="preserve">Per-event agreement (onset/offset within ±1 sample) and per-day wear minutes.</w:t>
       </w:r>
     </w:p>
     <w:p>
@@ -5263,279 +5351,33 @@
         <w:pStyle w:val="Compact"/>
       </w:pPr>
       <w:r>
-        <w:t xml:space="preserve">Stop at</w:t>
-      </w:r>
-      <w:r>
-        <w:t xml:space="preserve"> </w:t>
-      </w:r>
-      <w:r>
-        <w:rPr>
-          <w:rStyle w:val="VerbatimChar"/>
-        </w:rPr>
-        <w:t xml:space="preserve">MAX_DATA_ENTRIES</w:t>
-      </w:r>
-      <w:r>
-        <w:t xml:space="preserve"> </w:t>
-      </w:r>
-      <w:r>
-        <w:t xml:space="preserve">in</w:t>
-      </w:r>
-      <w:r>
-        <w:t xml:space="preserve"> </w:t>
-      </w:r>
-      <w:r>
-        <w:rPr>
-          <w:rStyle w:val="VerbatimChar"/>
-        </w:rPr>
-        <w:t xml:space="preserve">saveTemperatureReading</w:t>
-      </w:r>
-      <w:r>
-        <w:t xml:space="preserve">, or erase all the pages that may be written.</w:t>
-      </w:r>
-    </w:p>
-    <w:bookmarkEnd w:id="56"/>
-    <w:bookmarkStart w:id="57" w:name="a.4-next-steps"/>
-    <w:p>
-      <w:pPr>
-        <w:pStyle w:val="Heading2"/>
-      </w:pPr>
-      <w:r>
-        <w:t xml:space="preserve">A.4 Next steps</w:t>
-      </w:r>
-    </w:p>
-    <w:p>
-      <w:pPr>
-        <w:pStyle w:val="FirstParagraph"/>
-      </w:pPr>
-      <w:r>
-        <w:t xml:space="preserve">Implement A.3 first (small, low risk), then A.1, bench-test for a full month, and update the SOP (§1.1, §6, §7).</w:t>
+        <w:rPr>
+          <w:bCs/>
+          <w:b/>
+        </w:rPr>
+        <w:t xml:space="preserve">Long wear:</w:t>
+      </w:r>
+      <w:r>
+        <w:t xml:space="preserve"> </w:t>
+      </w:r>
+      <w:r>
+        <w:t xml:space="preserve">whether overnight wear is split or cut short (§5.1). Possible fixes: a longer baseline window, freezing the baseline while an event is in progress, or requiring two consecutive cooling samples before ending an event.</w:t>
+      </w:r>
+    </w:p>
+    <w:p>
+      <w:pPr>
+        <w:numPr>
+          <w:ilvl w:val="0"/>
+          <w:numId w:val="1021"/>
+        </w:numPr>
+        <w:pStyle w:val="Compact"/>
+      </w:pPr>
+      <w:r>
+        <w:t xml:space="preserve">False positives in warm environments, and false negatives with a loose splint.</w:t>
       </w:r>
     </w:p>
     <w:bookmarkEnd w:id="57"/>
     <w:bookmarkEnd w:id="58"/>
-    <w:bookmarkStart w:id="62" w:name="X1e46ee66dcce5645c2d432b6ebfb1a5d4d92f07"/>
-    <w:p>
-      <w:pPr>
-        <w:pStyle w:val="Heading1"/>
-      </w:pPr>
-      <w:r>
-        <w:t xml:space="preserve">Appendix B — Ground truth and re-tuning the detector</w:t>
-      </w:r>
-    </w:p>
-    <w:p>
-      <w:pPr>
-        <w:pStyle w:val="FirstParagraph"/>
-      </w:pPr>
-      <w:r>
-        <w:rPr>
-          <w:bCs/>
-          <w:b/>
-        </w:rPr>
-        <w:t xml:space="preserve">Status:</w:t>
-      </w:r>
-      <w:r>
-        <w:t xml:space="preserve"> </w:t>
-      </w:r>
-      <w:r>
-        <w:t xml:space="preserve">Needed before wear times are reported as results.</w:t>
-      </w:r>
-    </w:p>
-    <w:bookmarkStart w:id="59" w:name="b.1-collecting-ground-truth"/>
-    <w:p>
-      <w:pPr>
-        <w:pStyle w:val="Heading2"/>
-      </w:pPr>
-      <w:r>
-        <w:t xml:space="preserve">B.1 Collecting ground truth</w:t>
-      </w:r>
-    </w:p>
-    <w:p>
-      <w:pPr>
-        <w:numPr>
-          <w:ilvl w:val="0"/>
-          <w:numId w:val="1022"/>
-        </w:numPr>
-        <w:pStyle w:val="Compact"/>
-      </w:pPr>
-      <w:r>
-        <w:rPr>
-          <w:bCs/>
-          <w:b/>
-        </w:rPr>
-        <w:t xml:space="preserve">Wear diary:</w:t>
-      </w:r>
-      <w:r>
-        <w:t xml:space="preserve"> </w:t>
-      </w:r>
-      <w:r>
-        <w:t xml:space="preserve">the participant (or staff, in a supervised session) records on/off times. Cheap, but coarse and subject to the same recall bias the logger is meant to avoid.</w:t>
-      </w:r>
-    </w:p>
-    <w:p>
-      <w:pPr>
-        <w:numPr>
-          <w:ilvl w:val="0"/>
-          <w:numId w:val="1022"/>
-        </w:numPr>
-        <w:pStyle w:val="Compact"/>
-      </w:pPr>
-      <w:r>
-        <w:rPr>
-          <w:bCs/>
-          <w:b/>
-        </w:rPr>
-        <w:t xml:space="preserve">Supervised sessions:</w:t>
-      </w:r>
-      <w:r>
-        <w:t xml:space="preserve"> </w:t>
-      </w:r>
-      <w:r>
-        <w:t xml:space="preserve">scripted on/off periods in the lab, including long continuous wear and confounders (warm room, splint left on a warm surface, covered but not worn).</w:t>
-      </w:r>
-    </w:p>
-    <w:p>
-      <w:pPr>
-        <w:numPr>
-          <w:ilvl w:val="0"/>
-          <w:numId w:val="1022"/>
-        </w:numPr>
-        <w:pStyle w:val="Compact"/>
-      </w:pPr>
-      <w:r>
-        <w:rPr>
-          <w:bCs/>
-          <w:b/>
-        </w:rPr>
-        <w:t xml:space="preserve">Reference sensor:</w:t>
-      </w:r>
-      <w:r>
-        <w:t xml:space="preserve"> </w:t>
-      </w:r>
-      <w:r>
-        <w:t xml:space="preserve">a second, independent sensor (e.g. a commercial temperature button logger on the skin side) for a few deployments.</w:t>
-      </w:r>
-    </w:p>
-    <w:bookmarkEnd w:id="59"/>
-    <w:bookmarkStart w:id="60" w:name="b.2-what-to-check"/>
-    <w:p>
-      <w:pPr>
-        <w:pStyle w:val="Heading2"/>
-      </w:pPr>
-      <w:r>
-        <w:t xml:space="preserve">B.2 What to check</w:t>
-      </w:r>
-    </w:p>
-    <w:p>
-      <w:pPr>
-        <w:numPr>
-          <w:ilvl w:val="0"/>
-          <w:numId w:val="1023"/>
-        </w:numPr>
-        <w:pStyle w:val="Compact"/>
-      </w:pPr>
-      <w:r>
-        <w:t xml:space="preserve">Per-event agreement (onset/offset within ±1 sample) and per-day wear minutes.</w:t>
-      </w:r>
-    </w:p>
-    <w:p>
-      <w:pPr>
-        <w:numPr>
-          <w:ilvl w:val="0"/>
-          <w:numId w:val="1023"/>
-        </w:numPr>
-        <w:pStyle w:val="Compact"/>
-      </w:pPr>
-      <w:r>
-        <w:rPr>
-          <w:bCs/>
-          <w:b/>
-        </w:rPr>
-        <w:t xml:space="preserve">Long wear:</w:t>
-      </w:r>
-      <w:r>
-        <w:t xml:space="preserve"> </w:t>
-      </w:r>
-      <w:r>
-        <w:t xml:space="preserve">whether overnight wear is split or cut short (§5.1). Possible fixes: a longer baseline window, freezing the baseline while an event is in progress, or requiring two consecutive cooling samples before ending an event.</w:t>
-      </w:r>
-    </w:p>
-    <w:p>
-      <w:pPr>
-        <w:numPr>
-          <w:ilvl w:val="0"/>
-          <w:numId w:val="1023"/>
-        </w:numPr>
-        <w:pStyle w:val="Compact"/>
-      </w:pPr>
-      <w:r>
-        <w:t xml:space="preserve">False positives in warm environments, and false negatives with a loose splint.</w:t>
-      </w:r>
-    </w:p>
-    <w:bookmarkEnd w:id="60"/>
-    <w:bookmarkStart w:id="61" w:name="b.3-next-steps"/>
-    <w:p>
-      <w:pPr>
-        <w:pStyle w:val="Heading2"/>
-      </w:pPr>
-      <w:r>
-        <w:t xml:space="preserve">B.3 Next steps</w:t>
-      </w:r>
-    </w:p>
-    <w:p>
-      <w:pPr>
-        <w:pStyle w:val="FirstParagraph"/>
-      </w:pPr>
-      <w:r>
-        <w:t xml:space="preserve">Add each labelled recording to</w:t>
-      </w:r>
-      <w:r>
-        <w:t xml:space="preserve"> </w:t>
-      </w:r>
-      <w:r>
-        <w:rPr>
-          <w:rStyle w:val="VerbatimChar"/>
-        </w:rPr>
-        <w:t xml:space="preserve">tests/</w:t>
-      </w:r>
-      <w:r>
-        <w:t xml:space="preserve"> </w:t>
-      </w:r>
-      <w:r>
-        <w:t xml:space="preserve">as a regression case, then re-tune the thresholds in</w:t>
-      </w:r>
-      <w:r>
-        <w:t xml:space="preserve"> </w:t>
-      </w:r>
-      <w:r>
-        <w:rPr>
-          <w:rStyle w:val="VerbatimChar"/>
-        </w:rPr>
-        <w:t xml:space="preserve">detect_onsets_offsets</w:t>
-      </w:r>
-      <w:r>
-        <w:t xml:space="preserve"> </w:t>
-      </w:r>
-      <w:r>
-        <w:t xml:space="preserve">against them and record the new values in</w:t>
-      </w:r>
-      <w:r>
-        <w:t xml:space="preserve"> </w:t>
-      </w:r>
-      <w:r>
-        <w:rPr>
-          <w:rStyle w:val="VerbatimChar"/>
-        </w:rPr>
-        <w:t xml:space="preserve">HANDOFF.md</w:t>
-      </w:r>
-      <w:r>
-        <w:t xml:space="preserve"> </w:t>
-      </w:r>
-      <w:r>
-        <w:t xml:space="preserve">§4.</w:t>
-      </w:r>
-    </w:p>
-    <w:bookmarkEnd w:id="61"/>
-    <w:bookmarkEnd w:id="62"/>
     <w:sectPr/>
   </w:body>
 </w:document>
@@ -5718,91 +5560,6 @@
       </w:pPr>
     </w:lvl>
   </w:abstractNum>
-  <w:abstractNum w:abstractNumId="99411">
-    <w:nsid w:val="A99411"/>
-    <w:multiLevelType w:val="multilevel"/>
-    <w:lvl w:ilvl="0">
-      <w:start w:val="1"/>
-      <w:numFmt w:val="decimal"/>
-      <w:lvlText w:val="%1."/>
-      <w:lvlJc w:val="left"/>
-      <w:pPr>
-        <w:ind w:left="720" w:hanging="480"/>
-      </w:pPr>
-    </w:lvl>
-    <w:lvl w:ilvl="1">
-      <w:start w:val="1"/>
-      <w:numFmt w:val="decimal"/>
-      <w:lvlText w:val="%2."/>
-      <w:lvlJc w:val="left"/>
-      <w:pPr>
-        <w:ind w:left="1440" w:hanging="480"/>
-      </w:pPr>
-    </w:lvl>
-    <w:lvl w:ilvl="2">
-      <w:start w:val="1"/>
-      <w:numFmt w:val="decimal"/>
-      <w:lvlText w:val="%3."/>
-      <w:lvlJc w:val="left"/>
-      <w:pPr>
-        <w:ind w:left="2160" w:hanging="480"/>
-      </w:pPr>
-    </w:lvl>
-    <w:lvl w:ilvl="3">
-      <w:start w:val="1"/>
-      <w:numFmt w:val="decimal"/>
-      <w:lvlText w:val="%4."/>
-      <w:lvlJc w:val="left"/>
-      <w:pPr>
-        <w:ind w:left="2880" w:hanging="480"/>
-      </w:pPr>
-    </w:lvl>
-    <w:lvl w:ilvl="4">
-      <w:start w:val="1"/>
-      <w:numFmt w:val="decimal"/>
-      <w:lvlText w:val="%5."/>
-      <w:lvlJc w:val="left"/>
-      <w:pPr>
-        <w:ind w:left="3600" w:hanging="480"/>
-      </w:pPr>
-    </w:lvl>
-    <w:lvl w:ilvl="5">
-      <w:start w:val="1"/>
-      <w:numFmt w:val="decimal"/>
-      <w:lvlText w:val="%6."/>
-      <w:lvlJc w:val="left"/>
-      <w:pPr>
-        <w:ind w:left="4320" w:hanging="480"/>
-      </w:pPr>
-    </w:lvl>
-    <w:lvl w:ilvl="6">
-      <w:start w:val="1"/>
-      <w:numFmt w:val="decimal"/>
-      <w:lvlText w:val="%7."/>
-      <w:lvlJc w:val="left"/>
-      <w:pPr>
-        <w:ind w:left="5040" w:hanging="480"/>
-      </w:pPr>
-    </w:lvl>
-    <w:lvl w:ilvl="7">
-      <w:start w:val="1"/>
-      <w:numFmt w:val="decimal"/>
-      <w:lvlText w:val="%8."/>
-      <w:lvlJc w:val="left"/>
-      <w:pPr>
-        <w:ind w:left="5760" w:hanging="480"/>
-      </w:pPr>
-    </w:lvl>
-    <w:lvl w:ilvl="8">
-      <w:start w:val="1"/>
-      <w:numFmt w:val="decimal"/>
-      <w:lvlText w:val="%9."/>
-      <w:lvlJc w:val="left"/>
-      <w:pPr>
-        <w:ind w:left="6480" w:hanging="480"/>
-      </w:pPr>
-    </w:lvl>
-  </w:abstractNum>
   <w:num w:numId="1000">
     <w:abstractNumId w:val="990"/>
   </w:num>
@@ -5813,64 +5570,10 @@
     <w:abstractNumId w:val="991"/>
   </w:num>
   <w:num w:numId="1003">
-    <w:abstractNumId w:val="99411"/>
-    <w:lvlOverride w:ilvl="0">
-      <w:startOverride w:val="1"/>
-    </w:lvlOverride>
-    <w:lvlOverride w:ilvl="1">
-      <w:startOverride w:val="1"/>
-    </w:lvlOverride>
-    <w:lvlOverride w:ilvl="2">
-      <w:startOverride w:val="1"/>
-    </w:lvlOverride>
-    <w:lvlOverride w:ilvl="3">
-      <w:startOverride w:val="1"/>
-    </w:lvlOverride>
-    <w:lvlOverride w:ilvl="4">
-      <w:startOverride w:val="1"/>
-    </w:lvlOverride>
-    <w:lvlOverride w:ilvl="5">
-      <w:startOverride w:val="1"/>
-    </w:lvlOverride>
-    <w:lvlOverride w:ilvl="6">
-      <w:startOverride w:val="1"/>
-    </w:lvlOverride>
-    <w:lvlOverride w:ilvl="7">
-      <w:startOverride w:val="1"/>
-    </w:lvlOverride>
-    <w:lvlOverride w:ilvl="8">
-      <w:startOverride w:val="1"/>
-    </w:lvlOverride>
+    <w:abstractNumId w:val="991"/>
   </w:num>
   <w:num w:numId="1004">
-    <w:abstractNumId w:val="99411"/>
-    <w:lvlOverride w:ilvl="0">
-      <w:startOverride w:val="1"/>
-    </w:lvlOverride>
-    <w:lvlOverride w:ilvl="1">
-      <w:startOverride w:val="1"/>
-    </w:lvlOverride>
-    <w:lvlOverride w:ilvl="2">
-      <w:startOverride w:val="1"/>
-    </w:lvlOverride>
-    <w:lvlOverride w:ilvl="3">
-      <w:startOverride w:val="1"/>
-    </w:lvlOverride>
-    <w:lvlOverride w:ilvl="4">
-      <w:startOverride w:val="1"/>
-    </w:lvlOverride>
-    <w:lvlOverride w:ilvl="5">
-      <w:startOverride w:val="1"/>
-    </w:lvlOverride>
-    <w:lvlOverride w:ilvl="6">
-      <w:startOverride w:val="1"/>
-    </w:lvlOverride>
-    <w:lvlOverride w:ilvl="7">
-      <w:startOverride w:val="1"/>
-    </w:lvlOverride>
-    <w:lvlOverride w:ilvl="8">
-      <w:startOverride w:val="1"/>
-    </w:lvlOverride>
+    <w:abstractNumId w:val="991"/>
   </w:num>
   <w:num w:numId="1005">
     <w:abstractNumId w:val="991"/>
@@ -5921,12 +5624,6 @@
     <w:abstractNumId w:val="991"/>
   </w:num>
   <w:num w:numId="1021">
-    <w:abstractNumId w:val="991"/>
-  </w:num>
-  <w:num w:numId="1022">
-    <w:abstractNumId w:val="991"/>
-  </w:num>
-  <w:num w:numId="1023">
     <w:abstractNumId w:val="991"/>
   </w:num>
 </w:numbering>

</xml_diff>

<commit_message>
Handover round 4: drop appendices, review for non-technical readers
- Port Jamie's edits; appendices removed and all references updated
- Add a plain-language Summary at the top of §1; fold "testing to date"
  into §1.1; remove duplicated bullets and the developer file table
  (HANDOFF.md covers it); Directions to explore becomes §8
- Next-steps rows lead with why each item matters
- Consistent terms ("data collection", "app"); Key terms add Deployment,
  Wear event, Ground truth and App (GUI)
- State the short-wear caveat (<~10 min not counted) in §5.1
- SOP Appendix C: how to collect ground truth and re-tune the detection
  parameters
- HANDOFF.md §8: keep the proposed firmware changes formerly in
  Appendix A

Co-Authored-By: Claude Opus 5.5 <noreply@anthropic.com>
Claude-Session: https://claude.ai/code/session_01Ue3sWJSFRo3Bxhe8SfexR3
</commit_message>
<xml_diff>
--- a/docs/Project_Handover.docx
+++ b/docs/Project_Handover.docx
@@ -211,7 +211,7 @@
         <w:t xml:space="preserve"> </w:t>
       </w:r>
       <w:r>
-        <w:t xml:space="preserve">the state of the project at transition, all next steps in one place, and who to contact. Read this first.</w:t>
+        <w:t xml:space="preserve">where the project stands, what has been tested, all next steps in one place, and who to contact. Read this first.</w:t>
       </w:r>
     </w:p>
     <w:p>
@@ -227,13 +227,13 @@
           <w:bCs/>
           <w:b/>
         </w:rPr>
-        <w:t xml:space="preserve">Design decisions (§2–§7):</w:t>
-      </w:r>
-      <w:r>
-        <w:t xml:space="preserve"> </w:t>
-      </w:r>
-      <w:r>
-        <w:t xml:space="preserve">what was decided, why, and which alternatives were considered.</w:t>
+        <w:t xml:space="preserve">Problem and goals (§2):</w:t>
+      </w:r>
+      <w:r>
+        <w:t xml:space="preserve"> </w:t>
+      </w:r>
+      <w:r>
+        <w:t xml:space="preserve">what the system is for.</w:t>
       </w:r>
     </w:p>
     <w:p>
@@ -249,13 +249,13 @@
           <w:bCs/>
           <w:b/>
         </w:rPr>
-        <w:t xml:space="preserve">Testing and future directions (§8–§9):</w:t>
-      </w:r>
-      <w:r>
-        <w:t xml:space="preserve"> </w:t>
-      </w:r>
-      <w:r>
-        <w:t xml:space="preserve">what has been verified so far, and the areas to explore.</w:t>
+        <w:t xml:space="preserve">Design decisions (§3–§7):</w:t>
+      </w:r>
+      <w:r>
+        <w:t xml:space="preserve"> </w:t>
+      </w:r>
+      <w:r>
+        <w:t xml:space="preserve">what was decided, why, and which alternatives were considered.</w:t>
       </w:r>
     </w:p>
     <w:p>
@@ -271,13 +271,13 @@
           <w:bCs/>
           <w:b/>
         </w:rPr>
-        <w:t xml:space="preserve">Areas to explore (Appendices A–B):</w:t>
-      </w:r>
-      <w:r>
-        <w:t xml:space="preserve"> </w:t>
-      </w:r>
-      <w:r>
-        <w:t xml:space="preserve">longer notes on the two changes most worth making next.</w:t>
+        <w:t xml:space="preserve">Directions to explore (§8):</w:t>
+      </w:r>
+      <w:r>
+        <w:t xml:space="preserve"> </w:t>
+      </w:r>
+      <w:r>
+        <w:t xml:space="preserve">larger changes worth considering later.</w:t>
       </w:r>
     </w:p>
     <w:p>
@@ -285,7 +285,7 @@
         <w:pStyle w:val="FirstParagraph"/>
       </w:pPr>
       <w:r>
-        <w:t xml:space="preserve">Companion documents are listed in §1.3, and technical terms are explained under</w:t>
+        <w:t xml:space="preserve">Companion documents are listed in §1.3, and terms are explained under</w:t>
       </w:r>
       <w:r>
         <w:t xml:space="preserve"> </w:t>
@@ -393,35 +393,22 @@
               <w:rPr>
                 <w:sz w:val="19"/>
               </w:rPr>
-              <w:t xml:space="preserve">Build a logger, run a deployment, or download and analyze data</w:t>
-            </w:r>
-          </w:p>
-        </w:tc>
-        <w:tc>
-          <w:tcPr/>
-          <w:p>
-            <w:pPr>
-              <w:pStyle w:val="Compact"/>
-              <w:jc w:val="left"/>
-            </w:pPr>
-            <w:r>
-              <w:rPr>
-                <w:sz w:val="19"/>
-              </w:rPr>
-              <w:t xml:space="preserve">The SOP (</w:t>
-            </w:r>
-            <w:r>
-              <w:rPr>
-                <w:rStyle w:val="VerbatimChar"/>
-                <w:sz w:val="19"/>
-              </w:rPr>
-              <w:t xml:space="preserve">docs/SOP_Build_and_Use.docx</w:t>
-            </w:r>
-            <w:r>
-              <w:rPr>
-                <w:sz w:val="19"/>
-              </w:rPr>
-              <w:t xml:space="preserve">)</w:t>
+              <w:t xml:space="preserve">Know whether the system is ready and what is left to do</w:t>
+            </w:r>
+          </w:p>
+        </w:tc>
+        <w:tc>
+          <w:tcPr/>
+          <w:p>
+            <w:pPr>
+              <w:pStyle w:val="Compact"/>
+              <w:jc w:val="left"/>
+            </w:pPr>
+            <w:r>
+              <w:rPr>
+                <w:sz w:val="19"/>
+              </w:rPr>
+              <w:t xml:space="preserve">§1</w:t>
             </w:r>
           </w:p>
         </w:tc>
@@ -438,54 +425,35 @@
               <w:rPr>
                 <w:sz w:val="19"/>
               </w:rPr>
-              <w:t xml:space="preserve">Change the app or the firmware</w:t>
-            </w:r>
-          </w:p>
-        </w:tc>
-        <w:tc>
-          <w:tcPr/>
-          <w:p>
-            <w:pPr>
-              <w:pStyle w:val="Compact"/>
-              <w:jc w:val="left"/>
-            </w:pPr>
+              <w:t xml:space="preserve">Build a logger, run a deployment, or download and analyze data</w:t>
+            </w:r>
+          </w:p>
+        </w:tc>
+        <w:tc>
+          <w:tcPr/>
+          <w:p>
+            <w:pPr>
+              <w:pStyle w:val="Compact"/>
+              <w:jc w:val="left"/>
+            </w:pPr>
+            <w:r>
+              <w:rPr>
+                <w:sz w:val="19"/>
+              </w:rPr>
+              <w:t xml:space="preserve">The SOP (</w:t>
+            </w:r>
             <w:r>
               <w:rPr>
                 <w:rStyle w:val="VerbatimChar"/>
                 <w:sz w:val="19"/>
               </w:rPr>
-              <w:t xml:space="preserve">README.md</w:t>
-            </w:r>
-            <w:r>
-              <w:rPr>
-                <w:sz w:val="19"/>
-              </w:rPr>
-              <w:t xml:space="preserve">, then</w:t>
-            </w:r>
-            <w:r>
-              <w:rPr>
-                <w:sz w:val="19"/>
-              </w:rPr>
-              <w:t xml:space="preserve"> </w:t>
-            </w:r>
-            <w:r>
-              <w:rPr>
-                <w:rStyle w:val="VerbatimChar"/>
-                <w:sz w:val="19"/>
-              </w:rPr>
-              <w:t xml:space="preserve">HANDOFF.md</w:t>
-            </w:r>
-            <w:r>
-              <w:rPr>
-                <w:sz w:val="19"/>
-              </w:rPr>
-              <w:t xml:space="preserve"> </w:t>
-            </w:r>
-            <w:r>
-              <w:rPr>
-                <w:sz w:val="19"/>
-              </w:rPr>
-              <w:t xml:space="preserve">(developer reference), then §3–§7 of this document</w:t>
+              <w:t xml:space="preserve">docs/SOP_Build_and_Use.docx</w:t>
+            </w:r>
+            <w:r>
+              <w:rPr>
+                <w:sz w:val="19"/>
+              </w:rPr>
+              <w:t xml:space="preserve">)</w:t>
             </w:r>
           </w:p>
         </w:tc>
@@ -502,22 +470,54 @@
               <w:rPr>
                 <w:sz w:val="19"/>
               </w:rPr>
-              <w:t xml:space="preserve">Plan the next stage of research</w:t>
-            </w:r>
-          </w:p>
-        </w:tc>
-        <w:tc>
-          <w:tcPr/>
-          <w:p>
-            <w:pPr>
-              <w:pStyle w:val="Compact"/>
-              <w:jc w:val="left"/>
-            </w:pPr>
-            <w:r>
-              <w:rPr>
-                <w:sz w:val="19"/>
-              </w:rPr>
-              <w:t xml:space="preserve">§1.2 (next steps), then §8, §9 and Appendices A–B</w:t>
+              <w:t xml:space="preserve">Change the app or the firmware</w:t>
+            </w:r>
+          </w:p>
+        </w:tc>
+        <w:tc>
+          <w:tcPr/>
+          <w:p>
+            <w:pPr>
+              <w:pStyle w:val="Compact"/>
+              <w:jc w:val="left"/>
+            </w:pPr>
+            <w:r>
+              <w:rPr>
+                <w:rStyle w:val="VerbatimChar"/>
+                <w:sz w:val="19"/>
+              </w:rPr>
+              <w:t xml:space="preserve">README.md</w:t>
+            </w:r>
+            <w:r>
+              <w:rPr>
+                <w:sz w:val="19"/>
+              </w:rPr>
+              <w:t xml:space="preserve">, then</w:t>
+            </w:r>
+            <w:r>
+              <w:rPr>
+                <w:sz w:val="19"/>
+              </w:rPr>
+              <w:t xml:space="preserve"> </w:t>
+            </w:r>
+            <w:r>
+              <w:rPr>
+                <w:rStyle w:val="VerbatimChar"/>
+                <w:sz w:val="19"/>
+              </w:rPr>
+              <w:t xml:space="preserve">HANDOFF.md</w:t>
+            </w:r>
+            <w:r>
+              <w:rPr>
+                <w:sz w:val="19"/>
+              </w:rPr>
+              <w:t xml:space="preserve"> </w:t>
+            </w:r>
+            <w:r>
+              <w:rPr>
+                <w:sz w:val="19"/>
+              </w:rPr>
+              <w:t xml:space="preserve">(developer reference), then §3–§7 of this document</w:t>
             </w:r>
           </w:p>
         </w:tc>
@@ -563,6 +563,24 @@
       </w:pPr>
       <w:r>
         <w:t xml:space="preserve">1. State at transition (October 2026)</w:t>
+      </w:r>
+    </w:p>
+    <w:p>
+      <w:pPr>
+        <w:pStyle w:val="FirstParagraph"/>
+      </w:pPr>
+      <w:r>
+        <w:rPr>
+          <w:bCs/>
+          <w:b/>
+        </w:rPr>
+        <w:t xml:space="preserve">Summary.</w:t>
+      </w:r>
+      <w:r>
+        <w:t xml:space="preserve"> </w:t>
+      </w:r>
+      <w:r>
+        <w:t xml:space="preserve">The system works end to end: a logger can be set up with the app, worn in the splint for up to about a month, and downloaded, and the app turns the recording into daily wear time and an hour-by-hour picture of when the splint was worn. Two loggers have been built. Wear times are estimates in 5-minute steps (wear shorter than about 10 minutes is not counted), and the detection has not yet been fully validated against a record of actual wear. Before a larger study, the known firmware issues should be fixed, battery life measured, and wear detection validated (§1.2).</w:t>
       </w:r>
     </w:p>
     <w:bookmarkStart w:id="21" w:name="current-state"/>
@@ -593,19 +611,7 @@
         <w:t xml:space="preserve"> </w:t>
       </w:r>
       <w:r>
-        <w:t xml:space="preserve">Arduino Nano 33 BLE Sense (nRF52840) with its built-in HS300x temperature and APDS9960 proximity sensors. It records one reading every 5 minutes to its own flash memory, for up to about 52 days of storage, and is configured and read over USB. Firmware:</w:t>
-      </w:r>
-      <w:r>
-        <w:t xml:space="preserve"> </w:t>
-      </w:r>
-      <w:r>
-        <w:rPr>
-          <w:rStyle w:val="VerbatimChar"/>
-        </w:rPr>
-        <w:t xml:space="preserve">collect_temperature/collect_temperature.ino</w:t>
-      </w:r>
-      <w:r>
-        <w:t xml:space="preserve">.</w:t>
+        <w:t xml:space="preserve">Arduino Nano 33 BLE Sense (nRF52840) with its built-in HS300x temperature and APDS9960 proximity sensors. It records one reading every 5 minutes to its own flash memory, for up to about 52 days of storage, and is configured and read over USB.</w:t>
       </w:r>
     </w:p>
     <w:p>
@@ -621,23 +627,13 @@
           <w:bCs/>
           <w:b/>
         </w:rPr>
-        <w:t xml:space="preserve">Desktop app v1.3.0.</w:t>
-      </w:r>
-      <w:r>
-        <w:t xml:space="preserve"> </w:t>
-      </w:r>
-      <w:r>
-        <w:rPr>
-          <w:iCs/>
-          <w:i/>
-        </w:rPr>
-        <w:t xml:space="preserve">Splint Adherence</w:t>
-      </w:r>
-      <w:r>
-        <w:t xml:space="preserve"> </w:t>
-      </w:r>
-      <w:r>
-        <w:t xml:space="preserve">(Dash/Flask, opens in the browser, works offline). It initializes loggers, downloads recordings to CSV, recovers lost start times, and shows detected wear events, daily wear totals and an hour-of-day timeline. Built for Windows and macOS by GitHub Actions on each version tag, and published on the repository’s Releases page.</w:t>
+        <w:t xml:space="preserve">Desktop application (v1.3.0).</w:t>
+      </w:r>
+      <w:r>
+        <w:t xml:space="preserve"> </w:t>
+      </w:r>
+      <w:r>
+        <w:t xml:space="preserve">It initializes loggers, downloads recordings to CSV, recovers lost start times, and shows detected wear events, daily wear totals and an hour-of-day timeline. Built for Windows and macOS by GitHub Actions on each version tag, and published on the repository’s Releases page.</w:t>
       </w:r>
     </w:p>
     <w:p>
@@ -653,13 +649,13 @@
           <w:bCs/>
           <w:b/>
         </w:rPr>
-        <w:t xml:space="preserve">Preliminary test use.</w:t>
-      </w:r>
-      <w:r>
-        <w:t xml:space="preserve"> </w:t>
-      </w:r>
-      <w:r>
-        <w:t xml:space="preserve">Recordings of up to about 36 days have been collected and analyzed, and the analysis was hardened against what they showed (proximity drift, §5.3). There are two loggers built, where one of them needs re-connection at the rear 3.3 V trace to update the firmware while the other one is ready for deployment. The logger that requires updated firmware has a tag attached noting that its firmware needs updating.</w:t>
+        <w:t xml:space="preserve">Preliminary test.</w:t>
+      </w:r>
+      <w:r>
+        <w:t xml:space="preserve"> </w:t>
+      </w:r>
+      <w:r>
+        <w:t xml:space="preserve">Recordings of up to about 36 days have been collected and analyzed to tune the wearing detection algorithm. There are two loggers built, where one of them needs reconnection at the rear 3.3 V trace to update the firmware while the other one is ready for deployment. The logger that requires updated firmware has a tag attached noting that its firmware needs updating.</w:t>
       </w:r>
     </w:p>
     <w:p>
@@ -675,53 +671,13 @@
           <w:bCs/>
           <w:b/>
         </w:rPr>
-        <w:t xml:space="preserve">Automated application tests.</w:t>
-      </w:r>
-      <w:r>
-        <w:t xml:space="preserve"> </w:t>
-      </w:r>
-      <w:r>
-        <w:t xml:space="preserve">22 automated tests (wear detection, time zones, timestamp recovery, serial protocol) run on every pull request for maintaining the application.</w:t>
-      </w:r>
-    </w:p>
-    <w:p>
-      <w:pPr>
-        <w:numPr>
-          <w:ilvl w:val="0"/>
-          <w:numId w:val="1002"/>
-        </w:numPr>
-        <w:pStyle w:val="Compact"/>
-      </w:pPr>
-      <w:r>
-        <w:rPr>
-          <w:bCs/>
-          <w:b/>
-        </w:rPr>
-        <w:t xml:space="preserve">Documentation.</w:t>
-      </w:r>
-      <w:r>
-        <w:t xml:space="preserve"> </w:t>
-      </w:r>
-      <w:r>
-        <w:t xml:space="preserve">SOP (</w:t>
-      </w:r>
-      <w:r>
-        <w:rPr>
-          <w:rStyle w:val="VerbatimChar"/>
-        </w:rPr>
-        <w:t xml:space="preserve">docs/SOP_Build_and_Use</w:t>
-      </w:r>
-      <w:r>
-        <w:t xml:space="preserve">), developer reference (</w:t>
-      </w:r>
-      <w:r>
-        <w:rPr>
-          <w:rStyle w:val="VerbatimChar"/>
-        </w:rPr>
-        <w:t xml:space="preserve">HANDOFF.md</w:t>
-      </w:r>
-      <w:r>
-        <w:t xml:space="preserve">), README, and this document.</w:t>
+        <w:t xml:space="preserve">Tested so far.</w:t>
+      </w:r>
+      <w:r>
+        <w:t xml:space="preserve"> </w:t>
+      </w:r>
+      <w:r>
+        <w:t xml:space="preserve">Resting current below about 750 µA on the bench. The proximity reading was found to drift upward over a 35-day recording, and the analysis now allows for it (§5.3). 22 automated tests (wear detection, time zones, timestamp recovery, serial protocol) run on every change to the app.</w:t>
       </w:r>
     </w:p>
     <w:bookmarkEnd w:id="21"/>
@@ -739,7 +695,7 @@
         <w:pStyle w:val="FirstParagraph"/>
       </w:pPr>
       <w:r>
-        <w:t xml:space="preserve">All remaining work, in recommended order. The design sections (§3–§7) explain why each item exists, and the appendices give the technical detail.</w:t>
+        <w:t xml:space="preserve">All remaining work, in recommended order.</w:t>
       </w:r>
     </w:p>
     <w:tbl>
@@ -758,10 +714,10 @@
         </w:tblBorders>
       </w:tblPr>
       <w:tblGrid>
-        <w:gridCol w:w="1638"/>
-        <w:gridCol w:w="1638"/>
-        <w:gridCol w:w="3550"/>
-        <w:gridCol w:w="1092"/>
+        <w:gridCol w:w="1298"/>
+        <w:gridCol w:w="1298"/>
+        <w:gridCol w:w="3895"/>
+        <w:gridCol w:w="1428"/>
       </w:tblGrid>
       <w:tr>
         <w:trPr>
@@ -852,7 +808,7 @@
               <w:rPr>
                 <w:sz w:val="19"/>
               </w:rPr>
-              <w:t xml:space="preserve">1. Firmware fixes: wrap-safe sleep, storage limit, start collection at Initialize</w:t>
+              <w:t xml:space="preserve">1. Firmware fixes (timing, storage, start time)</w:t>
             </w:r>
           </w:p>
         </w:tc>
@@ -880,9 +836,11 @@
             </w:pPr>
             <w:r>
               <w:rPr>
-                <w:sz w:val="19"/>
-              </w:rPr>
-              <w:t xml:space="preserve">First confirm the storage issue: initialize a logger with a 1-second interval (temporary change to</w:t>
+                <w:iCs/>
+                <w:i/>
+                <w:sz w:val="19"/>
+              </w:rPr>
+              <w:t xml:space="preserve">Why:</w:t>
             </w:r>
             <w:r>
               <w:rPr>
@@ -892,6 +850,18 @@
             </w:r>
             <w:r>
               <w:rPr>
+                <w:sz w:val="19"/>
+              </w:rPr>
+              <w:t xml:space="preserve">recordings longer than about 7 weeks may be corrupted, and timestamps are only right if the logger is powered on at the entered start time. First confirm the storage issue: initialize a logger with a 1-second interval (temporary change to</w:t>
+            </w:r>
+            <w:r>
+              <w:rPr>
+                <w:sz w:val="19"/>
+              </w:rPr>
+              <w:t xml:space="preserve"> </w:t>
+            </w:r>
+            <w:r>
+              <w:rPr>
                 <w:rStyle w:val="VerbatimChar"/>
                 <w:sz w:val="19"/>
               </w:rPr>
@@ -926,22 +896,47 @@
               <w:rPr>
                 <w:sz w:val="19"/>
               </w:rPr>
-              <w:t xml:space="preserve">) and leave it for 5 hours; the download should stop at exactly 15 000 rows. Then fix wrap-safe sleep and the storage limit (small, low risk), then start collection at Initialize, in one firmware release. Bench-test for a full month, re-flash loggers after downloading their data, and update the SOP.</w:t>
-            </w:r>
-          </w:p>
-        </w:tc>
-        <w:tc>
-          <w:tcPr/>
-          <w:p>
-            <w:pPr>
-              <w:pStyle w:val="Compact"/>
-              <w:jc w:val="left"/>
-            </w:pPr>
-            <w:r>
-              <w:rPr>
-                <w:sz w:val="19"/>
-              </w:rPr>
-              <w:t xml:space="preserve">Appendix A; §4.4</w:t>
+              <w:t xml:space="preserve">) and leave it for 5 hours; the download should stop at exactly 15 000 rows. Then fix wrap-safe sleep and the storage limit (small, low risk), then start data collection at Initialize, in one firmware release. Bench-test for a full month, re-flash loggers after downloading their data, and update the SOP.</w:t>
+            </w:r>
+          </w:p>
+        </w:tc>
+        <w:tc>
+          <w:tcPr/>
+          <w:p>
+            <w:pPr>
+              <w:pStyle w:val="Compact"/>
+              <w:jc w:val="left"/>
+            </w:pPr>
+            <w:r>
+              <w:rPr>
+                <w:sz w:val="19"/>
+              </w:rPr>
+              <w:t xml:space="preserve">§4.4;</w:t>
+            </w:r>
+            <w:r>
+              <w:rPr>
+                <w:sz w:val="19"/>
+              </w:rPr>
+              <w:t xml:space="preserve"> </w:t>
+            </w:r>
+            <w:r>
+              <w:rPr>
+                <w:rStyle w:val="VerbatimChar"/>
+                <w:sz w:val="19"/>
+              </w:rPr>
+              <w:t xml:space="preserve">HANDOFF.md</w:t>
+            </w:r>
+            <w:r>
+              <w:rPr>
+                <w:sz w:val="19"/>
+              </w:rPr>
+              <w:t xml:space="preserve"> </w:t>
+            </w:r>
+            <w:r>
+              <w:rPr>
+                <w:sz w:val="19"/>
+              </w:rPr>
+              <w:t xml:space="preserve">§8</w:t>
             </w:r>
           </w:p>
         </w:tc>
@@ -973,22 +968,36 @@
               <w:rPr>
                 <w:sz w:val="19"/>
               </w:rPr>
-              <w:t xml:space="preserve">Not measured; resting current below ~750 µA</w:t>
-            </w:r>
-          </w:p>
-        </w:tc>
-        <w:tc>
-          <w:tcPr/>
-          <w:p>
-            <w:pPr>
-              <w:pStyle w:val="Compact"/>
-              <w:jc w:val="left"/>
-            </w:pPr>
-            <w:r>
-              <w:rPr>
-                <w:sz w:val="19"/>
-              </w:rPr>
-              <w:t xml:space="preserve">One logger on the bench for a full month or until the battery dies, which is the duration of expected battery life.</w:t>
+              <w:t xml:space="preserve">Not measured with the latest firmware; resting current below ~750 µA</w:t>
+            </w:r>
+          </w:p>
+        </w:tc>
+        <w:tc>
+          <w:tcPr/>
+          <w:p>
+            <w:pPr>
+              <w:pStyle w:val="Compact"/>
+              <w:jc w:val="left"/>
+            </w:pPr>
+            <w:r>
+              <w:rPr>
+                <w:iCs/>
+                <w:i/>
+                <w:sz w:val="19"/>
+              </w:rPr>
+              <w:t xml:space="preserve">Why:</w:t>
+            </w:r>
+            <w:r>
+              <w:rPr>
+                <w:sz w:val="19"/>
+              </w:rPr>
+              <w:t xml:space="preserve"> </w:t>
+            </w:r>
+            <w:r>
+              <w:rPr>
+                <w:sz w:val="19"/>
+              </w:rPr>
+              <w:t xml:space="preserve">sets how long a deployment can safely run. One logger on the bench for a full month or until the battery dies, which is the duration of expected battery life.</w:t>
             </w:r>
           </w:p>
         </w:tc>
@@ -1035,22 +1044,24 @@
               <w:rPr>
                 <w:sz w:val="19"/>
               </w:rPr>
-              <w:t xml:space="preserve">Not validated against ground truth</w:t>
-            </w:r>
-          </w:p>
-        </w:tc>
-        <w:tc>
-          <w:tcPr/>
-          <w:p>
-            <w:pPr>
-              <w:pStyle w:val="Compact"/>
-              <w:jc w:val="left"/>
-            </w:pPr>
-            <w:r>
-              <w:rPr>
-                <w:sz w:val="19"/>
-              </w:rPr>
-              <w:t xml:space="preserve">Collect ground truth on a few deployments (wear diary or reference sensor), check overnight wear especially, and re-tune the thresholds. Add each labelled recording to</w:t>
+              <w:t xml:space="preserve">Not fully validated</w:t>
+            </w:r>
+          </w:p>
+        </w:tc>
+        <w:tc>
+          <w:tcPr/>
+          <w:p>
+            <w:pPr>
+              <w:pStyle w:val="Compact"/>
+              <w:jc w:val="left"/>
+            </w:pPr>
+            <w:r>
+              <w:rPr>
+                <w:iCs/>
+                <w:i/>
+                <w:sz w:val="19"/>
+              </w:rPr>
+              <w:t xml:space="preserve">Why:</w:t>
             </w:r>
             <w:r>
               <w:rPr>
@@ -1060,62 +1071,24 @@
             </w:r>
             <w:r>
               <w:rPr>
-                <w:rStyle w:val="VerbatimChar"/>
-                <w:sz w:val="19"/>
-              </w:rPr>
-              <w:t xml:space="preserve">tests/</w:t>
-            </w:r>
-            <w:r>
-              <w:rPr>
-                <w:sz w:val="19"/>
-              </w:rPr>
-              <w:t xml:space="preserve"> </w:t>
-            </w:r>
-            <w:r>
-              <w:rPr>
-                <w:sz w:val="19"/>
-              </w:rPr>
-              <w:t xml:space="preserve">as a regression case and record the new values in</w:t>
-            </w:r>
-            <w:r>
-              <w:rPr>
-                <w:sz w:val="19"/>
-              </w:rPr>
-              <w:t xml:space="preserve"> </w:t>
-            </w:r>
-            <w:r>
-              <w:rPr>
-                <w:rStyle w:val="VerbatimChar"/>
-                <w:sz w:val="19"/>
-              </w:rPr>
-              <w:t xml:space="preserve">HANDOFF.md</w:t>
-            </w:r>
-            <w:r>
-              <w:rPr>
-                <w:sz w:val="19"/>
-              </w:rPr>
-              <w:t xml:space="preserve"> </w:t>
-            </w:r>
-            <w:r>
-              <w:rPr>
-                <w:sz w:val="19"/>
-              </w:rPr>
-              <w:t xml:space="preserve">§4.</w:t>
-            </w:r>
-          </w:p>
-        </w:tc>
-        <w:tc>
-          <w:tcPr/>
-          <w:p>
-            <w:pPr>
-              <w:pStyle w:val="Compact"/>
-              <w:jc w:val="left"/>
-            </w:pPr>
-            <w:r>
-              <w:rPr>
-                <w:sz w:val="19"/>
-              </w:rPr>
-              <w:t xml:space="preserve">Appendix B; §5.1, §5.4</w:t>
+                <w:sz w:val="19"/>
+              </w:rPr>
+              <w:t xml:space="preserve">needed before wear times are reported as study results. Collect ground truth on a few deployments (wear diary or reference sensor), check overnight wear especially, and re-tune the thresholds accordingly.</w:t>
+            </w:r>
+          </w:p>
+        </w:tc>
+        <w:tc>
+          <w:tcPr/>
+          <w:p>
+            <w:pPr>
+              <w:pStyle w:val="Compact"/>
+              <w:jc w:val="left"/>
+            </w:pPr>
+            <w:r>
+              <w:rPr>
+                <w:sz w:val="19"/>
+              </w:rPr>
+              <w:t xml:space="preserve">§5; SOP Appendix C</w:t>
             </w:r>
           </w:p>
         </w:tc>
@@ -1160,9 +1133,23 @@
             </w:pPr>
             <w:r>
               <w:rPr>
-                <w:sz w:val="19"/>
-              </w:rPr>
-              <w:t xml:space="preserve">At the end of each deployment, note the real time of the power-cycle and compare it with the last timestamp in the file. They should agree within one interval (5 minutes); a larger gap shows drift or a late power-on.</w:t>
+                <w:iCs/>
+                <w:i/>
+                <w:sz w:val="19"/>
+              </w:rPr>
+              <w:t xml:space="preserve">Why:</w:t>
+            </w:r>
+            <w:r>
+              <w:rPr>
+                <w:sz w:val="19"/>
+              </w:rPr>
+              <w:t xml:space="preserve"> </w:t>
+            </w:r>
+            <w:r>
+              <w:rPr>
+                <w:sz w:val="19"/>
+              </w:rPr>
+              <w:t xml:space="preserve">confirms the timestamps stay accurate over a deployment, at no extra cost. At the end of each deployment, note the real time of the power-cycle and compare it with the last timestamp in the file. They should agree within one interval (5 minutes); a larger gap shows drift or a late power-on.</w:t>
             </w:r>
           </w:p>
         </w:tc>
@@ -1194,7 +1181,7 @@
               <w:rPr>
                 <w:sz w:val="19"/>
               </w:rPr>
-              <w:t xml:space="preserve">5. Battery monitoring</w:t>
+              <w:t xml:space="preserve">5. Mode by USB presence (optional)</w:t>
             </w:r>
           </w:p>
         </w:tc>
@@ -1222,99 +1209,76 @@
             </w:pPr>
             <w:r>
               <w:rPr>
-                <w:sz w:val="19"/>
-              </w:rPr>
-              <w:t xml:space="preserve">Log the battery voltage with each reading, so a dying battery shows in the data.</w:t>
-            </w:r>
-          </w:p>
-        </w:tc>
-        <w:tc>
-          <w:tcPr/>
-          <w:p>
-            <w:pPr>
-              <w:pStyle w:val="Compact"/>
-              <w:jc w:val="left"/>
-            </w:pPr>
-            <w:r>
-              <w:rPr>
-                <w:sz w:val="19"/>
-              </w:rPr>
-              <w:t xml:space="preserve">–</w:t>
-            </w:r>
-          </w:p>
-        </w:tc>
-      </w:tr>
-      <w:tr>
-        <w:tc>
-          <w:tcPr/>
-          <w:p>
-            <w:pPr>
-              <w:pStyle w:val="Compact"/>
-              <w:jc w:val="left"/>
-            </w:pPr>
-            <w:r>
-              <w:rPr>
-                <w:sz w:val="19"/>
-              </w:rPr>
-              <w:t xml:space="preserve">6. Mode by USB presence (optional)</w:t>
-            </w:r>
-          </w:p>
-        </w:tc>
-        <w:tc>
-          <w:tcPr/>
-          <w:p>
-            <w:pPr>
-              <w:pStyle w:val="Compact"/>
-              <w:jc w:val="left"/>
-            </w:pPr>
-            <w:r>
-              <w:rPr>
-                <w:sz w:val="19"/>
-              </w:rPr>
-              <w:t xml:space="preserve">Not started</w:t>
-            </w:r>
-          </w:p>
-        </w:tc>
-        <w:tc>
-          <w:tcPr/>
-          <w:p>
-            <w:pPr>
-              <w:pStyle w:val="Compact"/>
-              <w:jc w:val="left"/>
-            </w:pPr>
-            <w:r>
-              <w:rPr>
-                <w:sz w:val="19"/>
-              </w:rPr>
-              <w:t xml:space="preserve">Choose idle or collection at power-up by whether USB is connected, so a reset during a deployment costs only a gap.</w:t>
-            </w:r>
-          </w:p>
-        </w:tc>
-        <w:tc>
-          <w:tcPr/>
-          <w:p>
-            <w:pPr>
-              <w:pStyle w:val="Compact"/>
-              <w:jc w:val="left"/>
-            </w:pPr>
-            <w:r>
-              <w:rPr>
-                <w:sz w:val="19"/>
-              </w:rPr>
-              <w:t xml:space="preserve">Appendix A.2; §4.1</w:t>
+                <w:iCs/>
+                <w:i/>
+                <w:sz w:val="19"/>
+              </w:rPr>
+              <w:t xml:space="preserve">Why:</w:t>
+            </w:r>
+            <w:r>
+              <w:rPr>
+                <w:sz w:val="19"/>
+              </w:rPr>
+              <w:t xml:space="preserve"> </w:t>
+            </w:r>
+            <w:r>
+              <w:rPr>
+                <w:sz w:val="19"/>
+              </w:rPr>
+              <w:t xml:space="preserve">today a reset or power loss during a deployment ends the recording. Choose idle or data collection at power-up by whether USB is connected, so a reset costs only a gap.</w:t>
+            </w:r>
+          </w:p>
+        </w:tc>
+        <w:tc>
+          <w:tcPr/>
+          <w:p>
+            <w:pPr>
+              <w:pStyle w:val="Compact"/>
+              <w:jc w:val="left"/>
+            </w:pPr>
+            <w:r>
+              <w:rPr>
+                <w:sz w:val="19"/>
+              </w:rPr>
+              <w:t xml:space="preserve">§4.1;</w:t>
+            </w:r>
+            <w:r>
+              <w:rPr>
+                <w:sz w:val="19"/>
+              </w:rPr>
+              <w:t xml:space="preserve"> </w:t>
+            </w:r>
+            <w:r>
+              <w:rPr>
+                <w:rStyle w:val="VerbatimChar"/>
+                <w:sz w:val="19"/>
+              </w:rPr>
+              <w:t xml:space="preserve">HANDOFF.md</w:t>
+            </w:r>
+            <w:r>
+              <w:rPr>
+                <w:sz w:val="19"/>
+              </w:rPr>
+              <w:t xml:space="preserve"> </w:t>
+            </w:r>
+            <w:r>
+              <w:rPr>
+                <w:sz w:val="19"/>
+              </w:rPr>
+              <w:t xml:space="preserve">§8</w:t>
             </w:r>
           </w:p>
         </w:tc>
       </w:tr>
     </w:tbl>
     <w:bookmarkEnd w:id="22"/>
-    <w:bookmarkStart w:id="23" w:name="documents-files-reference"/>
+    <w:bookmarkStart w:id="23" w:name="documents"/>
     <w:p>
       <w:pPr>
         <w:pStyle w:val="Heading2"/>
       </w:pPr>
       <w:r>
-        <w:t xml:space="preserve">1.3 Documents &amp; files reference</w:t>
+        <w:t xml:space="preserve">1.3 Documents</w:t>
       </w:r>
     </w:p>
     <w:tbl>
@@ -1436,7 +1400,7 @@
               <w:rPr>
                 <w:sz w:val="19"/>
               </w:rPr>
-              <w:t xml:space="preserve">Building the logger, deployments, download, analysis, troubleshooting</w:t>
+              <w:t xml:space="preserve">Building the logger, deployments, download, analysis, troubleshooting, tuning the detection</w:t>
             </w:r>
           </w:p>
         </w:tc>
@@ -1533,7 +1497,7 @@
               <w:rPr>
                 <w:sz w:val="19"/>
               </w:rPr>
-              <w:t xml:space="preserve">Developer reference: file roles, flash layout, algorithm parameters table, vendored assets, release runbook</w:t>
+              <w:t xml:space="preserve">Developer reference: code layout, flash layout, algorithm parameters, known firmware issues and fixes, release runbook</w:t>
             </w:r>
           </w:p>
         </w:tc>
@@ -1567,572 +1531,6 @@
                 <w:sz w:val="19"/>
               </w:rPr>
               <w:t xml:space="preserve">Overview, quick start, serial protocol, data format</w:t>
-            </w:r>
-          </w:p>
-        </w:tc>
-      </w:tr>
-    </w:tbl>
-    <w:p/>
-    <w:tbl>
-      <w:tblPr>
-        <w:tblStyle w:val="Table"/>
-        <w:tblW w:type="pct" w:w="5000"/>
-        <w:tblLook w:firstRow="1" w:lastRow="0" w:firstColumn="0" w:lastColumn="0" w:noHBand="0" w:noVBand="0" w:val="0020"/>
-        <w:jc w:val="start"/>
-        <w:tblBorders>
-          <w:top w:val="single" w:sz="4" w:space="0" w:color="BFBFBF"/>
-          <w:left w:val="single" w:sz="4" w:space="0" w:color="BFBFBF"/>
-          <w:bottom w:val="single" w:sz="4" w:space="0" w:color="BFBFBF"/>
-          <w:right w:val="single" w:sz="4" w:space="0" w:color="BFBFBF"/>
-          <w:insideH w:val="single" w:sz="4" w:space="0" w:color="BFBFBF"/>
-          <w:insideV w:val="single" w:sz="4" w:space="0" w:color="BFBFBF"/>
-        </w:tblBorders>
-      </w:tblPr>
-      <w:tblGrid>
-        <w:gridCol w:w="3960"/>
-        <w:gridCol w:w="3960"/>
-      </w:tblGrid>
-      <w:tr>
-        <w:trPr>
-          <w:tblHeader w:val="true"/>
-        </w:trPr>
-        <w:tc>
-          <w:tcPr>
-            <w:shd w:val="clear" w:color="auto" w:fill="DCE6F1"/>
-          </w:tcPr>
-          <w:p>
-            <w:pPr>
-              <w:pStyle w:val="Compact"/>
-              <w:jc w:val="left"/>
-            </w:pPr>
-            <w:r>
-              <w:rPr>
-                <w:b/>
-                <w:sz w:val="19"/>
-              </w:rPr>
-              <w:t xml:space="preserve">File / folder</w:t>
-            </w:r>
-          </w:p>
-        </w:tc>
-        <w:tc>
-          <w:tcPr>
-            <w:shd w:val="clear" w:color="auto" w:fill="DCE6F1"/>
-          </w:tcPr>
-          <w:p>
-            <w:pPr>
-              <w:pStyle w:val="Compact"/>
-              <w:jc w:val="left"/>
-            </w:pPr>
-            <w:r>
-              <w:rPr>
-                <w:b/>
-                <w:sz w:val="19"/>
-              </w:rPr>
-              <w:t xml:space="preserve">Contents</w:t>
-            </w:r>
-          </w:p>
-        </w:tc>
-      </w:tr>
-      <w:tr>
-        <w:tc>
-          <w:tcPr/>
-          <w:p>
-            <w:pPr>
-              <w:pStyle w:val="Compact"/>
-              <w:jc w:val="left"/>
-            </w:pPr>
-            <w:r>
-              <w:rPr>
-                <w:rStyle w:val="VerbatimChar"/>
-                <w:sz w:val="19"/>
-              </w:rPr>
-              <w:t xml:space="preserve">collect_temperature/collect_temperature.ino</w:t>
-            </w:r>
-          </w:p>
-        </w:tc>
-        <w:tc>
-          <w:tcPr/>
-          <w:p>
-            <w:pPr>
-              <w:pStyle w:val="Compact"/>
-              <w:jc w:val="left"/>
-            </w:pPr>
-            <w:r>
-              <w:rPr>
-                <w:sz w:val="19"/>
-              </w:rPr>
-              <w:t xml:space="preserve">Logger firmware</w:t>
-            </w:r>
-          </w:p>
-        </w:tc>
-      </w:tr>
-      <w:tr>
-        <w:tc>
-          <w:tcPr/>
-          <w:p>
-            <w:pPr>
-              <w:pStyle w:val="Compact"/>
-              <w:jc w:val="left"/>
-            </w:pPr>
-            <w:r>
-              <w:rPr>
-                <w:rStyle w:val="VerbatimChar"/>
-                <w:sz w:val="19"/>
-              </w:rPr>
-              <w:t xml:space="preserve">app.py</w:t>
-            </w:r>
-            <w:r>
-              <w:rPr>
-                <w:sz w:val="19"/>
-              </w:rPr>
-              <w:t xml:space="preserve">,</w:t>
-            </w:r>
-            <w:r>
-              <w:rPr>
-                <w:sz w:val="19"/>
-              </w:rPr>
-              <w:t xml:space="preserve"> </w:t>
-            </w:r>
-            <w:r>
-              <w:rPr>
-                <w:rStyle w:val="VerbatimChar"/>
-                <w:sz w:val="19"/>
-              </w:rPr>
-              <w:t xml:space="preserve">app_instance.py</w:t>
-            </w:r>
-          </w:p>
-        </w:tc>
-        <w:tc>
-          <w:tcPr/>
-          <w:p>
-            <w:pPr>
-              <w:pStyle w:val="Compact"/>
-              <w:jc w:val="left"/>
-            </w:pPr>
-            <w:r>
-              <w:rPr>
-                <w:sz w:val="19"/>
-              </w:rPr>
-              <w:t xml:space="preserve">App entry point (routing, heartbeat shutdown), shared Dash/Flask/SocketIO objects</w:t>
-            </w:r>
-          </w:p>
-        </w:tc>
-      </w:tr>
-      <w:tr>
-        <w:tc>
-          <w:tcPr/>
-          <w:p>
-            <w:pPr>
-              <w:pStyle w:val="Compact"/>
-              <w:jc w:val="left"/>
-            </w:pPr>
-            <w:r>
-              <w:rPr>
-                <w:rStyle w:val="VerbatimChar"/>
-                <w:sz w:val="19"/>
-              </w:rPr>
-              <w:t xml:space="preserve">arduino.py</w:t>
-            </w:r>
-          </w:p>
-        </w:tc>
-        <w:tc>
-          <w:tcPr/>
-          <w:p>
-            <w:pPr>
-              <w:pStyle w:val="Compact"/>
-              <w:jc w:val="left"/>
-            </w:pPr>
-            <w:r>
-              <w:rPr>
-                <w:rStyle w:val="VerbatimChar"/>
-                <w:sz w:val="19"/>
-              </w:rPr>
-              <w:t xml:space="preserve">ArduinoClient</w:t>
-            </w:r>
-            <w:r>
-              <w:rPr>
-                <w:sz w:val="19"/>
-              </w:rPr>
-              <w:t xml:space="preserve">: port search, initialize, download; participant-ID rules</w:t>
-            </w:r>
-          </w:p>
-        </w:tc>
-      </w:tr>
-      <w:tr>
-        <w:tc>
-          <w:tcPr/>
-          <w:p>
-            <w:pPr>
-              <w:pStyle w:val="Compact"/>
-              <w:jc w:val="left"/>
-            </w:pPr>
-            <w:r>
-              <w:rPr>
-                <w:rStyle w:val="VerbatimChar"/>
-                <w:sz w:val="19"/>
-              </w:rPr>
-              <w:t xml:space="preserve">pages/index_page.py</w:t>
-            </w:r>
-          </w:p>
-        </w:tc>
-        <w:tc>
-          <w:tcPr/>
-          <w:p>
-            <w:pPr>
-              <w:pStyle w:val="Compact"/>
-              <w:jc w:val="left"/>
-            </w:pPr>
-            <w:r>
-              <w:rPr>
-                <w:sz w:val="19"/>
-              </w:rPr>
-              <w:t xml:space="preserve">Home page: Initialize and Download flows</w:t>
-            </w:r>
-          </w:p>
-        </w:tc>
-      </w:tr>
-      <w:tr>
-        <w:tc>
-          <w:tcPr/>
-          <w:p>
-            <w:pPr>
-              <w:pStyle w:val="Compact"/>
-              <w:jc w:val="left"/>
-            </w:pPr>
-            <w:r>
-              <w:rPr>
-                <w:rStyle w:val="VerbatimChar"/>
-                <w:sz w:val="19"/>
-              </w:rPr>
-              <w:t xml:space="preserve">pages/data_analysis_page.py</w:t>
-            </w:r>
-          </w:p>
-        </w:tc>
-        <w:tc>
-          <w:tcPr/>
-          <w:p>
-            <w:pPr>
-              <w:pStyle w:val="Compact"/>
-              <w:jc w:val="left"/>
-            </w:pPr>
-            <w:r>
-              <w:rPr>
-                <w:sz w:val="19"/>
-              </w:rPr>
-              <w:t xml:space="preserve">Data Analysis page: plots, events table, summaries</w:t>
-            </w:r>
-          </w:p>
-        </w:tc>
-      </w:tr>
-      <w:tr>
-        <w:tc>
-          <w:tcPr/>
-          <w:p>
-            <w:pPr>
-              <w:pStyle w:val="Compact"/>
-              <w:jc w:val="left"/>
-            </w:pPr>
-            <w:r>
-              <w:rPr>
-                <w:rStyle w:val="VerbatimChar"/>
-                <w:sz w:val="19"/>
-              </w:rPr>
-              <w:t xml:space="preserve">pages/analysis_helper.py</w:t>
-            </w:r>
-          </w:p>
-        </w:tc>
-        <w:tc>
-          <w:tcPr/>
-          <w:p>
-            <w:pPr>
-              <w:pStyle w:val="Compact"/>
-              <w:jc w:val="left"/>
-            </w:pPr>
-            <w:r>
-              <w:rPr>
-                <w:sz w:val="19"/>
-              </w:rPr>
-              <w:t xml:space="preserve">Parsing, time zones, wear detection, timestamp recovery</w:t>
-            </w:r>
-          </w:p>
-        </w:tc>
-      </w:tr>
-      <w:tr>
-        <w:tc>
-          <w:tcPr/>
-          <w:p>
-            <w:pPr>
-              <w:pStyle w:val="Compact"/>
-              <w:jc w:val="left"/>
-            </w:pPr>
-            <w:r>
-              <w:rPr>
-                <w:rStyle w:val="VerbatimChar"/>
-                <w:sz w:val="19"/>
-              </w:rPr>
-              <w:t xml:space="preserve">timezone_config.py</w:t>
-            </w:r>
-          </w:p>
-        </w:tc>
-        <w:tc>
-          <w:tcPr/>
-          <w:p>
-            <w:pPr>
-              <w:pStyle w:val="Compact"/>
-              <w:jc w:val="left"/>
-            </w:pPr>
-            <w:r>
-              <w:rPr>
-                <w:sz w:val="19"/>
-              </w:rPr>
-              <w:t xml:space="preserve">Display time zone (America/New_York)</w:t>
-            </w:r>
-          </w:p>
-        </w:tc>
-      </w:tr>
-      <w:tr>
-        <w:tc>
-          <w:tcPr/>
-          <w:p>
-            <w:pPr>
-              <w:pStyle w:val="Compact"/>
-              <w:jc w:val="left"/>
-            </w:pPr>
-            <w:r>
-              <w:rPr>
-                <w:rStyle w:val="VerbatimChar"/>
-                <w:sz w:val="19"/>
-              </w:rPr>
-              <w:t xml:space="preserve">tests/</w:t>
-            </w:r>
-          </w:p>
-        </w:tc>
-        <w:tc>
-          <w:tcPr/>
-          <w:p>
-            <w:pPr>
-              <w:pStyle w:val="Compact"/>
-              <w:jc w:val="left"/>
-            </w:pPr>
-            <w:r>
-              <w:rPr>
-                <w:sz w:val="19"/>
-              </w:rPr>
-              <w:t xml:space="preserve">pytest suite (no hardware)</w:t>
-            </w:r>
-          </w:p>
-        </w:tc>
-      </w:tr>
-      <w:tr>
-        <w:tc>
-          <w:tcPr/>
-          <w:p>
-            <w:pPr>
-              <w:pStyle w:val="Compact"/>
-              <w:jc w:val="left"/>
-            </w:pPr>
-            <w:r>
-              <w:rPr>
-                <w:rStyle w:val="VerbatimChar"/>
-                <w:sz w:val="19"/>
-              </w:rPr>
-              <w:t xml:space="preserve">setup.py</w:t>
-            </w:r>
-          </w:p>
-        </w:tc>
-        <w:tc>
-          <w:tcPr/>
-          <w:p>
-            <w:pPr>
-              <w:pStyle w:val="Compact"/>
-              <w:jc w:val="left"/>
-            </w:pPr>
-            <w:r>
-              <w:rPr>
-                <w:sz w:val="19"/>
-              </w:rPr>
-              <w:t xml:space="preserve">App version and packaging settings used by the release workflow</w:t>
-            </w:r>
-          </w:p>
-        </w:tc>
-      </w:tr>
-      <w:tr>
-        <w:tc>
-          <w:tcPr/>
-          <w:p>
-            <w:pPr>
-              <w:pStyle w:val="Compact"/>
-              <w:jc w:val="left"/>
-            </w:pPr>
-            <w:r>
-              <w:rPr>
-                <w:rStyle w:val="VerbatimChar"/>
-                <w:sz w:val="19"/>
-              </w:rPr>
-              <w:t xml:space="preserve">.github/workflows/tests.yml</w:t>
-            </w:r>
-            <w:r>
-              <w:rPr>
-                <w:sz w:val="19"/>
-              </w:rPr>
-              <w:t xml:space="preserve">,</w:t>
-            </w:r>
-            <w:r>
-              <w:rPr>
-                <w:sz w:val="19"/>
-              </w:rPr>
-              <w:t xml:space="preserve"> </w:t>
-            </w:r>
-            <w:r>
-              <w:rPr>
-                <w:rStyle w:val="VerbatimChar"/>
-                <w:sz w:val="19"/>
-              </w:rPr>
-              <w:t xml:space="preserve">build-release.yml</w:t>
-            </w:r>
-          </w:p>
-        </w:tc>
-        <w:tc>
-          <w:tcPr/>
-          <w:p>
-            <w:pPr>
-              <w:pStyle w:val="Compact"/>
-              <w:jc w:val="left"/>
-            </w:pPr>
-            <w:r>
-              <w:rPr>
-                <w:sz w:val="19"/>
-              </w:rPr>
-              <w:t xml:space="preserve">Tests on every pull request; Windows/macOS builds on a</w:t>
-            </w:r>
-            <w:r>
-              <w:rPr>
-                <w:sz w:val="19"/>
-              </w:rPr>
-              <w:t xml:space="preserve"> </w:t>
-            </w:r>
-            <w:r>
-              <w:rPr>
-                <w:rStyle w:val="VerbatimChar"/>
-                <w:sz w:val="19"/>
-              </w:rPr>
-              <w:t xml:space="preserve">v*</w:t>
-            </w:r>
-            <w:r>
-              <w:rPr>
-                <w:sz w:val="19"/>
-              </w:rPr>
-              <w:t xml:space="preserve"> </w:t>
-            </w:r>
-            <w:r>
-              <w:rPr>
-                <w:sz w:val="19"/>
-              </w:rPr>
-              <w:t xml:space="preserve">tag</w:t>
-            </w:r>
-          </w:p>
-        </w:tc>
-      </w:tr>
-      <w:tr>
-        <w:tc>
-          <w:tcPr/>
-          <w:p>
-            <w:pPr>
-              <w:pStyle w:val="Compact"/>
-              <w:jc w:val="left"/>
-            </w:pPr>
-            <w:r>
-              <w:rPr>
-                <w:rStyle w:val="VerbatimChar"/>
-                <w:sz w:val="19"/>
-              </w:rPr>
-              <w:t xml:space="preserve">docs/</w:t>
-            </w:r>
-          </w:p>
-        </w:tc>
-        <w:tc>
-          <w:tcPr/>
-          <w:p>
-            <w:pPr>
-              <w:pStyle w:val="Compact"/>
-              <w:jc w:val="left"/>
-            </w:pPr>
-            <w:r>
-              <w:rPr>
-                <w:sz w:val="19"/>
-              </w:rPr>
-              <w:t xml:space="preserve">SOP, this document, figures (</w:t>
-            </w:r>
-            <w:r>
-              <w:rPr>
-                <w:rStyle w:val="VerbatimChar"/>
-                <w:sz w:val="19"/>
-              </w:rPr>
-              <w:t xml:space="preserve">docs/images/</w:t>
-            </w:r>
-            <w:r>
-              <w:rPr>
-                <w:sz w:val="19"/>
-              </w:rPr>
-              <w:t xml:space="preserve">), and the build script</w:t>
-            </w:r>
-          </w:p>
-        </w:tc>
-      </w:tr>
-      <w:tr>
-        <w:tc>
-          <w:tcPr/>
-          <w:p>
-            <w:pPr>
-              <w:pStyle w:val="Compact"/>
-              <w:jc w:val="left"/>
-            </w:pPr>
-            <w:r>
-              <w:rPr>
-                <w:rStyle w:val="VerbatimChar"/>
-                <w:sz w:val="19"/>
-              </w:rPr>
-              <w:t xml:space="preserve">docs/build_docs.sh</w:t>
-            </w:r>
-          </w:p>
-        </w:tc>
-        <w:tc>
-          <w:tcPr/>
-          <w:p>
-            <w:pPr>
-              <w:pStyle w:val="Compact"/>
-              <w:jc w:val="left"/>
-            </w:pPr>
-            <w:r>
-              <w:rPr>
-                <w:sz w:val="19"/>
-              </w:rPr>
-              <w:t xml:space="preserve">Regenerates both</w:t>
-            </w:r>
-            <w:r>
-              <w:rPr>
-                <w:sz w:val="19"/>
-              </w:rPr>
-              <w:t xml:space="preserve"> </w:t>
-            </w:r>
-            <w:r>
-              <w:rPr>
-                <w:rStyle w:val="VerbatimChar"/>
-                <w:sz w:val="19"/>
-              </w:rPr>
-              <w:t xml:space="preserve">.docx</w:t>
-            </w:r>
-            <w:r>
-              <w:rPr>
-                <w:sz w:val="19"/>
-              </w:rPr>
-              <w:t xml:space="preserve"> </w:t>
-            </w:r>
-            <w:r>
-              <w:rPr>
-                <w:sz w:val="19"/>
-              </w:rPr>
-              <w:t xml:space="preserve">files from their Markdown</w:t>
             </w:r>
           </w:p>
         </w:tc>
@@ -2312,7 +1710,7 @@
               <w:rPr>
                 <w:sz w:val="19"/>
               </w:rPr>
-              <w:t xml:space="preserve">The Arduino Nano 33 BLE Sense board with programmed hardware, designed to be in the splint.</w:t>
+              <w:t xml:space="preserve">The Arduino Nano 33 BLE Sense board with programmed hardware, designed to be in the splint</w:t>
             </w:r>
           </w:p>
         </w:tc>
@@ -2329,22 +1727,22 @@
               <w:rPr>
                 <w:sz w:val="19"/>
               </w:rPr>
-              <w:t xml:space="preserve">HS300x</w:t>
-            </w:r>
-          </w:p>
-        </w:tc>
-        <w:tc>
-          <w:tcPr/>
-          <w:p>
-            <w:pPr>
-              <w:pStyle w:val="Compact"/>
-              <w:jc w:val="left"/>
-            </w:pPr>
-            <w:r>
-              <w:rPr>
-                <w:sz w:val="19"/>
-              </w:rPr>
-              <w:t xml:space="preserve">The board’s temperature (and humidity) sensor; only temperature is used</w:t>
+              <w:t xml:space="preserve">App (GUI)</w:t>
+            </w:r>
+          </w:p>
+        </w:tc>
+        <w:tc>
+          <w:tcPr/>
+          <w:p>
+            <w:pPr>
+              <w:pStyle w:val="Compact"/>
+              <w:jc w:val="left"/>
+            </w:pPr>
+            <w:r>
+              <w:rPr>
+                <w:sz w:val="19"/>
+              </w:rPr>
+              <w:t xml:space="preserve">The desktop application used to set up loggers, download recordings and view the analysis</w:t>
             </w:r>
           </w:p>
         </w:tc>
@@ -2361,48 +1759,22 @@
               <w:rPr>
                 <w:sz w:val="19"/>
               </w:rPr>
-              <w:t xml:space="preserve">APDS9960</w:t>
-            </w:r>
-          </w:p>
-        </w:tc>
-        <w:tc>
-          <w:tcPr/>
-          <w:p>
-            <w:pPr>
-              <w:pStyle w:val="Compact"/>
-              <w:jc w:val="left"/>
-            </w:pPr>
-            <w:r>
-              <w:rPr>
-                <w:sz w:val="19"/>
-              </w:rPr>
-              <w:t xml:space="preserve">The board’s proximity/light/gesture sensor; only proximity is used. Reads 0–255,</w:t>
-            </w:r>
-            <w:r>
-              <w:rPr>
-                <w:sz w:val="19"/>
-              </w:rPr>
-              <w:t xml:space="preserve"> </w:t>
-            </w:r>
-            <w:r>
-              <w:rPr>
-                <w:bCs/>
-                <w:b/>
-                <w:sz w:val="19"/>
-              </w:rPr>
-              <w:t xml:space="preserve">low = something close</w:t>
-            </w:r>
-            <w:r>
-              <w:rPr>
-                <w:sz w:val="19"/>
-              </w:rPr>
-              <w:t xml:space="preserve"> </w:t>
-            </w:r>
-            <w:r>
-              <w:rPr>
-                <w:sz w:val="19"/>
-              </w:rPr>
-              <w:t xml:space="preserve">(splint worn)</w:t>
+              <w:t xml:space="preserve">Deployment</w:t>
+            </w:r>
+          </w:p>
+        </w:tc>
+        <w:tc>
+          <w:tcPr/>
+          <w:p>
+            <w:pPr>
+              <w:pStyle w:val="Compact"/>
+              <w:jc w:val="left"/>
+            </w:pPr>
+            <w:r>
+              <w:rPr>
+                <w:sz w:val="19"/>
+              </w:rPr>
+              <w:t xml:space="preserve">One period during which a participant wears the splint with a logger collecting data</w:t>
             </w:r>
           </w:p>
         </w:tc>
@@ -2419,52 +1791,22 @@
               <w:rPr>
                 <w:sz w:val="19"/>
               </w:rPr>
-              <w:t xml:space="preserve">Firmware</w:t>
-            </w:r>
-          </w:p>
-        </w:tc>
-        <w:tc>
-          <w:tcPr/>
-          <w:p>
-            <w:pPr>
-              <w:pStyle w:val="Compact"/>
-              <w:jc w:val="left"/>
-            </w:pPr>
-            <w:r>
-              <w:rPr>
-                <w:sz w:val="19"/>
-              </w:rPr>
-              <w:t xml:space="preserve">The program running on the logger (an Arduino</w:t>
-            </w:r>
-            <w:r>
-              <w:rPr>
-                <w:sz w:val="19"/>
-              </w:rPr>
-              <w:t xml:space="preserve"> </w:t>
-            </w:r>
-            <w:r>
-              <w:rPr>
-                <w:sz w:val="19"/>
-              </w:rPr>
-              <w:t xml:space="preserve">“</w:t>
-            </w:r>
-            <w:r>
-              <w:rPr>
-                <w:sz w:val="19"/>
-              </w:rPr>
-              <w:t xml:space="preserve">sketch</w:t>
-            </w:r>
-            <w:r>
-              <w:rPr>
-                <w:sz w:val="19"/>
-              </w:rPr>
-              <w:t xml:space="preserve">”</w:t>
-            </w:r>
-            <w:r>
-              <w:rPr>
-                <w:sz w:val="19"/>
-              </w:rPr>
-              <w:t xml:space="preserve">). Changing it means re-flashing every logger</w:t>
+              <w:t xml:space="preserve">Wear event</w:t>
+            </w:r>
+          </w:p>
+        </w:tc>
+        <w:tc>
+          <w:tcPr/>
+          <w:p>
+            <w:pPr>
+              <w:pStyle w:val="Compact"/>
+              <w:jc w:val="left"/>
+            </w:pPr>
+            <w:r>
+              <w:rPr>
+                <w:sz w:val="19"/>
+              </w:rPr>
+              <w:t xml:space="preserve">A period the app judges the splint was worn, from its start (onset) to its end (offset)</w:t>
             </w:r>
           </w:p>
         </w:tc>
@@ -2481,22 +1823,22 @@
               <w:rPr>
                 <w:sz w:val="19"/>
               </w:rPr>
-              <w:t xml:space="preserve">Flash</w:t>
-            </w:r>
-          </w:p>
-        </w:tc>
-        <w:tc>
-          <w:tcPr/>
-          <w:p>
-            <w:pPr>
-              <w:pStyle w:val="Compact"/>
-              <w:jc w:val="left"/>
-            </w:pPr>
-            <w:r>
-              <w:rPr>
-                <w:sz w:val="19"/>
-              </w:rPr>
-              <w:t xml:space="preserve">The logger’s built-in memory, which keeps the settings and readings without power</w:t>
+              <w:t xml:space="preserve">Ground truth</w:t>
+            </w:r>
+          </w:p>
+        </w:tc>
+        <w:tc>
+          <w:tcPr/>
+          <w:p>
+            <w:pPr>
+              <w:pStyle w:val="Compact"/>
+              <w:jc w:val="left"/>
+            </w:pPr>
+            <w:r>
+              <w:rPr>
+                <w:sz w:val="19"/>
+              </w:rPr>
+              <w:t xml:space="preserve">An independent record of when the splint was actually worn (e.g. a diary or a second sensor), used to check the detection</w:t>
             </w:r>
           </w:p>
         </w:tc>
@@ -2513,22 +1855,22 @@
               <w:rPr>
                 <w:sz w:val="19"/>
               </w:rPr>
-              <w:t xml:space="preserve">Initialize</w:t>
-            </w:r>
-          </w:p>
-        </w:tc>
-        <w:tc>
-          <w:tcPr/>
-          <w:p>
-            <w:pPr>
-              <w:pStyle w:val="Compact"/>
-              <w:jc w:val="left"/>
-            </w:pPr>
-            <w:r>
-              <w:rPr>
-                <w:sz w:val="19"/>
-              </w:rPr>
-              <w:t xml:space="preserve">Sending the start time and participant ID to the logger; erases the previous recording</w:t>
+              <w:t xml:space="preserve">HS300x</w:t>
+            </w:r>
+          </w:p>
+        </w:tc>
+        <w:tc>
+          <w:tcPr/>
+          <w:p>
+            <w:pPr>
+              <w:pStyle w:val="Compact"/>
+              <w:jc w:val="left"/>
+            </w:pPr>
+            <w:r>
+              <w:rPr>
+                <w:sz w:val="19"/>
+              </w:rPr>
+              <w:t xml:space="preserve">The board’s temperature (and humidity) sensor; only temperature is used</w:t>
             </w:r>
           </w:p>
         </w:tc>
@@ -2545,22 +1887,22 @@
               <w:rPr>
                 <w:sz w:val="19"/>
               </w:rPr>
-              <w:t xml:space="preserve">Logging / idle mode</w:t>
-            </w:r>
-          </w:p>
-        </w:tc>
-        <w:tc>
-          <w:tcPr/>
-          <w:p>
-            <w:pPr>
-              <w:pStyle w:val="Compact"/>
-              <w:jc w:val="left"/>
-            </w:pPr>
-            <w:r>
-              <w:rPr>
-                <w:sz w:val="19"/>
-              </w:rPr>
-              <w:t xml:space="preserve">Recording with USB off / waiting for the app with USB on. Toggled on every power-up</w:t>
+              <w:t xml:space="preserve">APDS9960</w:t>
+            </w:r>
+          </w:p>
+        </w:tc>
+        <w:tc>
+          <w:tcPr/>
+          <w:p>
+            <w:pPr>
+              <w:pStyle w:val="Compact"/>
+              <w:jc w:val="left"/>
+            </w:pPr>
+            <w:r>
+              <w:rPr>
+                <w:sz w:val="19"/>
+              </w:rPr>
+              <w:t xml:space="preserve">The board’s proximity sensor. Reads 0–255; a low value means the splint is worn</w:t>
             </w:r>
           </w:p>
         </w:tc>
@@ -2577,22 +1919,52 @@
               <w:rPr>
                 <w:sz w:val="19"/>
               </w:rPr>
-              <w:t xml:space="preserve">Power-cycle</w:t>
-            </w:r>
-          </w:p>
-        </w:tc>
-        <w:tc>
-          <w:tcPr/>
-          <w:p>
-            <w:pPr>
-              <w:pStyle w:val="Compact"/>
-              <w:jc w:val="left"/>
-            </w:pPr>
-            <w:r>
-              <w:rPr>
-                <w:sz w:val="19"/>
-              </w:rPr>
-              <w:t xml:space="preserve">Turning the logger off and on</w:t>
+              <w:t xml:space="preserve">Firmware</w:t>
+            </w:r>
+          </w:p>
+        </w:tc>
+        <w:tc>
+          <w:tcPr/>
+          <w:p>
+            <w:pPr>
+              <w:pStyle w:val="Compact"/>
+              <w:jc w:val="left"/>
+            </w:pPr>
+            <w:r>
+              <w:rPr>
+                <w:sz w:val="19"/>
+              </w:rPr>
+              <w:t xml:space="preserve">The program running on the logger (an Arduino</w:t>
+            </w:r>
+            <w:r>
+              <w:rPr>
+                <w:sz w:val="19"/>
+              </w:rPr>
+              <w:t xml:space="preserve"> </w:t>
+            </w:r>
+            <w:r>
+              <w:rPr>
+                <w:sz w:val="19"/>
+              </w:rPr>
+              <w:t xml:space="preserve">“</w:t>
+            </w:r>
+            <w:r>
+              <w:rPr>
+                <w:sz w:val="19"/>
+              </w:rPr>
+              <w:t xml:space="preserve">sketch</w:t>
+            </w:r>
+            <w:r>
+              <w:rPr>
+                <w:sz w:val="19"/>
+              </w:rPr>
+              <w:t xml:space="preserve">”</w:t>
+            </w:r>
+            <w:r>
+              <w:rPr>
+                <w:sz w:val="19"/>
+              </w:rPr>
+              <w:t xml:space="preserve">). Changing it means re-flashing every logger</w:t>
             </w:r>
           </w:p>
         </w:tc>
@@ -2609,122 +1981,22 @@
               <w:rPr>
                 <w:sz w:val="19"/>
               </w:rPr>
-              <w:t xml:space="preserve">Serial (USB serial)</w:t>
-            </w:r>
-          </w:p>
-        </w:tc>
-        <w:tc>
-          <w:tcPr/>
-          <w:p>
-            <w:pPr>
-              <w:pStyle w:val="Compact"/>
-              <w:jc w:val="left"/>
-            </w:pPr>
-            <w:r>
-              <w:rPr>
-                <w:sz w:val="19"/>
-              </w:rPr>
-              <w:t xml:space="preserve">The text connection over the USB cable between the app and the logger (9600 baud). The app sends one-character commands:</w:t>
-            </w:r>
-            <w:r>
-              <w:rPr>
-                <w:sz w:val="19"/>
-              </w:rPr>
-              <w:t xml:space="preserve"> </w:t>
-            </w:r>
-            <w:r>
-              <w:rPr>
-                <w:rStyle w:val="VerbatimChar"/>
-                <w:sz w:val="19"/>
-              </w:rPr>
-              <w:t xml:space="preserve">?</w:t>
-            </w:r>
-            <w:r>
-              <w:rPr>
-                <w:sz w:val="19"/>
-              </w:rPr>
-              <w:t xml:space="preserve"> </w:t>
-            </w:r>
-            <w:r>
-              <w:rPr>
-                <w:sz w:val="19"/>
-              </w:rPr>
-              <w:t xml:space="preserve">handshake,</w:t>
-            </w:r>
-            <w:r>
-              <w:rPr>
-                <w:sz w:val="19"/>
-              </w:rPr>
-              <w:t xml:space="preserve"> </w:t>
-            </w:r>
-            <w:r>
-              <w:rPr>
-                <w:rStyle w:val="VerbatimChar"/>
-                <w:sz w:val="19"/>
-              </w:rPr>
-              <w:t xml:space="preserve">!</w:t>
-            </w:r>
-            <w:r>
-              <w:rPr>
-                <w:sz w:val="19"/>
-              </w:rPr>
-              <w:t xml:space="preserve"> </w:t>
-            </w:r>
-            <w:r>
-              <w:rPr>
-                <w:sz w:val="19"/>
-              </w:rPr>
-              <w:t xml:space="preserve">status,</w:t>
-            </w:r>
-            <w:r>
-              <w:rPr>
-                <w:sz w:val="19"/>
-              </w:rPr>
-              <w:t xml:space="preserve"> </w:t>
-            </w:r>
-            <w:r>
-              <w:rPr>
-                <w:rStyle w:val="VerbatimChar"/>
-                <w:sz w:val="19"/>
-              </w:rPr>
-              <w:t xml:space="preserve">i</w:t>
-            </w:r>
-            <w:r>
-              <w:rPr>
-                <w:sz w:val="19"/>
-              </w:rPr>
-              <w:t xml:space="preserve"> </w:t>
-            </w:r>
-            <w:r>
-              <w:rPr>
-                <w:sz w:val="19"/>
-              </w:rPr>
-              <w:t xml:space="preserve">initialize,</w:t>
-            </w:r>
-            <w:r>
-              <w:rPr>
-                <w:sz w:val="19"/>
-              </w:rPr>
-              <w:t xml:space="preserve"> </w:t>
-            </w:r>
-            <w:r>
-              <w:rPr>
-                <w:rStyle w:val="VerbatimChar"/>
-                <w:sz w:val="19"/>
-              </w:rPr>
-              <w:t xml:space="preserve">r</w:t>
-            </w:r>
-            <w:r>
-              <w:rPr>
-                <w:sz w:val="19"/>
-              </w:rPr>
-              <w:t xml:space="preserve"> </w:t>
-            </w:r>
-            <w:r>
-              <w:rPr>
-                <w:sz w:val="19"/>
-              </w:rPr>
-              <w:t xml:space="preserve">read data</w:t>
+              <w:t xml:space="preserve">Flash</w:t>
+            </w:r>
+          </w:p>
+        </w:tc>
+        <w:tc>
+          <w:tcPr/>
+          <w:p>
+            <w:pPr>
+              <w:pStyle w:val="Compact"/>
+              <w:jc w:val="left"/>
+            </w:pPr>
+            <w:r>
+              <w:rPr>
+                <w:sz w:val="19"/>
+              </w:rPr>
+              <w:t xml:space="preserve">The logger’s built-in memory, which keeps the settings and readings without power</w:t>
             </w:r>
           </w:p>
         </w:tc>
@@ -2739,25 +2011,24 @@
             </w:pPr>
             <w:r>
               <w:rPr>
-                <w:rStyle w:val="VerbatimChar"/>
-                <w:sz w:val="19"/>
-              </w:rPr>
-              <w:t xml:space="preserve">millis()</w:t>
-            </w:r>
-          </w:p>
-        </w:tc>
-        <w:tc>
-          <w:tcPr/>
-          <w:p>
-            <w:pPr>
-              <w:pStyle w:val="Compact"/>
-              <w:jc w:val="left"/>
-            </w:pPr>
-            <w:r>
-              <w:rPr>
-                <w:sz w:val="19"/>
-              </w:rPr>
-              <w:t xml:space="preserve">The board’s millisecond counter since power-on; the logger’s only clock. 32 bits, so it wraps after ~49.7 days</w:t>
+                <w:sz w:val="19"/>
+              </w:rPr>
+              <w:t xml:space="preserve">Initialize</w:t>
+            </w:r>
+          </w:p>
+        </w:tc>
+        <w:tc>
+          <w:tcPr/>
+          <w:p>
+            <w:pPr>
+              <w:pStyle w:val="Compact"/>
+              <w:jc w:val="left"/>
+            </w:pPr>
+            <w:r>
+              <w:rPr>
+                <w:sz w:val="19"/>
+              </w:rPr>
+              <w:t xml:space="preserve">Sending the start time and participant ID to the logger; erases the previous recording</w:t>
             </w:r>
           </w:p>
         </w:tc>
@@ -2774,22 +2045,22 @@
               <w:rPr>
                 <w:sz w:val="19"/>
               </w:rPr>
-              <w:t xml:space="preserve">Epoch</w:t>
-            </w:r>
-          </w:p>
-        </w:tc>
-        <w:tc>
-          <w:tcPr/>
-          <w:p>
-            <w:pPr>
-              <w:pStyle w:val="Compact"/>
-              <w:jc w:val="left"/>
-            </w:pPr>
-            <w:r>
-              <w:rPr>
-                <w:sz w:val="19"/>
-              </w:rPr>
-              <w:t xml:space="preserve">Time as seconds since 1 Jan 1970 UTC; how the logger stores the start time</w:t>
+              <w:t xml:space="preserve">Data collection / idle</w:t>
+            </w:r>
+          </w:p>
+        </w:tc>
+        <w:tc>
+          <w:tcPr/>
+          <w:p>
+            <w:pPr>
+              <w:pStyle w:val="Compact"/>
+              <w:jc w:val="left"/>
+            </w:pPr>
+            <w:r>
+              <w:rPr>
+                <w:sz w:val="19"/>
+              </w:rPr>
+              <w:t xml:space="preserve">The logger recording with USB off / waiting for the app with USB on. Switches on every power-up</w:t>
             </w:r>
           </w:p>
         </w:tc>
@@ -2806,22 +2077,22 @@
               <w:rPr>
                 <w:sz w:val="19"/>
               </w:rPr>
-              <w:t xml:space="preserve">Baseline / delta</w:t>
-            </w:r>
-          </w:p>
-        </w:tc>
-        <w:tc>
-          <w:tcPr/>
-          <w:p>
-            <w:pPr>
-              <w:pStyle w:val="Compact"/>
-              <w:jc w:val="left"/>
-            </w:pPr>
-            <w:r>
-              <w:rPr>
-                <w:sz w:val="19"/>
-              </w:rPr>
-              <w:t xml:space="preserve">The rolling-minimum temperature (taken as room temperature), and the temperature above it</w:t>
+              <w:t xml:space="preserve">Power-cycle</w:t>
+            </w:r>
+          </w:p>
+        </w:tc>
+        <w:tc>
+          <w:tcPr/>
+          <w:p>
+            <w:pPr>
+              <w:pStyle w:val="Compact"/>
+              <w:jc w:val="left"/>
+            </w:pPr>
+            <w:r>
+              <w:rPr>
+                <w:sz w:val="19"/>
+              </w:rPr>
+              <w:t xml:space="preserve">Turning the logger off and on</w:t>
             </w:r>
           </w:p>
         </w:tc>
@@ -2838,22 +2109,119 @@
               <w:rPr>
                 <w:sz w:val="19"/>
               </w:rPr>
-              <w:t xml:space="preserve">Onset / offset</w:t>
-            </w:r>
-          </w:p>
-        </w:tc>
-        <w:tc>
-          <w:tcPr/>
-          <w:p>
-            <w:pPr>
-              <w:pStyle w:val="Compact"/>
-              <w:jc w:val="left"/>
-            </w:pPr>
-            <w:r>
-              <w:rPr>
-                <w:sz w:val="19"/>
-              </w:rPr>
-              <w:t xml:space="preserve">The start / end of a detected wear event</w:t>
+              <w:t xml:space="preserve">Serial (USB serial)</w:t>
+            </w:r>
+          </w:p>
+        </w:tc>
+        <w:tc>
+          <w:tcPr/>
+          <w:p>
+            <w:pPr>
+              <w:pStyle w:val="Compact"/>
+              <w:jc w:val="left"/>
+            </w:pPr>
+            <w:r>
+              <w:rPr>
+                <w:sz w:val="19"/>
+              </w:rPr>
+              <w:t xml:space="preserve">The text connection over the USB cable between the app and the logger (9600 baud)</w:t>
+            </w:r>
+          </w:p>
+        </w:tc>
+      </w:tr>
+      <w:tr>
+        <w:tc>
+          <w:tcPr/>
+          <w:p>
+            <w:pPr>
+              <w:pStyle w:val="Compact"/>
+              <w:jc w:val="left"/>
+            </w:pPr>
+            <w:r>
+              <w:rPr>
+                <w:rStyle w:val="VerbatimChar"/>
+                <w:sz w:val="19"/>
+              </w:rPr>
+              <w:t xml:space="preserve">millis()</w:t>
+            </w:r>
+          </w:p>
+        </w:tc>
+        <w:tc>
+          <w:tcPr/>
+          <w:p>
+            <w:pPr>
+              <w:pStyle w:val="Compact"/>
+              <w:jc w:val="left"/>
+            </w:pPr>
+            <w:r>
+              <w:rPr>
+                <w:sz w:val="19"/>
+              </w:rPr>
+              <w:t xml:space="preserve">The board’s millisecond counter since power-on; the logger’s only clock. 32 bits, so it wraps after ~49.7 days</w:t>
+            </w:r>
+          </w:p>
+        </w:tc>
+      </w:tr>
+      <w:tr>
+        <w:tc>
+          <w:tcPr/>
+          <w:p>
+            <w:pPr>
+              <w:pStyle w:val="Compact"/>
+              <w:jc w:val="left"/>
+            </w:pPr>
+            <w:r>
+              <w:rPr>
+                <w:sz w:val="19"/>
+              </w:rPr>
+              <w:t xml:space="preserve">Epoch</w:t>
+            </w:r>
+          </w:p>
+        </w:tc>
+        <w:tc>
+          <w:tcPr/>
+          <w:p>
+            <w:pPr>
+              <w:pStyle w:val="Compact"/>
+              <w:jc w:val="left"/>
+            </w:pPr>
+            <w:r>
+              <w:rPr>
+                <w:sz w:val="19"/>
+              </w:rPr>
+              <w:t xml:space="preserve">Time as seconds since 1 Jan 1970 UTC; how the logger stores the start time</w:t>
+            </w:r>
+          </w:p>
+        </w:tc>
+      </w:tr>
+      <w:tr>
+        <w:tc>
+          <w:tcPr/>
+          <w:p>
+            <w:pPr>
+              <w:pStyle w:val="Compact"/>
+              <w:jc w:val="left"/>
+            </w:pPr>
+            <w:r>
+              <w:rPr>
+                <w:sz w:val="19"/>
+              </w:rPr>
+              <w:t xml:space="preserve">Baseline / delta</w:t>
+            </w:r>
+          </w:p>
+        </w:tc>
+        <w:tc>
+          <w:tcPr/>
+          <w:p>
+            <w:pPr>
+              <w:pStyle w:val="Compact"/>
+              <w:jc w:val="left"/>
+            </w:pPr>
+            <w:r>
+              <w:rPr>
+                <w:sz w:val="19"/>
+              </w:rPr>
+              <w:t xml:space="preserve">The rolling-minimum temperature (taken as room temperature), and the temperature above it</w:t>
             </w:r>
           </w:p>
         </w:tc>
@@ -3145,6 +2513,14 @@
     <w:p>
       <w:pPr>
         <w:pStyle w:val="FirstParagraph"/>
+      </w:pPr>
+      <w:r>
+        <w:t xml:space="preserve">Sections 3–7 explain the technical design; readers who only need the status can stop after §2.</w:t>
+      </w:r>
+    </w:p>
+    <w:p>
+      <w:pPr>
+        <w:pStyle w:val="BodyText"/>
       </w:pPr>
       <w:r>
         <w:t xml:space="preserve">The logger records on its own during the deployment. It only talks to a computer before (Initialize) and after (Download) a deployment, over USB serial (Figure 1).</w:t>
@@ -3277,7 +2653,7 @@
         <w:t xml:space="preserve"> </w:t>
       </w:r>
       <w:r>
-        <w:t xml:space="preserve">Detecting wear on the board; streaming over Bluetooth to a phone (needs the patient’s phone and consumes more power).</w:t>
+        <w:t xml:space="preserve">Detecting wear directly on the board; streaming over Bluetooth to a phone (needs the patient’s phone and consumes more power).</w:t>
       </w:r>
     </w:p>
     <w:bookmarkEnd w:id="31"/>
@@ -3395,7 +2771,7 @@
         <w:t xml:space="preserve"> </w:t>
       </w:r>
       <w:r>
-        <w:t xml:space="preserve">The logger keeps a mode flag in flash and changes it on every power-up: an initialized logger with no data starts collecting; a collecting logger becomes idle (Figure 1).</w:t>
+        <w:t xml:space="preserve">The logger keeps a mode flag in flash and changes it on every power-up: an initialized logger with no data starts data collection; a logger collecting data becomes idle (Figure 1).</w:t>
       </w:r>
     </w:p>
     <w:p>
@@ -3417,7 +2793,7 @@
         <w:t xml:space="preserve"> </w:t>
       </w:r>
       <w:r>
-        <w:t xml:space="preserve">During collection USB is switched off to save power, so the computer can’t send a</w:t>
+        <w:t xml:space="preserve">During data collection USB is switched off to save power, so the computer can’t send a</w:t>
       </w:r>
       <w:r>
         <w:t xml:space="preserve"> </w:t>
@@ -3457,7 +2833,7 @@
         <w:t xml:space="preserve"> </w:t>
       </w:r>
       <w:r>
-        <w:t xml:space="preserve">The logger can’t be seen by the app while collecting; power-cycle it first. Any reset or power loss during collection also counts as a power-up, so the recording ends there: the data so far is kept, but nothing more is recorded. An alternative is §1.2 item 6.</w:t>
+        <w:t xml:space="preserve">The logger can’t be seen by the app during data collection; power-cycle it first. Any reset or power loss during data collection also counts as a power-up, so the recording ends there: the data so far is kept, but nothing more is recorded. An alternative is §1.2 item 5.</w:t>
       </w:r>
     </w:p>
     <w:bookmarkEnd w:id="34"/>
@@ -3596,7 +2972,7 @@
         <w:t xml:space="preserve"> </w:t>
       </w:r>
       <w:r>
-        <w:t xml:space="preserve">During collection the firmware disables USB, UART, the radio and other unused peripherals, and waits between readings with</w:t>
+        <w:t xml:space="preserve">During data collection the firmware disables USB, UART, the radio and other unused peripherals, and waits between readings with</w:t>
       </w:r>
       <w:r>
         <w:t xml:space="preserve"> </w:t>
@@ -3653,192 +3029,6 @@
       </w:pPr>
       <w:r>
         <w:t xml:space="preserve">4.4 Fixed 5-minute interval, elapsed-time records</w:t>
-      </w:r>
-    </w:p>
-    <w:p>
-      <w:pPr>
-        <w:numPr>
-          <w:ilvl w:val="0"/>
-          <w:numId w:val="1009"/>
-        </w:numPr>
-        <w:pStyle w:val="Compact"/>
-      </w:pPr>
-      <w:r>
-        <w:rPr>
-          <w:bCs/>
-          <w:b/>
-        </w:rPr>
-        <w:t xml:space="preserve">Design Decision:</w:t>
-      </w:r>
-      <w:r>
-        <w:t xml:space="preserve"> </w:t>
-      </w:r>
-      <w:r>
-        <w:t xml:space="preserve">One reading every 300 s (</w:t>
-      </w:r>
-      <w:r>
-        <w:rPr>
-          <w:rStyle w:val="VerbatimChar"/>
-        </w:rPr>
-        <w:t xml:space="preserve">WAKEUP_INTERVAL_SECONDS</w:t>
-      </w:r>
-      <w:r>
-        <w:t xml:space="preserve"> </w:t>
-      </w:r>
-      <w:r>
-        <w:t xml:space="preserve">in</w:t>
-      </w:r>
-      <w:r>
-        <w:t xml:space="preserve"> </w:t>
-      </w:r>
-      <w:r>
-        <w:rPr>
-          <w:rStyle w:val="VerbatimChar"/>
-        </w:rPr>
-        <w:t xml:space="preserve">arduino.py</w:t>
-      </w:r>
-      <w:r>
-        <w:t xml:space="preserve">, sent at Initialize). Each record stores seconds elapsed since collection started (from</w:t>
-      </w:r>
-      <w:r>
-        <w:t xml:space="preserve"> </w:t>
-      </w:r>
-      <w:r>
-        <w:rPr>
-          <w:rStyle w:val="VerbatimChar"/>
-        </w:rPr>
-        <w:t xml:space="preserve">millis()</w:t>
-      </w:r>
-      <w:r>
-        <w:t xml:space="preserve">), plus temperature and proximity, in 12 bytes; the app adds the start time.</w:t>
-      </w:r>
-    </w:p>
-    <w:p>
-      <w:pPr>
-        <w:numPr>
-          <w:ilvl w:val="0"/>
-          <w:numId w:val="1009"/>
-        </w:numPr>
-        <w:pStyle w:val="Compact"/>
-      </w:pPr>
-      <w:r>
-        <w:rPr>
-          <w:bCs/>
-          <w:b/>
-        </w:rPr>
-        <w:t xml:space="preserve">Why:</w:t>
-      </w:r>
-      <w:r>
-        <w:t xml:space="preserve"> </w:t>
-      </w:r>
-      <w:r>
-        <w:t xml:space="preserve">The board has no real-time clock, so elapsed time is the simplest reliable record. 5 minutes resolves wear periods well enough for daily totals, and fits a month in flash. The analysis infers the real interval from the timestamps, so the interval can be changed without changing the analysis. Figure 2 shows how one reading is stored and downloaded.</w:t>
-      </w:r>
-    </w:p>
-    <w:p>
-      <w:pPr>
-        <w:numPr>
-          <w:ilvl w:val="0"/>
-          <w:numId w:val="1009"/>
-        </w:numPr>
-        <w:pStyle w:val="Compact"/>
-      </w:pPr>
-      <w:r>
-        <w:rPr>
-          <w:bCs/>
-          <w:b/>
-        </w:rPr>
-        <w:t xml:space="preserve">Limitations:</w:t>
-      </w:r>
-    </w:p>
-    <w:p>
-      <w:pPr>
-        <w:numPr>
-          <w:ilvl w:val="1"/>
-          <w:numId w:val="1010"/>
-        </w:numPr>
-        <w:pStyle w:val="Compact"/>
-      </w:pPr>
-      <w:r>
-        <w:rPr>
-          <w:iCs/>
-          <w:i/>
-        </w:rPr>
-        <w:t xml:space="preserve">Start time.</w:t>
-      </w:r>
-      <w:r>
-        <w:t xml:space="preserve"> </w:t>
-      </w:r>
-      <w:r>
-        <w:t xml:space="preserve">Elapsed time counts from the power-on that starts collection, while the start time is the one typed into the app at Initialize. Any gap between the two shifts every timestamp by that amount, and nothing in the file shows it. Fix: §1.2 item 1.</w:t>
-      </w:r>
-    </w:p>
-    <w:p>
-      <w:pPr>
-        <w:numPr>
-          <w:ilvl w:val="1"/>
-          <w:numId w:val="1010"/>
-        </w:numPr>
-        <w:pStyle w:val="Compact"/>
-      </w:pPr>
-      <w:r>
-        <w:rPr>
-          <w:iCs/>
-          <w:i/>
-        </w:rPr>
-        <w:t xml:space="preserve">Rollover.</w:t>
-      </w:r>
-      <w:r>
-        <w:t xml:space="preserve"> </w:t>
-      </w:r>
-      <w:r>
-        <w:rPr>
-          <w:rStyle w:val="VerbatimChar"/>
-        </w:rPr>
-        <w:t xml:space="preserve">millis()</w:t>
-      </w:r>
-      <w:r>
-        <w:t xml:space="preserve"> </w:t>
-      </w:r>
-      <w:r>
-        <w:t xml:space="preserve">is 32-bit and wraps at about 49.7 days, and the sleep check</w:t>
-      </w:r>
-      <w:r>
-        <w:t xml:space="preserve"> </w:t>
-      </w:r>
-      <w:r>
-        <w:rPr>
-          <w:rStyle w:val="VerbatimChar"/>
-        </w:rPr>
-        <w:t xml:space="preserve">nextWakeTime &gt; currentTime</w:t>
-      </w:r>
-      <w:r>
-        <w:t xml:space="preserve"> </w:t>
-      </w:r>
-      <w:r>
-        <w:t xml:space="preserve">is not wrap-safe: expect a burst of readings, then a long gap. The stored elapsed times stay correct. Fix: §1.2 item 1; until then, keep deployments to about a month.</w:t>
-      </w:r>
-    </w:p>
-    <w:p>
-      <w:pPr>
-        <w:numPr>
-          <w:ilvl w:val="1"/>
-          <w:numId w:val="1010"/>
-        </w:numPr>
-        <w:pStyle w:val="Compact"/>
-      </w:pPr>
-      <w:r>
-        <w:rPr>
-          <w:iCs/>
-          <w:i/>
-        </w:rPr>
-        <w:t xml:space="preserve">Clock accuracy.</w:t>
-      </w:r>
-      <w:r>
-        <w:t xml:space="preserve"> </w:t>
-      </w:r>
-      <w:r>
-        <w:t xml:space="preserve">Timestamps rely on the board’s oscillator, with no correction. With the board’s crystal (tens of ppm) the error is about 1–2 minutes a month, well under one interval; while this is not measured directly, it is a commonly known limitation of using onboard crystal (check: §1.2 item 4).</w:t>
       </w:r>
     </w:p>
     <w:p>
@@ -3896,6 +3086,192 @@
         <w:t xml:space="preserve">Figure 2. One reading, from flash to the downloaded CSV.</w:t>
       </w:r>
     </w:p>
+    <w:p>
+      <w:pPr>
+        <w:numPr>
+          <w:ilvl w:val="0"/>
+          <w:numId w:val="1009"/>
+        </w:numPr>
+        <w:pStyle w:val="Compact"/>
+      </w:pPr>
+      <w:r>
+        <w:rPr>
+          <w:bCs/>
+          <w:b/>
+        </w:rPr>
+        <w:t xml:space="preserve">Design Decision:</w:t>
+      </w:r>
+      <w:r>
+        <w:t xml:space="preserve"> </w:t>
+      </w:r>
+      <w:r>
+        <w:t xml:space="preserve">One reading every 300 seconds (5 minutes) (</w:t>
+      </w:r>
+      <w:r>
+        <w:rPr>
+          <w:rStyle w:val="VerbatimChar"/>
+        </w:rPr>
+        <w:t xml:space="preserve">WAKEUP_INTERVAL_SECONDS</w:t>
+      </w:r>
+      <w:r>
+        <w:t xml:space="preserve"> </w:t>
+      </w:r>
+      <w:r>
+        <w:t xml:space="preserve">in</w:t>
+      </w:r>
+      <w:r>
+        <w:t xml:space="preserve"> </w:t>
+      </w:r>
+      <w:r>
+        <w:rPr>
+          <w:rStyle w:val="VerbatimChar"/>
+        </w:rPr>
+        <w:t xml:space="preserve">arduino.py</w:t>
+      </w:r>
+      <w:r>
+        <w:t xml:space="preserve">, sent at Initialize). Each record stores seconds elapsed since data collection started (from</w:t>
+      </w:r>
+      <w:r>
+        <w:t xml:space="preserve"> </w:t>
+      </w:r>
+      <w:r>
+        <w:rPr>
+          <w:rStyle w:val="VerbatimChar"/>
+        </w:rPr>
+        <w:t xml:space="preserve">millis()</w:t>
+      </w:r>
+      <w:r>
+        <w:t xml:space="preserve">), plus temperature and proximity, in 12 bytes; the app adds the start time.</w:t>
+      </w:r>
+    </w:p>
+    <w:p>
+      <w:pPr>
+        <w:numPr>
+          <w:ilvl w:val="0"/>
+          <w:numId w:val="1009"/>
+        </w:numPr>
+        <w:pStyle w:val="Compact"/>
+      </w:pPr>
+      <w:r>
+        <w:rPr>
+          <w:bCs/>
+          <w:b/>
+        </w:rPr>
+        <w:t xml:space="preserve">Why:</w:t>
+      </w:r>
+      <w:r>
+        <w:t xml:space="preserve"> </w:t>
+      </w:r>
+      <w:r>
+        <w:t xml:space="preserve">The board has no real-time clock, so elapsed time is the simplest reliable record. 5 minutes resolves wear periods well enough for daily totals, and fits a month in flash. The analysis infers the real interval from the timestamps, so the interval can be changed without changing the analysis.</w:t>
+      </w:r>
+    </w:p>
+    <w:p>
+      <w:pPr>
+        <w:numPr>
+          <w:ilvl w:val="0"/>
+          <w:numId w:val="1009"/>
+        </w:numPr>
+        <w:pStyle w:val="Compact"/>
+      </w:pPr>
+      <w:r>
+        <w:rPr>
+          <w:bCs/>
+          <w:b/>
+        </w:rPr>
+        <w:t xml:space="preserve">Limitations:</w:t>
+      </w:r>
+    </w:p>
+    <w:p>
+      <w:pPr>
+        <w:numPr>
+          <w:ilvl w:val="1"/>
+          <w:numId w:val="1010"/>
+        </w:numPr>
+        <w:pStyle w:val="Compact"/>
+      </w:pPr>
+      <w:r>
+        <w:rPr>
+          <w:iCs/>
+          <w:i/>
+        </w:rPr>
+        <w:t xml:space="preserve">Start time.</w:t>
+      </w:r>
+      <w:r>
+        <w:t xml:space="preserve"> </w:t>
+      </w:r>
+      <w:r>
+        <w:t xml:space="preserve">Elapsed time counts from the power-on that starts data collection, while the start time is the one typed into the app at Initialize. Any gap between the two shifts every timestamp by that amount, and nothing in the file shows it. Fix: §1.2 item 1.</w:t>
+      </w:r>
+    </w:p>
+    <w:p>
+      <w:pPr>
+        <w:numPr>
+          <w:ilvl w:val="1"/>
+          <w:numId w:val="1010"/>
+        </w:numPr>
+        <w:pStyle w:val="Compact"/>
+      </w:pPr>
+      <w:r>
+        <w:rPr>
+          <w:iCs/>
+          <w:i/>
+        </w:rPr>
+        <w:t xml:space="preserve">Rollover.</w:t>
+      </w:r>
+      <w:r>
+        <w:t xml:space="preserve"> </w:t>
+      </w:r>
+      <w:r>
+        <w:rPr>
+          <w:rStyle w:val="VerbatimChar"/>
+        </w:rPr>
+        <w:t xml:space="preserve">millis()</w:t>
+      </w:r>
+      <w:r>
+        <w:t xml:space="preserve"> </w:t>
+      </w:r>
+      <w:r>
+        <w:t xml:space="preserve">is 32-bit and wraps at about 49.7 days, and the sleep check</w:t>
+      </w:r>
+      <w:r>
+        <w:t xml:space="preserve"> </w:t>
+      </w:r>
+      <w:r>
+        <w:rPr>
+          <w:rStyle w:val="VerbatimChar"/>
+        </w:rPr>
+        <w:t xml:space="preserve">nextWakeTime &gt; currentTime</w:t>
+      </w:r>
+      <w:r>
+        <w:t xml:space="preserve"> </w:t>
+      </w:r>
+      <w:r>
+        <w:t xml:space="preserve">is not wrap-safe: expect a burst of readings, then a long gap. The stored elapsed times stay correct. Fix: §1.2 item 1; until then, keep deployments to about a month.</w:t>
+      </w:r>
+    </w:p>
+    <w:p>
+      <w:pPr>
+        <w:numPr>
+          <w:ilvl w:val="1"/>
+          <w:numId w:val="1010"/>
+        </w:numPr>
+        <w:pStyle w:val="Compact"/>
+      </w:pPr>
+      <w:r>
+        <w:rPr>
+          <w:iCs/>
+          <w:i/>
+        </w:rPr>
+        <w:t xml:space="preserve">Clock accuracy.</w:t>
+      </w:r>
+      <w:r>
+        <w:t xml:space="preserve"> </w:t>
+      </w:r>
+      <w:r>
+        <w:t xml:space="preserve">Timestamps rely on the board’s oscillator, with no correction. With the board’s crystal (tens of ppm) the error is about 1–2 minutes a month, well under one interval; while this is not measured directly, it is a commonly known limitation of using onboard crystal (check: §1.2 item 4).</w:t>
+      </w:r>
+    </w:p>
     <w:bookmarkEnd w:id="40"/>
     <w:bookmarkStart w:id="41" w:name="robust-proximity-reads"/>
     <w:p>
@@ -3993,7 +3369,7 @@
         <w:t xml:space="preserve"> </w:t>
       </w:r>
       <w:r>
-        <w:t xml:space="preserve">§4.</w:t>
+        <w:t xml:space="preserve">§4. How to re-tune: SOP Appendix C.</w:t>
       </w:r>
     </w:p>
     <w:bookmarkStart w:id="43" w:name="temperature-above-a-rolling-baseline"/>
@@ -4062,122 +3438,79 @@
           <w:bCs/>
           <w:b/>
         </w:rPr>
-        <w:t xml:space="preserve">Limitation:</w:t>
-      </w:r>
-      <w:r>
-        <w:t xml:space="preserve"> </w:t>
-      </w:r>
-      <w:r>
-        <w:t xml:space="preserve">After about an hour of continuous wear the 2-hour window holds only</w:t>
-      </w:r>
-      <w:r>
-        <w:t xml:space="preserve"> </w:t>
-      </w:r>
-      <w:r>
-        <w:t xml:space="preserve">“</w:t>
-      </w:r>
-      <w:r>
-        <w:t xml:space="preserve">worn</w:t>
-      </w:r>
-      <w:r>
-        <w:t xml:space="preserve">”</w:t>
-      </w:r>
-      <w:r>
-        <w:t xml:space="preserve"> </w:t>
-      </w:r>
-      <w:r>
-        <w:t xml:space="preserve">samples, so the baseline rises to skin temperature and delta falls to about 0. From then on, a single drop of 0.4 °C between samples ends the event, and it cannot restart (that needs delta ≥ 3 °C or a jump ≥ 0.8 °C). On synthetic 8-hour overnight wear, noise with a standard deviation of 0.15 °C split the nights into short pieces; with 0.04 °C they were detected whole. Possible fixes are in Appendix B.2; validation is §1.2 item 3.</w:t>
-      </w:r>
-    </w:p>
-    <w:bookmarkEnd w:id="43"/>
-    <w:bookmarkStart w:id="44" w:name="proximity-as-a-gate"/>
-    <w:p>
-      <w:pPr>
-        <w:pStyle w:val="Heading2"/>
-      </w:pPr>
-      <w:r>
-        <w:t xml:space="preserve">5.2 Proximity as a gate</w:t>
+        <w:t xml:space="preserve">Limitations:</w:t>
       </w:r>
     </w:p>
     <w:p>
       <w:pPr>
         <w:numPr>
-          <w:ilvl w:val="0"/>
+          <w:ilvl w:val="1"/>
           <w:numId w:val="1013"/>
         </w:numPr>
         <w:pStyle w:val="Compact"/>
       </w:pPr>
       <w:r>
         <w:rPr>
-          <w:bCs/>
-          <w:b/>
-        </w:rPr>
-        <w:t xml:space="preserve">Design Decision:</w:t>
-      </w:r>
-      <w:r>
-        <w:t xml:space="preserve"> </w:t>
-      </w:r>
-      <w:r>
-        <w:t xml:space="preserve">Use the proximity sensor only to confirm</w:t>
-      </w:r>
-      <w:r>
-        <w:t xml:space="preserve"> </w:t>
-      </w:r>
-      <w:r>
-        <w:t xml:space="preserve">“</w:t>
-      </w:r>
-      <w:r>
-        <w:t xml:space="preserve">covered</w:t>
-      </w:r>
-      <w:r>
-        <w:t xml:space="preserve">”</w:t>
-      </w:r>
-      <w:r>
-        <w:t xml:space="preserve">, not to detect wear on its own.</w:t>
+          <w:iCs/>
+          <w:i/>
+        </w:rPr>
+        <w:t xml:space="preserve">Short wear.</w:t>
+      </w:r>
+      <w:r>
+        <w:t xml:space="preserve"> </w:t>
+      </w:r>
+      <w:r>
+        <w:t xml:space="preserve">Events shorter than 2 readings are dropped, so wear periods under about 10 minutes are not counted, and every start and end time is accurate to one 5-minute step.</w:t>
       </w:r>
     </w:p>
     <w:p>
       <w:pPr>
         <w:numPr>
-          <w:ilvl w:val="0"/>
+          <w:ilvl w:val="1"/>
           <w:numId w:val="1013"/>
         </w:numPr>
         <w:pStyle w:val="Compact"/>
       </w:pPr>
       <w:r>
         <w:rPr>
-          <w:bCs/>
-          <w:b/>
-        </w:rPr>
-        <w:t xml:space="preserve">Why:</w:t>
-      </w:r>
-      <w:r>
-        <w:t xml:space="preserve"> </w:t>
-      </w:r>
-      <w:r>
-        <w:t xml:space="preserve">Temperature alone can’t tell wear from a warm environment (e.g. the splint left on a radiator or in the sun); the covered sensor rules those out.</w:t>
-      </w:r>
-    </w:p>
-    <w:bookmarkEnd w:id="44"/>
-    <w:bookmarkStart w:id="45" w:name="drift-invariant-covered"/>
+          <w:iCs/>
+          <w:i/>
+        </w:rPr>
+        <w:t xml:space="preserve">Long wear.</w:t>
+      </w:r>
+      <w:r>
+        <w:t xml:space="preserve"> </w:t>
+      </w:r>
+      <w:r>
+        <w:t xml:space="preserve">After about an hour of continuous wear the 2-hour window holds only</w:t>
+      </w:r>
+      <w:r>
+        <w:t xml:space="preserve"> </w:t>
+      </w:r>
+      <w:r>
+        <w:t xml:space="preserve">“</w:t>
+      </w:r>
+      <w:r>
+        <w:t xml:space="preserve">worn</w:t>
+      </w:r>
+      <w:r>
+        <w:t xml:space="preserve">”</w:t>
+      </w:r>
+      <w:r>
+        <w:t xml:space="preserve"> </w:t>
+      </w:r>
+      <w:r>
+        <w:t xml:space="preserve">samples, so the baseline rises to skin temperature and delta falls to about 0. From then on, a single drop of 0.4 °C between samples ends the event, and it cannot restart (that needs delta ≥ 3 °C or a jump ≥ 0.8 °C). On synthetic 8-hour overnight wear, noise with a standard deviation of 0.15 °C split the nights into short pieces; with 0.04 °C they were detected whole. Possible fixes are in SOP Appendix C; validation is §1.2 item 3.</w:t>
+      </w:r>
+    </w:p>
+    <w:bookmarkEnd w:id="43"/>
+    <w:bookmarkStart w:id="44" w:name="proximity-as-a-gate"/>
     <w:p>
       <w:pPr>
         <w:pStyle w:val="Heading2"/>
       </w:pPr>
       <w:r>
-        <w:t xml:space="preserve">5.3 Drift-invariant</w:t>
-      </w:r>
-      <w:r>
-        <w:t xml:space="preserve"> </w:t>
-      </w:r>
-      <w:r>
-        <w:t xml:space="preserve">“</w:t>
-      </w:r>
-      <w:r>
-        <w:t xml:space="preserve">covered</w:t>
-      </w:r>
-      <w:r>
-        <w:t xml:space="preserve">”</w:t>
+        <w:t xml:space="preserve">5.2 Proximity as a gate</w:t>
       </w:r>
     </w:p>
     <w:p>
@@ -4199,16 +3532,22 @@
         <w:t xml:space="preserve"> </w:t>
       </w:r>
       <w:r>
-        <w:t xml:space="preserve">Track the proximity floor as the rolling 10th percentile over about a day, subtract it, and call the sensor covered when the remainder is within the noise (</w:t>
-      </w:r>
-      <w:r>
-        <w:rPr>
-          <w:rStyle w:val="VerbatimChar"/>
-        </w:rPr>
-        <w:t xml:space="preserve">max(5, 4 × MAD)</w:t>
-      </w:r>
-      <w:r>
-        <w:t xml:space="preserve">, where MAD is the median absolute deviation).</w:t>
+        <w:t xml:space="preserve">Use the proximity sensor only to confirm</w:t>
+      </w:r>
+      <w:r>
+        <w:t xml:space="preserve"> </w:t>
+      </w:r>
+      <w:r>
+        <w:t xml:space="preserve">“</w:t>
+      </w:r>
+      <w:r>
+        <w:t xml:space="preserve">covered</w:t>
+      </w:r>
+      <w:r>
+        <w:t xml:space="preserve">”</w:t>
+      </w:r>
+      <w:r>
+        <w:t xml:space="preserve">, not to detect wear on its own.</w:t>
       </w:r>
     </w:p>
     <w:p>
@@ -4230,45 +3569,29 @@
         <w:t xml:space="preserve"> </w:t>
       </w:r>
       <w:r>
-        <w:t xml:space="preserve">On a 35-day recording the proximity reading while worn crept from 0 into the 50s as the battery discharged. The original test (</w:t>
-      </w:r>
-      <w:r>
-        <w:rPr>
-          <w:rStyle w:val="VerbatimChar"/>
-        </w:rPr>
-        <w:t xml:space="preserve">prox == 0</w:t>
-      </w:r>
-      <w:r>
-        <w:t xml:space="preserve">) stopped working after about 11 days, and wear was missed from then on.</w:t>
-      </w:r>
-    </w:p>
-    <w:bookmarkEnd w:id="45"/>
-    <w:bookmarkStart w:id="46" w:name="thresholds-are-empirical"/>
+        <w:t xml:space="preserve">Temperature alone can’t tell wear from a warm environment (e.g. the splint left on a radiator or in the sun); the covered sensor rules those out.</w:t>
+      </w:r>
+    </w:p>
+    <w:bookmarkEnd w:id="44"/>
+    <w:bookmarkStart w:id="45" w:name="drift-invariant-covered"/>
     <w:p>
       <w:pPr>
         <w:pStyle w:val="Heading2"/>
       </w:pPr>
       <w:r>
-        <w:t xml:space="preserve">5.4 Thresholds are empirical</w:t>
-      </w:r>
-    </w:p>
-    <w:p>
-      <w:pPr>
-        <w:pStyle w:val="FirstParagraph"/>
-      </w:pPr>
-      <w:r>
-        <w:t xml:space="preserve">All thresholds were set by inspecting a small number of recordings. A finer tuning may be required based on the larger sample data. Appendix B describes further on how.</w:t>
-      </w:r>
-    </w:p>
-    <w:bookmarkEnd w:id="46"/>
-    <w:bookmarkEnd w:id="47"/>
-    <w:bookmarkStart w:id="48" w:name="time-handling"/>
-    <w:p>
-      <w:pPr>
-        <w:pStyle w:val="Heading1"/>
-      </w:pPr>
-      <w:r>
-        <w:t xml:space="preserve">6. Time handling</w:t>
+        <w:t xml:space="preserve">5.3 Drift-invariant</w:t>
+      </w:r>
+      <w:r>
+        <w:t xml:space="preserve"> </w:t>
+      </w:r>
+      <w:r>
+        <w:t xml:space="preserve">“</w:t>
+      </w:r>
+      <w:r>
+        <w:t xml:space="preserve">covered</w:t>
+      </w:r>
+      <w:r>
+        <w:t xml:space="preserve">”</w:t>
       </w:r>
     </w:p>
     <w:p>
@@ -4290,32 +3613,16 @@
         <w:t xml:space="preserve"> </w:t>
       </w:r>
       <w:r>
-        <w:t xml:space="preserve">The logger knows only UTC epoch seconds. The app asks for and shows</w:t>
-      </w:r>
-      <w:r>
-        <w:t xml:space="preserve"> </w:t>
-      </w:r>
-      <w:r>
-        <w:rPr>
-          <w:bCs/>
-          <w:b/>
-        </w:rPr>
-        <w:t xml:space="preserve">Eastern time</w:t>
-      </w:r>
-      <w:r>
-        <w:t xml:space="preserve"> </w:t>
-      </w:r>
-      <w:r>
-        <w:t xml:space="preserve">(America/New_York, daylight-saving aware) everywhere, and writes timestamps with their UTC offset (e.g. </w:t>
+        <w:t xml:space="preserve">Track the proximity floor as the rolling 10th percentile over about a day, subtract it, and call the sensor covered when the remainder is within the noise (</w:t>
       </w:r>
       <w:r>
         <w:rPr>
           <w:rStyle w:val="VerbatimChar"/>
         </w:rPr>
-        <w:t xml:space="preserve">-04:00</w:t>
-      </w:r>
-      <w:r>
-        <w:t xml:space="preserve">).</w:t>
+        <w:t xml:space="preserve">max(5, 4 × MAD)</w:t>
+      </w:r>
+      <w:r>
+        <w:t xml:space="preserve">, where MAD is the median absolute deviation).</w:t>
       </w:r>
     </w:p>
     <w:p>
@@ -4337,73 +3644,45 @@
         <w:t xml:space="preserve"> </w:t>
       </w:r>
       <w:r>
-        <w:t xml:space="preserve">The study runs in Ontario. The offset keeps the repeated hour at the November change unambiguous, and durations across the change come out right.</w:t>
-      </w:r>
-    </w:p>
-    <w:p>
-      <w:pPr>
-        <w:numPr>
-          <w:ilvl w:val="0"/>
-          <w:numId w:val="1015"/>
-        </w:numPr>
-        <w:pStyle w:val="Compact"/>
-      </w:pPr>
-      <w:r>
-        <w:rPr>
-          <w:bCs/>
-          <w:b/>
-        </w:rPr>
-        <w:t xml:space="preserve">Recovery:</w:t>
-      </w:r>
-      <w:r>
-        <w:t xml:space="preserve"> </w:t>
-      </w:r>
-      <w:r>
-        <w:t xml:space="preserve">If a logger loses its start time, the elapsed times survive. The app detects such files and rebuilds the timestamps from a start time the user enters, during download or on the Data Analysis page.</w:t>
-      </w:r>
-    </w:p>
-    <w:p>
-      <w:pPr>
-        <w:numPr>
-          <w:ilvl w:val="0"/>
-          <w:numId w:val="1015"/>
-        </w:numPr>
-        <w:pStyle w:val="Compact"/>
-      </w:pPr>
-      <w:r>
-        <w:rPr>
-          <w:bCs/>
-          <w:b/>
-        </w:rPr>
-        <w:t xml:space="preserve">To change the zone:</w:t>
-      </w:r>
-      <w:r>
-        <w:t xml:space="preserve"> </w:t>
-      </w:r>
-      <w:r>
-        <w:t xml:space="preserve">edit</w:t>
-      </w:r>
-      <w:r>
-        <w:t xml:space="preserve"> </w:t>
+        <w:t xml:space="preserve">On a 35-day recording the proximity reading while worn crept from 0 into the 50s as the battery discharged. The original test (</w:t>
       </w:r>
       <w:r>
         <w:rPr>
           <w:rStyle w:val="VerbatimChar"/>
         </w:rPr>
-        <w:t xml:space="preserve">timezone_config.py</w:t>
-      </w:r>
-      <w:r>
-        <w:t xml:space="preserve">.</w:t>
-      </w:r>
-    </w:p>
-    <w:bookmarkEnd w:id="48"/>
-    <w:bookmarkStart w:id="49" w:name="desktop-application"/>
+        <w:t xml:space="preserve">prox == 0</w:t>
+      </w:r>
+      <w:r>
+        <w:t xml:space="preserve">) stopped working after about 11 days, and wear was missed from then on.</w:t>
+      </w:r>
+    </w:p>
+    <w:bookmarkEnd w:id="45"/>
+    <w:bookmarkStart w:id="46" w:name="thresholds-are-empirical"/>
+    <w:p>
+      <w:pPr>
+        <w:pStyle w:val="Heading2"/>
+      </w:pPr>
+      <w:r>
+        <w:t xml:space="preserve">5.4 Thresholds are empirical</w:t>
+      </w:r>
+    </w:p>
+    <w:p>
+      <w:pPr>
+        <w:pStyle w:val="FirstParagraph"/>
+      </w:pPr>
+      <w:r>
+        <w:t xml:space="preserve">All thresholds were set by inspecting a small number of recordings. A finer tuning may be required based on the larger sample data; SOP Appendix C describes how.</w:t>
+      </w:r>
+    </w:p>
+    <w:bookmarkEnd w:id="46"/>
+    <w:bookmarkEnd w:id="47"/>
+    <w:bookmarkStart w:id="48" w:name="time-handling"/>
     <w:p>
       <w:pPr>
         <w:pStyle w:val="Heading1"/>
       </w:pPr>
       <w:r>
-        <w:t xml:space="preserve">7. Desktop application</w:t>
+        <w:t xml:space="preserve">6. Time handling</w:t>
       </w:r>
     </w:p>
     <w:p>
@@ -4419,28 +3698,38 @@
           <w:bCs/>
           <w:b/>
         </w:rPr>
-        <w:t xml:space="preserve">Browser-based interface (Dash + Flask-SocketIO).</w:t>
-      </w:r>
-      <w:r>
-        <w:t xml:space="preserve"> </w:t>
-      </w:r>
-      <w:r>
-        <w:t xml:space="preserve">Plotly/Dash provide the charts and tables; the app runs a local server on</w:t>
-      </w:r>
-      <w:r>
-        <w:t xml:space="preserve"> </w:t>
+        <w:t xml:space="preserve">Design Decision:</w:t>
+      </w:r>
+      <w:r>
+        <w:t xml:space="preserve"> </w:t>
+      </w:r>
+      <w:r>
+        <w:t xml:space="preserve">The logger knows only UTC epoch seconds. The app asks for and shows</w:t>
+      </w:r>
+      <w:r>
+        <w:t xml:space="preserve"> </w:t>
+      </w:r>
+      <w:r>
+        <w:rPr>
+          <w:bCs/>
+          <w:b/>
+        </w:rPr>
+        <w:t xml:space="preserve">Eastern time</w:t>
+      </w:r>
+      <w:r>
+        <w:t xml:space="preserve"> </w:t>
+      </w:r>
+      <w:r>
+        <w:t xml:space="preserve">(America/New_York, daylight-saving aware) everywhere, and writes timestamps with their UTC offset (e.g. </w:t>
       </w:r>
       <w:r>
         <w:rPr>
           <w:rStyle w:val="VerbatimChar"/>
         </w:rPr>
-        <w:t xml:space="preserve">127.0.0.1:8050</w:t>
-      </w:r>
-      <w:r>
-        <w:t xml:space="preserve"> </w:t>
-      </w:r>
-      <w:r>
-        <w:t xml:space="preserve">and opens the browser.</w:t>
+        <w:t xml:space="preserve">-04:00</w:t>
+      </w:r>
+      <w:r>
+        <w:t xml:space="preserve">).</w:t>
       </w:r>
     </w:p>
     <w:p>
@@ -4456,13 +3745,13 @@
           <w:bCs/>
           <w:b/>
         </w:rPr>
-        <w:t xml:space="preserve">Heartbeat shutdown.</w:t>
-      </w:r>
-      <w:r>
-        <w:t xml:space="preserve"> </w:t>
-      </w:r>
-      <w:r>
-        <w:t xml:space="preserve">The page sends a heartbeat every 5 s. With none for 5 minutes, the server warns the page and exits, so closing the tab doesn’t leave a hidden server holding the serial port for data privacy.</w:t>
+        <w:t xml:space="preserve">Why:</w:t>
+      </w:r>
+      <w:r>
+        <w:t xml:space="preserve"> </w:t>
+      </w:r>
+      <w:r>
+        <w:t xml:space="preserve">The study runs in Ontario. The offset keeps the repeated hour at the November change unambiguous, and durations across the change come out right.</w:t>
       </w:r>
     </w:p>
     <w:p>
@@ -4478,13 +3767,13 @@
           <w:bCs/>
           <w:b/>
         </w:rPr>
-        <w:t xml:space="preserve">Works offline.</w:t>
-      </w:r>
-      <w:r>
-        <w:t xml:space="preserve"> </w:t>
-      </w:r>
-      <w:r>
-        <w:t xml:space="preserve">All required assets are packaged, allowing the application to be usable in offline conditions as well.</w:t>
+        <w:t xml:space="preserve">Recovery:</w:t>
+      </w:r>
+      <w:r>
+        <w:t xml:space="preserve"> </w:t>
+      </w:r>
+      <w:r>
+        <w:t xml:space="preserve">If a logger loses its start time, the elapsed times survive. The app detects such files and rebuilds the timestamps from a start time the user enters, during download or on the Data Analysis page.</w:t>
       </w:r>
     </w:p>
     <w:p>
@@ -4500,13 +3789,13 @@
           <w:bCs/>
           <w:b/>
         </w:rPr>
-        <w:t xml:space="preserve">Automated releases.</w:t>
-      </w:r>
-      <w:r>
-        <w:t xml:space="preserve"> </w:t>
-      </w:r>
-      <w:r>
-        <w:t xml:space="preserve">GitHub Actions builds stand-alone Windows and macOS programs on each</w:t>
+        <w:t xml:space="preserve">To change the zone:</w:t>
+      </w:r>
+      <w:r>
+        <w:t xml:space="preserve"> </w:t>
+      </w:r>
+      <w:r>
+        <w:t xml:space="preserve">edit</w:t>
       </w:r>
       <w:r>
         <w:t xml:space="preserve"> </w:t>
@@ -4515,20 +3804,27 @@
         <w:rPr>
           <w:rStyle w:val="VerbatimChar"/>
         </w:rPr>
-        <w:t xml:space="preserve">v*</w:t>
-      </w:r>
-      <w:r>
-        <w:t xml:space="preserve"> </w:t>
-      </w:r>
-      <w:r>
-        <w:t xml:space="preserve">tag, with Python included, so staff need no Python (SOP Appendix B).</w:t>
+        <w:t xml:space="preserve">timezone_config.py</w:t>
+      </w:r>
+      <w:r>
+        <w:t xml:space="preserve">.</w:t>
+      </w:r>
+    </w:p>
+    <w:bookmarkEnd w:id="48"/>
+    <w:bookmarkStart w:id="49" w:name="desktop-application"/>
+    <w:p>
+      <w:pPr>
+        <w:pStyle w:val="Heading1"/>
+      </w:pPr>
+      <w:r>
+        <w:t xml:space="preserve">7. Desktop application</w:t>
       </w:r>
     </w:p>
     <w:p>
       <w:pPr>
         <w:numPr>
           <w:ilvl w:val="0"/>
-          <w:numId w:val="1016"/>
+          <w:numId w:val="1017"/>
         </w:numPr>
         <w:pStyle w:val="Compact"/>
       </w:pPr>
@@ -4537,6 +3833,124 @@
           <w:bCs/>
           <w:b/>
         </w:rPr>
+        <w:t xml:space="preserve">Browser-based interface (Dash + Flask-SocketIO).</w:t>
+      </w:r>
+      <w:r>
+        <w:t xml:space="preserve"> </w:t>
+      </w:r>
+      <w:r>
+        <w:t xml:space="preserve">Plotly/Dash provide the charts and tables; the app runs a local server on</w:t>
+      </w:r>
+      <w:r>
+        <w:t xml:space="preserve"> </w:t>
+      </w:r>
+      <w:r>
+        <w:rPr>
+          <w:rStyle w:val="VerbatimChar"/>
+        </w:rPr>
+        <w:t xml:space="preserve">127.0.0.1:8050</w:t>
+      </w:r>
+      <w:r>
+        <w:t xml:space="preserve"> </w:t>
+      </w:r>
+      <w:r>
+        <w:t xml:space="preserve">and opens the browser.</w:t>
+      </w:r>
+    </w:p>
+    <w:p>
+      <w:pPr>
+        <w:numPr>
+          <w:ilvl w:val="0"/>
+          <w:numId w:val="1017"/>
+        </w:numPr>
+        <w:pStyle w:val="Compact"/>
+      </w:pPr>
+      <w:r>
+        <w:rPr>
+          <w:bCs/>
+          <w:b/>
+        </w:rPr>
+        <w:t xml:space="preserve">Heartbeat shutdown.</w:t>
+      </w:r>
+      <w:r>
+        <w:t xml:space="preserve"> </w:t>
+      </w:r>
+      <w:r>
+        <w:t xml:space="preserve">The page sends a heartbeat every 5 s. With none for 5 minutes, the server warns the page and exits, so closing the tab doesn’t leave a hidden server holding the serial port for data privacy.</w:t>
+      </w:r>
+    </w:p>
+    <w:p>
+      <w:pPr>
+        <w:numPr>
+          <w:ilvl w:val="0"/>
+          <w:numId w:val="1017"/>
+        </w:numPr>
+        <w:pStyle w:val="Compact"/>
+      </w:pPr>
+      <w:r>
+        <w:rPr>
+          <w:bCs/>
+          <w:b/>
+        </w:rPr>
+        <w:t xml:space="preserve">Works offline.</w:t>
+      </w:r>
+      <w:r>
+        <w:t xml:space="preserve"> </w:t>
+      </w:r>
+      <w:r>
+        <w:t xml:space="preserve">All required assets are packaged, allowing the application to be usable in offline conditions as well.</w:t>
+      </w:r>
+    </w:p>
+    <w:p>
+      <w:pPr>
+        <w:numPr>
+          <w:ilvl w:val="0"/>
+          <w:numId w:val="1017"/>
+        </w:numPr>
+        <w:pStyle w:val="Compact"/>
+      </w:pPr>
+      <w:r>
+        <w:rPr>
+          <w:bCs/>
+          <w:b/>
+        </w:rPr>
+        <w:t xml:space="preserve">Automated releases.</w:t>
+      </w:r>
+      <w:r>
+        <w:t xml:space="preserve"> </w:t>
+      </w:r>
+      <w:r>
+        <w:t xml:space="preserve">GitHub Actions builds stand-alone Windows and macOS programs on each</w:t>
+      </w:r>
+      <w:r>
+        <w:t xml:space="preserve"> </w:t>
+      </w:r>
+      <w:r>
+        <w:rPr>
+          <w:rStyle w:val="VerbatimChar"/>
+        </w:rPr>
+        <w:t xml:space="preserve">v*</w:t>
+      </w:r>
+      <w:r>
+        <w:t xml:space="preserve"> </w:t>
+      </w:r>
+      <w:r>
+        <w:t xml:space="preserve">tag, with Python included, so staff need no Python (SOP Appendix B).</w:t>
+      </w:r>
+    </w:p>
+    <w:p>
+      <w:pPr>
+        <w:numPr>
+          <w:ilvl w:val="0"/>
+          <w:numId w:val="1017"/>
+        </w:numPr>
+        <w:pStyle w:val="Compact"/>
+      </w:pPr>
+      <w:r>
+        <w:rPr>
+          <w:bCs/>
+          <w:b/>
+        </w:rPr>
         <w:t xml:space="preserve">Participant IDs.</w:t>
       </w:r>
       <w:r>
@@ -4574,212 +3988,13 @@
       </w:r>
     </w:p>
     <w:bookmarkEnd w:id="49"/>
-    <w:bookmarkStart w:id="50" w:name="testing-and-validation-to-date"/>
+    <w:bookmarkStart w:id="50" w:name="directions-to-explore"/>
     <w:p>
       <w:pPr>
         <w:pStyle w:val="Heading1"/>
       </w:pPr>
       <w:r>
-        <w:t xml:space="preserve">8. Testing and validation to date</w:t>
-      </w:r>
-    </w:p>
-    <w:tbl>
-      <w:tblPr>
-        <w:tblStyle w:val="Table"/>
-        <w:tblW w:type="pct" w:w="5000"/>
-        <w:tblLook w:firstRow="1" w:lastRow="0" w:firstColumn="0" w:lastColumn="0" w:noHBand="0" w:noVBand="0" w:val="0020"/>
-        <w:jc w:val="start"/>
-        <w:tblBorders>
-          <w:top w:val="single" w:sz="4" w:space="0" w:color="BFBFBF"/>
-          <w:left w:val="single" w:sz="4" w:space="0" w:color="BFBFBF"/>
-          <w:bottom w:val="single" w:sz="4" w:space="0" w:color="BFBFBF"/>
-          <w:right w:val="single" w:sz="4" w:space="0" w:color="BFBFBF"/>
-          <w:insideH w:val="single" w:sz="4" w:space="0" w:color="BFBFBF"/>
-          <w:insideV w:val="single" w:sz="4" w:space="0" w:color="BFBFBF"/>
-        </w:tblBorders>
-      </w:tblPr>
-      <w:tblGrid>
-        <w:gridCol w:w="3960"/>
-        <w:gridCol w:w="3960"/>
-      </w:tblGrid>
-      <w:tr>
-        <w:trPr>
-          <w:tblHeader w:val="true"/>
-        </w:trPr>
-        <w:tc>
-          <w:tcPr>
-            <w:shd w:val="clear" w:color="auto" w:fill="DCE6F1"/>
-          </w:tcPr>
-          <w:p>
-            <w:pPr>
-              <w:pStyle w:val="Compact"/>
-              <w:jc w:val="left"/>
-            </w:pPr>
-            <w:r>
-              <w:rPr>
-                <w:b/>
-                <w:sz w:val="19"/>
-              </w:rPr>
-              <w:t xml:space="preserve">Area</w:t>
-            </w:r>
-          </w:p>
-        </w:tc>
-        <w:tc>
-          <w:tcPr>
-            <w:shd w:val="clear" w:color="auto" w:fill="DCE6F1"/>
-          </w:tcPr>
-          <w:p>
-            <w:pPr>
-              <w:pStyle w:val="Compact"/>
-              <w:jc w:val="left"/>
-            </w:pPr>
-            <w:r>
-              <w:rPr>
-                <w:b/>
-                <w:sz w:val="19"/>
-              </w:rPr>
-              <w:t xml:space="preserve">Status</w:t>
-            </w:r>
-          </w:p>
-        </w:tc>
-      </w:tr>
-      <w:tr>
-        <w:tc>
-          <w:tcPr/>
-          <w:p>
-            <w:pPr>
-              <w:pStyle w:val="Compact"/>
-              <w:jc w:val="left"/>
-            </w:pPr>
-            <w:r>
-              <w:rPr>
-                <w:sz w:val="19"/>
-              </w:rPr>
-              <w:t xml:space="preserve">Logging over a deployment</w:t>
-            </w:r>
-          </w:p>
-        </w:tc>
-        <w:tc>
-          <w:tcPr/>
-          <w:p>
-            <w:pPr>
-              <w:pStyle w:val="Compact"/>
-              <w:jc w:val="left"/>
-            </w:pPr>
-            <w:r>
-              <w:rPr>
-                <w:sz w:val="19"/>
-              </w:rPr>
-              <w:t xml:space="preserve">Recordings up to ~36 days collected and analyzed</w:t>
-            </w:r>
-          </w:p>
-        </w:tc>
-      </w:tr>
-      <w:tr>
-        <w:tc>
-          <w:tcPr/>
-          <w:p>
-            <w:pPr>
-              <w:pStyle w:val="Compact"/>
-              <w:jc w:val="left"/>
-            </w:pPr>
-            <w:r>
-              <w:rPr>
-                <w:sz w:val="19"/>
-              </w:rPr>
-              <w:t xml:space="preserve">Resting current</w:t>
-            </w:r>
-          </w:p>
-        </w:tc>
-        <w:tc>
-          <w:tcPr/>
-          <w:p>
-            <w:pPr>
-              <w:pStyle w:val="Compact"/>
-              <w:jc w:val="left"/>
-            </w:pPr>
-            <w:r>
-              <w:rPr>
-                <w:sz w:val="19"/>
-              </w:rPr>
-              <w:t xml:space="preserve">Below ~750 µA on the bench</w:t>
-            </w:r>
-          </w:p>
-        </w:tc>
-      </w:tr>
-      <w:tr>
-        <w:tc>
-          <w:tcPr/>
-          <w:p>
-            <w:pPr>
-              <w:pStyle w:val="Compact"/>
-              <w:jc w:val="left"/>
-            </w:pPr>
-            <w:r>
-              <w:rPr>
-                <w:sz w:val="19"/>
-              </w:rPr>
-              <w:t xml:space="preserve">Proximity drift</w:t>
-            </w:r>
-          </w:p>
-        </w:tc>
-        <w:tc>
-          <w:tcPr/>
-          <w:p>
-            <w:pPr>
-              <w:pStyle w:val="Compact"/>
-              <w:jc w:val="left"/>
-            </w:pPr>
-            <w:r>
-              <w:rPr>
-                <w:sz w:val="19"/>
-              </w:rPr>
-              <w:t xml:space="preserve">Seen on a 35-day recording; handled in analysis (§5.3), covered by a test</w:t>
-            </w:r>
-          </w:p>
-        </w:tc>
-      </w:tr>
-      <w:tr>
-        <w:tc>
-          <w:tcPr/>
-          <w:p>
-            <w:pPr>
-              <w:pStyle w:val="Compact"/>
-              <w:jc w:val="left"/>
-            </w:pPr>
-            <w:r>
-              <w:rPr>
-                <w:sz w:val="19"/>
-              </w:rPr>
-              <w:t xml:space="preserve">Analysis code</w:t>
-            </w:r>
-          </w:p>
-        </w:tc>
-        <w:tc>
-          <w:tcPr/>
-          <w:p>
-            <w:pPr>
-              <w:pStyle w:val="Compact"/>
-              <w:jc w:val="left"/>
-            </w:pPr>
-            <w:r>
-              <w:rPr>
-                <w:sz w:val="19"/>
-              </w:rPr>
-              <w:t xml:space="preserve">22 automated tests (detection, drift invariance, DST, legacy files, recovery, serial parsing)</w:t>
-            </w:r>
-          </w:p>
-        </w:tc>
-      </w:tr>
-    </w:tbl>
-    <w:bookmarkEnd w:id="50"/>
-    <w:bookmarkStart w:id="51" w:name="directions-to-explore"/>
-    <w:p>
-      <w:pPr>
-        <w:pStyle w:val="Heading1"/>
-      </w:pPr>
-      <w:r>
-        <w:t xml:space="preserve">9. Directions to explore</w:t>
+        <w:t xml:space="preserve">8. Directions to explore</w:t>
       </w:r>
     </w:p>
     <w:tbl>
@@ -4939,445 +4154,7 @@
         </w:tc>
       </w:tr>
     </w:tbl>
-    <w:bookmarkEnd w:id="51"/>
-    <w:bookmarkStart w:id="55" w:name="appendix-a-firmware-robustness"/>
-    <w:p>
-      <w:pPr>
-        <w:pStyle w:val="Heading1"/>
-      </w:pPr>
-      <w:r>
-        <w:t xml:space="preserve">Appendix A — Firmware robustness</w:t>
-      </w:r>
-    </w:p>
-    <w:p>
-      <w:pPr>
-        <w:pStyle w:val="FirstParagraph"/>
-      </w:pPr>
-      <w:r>
-        <w:rPr>
-          <w:bCs/>
-          <w:b/>
-        </w:rPr>
-        <w:t xml:space="preserve">Status:</w:t>
-      </w:r>
-      <w:r>
-        <w:t xml:space="preserve"> </w:t>
-      </w:r>
-      <w:r>
-        <w:t xml:space="preserve">Explained in §4.1 and §4.4; scheduled as §1.2 items 1 and 6. Not yet implemented.</w:t>
-      </w:r>
-    </w:p>
-    <w:bookmarkStart w:id="52" w:name="a.1-start-the-recording-at-initialize"/>
-    <w:p>
-      <w:pPr>
-        <w:pStyle w:val="Heading2"/>
-      </w:pPr>
-      <w:r>
-        <w:t xml:space="preserve">A.1 Start the recording at Initialize</w:t>
-      </w:r>
-    </w:p>
-    <w:p>
-      <w:pPr>
-        <w:pStyle w:val="FirstParagraph"/>
-      </w:pPr>
-      <w:r>
-        <w:t xml:space="preserve">Today the logger powers down at Initialize and starts counting time at the</w:t>
-      </w:r>
-      <w:r>
-        <w:t xml:space="preserve"> </w:t>
-      </w:r>
-      <w:r>
-        <w:rPr>
-          <w:iCs/>
-          <w:i/>
-        </w:rPr>
-        <w:t xml:space="preserve">next</w:t>
-      </w:r>
-      <w:r>
-        <w:t xml:space="preserve"> </w:t>
-      </w:r>
-      <w:r>
-        <w:t xml:space="preserve">power-on, so the start time is only right if it is powered on at the entered minute. Two ways to remove this:</w:t>
-      </w:r>
-    </w:p>
-    <w:p>
-      <w:pPr>
-        <w:numPr>
-          <w:ilvl w:val="0"/>
-          <w:numId w:val="1017"/>
-        </w:numPr>
-        <w:pStyle w:val="Compact"/>
-      </w:pPr>
-      <w:r>
-        <w:rPr>
-          <w:bCs/>
-          <w:b/>
-        </w:rPr>
-        <w:t xml:space="preserve">Start at Initialize, from the computer’s clock.</w:t>
-      </w:r>
-      <w:r>
-        <w:t xml:space="preserve"> </w:t>
-      </w:r>
-      <w:r>
-        <w:t xml:space="preserve">The app sends</w:t>
-      </w:r>
-      <w:r>
-        <w:t xml:space="preserve"> </w:t>
-      </w:r>
-      <w:r>
-        <w:t xml:space="preserve">“</w:t>
-      </w:r>
-      <w:r>
-        <w:t xml:space="preserve">now</w:t>
-      </w:r>
-      <w:r>
-        <w:t xml:space="preserve">”</w:t>
-      </w:r>
-      <w:r>
-        <w:t xml:space="preserve"> </w:t>
-      </w:r>
-      <w:r>
-        <w:t xml:space="preserve">and the logger starts collecting immediately (no power-down). The start time is then exact, but the scheduled start goes away.</w:t>
-      </w:r>
-    </w:p>
-    <w:p>
-      <w:pPr>
-        <w:numPr>
-          <w:ilvl w:val="0"/>
-          <w:numId w:val="1017"/>
-        </w:numPr>
-        <w:pStyle w:val="Compact"/>
-      </w:pPr>
-      <w:r>
-        <w:rPr>
-          <w:bCs/>
-          <w:b/>
-        </w:rPr>
-        <w:t xml:space="preserve">Keep the scheduled start, but count from Initialize.</w:t>
-      </w:r>
-      <w:r>
-        <w:t xml:space="preserve"> </w:t>
-      </w:r>
-      <w:r>
-        <w:t xml:space="preserve">The logger stays on in low power after Initialize and starts collecting when the entered start time arrives. Also exact, at the cost of a little battery between Initialize and the start. This keeps today’s workflow.</w:t>
-      </w:r>
-    </w:p>
-    <w:bookmarkEnd w:id="52"/>
-    <w:bookmarkStart w:id="53" w:name="X7067aa404fd0484d1413deb92c2ee6bdcfc5df0"/>
-    <w:p>
-      <w:pPr>
-        <w:pStyle w:val="Heading2"/>
-      </w:pPr>
-      <w:r>
-        <w:t xml:space="preserve">A.2 Idle vs. collection by USB presence (optional)</w:t>
-      </w:r>
-    </w:p>
-    <w:p>
-      <w:pPr>
-        <w:pStyle w:val="FirstParagraph"/>
-      </w:pPr>
-      <w:r>
-        <w:t xml:space="preserve">Choose the mode at power-up by whether USB power is present (the nRF52840 reports this), instead of toggling on every power-up:</w:t>
-      </w:r>
-    </w:p>
-    <w:p>
-      <w:pPr>
-        <w:numPr>
-          <w:ilvl w:val="0"/>
-          <w:numId w:val="1018"/>
-        </w:numPr>
-        <w:pStyle w:val="Compact"/>
-      </w:pPr>
-      <w:r>
-        <w:t xml:space="preserve">USB connected → idle, answer the app.</w:t>
-      </w:r>
-    </w:p>
-    <w:p>
-      <w:pPr>
-        <w:numPr>
-          <w:ilvl w:val="0"/>
-          <w:numId w:val="1018"/>
-        </w:numPr>
-        <w:pStyle w:val="Compact"/>
-      </w:pPr>
-      <w:r>
-        <w:t xml:space="preserve">No USB → if initialized, start or</w:t>
-      </w:r>
-      <w:r>
-        <w:t xml:space="preserve"> </w:t>
-      </w:r>
-      <w:r>
-        <w:rPr>
-          <w:bCs/>
-          <w:b/>
-        </w:rPr>
-        <w:t xml:space="preserve">resume</w:t>
-      </w:r>
-      <w:r>
-        <w:t xml:space="preserve"> </w:t>
-      </w:r>
-      <w:r>
-        <w:t xml:space="preserve">collection, appending after the last record.</w:t>
-      </w:r>
-    </w:p>
-    <w:p>
-      <w:pPr>
-        <w:pStyle w:val="FirstParagraph"/>
-      </w:pPr>
-      <w:r>
-        <w:t xml:space="preserve">This makes a reset during a deployment cost only a gap instead of the rest of the recording, and the logger no longer needs a power-cycle before download. Resuming needs the elapsed time to continue across the reset, e.g. by storing a reset counter and leaving a marker row in the data.</w:t>
-      </w:r>
-    </w:p>
-    <w:bookmarkEnd w:id="53"/>
-    <w:bookmarkStart w:id="54" w:name="a.3-timing-and-storage"/>
-    <w:p>
-      <w:pPr>
-        <w:pStyle w:val="Heading2"/>
-      </w:pPr>
-      <w:r>
-        <w:t xml:space="preserve">A.3 Timing and storage</w:t>
-      </w:r>
-    </w:p>
-    <w:p>
-      <w:pPr>
-        <w:numPr>
-          <w:ilvl w:val="0"/>
-          <w:numId w:val="1019"/>
-        </w:numPr>
-        <w:pStyle w:val="Compact"/>
-      </w:pPr>
-      <w:r>
-        <w:t xml:space="preserve">Wrap-safe sleep:</w:t>
-      </w:r>
-      <w:r>
-        <w:t xml:space="preserve"> </w:t>
-      </w:r>
-      <w:r>
-        <w:rPr>
-          <w:rStyle w:val="VerbatimChar"/>
-        </w:rPr>
-        <w:t xml:space="preserve">if ((int32_t)(nextWakeTime - currentTime) &gt; 0)</w:t>
-      </w:r>
-      <w:r>
-        <w:t xml:space="preserve">. Test across the wrap with a temporary offset of about 2³² − 10 min added to</w:t>
-      </w:r>
-      <w:r>
-        <w:t xml:space="preserve"> </w:t>
-      </w:r>
-      <w:r>
-        <w:rPr>
-          <w:rStyle w:val="VerbatimChar"/>
-        </w:rPr>
-        <w:t xml:space="preserve">millis()</w:t>
-      </w:r>
-      <w:r>
-        <w:t xml:space="preserve"> </w:t>
-      </w:r>
-      <w:r>
-        <w:t xml:space="preserve">in the logging path.</w:t>
-      </w:r>
-    </w:p>
-    <w:p>
-      <w:pPr>
-        <w:numPr>
-          <w:ilvl w:val="0"/>
-          <w:numId w:val="1019"/>
-        </w:numPr>
-        <w:pStyle w:val="Compact"/>
-      </w:pPr>
-      <w:r>
-        <w:t xml:space="preserve">Stop at</w:t>
-      </w:r>
-      <w:r>
-        <w:t xml:space="preserve"> </w:t>
-      </w:r>
-      <w:r>
-        <w:rPr>
-          <w:rStyle w:val="VerbatimChar"/>
-        </w:rPr>
-        <w:t xml:space="preserve">MAX_DATA_ENTRIES</w:t>
-      </w:r>
-      <w:r>
-        <w:t xml:space="preserve"> </w:t>
-      </w:r>
-      <w:r>
-        <w:t xml:space="preserve">in</w:t>
-      </w:r>
-      <w:r>
-        <w:t xml:space="preserve"> </w:t>
-      </w:r>
-      <w:r>
-        <w:rPr>
-          <w:rStyle w:val="VerbatimChar"/>
-        </w:rPr>
-        <w:t xml:space="preserve">saveTemperatureReading</w:t>
-      </w:r>
-      <w:r>
-        <w:t xml:space="preserve">, or erase all the pages that may be written.</w:t>
-      </w:r>
-    </w:p>
-    <w:bookmarkEnd w:id="54"/>
-    <w:bookmarkEnd w:id="55"/>
-    <w:bookmarkStart w:id="58" w:name="X1e46ee66dcce5645c2d432b6ebfb1a5d4d92f07"/>
-    <w:p>
-      <w:pPr>
-        <w:pStyle w:val="Heading1"/>
-      </w:pPr>
-      <w:r>
-        <w:t xml:space="preserve">Appendix B — Ground truth and re-tuning the detector</w:t>
-      </w:r>
-    </w:p>
-    <w:p>
-      <w:pPr>
-        <w:pStyle w:val="FirstParagraph"/>
-      </w:pPr>
-      <w:r>
-        <w:rPr>
-          <w:bCs/>
-          <w:b/>
-        </w:rPr>
-        <w:t xml:space="preserve">Status:</w:t>
-      </w:r>
-      <w:r>
-        <w:t xml:space="preserve"> </w:t>
-      </w:r>
-      <w:r>
-        <w:t xml:space="preserve">Needed before wear times are reported as results; scheduled as §1.2 item 3.</w:t>
-      </w:r>
-    </w:p>
-    <w:bookmarkStart w:id="56" w:name="b.1-collecting-ground-truth"/>
-    <w:p>
-      <w:pPr>
-        <w:pStyle w:val="Heading2"/>
-      </w:pPr>
-      <w:r>
-        <w:t xml:space="preserve">B.1 Collecting ground truth</w:t>
-      </w:r>
-    </w:p>
-    <w:p>
-      <w:pPr>
-        <w:numPr>
-          <w:ilvl w:val="0"/>
-          <w:numId w:val="1020"/>
-        </w:numPr>
-        <w:pStyle w:val="Compact"/>
-      </w:pPr>
-      <w:r>
-        <w:rPr>
-          <w:bCs/>
-          <w:b/>
-        </w:rPr>
-        <w:t xml:space="preserve">Wear diary:</w:t>
-      </w:r>
-      <w:r>
-        <w:t xml:space="preserve"> </w:t>
-      </w:r>
-      <w:r>
-        <w:t xml:space="preserve">the participant (or staff, in a supervised session) records on/off times. Cheap, but coarse and subject to the same recall bias the logger is meant to avoid.</w:t>
-      </w:r>
-    </w:p>
-    <w:p>
-      <w:pPr>
-        <w:numPr>
-          <w:ilvl w:val="0"/>
-          <w:numId w:val="1020"/>
-        </w:numPr>
-        <w:pStyle w:val="Compact"/>
-      </w:pPr>
-      <w:r>
-        <w:rPr>
-          <w:bCs/>
-          <w:b/>
-        </w:rPr>
-        <w:t xml:space="preserve">Supervised sessions:</w:t>
-      </w:r>
-      <w:r>
-        <w:t xml:space="preserve"> </w:t>
-      </w:r>
-      <w:r>
-        <w:t xml:space="preserve">scripted on/off periods in the lab, including long continuous wear and confounders (warm room, splint left on a warm surface, covered but not worn).</w:t>
-      </w:r>
-    </w:p>
-    <w:p>
-      <w:pPr>
-        <w:numPr>
-          <w:ilvl w:val="0"/>
-          <w:numId w:val="1020"/>
-        </w:numPr>
-        <w:pStyle w:val="Compact"/>
-      </w:pPr>
-      <w:r>
-        <w:rPr>
-          <w:bCs/>
-          <w:b/>
-        </w:rPr>
-        <w:t xml:space="preserve">Reference sensor:</w:t>
-      </w:r>
-      <w:r>
-        <w:t xml:space="preserve"> </w:t>
-      </w:r>
-      <w:r>
-        <w:t xml:space="preserve">a second, independent sensor (e.g. a commercial temperature button logger on the skin side) for a few deployments.</w:t>
-      </w:r>
-    </w:p>
-    <w:bookmarkEnd w:id="56"/>
-    <w:bookmarkStart w:id="57" w:name="b.2-what-to-check"/>
-    <w:p>
-      <w:pPr>
-        <w:pStyle w:val="Heading2"/>
-      </w:pPr>
-      <w:r>
-        <w:t xml:space="preserve">B.2 What to check</w:t>
-      </w:r>
-    </w:p>
-    <w:p>
-      <w:pPr>
-        <w:numPr>
-          <w:ilvl w:val="0"/>
-          <w:numId w:val="1021"/>
-        </w:numPr>
-        <w:pStyle w:val="Compact"/>
-      </w:pPr>
-      <w:r>
-        <w:t xml:space="preserve">Per-event agreement (onset/offset within ±1 sample) and per-day wear minutes.</w:t>
-      </w:r>
-    </w:p>
-    <w:p>
-      <w:pPr>
-        <w:numPr>
-          <w:ilvl w:val="0"/>
-          <w:numId w:val="1021"/>
-        </w:numPr>
-        <w:pStyle w:val="Compact"/>
-      </w:pPr>
-      <w:r>
-        <w:rPr>
-          <w:bCs/>
-          <w:b/>
-        </w:rPr>
-        <w:t xml:space="preserve">Long wear:</w:t>
-      </w:r>
-      <w:r>
-        <w:t xml:space="preserve"> </w:t>
-      </w:r>
-      <w:r>
-        <w:t xml:space="preserve">whether overnight wear is split or cut short (§5.1). Possible fixes: a longer baseline window, freezing the baseline while an event is in progress, or requiring two consecutive cooling samples before ending an event.</w:t>
-      </w:r>
-    </w:p>
-    <w:p>
-      <w:pPr>
-        <w:numPr>
-          <w:ilvl w:val="0"/>
-          <w:numId w:val="1021"/>
-        </w:numPr>
-        <w:pStyle w:val="Compact"/>
-      </w:pPr>
-      <w:r>
-        <w:t xml:space="preserve">False positives in warm environments, and false negatives with a loose splint.</w:t>
-      </w:r>
-    </w:p>
-    <w:bookmarkEnd w:id="57"/>
-    <w:bookmarkEnd w:id="58"/>
+    <w:bookmarkEnd w:id="50"/>
     <w:sectPr/>
   </w:body>
 </w:document>
@@ -5612,18 +4389,6 @@
     <w:abstractNumId w:val="991"/>
   </w:num>
   <w:num w:numId="1017">
-    <w:abstractNumId w:val="991"/>
-  </w:num>
-  <w:num w:numId="1018">
-    <w:abstractNumId w:val="991"/>
-  </w:num>
-  <w:num w:numId="1019">
-    <w:abstractNumId w:val="991"/>
-  </w:num>
-  <w:num w:numId="1020">
-    <w:abstractNumId w:val="991"/>
-  </w:num>
-  <w:num w:numId="1021">
     <w:abstractNumId w:val="991"/>
   </w:num>
 </w:numbering>

</xml_diff>

<commit_message>
Add ethics approval and data governance as next steps
- Handover §1.2: new items 3 (ethics approval) and 4 (data-governance
  plan) ahead of wear-detection validation; later items renumbered and
  cross-references updated; Summary mentions both
- New §7.1: what the app does with data (local only, unencrypted on the
  logger until re-initialized, CSV via browser, no copies or log files),
  stated as behaviour, not policy
- SOP: safety callout notes ethics approval is not yet obtained; §10
  advises study-code participant IDs and points to the governance item

Co-Authored-By: Claude Opus 5.5 <noreply@anthropic.com>
Claude-Session: https://claude.ai/code/session_01Ue3sWJSFRo3Bxhe8SfexR3
</commit_message>
<xml_diff>
--- a/docs/Project_Handover.docx
+++ b/docs/Project_Handover.docx
@@ -211,7 +211,7 @@
         <w:t xml:space="preserve"> </w:t>
       </w:r>
       <w:r>
-        <w:t xml:space="preserve">where the project stands, what has been tested, all next steps in one place, and who to contact. Read this first.</w:t>
+        <w:t xml:space="preserve">where the project stands, what has been tested, all next steps (including ethics and data governance) in one place, and who to contact. Read this first.</w:t>
       </w:r>
     </w:p>
     <w:p>
@@ -580,7 +580,7 @@
         <w:t xml:space="preserve"> </w:t>
       </w:r>
       <w:r>
-        <w:t xml:space="preserve">The system works end to end: a logger can be set up with the app, worn in the splint for up to about a month, and downloaded, and the app turns the recording into daily wear time and an hour-by-hour picture of when the splint was worn. Two loggers have been built. Wear times are estimates in 5-minute steps (wear shorter than about 10 minutes is not counted), and the detection has not yet been fully validated against a record of actual wear. Before a larger study, the known firmware issues should be fixed, battery life measured, and wear detection validated (§1.2).</w:t>
+        <w:t xml:space="preserve">The system works end to end: a logger can be set up with the app, worn in the splint for up to about a month, and downloaded, and the app turns the recording into daily wear time and an hour-by-hour picture of when the splint was worn. Two loggers have been built. Wear times are estimates in 5-minute steps (wear shorter than about 10 minutes is not counted), and the detection has not yet been fully validated against a record of actual wear. Before a study with participants, ethics approval and a data-governance plan are needed, the known firmware issues should be fixed, battery life measured, and wear detection validated (§1.2).</w:t>
       </w:r>
     </w:p>
     <w:bookmarkStart w:id="21" w:name="current-state"/>
@@ -1029,22 +1029,22 @@
               <w:rPr>
                 <w:sz w:val="19"/>
               </w:rPr>
-              <w:t xml:space="preserve">3. Wear-detection accuracy</w:t>
-            </w:r>
-          </w:p>
-        </w:tc>
-        <w:tc>
-          <w:tcPr/>
-          <w:p>
-            <w:pPr>
-              <w:pStyle w:val="Compact"/>
-              <w:jc w:val="left"/>
-            </w:pPr>
-            <w:r>
-              <w:rPr>
-                <w:sz w:val="19"/>
-              </w:rPr>
-              <w:t xml:space="preserve">Not fully validated</w:t>
+              <w:t xml:space="preserve">3. Ethics approval</w:t>
+            </w:r>
+          </w:p>
+        </w:tc>
+        <w:tc>
+          <w:tcPr/>
+          <w:p>
+            <w:pPr>
+              <w:pStyle w:val="Compact"/>
+              <w:jc w:val="left"/>
+            </w:pPr>
+            <w:r>
+              <w:rPr>
+                <w:sz w:val="19"/>
+              </w:rPr>
+              <w:t xml:space="preserve">Not started</w:t>
             </w:r>
           </w:p>
         </w:tc>
@@ -1073,22 +1073,22 @@
               <w:rPr>
                 <w:sz w:val="19"/>
               </w:rPr>
-              <w:t xml:space="preserve">needed before wear times are reported as study results. Collect ground truth on a few deployments (wear diary or reference sensor), check overnight wear especially, and re-tune the thresholds accordingly.</w:t>
-            </w:r>
-          </w:p>
-        </w:tc>
-        <w:tc>
-          <w:tcPr/>
-          <w:p>
-            <w:pPr>
-              <w:pStyle w:val="Compact"/>
-              <w:jc w:val="left"/>
-            </w:pPr>
-            <w:r>
-              <w:rPr>
-                <w:sz w:val="19"/>
-              </w:rPr>
-              <w:t xml:space="preserve">§5; SOP Appendix C</w:t>
+              <w:t xml:space="preserve">required before any deployment with participants, including the ground-truth deployments in item 5. Prepare the submission covering the device (worn against the skin, battery-powered, research prototype), what is recorded, and how data is handled (item 4).</w:t>
+            </w:r>
+          </w:p>
+        </w:tc>
+        <w:tc>
+          <w:tcPr/>
+          <w:p>
+            <w:pPr>
+              <w:pStyle w:val="Compact"/>
+              <w:jc w:val="left"/>
+            </w:pPr>
+            <w:r>
+              <w:rPr>
+                <w:sz w:val="19"/>
+              </w:rPr>
+              <w:t xml:space="preserve">§7.1; SOP §1</w:t>
             </w:r>
           </w:p>
         </w:tc>
@@ -1105,22 +1105,22 @@
               <w:rPr>
                 <w:sz w:val="19"/>
               </w:rPr>
-              <w:t xml:space="preserve">4. Clock drift</w:t>
-            </w:r>
-          </w:p>
-        </w:tc>
-        <w:tc>
-          <w:tcPr/>
-          <w:p>
-            <w:pPr>
-              <w:pStyle w:val="Compact"/>
-              <w:jc w:val="left"/>
-            </w:pPr>
-            <w:r>
-              <w:rPr>
-                <w:sz w:val="19"/>
-              </w:rPr>
-              <w:t xml:space="preserve">Not measured; expected negligible</w:t>
+              <w:t xml:space="preserve">4. Data-governance plan</w:t>
+            </w:r>
+          </w:p>
+        </w:tc>
+        <w:tc>
+          <w:tcPr/>
+          <w:p>
+            <w:pPr>
+              <w:pStyle w:val="Compact"/>
+              <w:jc w:val="left"/>
+            </w:pPr>
+            <w:r>
+              <w:rPr>
+                <w:sz w:val="19"/>
+              </w:rPr>
+              <w:t xml:space="preserve">Not started; no policy exists</w:t>
             </w:r>
           </w:p>
         </w:tc>
@@ -1149,22 +1149,22 @@
               <w:rPr>
                 <w:sz w:val="19"/>
               </w:rPr>
-              <w:t xml:space="preserve">confirms the timestamps stay accurate over a deployment, at no extra cost. At the end of each deployment, note the real time of the power-cycle and compare it with the last timestamp in the file. They should agree within one interval (5 minutes); a larger gap shows drift or a late power-on.</w:t>
-            </w:r>
-          </w:p>
-        </w:tc>
-        <w:tc>
-          <w:tcPr/>
-          <w:p>
-            <w:pPr>
-              <w:pStyle w:val="Compact"/>
-              <w:jc w:val="left"/>
-            </w:pPr>
-            <w:r>
-              <w:rPr>
-                <w:sz w:val="19"/>
-              </w:rPr>
-              <w:t xml:space="preserve">§4.4</w:t>
+              <w:t xml:space="preserve">the app leaves data handling to the user (§7.1). Decide where recordings and deployment logs are stored, who can access them, the participant ID scheme, how long data is kept, and how it is moved off the study computer; then update the SOP (§10).</w:t>
+            </w:r>
+          </w:p>
+        </w:tc>
+        <w:tc>
+          <w:tcPr/>
+          <w:p>
+            <w:pPr>
+              <w:pStyle w:val="Compact"/>
+              <w:jc w:val="left"/>
+            </w:pPr>
+            <w:r>
+              <w:rPr>
+                <w:sz w:val="19"/>
+              </w:rPr>
+              <w:t xml:space="preserve">§7.1; SOP §10</w:t>
             </w:r>
           </w:p>
         </w:tc>
@@ -1181,7 +1181,159 @@
               <w:rPr>
                 <w:sz w:val="19"/>
               </w:rPr>
-              <w:t xml:space="preserve">5. Mode by USB presence (optional)</w:t>
+              <w:t xml:space="preserve">5. Wear-detection accuracy</w:t>
+            </w:r>
+          </w:p>
+        </w:tc>
+        <w:tc>
+          <w:tcPr/>
+          <w:p>
+            <w:pPr>
+              <w:pStyle w:val="Compact"/>
+              <w:jc w:val="left"/>
+            </w:pPr>
+            <w:r>
+              <w:rPr>
+                <w:sz w:val="19"/>
+              </w:rPr>
+              <w:t xml:space="preserve">Not fully validated</w:t>
+            </w:r>
+          </w:p>
+        </w:tc>
+        <w:tc>
+          <w:tcPr/>
+          <w:p>
+            <w:pPr>
+              <w:pStyle w:val="Compact"/>
+              <w:jc w:val="left"/>
+            </w:pPr>
+            <w:r>
+              <w:rPr>
+                <w:iCs/>
+                <w:i/>
+                <w:sz w:val="19"/>
+              </w:rPr>
+              <w:t xml:space="preserve">Why:</w:t>
+            </w:r>
+            <w:r>
+              <w:rPr>
+                <w:sz w:val="19"/>
+              </w:rPr>
+              <w:t xml:space="preserve"> </w:t>
+            </w:r>
+            <w:r>
+              <w:rPr>
+                <w:sz w:val="19"/>
+              </w:rPr>
+              <w:t xml:space="preserve">needed before wear times are reported as study results. Collect ground truth on a few deployments (wear diary or reference sensor), check overnight wear especially, and re-tune the thresholds accordingly.</w:t>
+            </w:r>
+          </w:p>
+        </w:tc>
+        <w:tc>
+          <w:tcPr/>
+          <w:p>
+            <w:pPr>
+              <w:pStyle w:val="Compact"/>
+              <w:jc w:val="left"/>
+            </w:pPr>
+            <w:r>
+              <w:rPr>
+                <w:sz w:val="19"/>
+              </w:rPr>
+              <w:t xml:space="preserve">§5; SOP Appendix C</w:t>
+            </w:r>
+          </w:p>
+        </w:tc>
+      </w:tr>
+      <w:tr>
+        <w:tc>
+          <w:tcPr/>
+          <w:p>
+            <w:pPr>
+              <w:pStyle w:val="Compact"/>
+              <w:jc w:val="left"/>
+            </w:pPr>
+            <w:r>
+              <w:rPr>
+                <w:sz w:val="19"/>
+              </w:rPr>
+              <w:t xml:space="preserve">6. Clock drift</w:t>
+            </w:r>
+          </w:p>
+        </w:tc>
+        <w:tc>
+          <w:tcPr/>
+          <w:p>
+            <w:pPr>
+              <w:pStyle w:val="Compact"/>
+              <w:jc w:val="left"/>
+            </w:pPr>
+            <w:r>
+              <w:rPr>
+                <w:sz w:val="19"/>
+              </w:rPr>
+              <w:t xml:space="preserve">Not measured; expected negligible</w:t>
+            </w:r>
+          </w:p>
+        </w:tc>
+        <w:tc>
+          <w:tcPr/>
+          <w:p>
+            <w:pPr>
+              <w:pStyle w:val="Compact"/>
+              <w:jc w:val="left"/>
+            </w:pPr>
+            <w:r>
+              <w:rPr>
+                <w:iCs/>
+                <w:i/>
+                <w:sz w:val="19"/>
+              </w:rPr>
+              <w:t xml:space="preserve">Why:</w:t>
+            </w:r>
+            <w:r>
+              <w:rPr>
+                <w:sz w:val="19"/>
+              </w:rPr>
+              <w:t xml:space="preserve"> </w:t>
+            </w:r>
+            <w:r>
+              <w:rPr>
+                <w:sz w:val="19"/>
+              </w:rPr>
+              <w:t xml:space="preserve">confirms the timestamps stay accurate over a deployment, at no extra cost. At the end of each deployment, note the real time of the power-cycle and compare it with the last timestamp in the file. They should agree within one interval (5 minutes); a larger gap shows drift or a late power-on.</w:t>
+            </w:r>
+          </w:p>
+        </w:tc>
+        <w:tc>
+          <w:tcPr/>
+          <w:p>
+            <w:pPr>
+              <w:pStyle w:val="Compact"/>
+              <w:jc w:val="left"/>
+            </w:pPr>
+            <w:r>
+              <w:rPr>
+                <w:sz w:val="19"/>
+              </w:rPr>
+              <w:t xml:space="preserve">§4.4</w:t>
+            </w:r>
+          </w:p>
+        </w:tc>
+      </w:tr>
+      <w:tr>
+        <w:tc>
+          <w:tcPr/>
+          <w:p>
+            <w:pPr>
+              <w:pStyle w:val="Compact"/>
+              <w:jc w:val="left"/>
+            </w:pPr>
+            <w:r>
+              <w:rPr>
+                <w:sz w:val="19"/>
+              </w:rPr>
+              <w:t xml:space="preserve">7. Mode by USB presence (optional)</w:t>
             </w:r>
           </w:p>
         </w:tc>
@@ -2833,7 +2985,7 @@
         <w:t xml:space="preserve"> </w:t>
       </w:r>
       <w:r>
-        <w:t xml:space="preserve">The logger can’t be seen by the app during data collection; power-cycle it first. Any reset or power loss during data collection also counts as a power-up, so the recording ends there: the data so far is kept, but nothing more is recorded. An alternative is §1.2 item 5.</w:t>
+        <w:t xml:space="preserve">The logger can’t be seen by the app during data collection; power-cycle it first. Any reset or power loss during data collection also counts as a power-up, so the recording ends there: the data so far is kept, but nothing more is recorded. An alternative is §1.2 item 7.</w:t>
       </w:r>
     </w:p>
     <w:bookmarkEnd w:id="34"/>
@@ -3269,7 +3421,7 @@
         <w:t xml:space="preserve"> </w:t>
       </w:r>
       <w:r>
-        <w:t xml:space="preserve">Timestamps rely on the board’s oscillator, with no correction. With the board’s crystal (tens of ppm) the error is about 1–2 minutes a month, well under one interval; while this is not measured directly, it is a commonly known limitation of using onboard crystal (check: §1.2 item 4).</w:t>
+        <w:t xml:space="preserve">Timestamps rely on the board’s oscillator, with no correction. With the board’s crystal (tens of ppm) the error is about 1–2 minutes a month, well under one interval; while this is not measured directly, it is a commonly known limitation of using onboard crystal (check: §1.2 item 6).</w:t>
       </w:r>
     </w:p>
     <w:bookmarkEnd w:id="40"/>
@@ -3500,7 +3652,7 @@
         <w:t xml:space="preserve"> </w:t>
       </w:r>
       <w:r>
-        <w:t xml:space="preserve">samples, so the baseline rises to skin temperature and delta falls to about 0. From then on, a single drop of 0.4 °C between samples ends the event, and it cannot restart (that needs delta ≥ 3 °C or a jump ≥ 0.8 °C). On synthetic 8-hour overnight wear, noise with a standard deviation of 0.15 °C split the nights into short pieces; with 0.04 °C they were detected whole. Possible fixes are in SOP Appendix C; validation is §1.2 item 3.</w:t>
+        <w:t xml:space="preserve">samples, so the baseline rises to skin temperature and delta falls to about 0. From then on, a single drop of 0.4 °C between samples ends the event, and it cannot restart (that needs delta ≥ 3 °C or a jump ≥ 0.8 °C). On synthetic 8-hour overnight wear, noise with a standard deviation of 0.15 °C split the nights into short pieces; with 0.04 °C they were detected whole. Possible fixes are in SOP Appendix C; validation is §1.2 item 5.</w:t>
       </w:r>
     </w:p>
     <w:bookmarkEnd w:id="43"/>
@@ -3811,7 +3963,7 @@
       </w:r>
     </w:p>
     <w:bookmarkEnd w:id="48"/>
-    <w:bookmarkStart w:id="49" w:name="desktop-application"/>
+    <w:bookmarkStart w:id="50" w:name="desktop-application"/>
     <w:p>
       <w:pPr>
         <w:pStyle w:val="Heading1"/>
@@ -3987,8 +4139,167 @@
         <w:t xml:space="preserve">, up to 15 characters: they go into the CSV header and often into file names, where commas or spaces would cause trouble.</w:t>
       </w:r>
     </w:p>
+    <w:bookmarkStart w:id="49" w:name="data-handling-app-behaviour"/>
+    <w:p>
+      <w:pPr>
+        <w:pStyle w:val="Heading2"/>
+      </w:pPr>
+      <w:r>
+        <w:t xml:space="preserve">7.1 Data handling (app behaviour)</w:t>
+      </w:r>
+    </w:p>
+    <w:p>
+      <w:pPr>
+        <w:pStyle w:val="FirstParagraph"/>
+      </w:pPr>
+      <w:r>
+        <w:t xml:space="preserve">This describes what the software does with data. It is not a data-handling policy; none exists yet (§1.2 item 4).</w:t>
+      </w:r>
+    </w:p>
+    <w:p>
+      <w:pPr>
+        <w:numPr>
+          <w:ilvl w:val="0"/>
+          <w:numId w:val="1018"/>
+        </w:numPr>
+        <w:pStyle w:val="Compact"/>
+      </w:pPr>
+      <w:r>
+        <w:rPr>
+          <w:bCs/>
+          <w:b/>
+        </w:rPr>
+        <w:t xml:space="preserve">Where data goes.</w:t>
+      </w:r>
+      <w:r>
+        <w:t xml:space="preserve"> </w:t>
+      </w:r>
+      <w:r>
+        <w:t xml:space="preserve">Everything stays on the study computer. The app runs a local server that only that computer can reach (</w:t>
+      </w:r>
+      <w:r>
+        <w:rPr>
+          <w:rStyle w:val="VerbatimChar"/>
+        </w:rPr>
+        <w:t xml:space="preserve">127.0.0.1</w:t>
+      </w:r>
+      <w:r>
+        <w:t xml:space="preserve">), and it sends nothing over the internet.</w:t>
+      </w:r>
+    </w:p>
+    <w:p>
+      <w:pPr>
+        <w:numPr>
+          <w:ilvl w:val="0"/>
+          <w:numId w:val="1018"/>
+        </w:numPr>
+        <w:pStyle w:val="Compact"/>
+      </w:pPr>
+      <w:r>
+        <w:rPr>
+          <w:bCs/>
+          <w:b/>
+        </w:rPr>
+        <w:t xml:space="preserve">On the logger.</w:t>
+      </w:r>
+      <w:r>
+        <w:t xml:space="preserve"> </w:t>
+      </w:r>
+      <w:r>
+        <w:t xml:space="preserve">Readings and the participant ID are stored unencrypted in the logger’s flash memory, and stay there until the logger is initialized again (§4.1). Anyone with the app and the logger can download them.</w:t>
+      </w:r>
+    </w:p>
+    <w:p>
+      <w:pPr>
+        <w:numPr>
+          <w:ilvl w:val="0"/>
+          <w:numId w:val="1018"/>
+        </w:numPr>
+        <w:pStyle w:val="Compact"/>
+      </w:pPr>
+      <w:r>
+        <w:rPr>
+          <w:bCs/>
+          <w:b/>
+        </w:rPr>
+        <w:t xml:space="preserve">Downloads.</w:t>
+      </w:r>
+      <w:r>
+        <w:t xml:space="preserve"> </w:t>
+      </w:r>
+      <w:r>
+        <w:t xml:space="preserve">The browser saves each download as a plain CSV file, normally in the Downloads folder. The file holds the participant ID, the start time and every reading. The app keeps no copy.</w:t>
+      </w:r>
+    </w:p>
+    <w:p>
+      <w:pPr>
+        <w:numPr>
+          <w:ilvl w:val="0"/>
+          <w:numId w:val="1018"/>
+        </w:numPr>
+        <w:pStyle w:val="Compact"/>
+      </w:pPr>
+      <w:r>
+        <w:rPr>
+          <w:bCs/>
+          <w:b/>
+        </w:rPr>
+        <w:t xml:space="preserve">Analysis page.</w:t>
+      </w:r>
+      <w:r>
+        <w:t xml:space="preserve"> </w:t>
+      </w:r>
+      <w:r>
+        <w:t xml:space="preserve">An uploaded file is processed in memory and is not saved by the app.</w:t>
+      </w:r>
+    </w:p>
+    <w:p>
+      <w:pPr>
+        <w:numPr>
+          <w:ilvl w:val="0"/>
+          <w:numId w:val="1018"/>
+        </w:numPr>
+        <w:pStyle w:val="Compact"/>
+      </w:pPr>
+      <w:r>
+        <w:rPr>
+          <w:bCs/>
+          <w:b/>
+        </w:rPr>
+        <w:t xml:space="preserve">Participant ID.</w:t>
+      </w:r>
+      <w:r>
+        <w:t xml:space="preserve"> </w:t>
+      </w:r>
+      <w:r>
+        <w:t xml:space="preserve">It is stored on the logger, in the CSV header and often in file names, so it should be a study code, not a name.</w:t>
+      </w:r>
+    </w:p>
+    <w:p>
+      <w:pPr>
+        <w:numPr>
+          <w:ilvl w:val="0"/>
+          <w:numId w:val="1018"/>
+        </w:numPr>
+        <w:pStyle w:val="Compact"/>
+      </w:pPr>
+      <w:r>
+        <w:rPr>
+          <w:bCs/>
+          <w:b/>
+        </w:rPr>
+        <w:t xml:space="preserve">Logs.</w:t>
+      </w:r>
+      <w:r>
+        <w:t xml:space="preserve"> </w:t>
+      </w:r>
+      <w:r>
+        <w:t xml:space="preserve">The app’s messages go to its console window only; it writes no log files.</w:t>
+      </w:r>
+    </w:p>
     <w:bookmarkEnd w:id="49"/>
-    <w:bookmarkStart w:id="50" w:name="directions-to-explore"/>
+    <w:bookmarkEnd w:id="50"/>
+    <w:bookmarkStart w:id="51" w:name="directions-to-explore"/>
     <w:p>
       <w:pPr>
         <w:pStyle w:val="Heading1"/>
@@ -4154,7 +4465,7 @@
         </w:tc>
       </w:tr>
     </w:tbl>
-    <w:bookmarkEnd w:id="50"/>
+    <w:bookmarkEnd w:id="51"/>
     <w:sectPr/>
   </w:body>
 </w:document>
@@ -4389,6 +4700,9 @@
     <w:abstractNumId w:val="991"/>
   </w:num>
   <w:num w:numId="1017">
+    <w:abstractNumId w:val="991"/>
+  </w:num>
+  <w:num w:numId="1018">
     <w:abstractNumId w:val="991"/>
   </w:num>
 </w:numbering>

</xml_diff>

<commit_message>
SOP: port Jamie's review edits; add clock-drift bench test appendix
- Port Jamie's edits: EVA foam (materials + §2.2 note), shorter §6
  deployment note, download figures after step 4, CSV inspection option,
  end-time comparison removed from §7.1, US spelling, §9 data-governance
  wording, troubleshooting power-cycle hint, Appendix C trims
- Light polish: tilted-sensor note, "press the reset button once",
  "case" instead of "wearable", "rules that use", subtitle spelling
- New Appendix D: one-off bench test for clock drift (known start and
  stop times, 2–4 weeks, optional 60 s interval for finer resolution)
- Handover next step 6 now points to the bench test

Co-Authored-By: Claude Opus 5.5 <noreply@anthropic.com>
Claude-Session: https://claude.ai/code/session_01Ue3sWJSFRo3Bxhe8SfexR3
</commit_message>
<xml_diff>
--- a/docs/Project_Handover.docx
+++ b/docs/Project_Handover.docx
@@ -1301,22 +1301,22 @@
               <w:rPr>
                 <w:sz w:val="19"/>
               </w:rPr>
-              <w:t xml:space="preserve">confirms the timestamps stay accurate over a deployment, at no extra cost. At the end of each deployment, note the real time of the power-cycle and compare it with the last timestamp in the file. They should agree within one interval (5 minutes); a larger gap shows drift or a late power-on.</w:t>
-            </w:r>
-          </w:p>
-        </w:tc>
-        <w:tc>
-          <w:tcPr/>
-          <w:p>
-            <w:pPr>
-              <w:pStyle w:val="Compact"/>
-              <w:jc w:val="left"/>
-            </w:pPr>
-            <w:r>
-              <w:rPr>
-                <w:sz w:val="19"/>
-              </w:rPr>
-              <w:t xml:space="preserve">§4.4</w:t>
+              <w:t xml:space="preserve">confirms the timestamps stay accurate over a deployment. Run the bench test in SOP Appendix D once; the difference should be under one interval (5 minutes).</w:t>
+            </w:r>
+          </w:p>
+        </w:tc>
+        <w:tc>
+          <w:tcPr/>
+          <w:p>
+            <w:pPr>
+              <w:pStyle w:val="Compact"/>
+              <w:jc w:val="left"/>
+            </w:pPr>
+            <w:r>
+              <w:rPr>
+                <w:sz w:val="19"/>
+              </w:rPr>
+              <w:t xml:space="preserve">§4.4; SOP Appendix D</w:t>
             </w:r>
           </w:p>
         </w:tc>

</xml_diff>

<commit_message>
Docs review: daily-average warning, moulding, cost, consistency fixes
- Warn that "Average Wear Time Per Day" excludes days with no detected
  wear (overstates adherence) and counts partial first/last days; give
  the workaround (Total Wear Time / days). Handover: Summary, new §5.5,
  next step 7 to fix it in the app. SOP: callout in §8
- PI (orthopedist) moulds the case into each splint (handover §3.2,
  SOP §6); rough ~$60/logger cost estimate in handover §2
- Remove the reference-sensor option; study protocol (wear instructions,
  skin checks) added to the ethics next step
- Fix stale SOP references (§3.2, §9), "Download window", firmware
  version in the deployment log, wording of next step 2 and §7

Co-Authored-By: Claude Opus 5.5 <noreply@anthropic.com>
Claude-Session: https://claude.ai/code/session_01Ue3sWJSFRo3Bxhe8SfexR3
</commit_message>
<xml_diff>
--- a/docs/Project_Handover.docx
+++ b/docs/Project_Handover.docx
@@ -580,7 +580,7 @@
         <w:t xml:space="preserve"> </w:t>
       </w:r>
       <w:r>
-        <w:t xml:space="preserve">The system works end to end: a logger can be set up with the app, worn in the splint for up to about a month, and downloaded, and the app turns the recording into daily wear time and an hour-by-hour picture of when the splint was worn. Two loggers have been built. They take a reading every 5 minutes, and the app estimates wear time from those readings. The detection has not yet been fully validated against a record of actual wear. Before a study with participants, ethics approval and a data-governance plan are needed, the known firmware issues should be fixed, battery life measured, and wear detection validated (§1.2).</w:t>
+        <w:t xml:space="preserve">The system works end to end: a logger can be set up with the app, worn in the splint for up to about a month, and downloaded, and the app turns the recording into daily wear time and an hour-by-hour picture of when the splint was worn. Two loggers have been built. They take a reading every 5 minutes, and the app estimates wear time from those readings. The detection has not yet been fully validated against a record of actual wear, and the app’s average daily wear time currently leaves out days with no detected wear, so it overstates adherence (§5.5). Before a study with participants, ethics approval and a data-governance plan are needed, the known firmware issues should be fixed, battery life measured, and wear detection validated (§1.2).</w:t>
       </w:r>
     </w:p>
     <w:bookmarkStart w:id="21" w:name="current-state"/>
@@ -896,7 +896,7 @@
               <w:rPr>
                 <w:sz w:val="19"/>
               </w:rPr>
-              <w:t xml:space="preserve">) and leave it for 5 hours; the download should stop at exactly 15 000 rows. Then fix wrap-safe sleep and the storage limit (small, low risk), then start data collection at Initialize, in one firmware release. Bench-test for a full month, re-flash loggers after downloading their data, and update the SOP.</w:t>
+              <w:t xml:space="preserve">, running the app from Python; SOP Appendix A) and leave it for 5 hours; the download should stop at exactly 15 000 rows. Then fix wrap-safe sleep and the storage limit (small, low risk), then start data collection at Initialize, in one firmware release. Bench-test for a full month, re-flash loggers after downloading their data, and update the SOP.</w:t>
             </w:r>
           </w:p>
         </w:tc>
@@ -997,7 +997,7 @@
               <w:rPr>
                 <w:sz w:val="19"/>
               </w:rPr>
-              <w:t xml:space="preserve">sets how long a deployment can safely run. A CR2450 (~620 mAh) at ~750 µA gives a rough upper bound of about 34 days, consistent with the ~36-day recording; until measured, fit a new cell for every deployment. One logger on the bench for a full month or until the battery dies, which is the duration of expected battery life.</w:t>
+              <w:t xml:space="preserve">sets how long a deployment can safely run. A CR2450 (~620 mAh) at ~750 µA gives a rough upper bound of about 34 days, consistent with the ~36-day recording; until measured, fit a new cell for every deployment. Leave one logger on the bench for a full month, or until the battery dies, to measure battery life.</w:t>
             </w:r>
           </w:p>
         </w:tc>
@@ -1073,7 +1073,7 @@
               <w:rPr>
                 <w:sz w:val="19"/>
               </w:rPr>
-              <w:t xml:space="preserve">required before any deployment with participants, including the ground-truth deployments in item 5. Prepare the submission covering the device (worn against the skin, battery-powered, research prototype), what is recorded, and how data is handled (item 4).</w:t>
+              <w:t xml:space="preserve">required before any deployment with participants, including the ground-truth deployments in item 5. Prepare the study protocol, including participant wear instructions and how often to check the skin, and the submission covering the device (worn against the skin, battery-powered, research prototype), what is recorded, and how data is handled (item 4).</w:t>
             </w:r>
           </w:p>
         </w:tc>
@@ -1149,22 +1149,22 @@
               <w:rPr>
                 <w:sz w:val="19"/>
               </w:rPr>
-              <w:t xml:space="preserve">the app leaves data handling to the user (§7.1). Decide where recordings and deployment logs are stored, who can access them, the participant ID scheme, how long data is kept, and how it is moved off the study computer; then update the SOP (§10).</w:t>
-            </w:r>
-          </w:p>
-        </w:tc>
-        <w:tc>
-          <w:tcPr/>
-          <w:p>
-            <w:pPr>
-              <w:pStyle w:val="Compact"/>
-              <w:jc w:val="left"/>
-            </w:pPr>
-            <w:r>
-              <w:rPr>
-                <w:sz w:val="19"/>
-              </w:rPr>
-              <w:t xml:space="preserve">§7.1; SOP §10</w:t>
+              <w:t xml:space="preserve">the app leaves data handling to the user (§7.1). Decide where recordings and deployment logs are stored, who can access them, the participant ID scheme, how long data is kept, and how it is moved off the study computer; then update the SOP (§9).</w:t>
+            </w:r>
+          </w:p>
+        </w:tc>
+        <w:tc>
+          <w:tcPr/>
+          <w:p>
+            <w:pPr>
+              <w:pStyle w:val="Compact"/>
+              <w:jc w:val="left"/>
+            </w:pPr>
+            <w:r>
+              <w:rPr>
+                <w:sz w:val="19"/>
+              </w:rPr>
+              <w:t xml:space="preserve">§7.1; SOP §9</w:t>
             </w:r>
           </w:p>
         </w:tc>
@@ -1225,7 +1225,7 @@
               <w:rPr>
                 <w:sz w:val="19"/>
               </w:rPr>
-              <w:t xml:space="preserve">needed before wear times are reported as study results. Collect ground truth on a few deployments (wear diary or reference sensor), check overnight wear especially, and re-tune the thresholds accordingly.</w:t>
+              <w:t xml:space="preserve">needed before wear times are reported as study results. Collect ground truth on a few deployments (e.g. a wear diary or supervised sessions), check overnight wear especially, and re-tune the thresholds accordingly.</w:t>
             </w:r>
           </w:p>
         </w:tc>
@@ -1317,6 +1317,106 @@
                 <w:sz w:val="19"/>
               </w:rPr>
               <w:t xml:space="preserve">§4.4; SOP Appendix D</w:t>
+            </w:r>
+          </w:p>
+        </w:tc>
+      </w:tr>
+      <w:tr>
+        <w:tc>
+          <w:tcPr/>
+          <w:p>
+            <w:pPr>
+              <w:pStyle w:val="Compact"/>
+              <w:jc w:val="left"/>
+            </w:pPr>
+            <w:r>
+              <w:rPr>
+                <w:sz w:val="19"/>
+              </w:rPr>
+              <w:t xml:space="preserve">7. Daily average in the app</w:t>
+            </w:r>
+          </w:p>
+        </w:tc>
+        <w:tc>
+          <w:tcPr/>
+          <w:p>
+            <w:pPr>
+              <w:pStyle w:val="Compact"/>
+              <w:jc w:val="left"/>
+            </w:pPr>
+            <w:r>
+              <w:rPr>
+                <w:sz w:val="19"/>
+              </w:rPr>
+              <w:t xml:space="preserve">Known issue</w:t>
+            </w:r>
+          </w:p>
+        </w:tc>
+        <w:tc>
+          <w:tcPr/>
+          <w:p>
+            <w:pPr>
+              <w:pStyle w:val="Compact"/>
+              <w:jc w:val="left"/>
+            </w:pPr>
+            <w:r>
+              <w:rPr>
+                <w:iCs/>
+                <w:i/>
+                <w:sz w:val="19"/>
+              </w:rPr>
+              <w:t xml:space="preserve">Why:</w:t>
+            </w:r>
+            <w:r>
+              <w:rPr>
+                <w:sz w:val="19"/>
+              </w:rPr>
+              <w:t xml:space="preserve"> </w:t>
+            </w:r>
+            <w:r>
+              <w:rPr>
+                <w:sz w:val="19"/>
+              </w:rPr>
+              <w:t xml:space="preserve">“</w:t>
+            </w:r>
+            <w:r>
+              <w:rPr>
+                <w:sz w:val="19"/>
+              </w:rPr>
+              <w:t xml:space="preserve">Average Wear Time Per Day</w:t>
+            </w:r>
+            <w:r>
+              <w:rPr>
+                <w:sz w:val="19"/>
+              </w:rPr>
+              <w:t xml:space="preserve">”</w:t>
+            </w:r>
+            <w:r>
+              <w:rPr>
+                <w:sz w:val="19"/>
+              </w:rPr>
+              <w:t xml:space="preserve"> </w:t>
+            </w:r>
+            <w:r>
+              <w:rPr>
+                <w:sz w:val="19"/>
+              </w:rPr>
+              <w:t xml:space="preserve">leaves out days with no detected wear, so it overstates adherence; the partial first and last days count as full days. Average over every calendar day of the recording, and report the partial first and last days separately. Until then, divide Total Wear Time by the number of days in the recording (SOP §8).</w:t>
+            </w:r>
+          </w:p>
+        </w:tc>
+        <w:tc>
+          <w:tcPr/>
+          <w:p>
+            <w:pPr>
+              <w:pStyle w:val="Compact"/>
+              <w:jc w:val="left"/>
+            </w:pPr>
+            <w:r>
+              <w:rPr>
+                <w:sz w:val="19"/>
+              </w:rPr>
+              <w:t xml:space="preserve">§5.5; SOP §8</w:t>
             </w:r>
           </w:p>
         </w:tc>
@@ -1889,7 +1989,7 @@
               <w:rPr>
                 <w:sz w:val="19"/>
               </w:rPr>
-              <w:t xml:space="preserve">An independent record of when the splint was actually worn (e.g. a diary or a second sensor), used to check the detection</w:t>
+              <w:t xml:space="preserve">An independent record of when the splint was actually worn (e.g. a wear diary or a supervised session), used to check the detection</w:t>
             </w:r>
           </w:p>
         </w:tc>
@@ -2527,7 +2627,7 @@
               <w:rPr>
                 <w:sz w:val="19"/>
               </w:rPr>
-              <w:t xml:space="preserve">Use a standard board with built-in sensors, so loggers are easy to build and replace</w:t>
+              <w:t xml:space="preserve">Use a standard board with built-in sensors, so loggers are easy to build and replace. Originally estimated at about $60 per logger, mostly the Arduino Nano 33 BLE Sense Rev2, whose price has been fluctuating and recently rising</w:t>
             </w:r>
           </w:p>
         </w:tc>
@@ -2802,7 +2902,7 @@
         <w:t xml:space="preserve"> </w:t>
       </w:r>
       <w:r>
-        <w:t xml:space="preserve">A CR2450 coin cell on the 3.3 V pin, with the 3.3 V jumper on the back of the board cut so the board’s regulator and USB circuitry draw no power. As a result, USB alone cannot power the logger: the cell must be connected whenever it is used with the app, and flashing new firmware needs the jumper bridged, then cut again (SOP §4.2). This is why one logger currently needs its 3.3 V trace reconnected before its firmware can be updated (§1.1).</w:t>
+        <w:t xml:space="preserve">A CR2450 coin cell on the 3.3 V pin, with the 3.3 V jumper on the back of the board cut so the board’s regulator and USB circuitry draw no power. As a result, USB alone cannot power the logger: the cell must be connected whenever it is used with the app, and flashing new firmware needs the jumper bridged, then cut again (SOP §3.2). This is why one logger currently needs its 3.3 V trace reconnected before its firmware can be updated (§1.1).</w:t>
       </w:r>
     </w:p>
     <w:p>
@@ -2836,7 +2936,7 @@
         <w:t xml:space="preserve"> </w:t>
       </w:r>
       <w:r>
-        <w:t xml:space="preserve">in the repository) holds the board with the sensors facing the skin, behind skin-friendly tape. It is moulded into each participant’s custom splint and secured through the thermoplastic with a Chicago screw, so the case and logger can be moved to the next participant’s splint.</w:t>
+        <w:t xml:space="preserve">in the repository) holds the board with the sensors facing the skin, behind skin-friendly tape. The PI (an orthopedist) moulds the case into each participant’s custom splint while moulding the splint itself, and it is secured through the thermoplastic with Chicago screws, so the case and logger can be moved to the next participant’s splint.</w:t>
       </w:r>
     </w:p>
     <w:bookmarkEnd w:id="32"/>
@@ -3447,7 +3547,7 @@
     </w:p>
     <w:bookmarkEnd w:id="41"/>
     <w:bookmarkEnd w:id="42"/>
-    <w:bookmarkStart w:id="47" w:name="wear-detection-algorithm"/>
+    <w:bookmarkStart w:id="48" w:name="wear-detection-algorithm"/>
     <w:p>
       <w:pPr>
         <w:pStyle w:val="Heading1"/>
@@ -3782,14 +3882,13 @@
       </w:r>
     </w:p>
     <w:bookmarkEnd w:id="46"/>
-    <w:bookmarkEnd w:id="47"/>
-    <w:bookmarkStart w:id="48" w:name="time-handling"/>
-    <w:p>
-      <w:pPr>
-        <w:pStyle w:val="Heading1"/>
-      </w:pPr>
-      <w:r>
-        <w:t xml:space="preserve">6. Time handling</w:t>
+    <w:bookmarkStart w:id="47" w:name="daily-summary"/>
+    <w:p>
+      <w:pPr>
+        <w:pStyle w:val="Heading2"/>
+      </w:pPr>
+      <w:r>
+        <w:t xml:space="preserve">5.5 Daily summary</w:t>
       </w:r>
     </w:p>
     <w:p>
@@ -3805,126 +3904,42 @@
           <w:bCs/>
           <w:b/>
         </w:rPr>
-        <w:t xml:space="preserve">Design Decision:</w:t>
-      </w:r>
-      <w:r>
-        <w:t xml:space="preserve"> </w:t>
-      </w:r>
-      <w:r>
-        <w:t xml:space="preserve">The logger knows only UTC epoch seconds. The app asks for and shows</w:t>
-      </w:r>
-      <w:r>
-        <w:t xml:space="preserve"> </w:t>
-      </w:r>
-      <w:r>
-        <w:rPr>
-          <w:bCs/>
-          <w:b/>
-        </w:rPr>
-        <w:t xml:space="preserve">Eastern time</w:t>
-      </w:r>
-      <w:r>
-        <w:t xml:space="preserve"> </w:t>
-      </w:r>
-      <w:r>
-        <w:t xml:space="preserve">(America/New_York, daylight-saving aware) everywhere, and writes timestamps with their UTC offset (e.g. </w:t>
-      </w:r>
-      <w:r>
-        <w:rPr>
-          <w:rStyle w:val="VerbatimChar"/>
-        </w:rPr>
-        <w:t xml:space="preserve">-04:00</w:t>
-      </w:r>
-      <w:r>
-        <w:t xml:space="preserve">).</w:t>
-      </w:r>
-    </w:p>
-    <w:p>
-      <w:pPr>
-        <w:numPr>
-          <w:ilvl w:val="0"/>
-          <w:numId w:val="1016"/>
-        </w:numPr>
-        <w:pStyle w:val="Compact"/>
-      </w:pPr>
-      <w:r>
-        <w:rPr>
-          <w:bCs/>
-          <w:b/>
-        </w:rPr>
-        <w:t xml:space="preserve">Why:</w:t>
-      </w:r>
-      <w:r>
-        <w:t xml:space="preserve"> </w:t>
-      </w:r>
-      <w:r>
-        <w:t xml:space="preserve">The study runs in Ontario. The offset keeps the repeated hour at the November change unambiguous, and durations across the change come out right.</w:t>
-      </w:r>
-    </w:p>
-    <w:p>
-      <w:pPr>
-        <w:numPr>
-          <w:ilvl w:val="0"/>
-          <w:numId w:val="1016"/>
-        </w:numPr>
-        <w:pStyle w:val="Compact"/>
-      </w:pPr>
-      <w:r>
-        <w:rPr>
-          <w:bCs/>
-          <w:b/>
-        </w:rPr>
-        <w:t xml:space="preserve">Recovery:</w:t>
-      </w:r>
-      <w:r>
-        <w:t xml:space="preserve"> </w:t>
-      </w:r>
-      <w:r>
-        <w:t xml:space="preserve">If a logger loses its start time, the elapsed times survive. The app detects such files and rebuilds the timestamps from a start time the user enters, during download or on the Data Analysis page.</w:t>
-      </w:r>
-    </w:p>
-    <w:p>
-      <w:pPr>
-        <w:numPr>
-          <w:ilvl w:val="0"/>
-          <w:numId w:val="1016"/>
-        </w:numPr>
-        <w:pStyle w:val="Compact"/>
-      </w:pPr>
-      <w:r>
-        <w:rPr>
-          <w:bCs/>
-          <w:b/>
-        </w:rPr>
-        <w:t xml:space="preserve">To change the zone:</w:t>
-      </w:r>
-      <w:r>
-        <w:t xml:space="preserve"> </w:t>
-      </w:r>
-      <w:r>
-        <w:t xml:space="preserve">edit</w:t>
-      </w:r>
-      <w:r>
-        <w:t xml:space="preserve"> </w:t>
-      </w:r>
-      <w:r>
-        <w:rPr>
-          <w:rStyle w:val="VerbatimChar"/>
-        </w:rPr>
-        <w:t xml:space="preserve">timezone_config.py</w:t>
-      </w:r>
-      <w:r>
-        <w:t xml:space="preserve">.</w:t>
-      </w:r>
-    </w:p>
+        <w:t xml:space="preserve">Limitation:</w:t>
+      </w:r>
+      <w:r>
+        <w:t xml:space="preserve"> </w:t>
+      </w:r>
+      <w:r>
+        <w:t xml:space="preserve">The app’s</w:t>
+      </w:r>
+      <w:r>
+        <w:t xml:space="preserve"> </w:t>
+      </w:r>
+      <w:r>
+        <w:t xml:space="preserve">“</w:t>
+      </w:r>
+      <w:r>
+        <w:t xml:space="preserve">Average Wear Time Per Day</w:t>
+      </w:r>
+      <w:r>
+        <w:t xml:space="preserve">”</w:t>
+      </w:r>
+      <w:r>
+        <w:t xml:space="preserve"> </w:t>
+      </w:r>
+      <w:r>
+        <w:t xml:space="preserve">is the mean over days with at least one detected wear event. Days with no detected wear are left out, so the average overstates adherence, and the partial first and last days of a recording are counted as full days. Until this is fixed (§1.2 item 7), divide Total Wear Time by the number of days in the recording (SOP §8).</w:t>
+      </w:r>
+    </w:p>
+    <w:bookmarkEnd w:id="47"/>
     <w:bookmarkEnd w:id="48"/>
-    <w:bookmarkStart w:id="50" w:name="desktop-application"/>
+    <w:bookmarkStart w:id="49" w:name="time-handling"/>
     <w:p>
       <w:pPr>
         <w:pStyle w:val="Heading1"/>
       </w:pPr>
       <w:r>
-        <w:t xml:space="preserve">7. Desktop application</w:t>
+        <w:t xml:space="preserve">6. Time handling</w:t>
       </w:r>
     </w:p>
     <w:p>
@@ -3940,28 +3955,38 @@
           <w:bCs/>
           <w:b/>
         </w:rPr>
-        <w:t xml:space="preserve">Browser-based interface (Dash + Flask-SocketIO).</w:t>
-      </w:r>
-      <w:r>
-        <w:t xml:space="preserve"> </w:t>
-      </w:r>
-      <w:r>
-        <w:t xml:space="preserve">Plotly/Dash provide the charts and tables; the app runs a local server on</w:t>
-      </w:r>
-      <w:r>
-        <w:t xml:space="preserve"> </w:t>
+        <w:t xml:space="preserve">Design Decision:</w:t>
+      </w:r>
+      <w:r>
+        <w:t xml:space="preserve"> </w:t>
+      </w:r>
+      <w:r>
+        <w:t xml:space="preserve">The logger knows only UTC epoch seconds. The app asks for and shows</w:t>
+      </w:r>
+      <w:r>
+        <w:t xml:space="preserve"> </w:t>
+      </w:r>
+      <w:r>
+        <w:rPr>
+          <w:bCs/>
+          <w:b/>
+        </w:rPr>
+        <w:t xml:space="preserve">Eastern time</w:t>
+      </w:r>
+      <w:r>
+        <w:t xml:space="preserve"> </w:t>
+      </w:r>
+      <w:r>
+        <w:t xml:space="preserve">(America/New_York, daylight-saving aware) everywhere, and writes timestamps with their UTC offset (e.g. </w:t>
       </w:r>
       <w:r>
         <w:rPr>
           <w:rStyle w:val="VerbatimChar"/>
         </w:rPr>
-        <w:t xml:space="preserve">127.0.0.1:8050</w:t>
-      </w:r>
-      <w:r>
-        <w:t xml:space="preserve"> </w:t>
-      </w:r>
-      <w:r>
-        <w:t xml:space="preserve">and opens the browser.</w:t>
+        <w:t xml:space="preserve">-04:00</w:t>
+      </w:r>
+      <w:r>
+        <w:t xml:space="preserve">).</w:t>
       </w:r>
     </w:p>
     <w:p>
@@ -3977,13 +4002,13 @@
           <w:bCs/>
           <w:b/>
         </w:rPr>
-        <w:t xml:space="preserve">Heartbeat shutdown.</w:t>
-      </w:r>
-      <w:r>
-        <w:t xml:space="preserve"> </w:t>
-      </w:r>
-      <w:r>
-        <w:t xml:space="preserve">The page sends a heartbeat every 5 s. With none for 5 minutes, the server warns the page and exits, so closing the tab doesn’t leave a hidden server holding the serial port for data privacy.</w:t>
+        <w:t xml:space="preserve">Why:</w:t>
+      </w:r>
+      <w:r>
+        <w:t xml:space="preserve"> </w:t>
+      </w:r>
+      <w:r>
+        <w:t xml:space="preserve">The study runs in Ontario. The offset keeps the repeated hour at the November change unambiguous, and durations across the change come out right.</w:t>
       </w:r>
     </w:p>
     <w:p>
@@ -3999,13 +4024,13 @@
           <w:bCs/>
           <w:b/>
         </w:rPr>
-        <w:t xml:space="preserve">Works offline.</w:t>
-      </w:r>
-      <w:r>
-        <w:t xml:space="preserve"> </w:t>
-      </w:r>
-      <w:r>
-        <w:t xml:space="preserve">All required assets are packaged, allowing the application to be usable in offline conditions as well.</w:t>
+        <w:t xml:space="preserve">Recovery:</w:t>
+      </w:r>
+      <w:r>
+        <w:t xml:space="preserve"> </w:t>
+      </w:r>
+      <w:r>
+        <w:t xml:space="preserve">If a logger loses its start time, the elapsed times survive. The app detects such files and rebuilds the timestamps from a start time the user enters, during download or on the Data Analysis page.</w:t>
       </w:r>
     </w:p>
     <w:p>
@@ -4021,13 +4046,13 @@
           <w:bCs/>
           <w:b/>
         </w:rPr>
-        <w:t xml:space="preserve">Automated releases.</w:t>
-      </w:r>
-      <w:r>
-        <w:t xml:space="preserve"> </w:t>
-      </w:r>
-      <w:r>
-        <w:t xml:space="preserve">GitHub Actions builds stand-alone Windows and macOS programs on each</w:t>
+        <w:t xml:space="preserve">To change the zone:</w:t>
+      </w:r>
+      <w:r>
+        <w:t xml:space="preserve"> </w:t>
+      </w:r>
+      <w:r>
+        <w:t xml:space="preserve">edit</w:t>
       </w:r>
       <w:r>
         <w:t xml:space="preserve"> </w:t>
@@ -4036,79 +4061,20 @@
         <w:rPr>
           <w:rStyle w:val="VerbatimChar"/>
         </w:rPr>
-        <w:t xml:space="preserve">v*</w:t>
-      </w:r>
-      <w:r>
-        <w:t xml:space="preserve"> </w:t>
-      </w:r>
-      <w:r>
-        <w:t xml:space="preserve">tag, with Python included, so staff need no Python (SOP Appendix B).</w:t>
-      </w:r>
-    </w:p>
-    <w:p>
-      <w:pPr>
-        <w:numPr>
-          <w:ilvl w:val="0"/>
-          <w:numId w:val="1017"/>
-        </w:numPr>
-        <w:pStyle w:val="Compact"/>
-      </w:pPr>
-      <w:r>
-        <w:rPr>
-          <w:bCs/>
-          <w:b/>
-        </w:rPr>
-        <w:t xml:space="preserve">Participant IDs.</w:t>
-      </w:r>
-      <w:r>
-        <w:t xml:space="preserve"> </w:t>
-      </w:r>
-      <w:r>
-        <w:t xml:space="preserve">Letters, digits,</w:t>
-      </w:r>
-      <w:r>
-        <w:t xml:space="preserve"> </w:t>
-      </w:r>
-      <w:r>
-        <w:rPr>
-          <w:rStyle w:val="VerbatimChar"/>
-        </w:rPr>
-        <w:t xml:space="preserve">-</w:t>
-      </w:r>
-      <w:r>
-        <w:t xml:space="preserve"> </w:t>
-      </w:r>
-      <w:r>
-        <w:t xml:space="preserve">and</w:t>
-      </w:r>
-      <w:r>
-        <w:t xml:space="preserve"> </w:t>
-      </w:r>
-      <w:r>
-        <w:rPr>
-          <w:rStyle w:val="VerbatimChar"/>
-        </w:rPr>
-        <w:t xml:space="preserve">_</w:t>
-      </w:r>
-      <w:r>
-        <w:t xml:space="preserve">, up to 15 characters: they go into the CSV header and often into file names, where commas or spaces would cause trouble.</w:t>
-      </w:r>
-    </w:p>
-    <w:bookmarkStart w:id="49" w:name="data-handling-app-behaviour"/>
-    <w:p>
-      <w:pPr>
-        <w:pStyle w:val="Heading2"/>
-      </w:pPr>
-      <w:r>
-        <w:t xml:space="preserve">7.1 Data handling (app behaviour)</w:t>
-      </w:r>
-    </w:p>
-    <w:p>
-      <w:pPr>
-        <w:pStyle w:val="FirstParagraph"/>
-      </w:pPr>
-      <w:r>
-        <w:t xml:space="preserve">This describes what the software does with data. It is not a data-handling policy; none exists yet (§1.2 item 4).</w:t>
+        <w:t xml:space="preserve">timezone_config.py</w:t>
+      </w:r>
+      <w:r>
+        <w:t xml:space="preserve">.</w:t>
+      </w:r>
+    </w:p>
+    <w:bookmarkEnd w:id="49"/>
+    <w:bookmarkStart w:id="51" w:name="desktop-application"/>
+    <w:p>
+      <w:pPr>
+        <w:pStyle w:val="Heading1"/>
+      </w:pPr>
+      <w:r>
+        <w:t xml:space="preserve">7. Desktop application</w:t>
       </w:r>
     </w:p>
     <w:p>
@@ -4124,22 +4090,28 @@
           <w:bCs/>
           <w:b/>
         </w:rPr>
-        <w:t xml:space="preserve">Where data goes.</w:t>
-      </w:r>
-      <w:r>
-        <w:t xml:space="preserve"> </w:t>
-      </w:r>
-      <w:r>
-        <w:t xml:space="preserve">Everything stays on the study computer. The app runs a local server that only that computer can reach (</w:t>
+        <w:t xml:space="preserve">Browser-based interface (Dash + Flask-SocketIO).</w:t>
+      </w:r>
+      <w:r>
+        <w:t xml:space="preserve"> </w:t>
+      </w:r>
+      <w:r>
+        <w:t xml:space="preserve">Plotly/Dash provide the charts and tables; the app runs a local server on</w:t>
+      </w:r>
+      <w:r>
+        <w:t xml:space="preserve"> </w:t>
       </w:r>
       <w:r>
         <w:rPr>
           <w:rStyle w:val="VerbatimChar"/>
         </w:rPr>
-        <w:t xml:space="preserve">127.0.0.1</w:t>
-      </w:r>
-      <w:r>
-        <w:t xml:space="preserve">), and it sends nothing over the internet.</w:t>
+        <w:t xml:space="preserve">127.0.0.1:8050</w:t>
+      </w:r>
+      <w:r>
+        <w:t xml:space="preserve"> </w:t>
+      </w:r>
+      <w:r>
+        <w:t xml:space="preserve">and opens the browser.</w:t>
       </w:r>
     </w:p>
     <w:p>
@@ -4155,13 +4127,13 @@
           <w:bCs/>
           <w:b/>
         </w:rPr>
-        <w:t xml:space="preserve">On the logger.</w:t>
-      </w:r>
-      <w:r>
-        <w:t xml:space="preserve"> </w:t>
-      </w:r>
-      <w:r>
-        <w:t xml:space="preserve">Readings and the participant ID are stored unencrypted in the logger’s flash memory, and stay there until the logger is initialized again (§4.1). Anyone with the app and the logger can download them.</w:t>
+        <w:t xml:space="preserve">Heartbeat shutdown.</w:t>
+      </w:r>
+      <w:r>
+        <w:t xml:space="preserve"> </w:t>
+      </w:r>
+      <w:r>
+        <w:t xml:space="preserve">The page sends a heartbeat every 5 s. With none for 5 minutes, the server warns the page and exits, so closing the tab doesn’t leave a hidden server holding the serial port.</w:t>
       </w:r>
     </w:p>
     <w:p>
@@ -4177,13 +4149,13 @@
           <w:bCs/>
           <w:b/>
         </w:rPr>
-        <w:t xml:space="preserve">Downloads.</w:t>
-      </w:r>
-      <w:r>
-        <w:t xml:space="preserve"> </w:t>
-      </w:r>
-      <w:r>
-        <w:t xml:space="preserve">The browser saves each download as a plain CSV file, normally in the Downloads folder. The file holds the participant ID, the start time and every reading. The app keeps no copy.</w:t>
+        <w:t xml:space="preserve">Works offline.</w:t>
+      </w:r>
+      <w:r>
+        <w:t xml:space="preserve"> </w:t>
+      </w:r>
+      <w:r>
+        <w:t xml:space="preserve">All required assets are packaged, allowing the application to be usable in offline conditions as well.</w:t>
       </w:r>
     </w:p>
     <w:p>
@@ -4199,13 +4171,28 @@
           <w:bCs/>
           <w:b/>
         </w:rPr>
-        <w:t xml:space="preserve">Analysis page.</w:t>
-      </w:r>
-      <w:r>
-        <w:t xml:space="preserve"> </w:t>
-      </w:r>
-      <w:r>
-        <w:t xml:space="preserve">An uploaded file is processed in memory and is not saved by the app.</w:t>
+        <w:t xml:space="preserve">Automated releases.</w:t>
+      </w:r>
+      <w:r>
+        <w:t xml:space="preserve"> </w:t>
+      </w:r>
+      <w:r>
+        <w:t xml:space="preserve">GitHub Actions builds stand-alone Windows and macOS programs on each</w:t>
+      </w:r>
+      <w:r>
+        <w:t xml:space="preserve"> </w:t>
+      </w:r>
+      <w:r>
+        <w:rPr>
+          <w:rStyle w:val="VerbatimChar"/>
+        </w:rPr>
+        <w:t xml:space="preserve">v*</w:t>
+      </w:r>
+      <w:r>
+        <w:t xml:space="preserve"> </w:t>
+      </w:r>
+      <w:r>
+        <w:t xml:space="preserve">tag, with Python included, so staff need no Python (SOP Appendix B).</w:t>
       </w:r>
     </w:p>
     <w:p>
@@ -4221,20 +4208,64 @@
           <w:bCs/>
           <w:b/>
         </w:rPr>
-        <w:t xml:space="preserve">Participant ID.</w:t>
-      </w:r>
-      <w:r>
-        <w:t xml:space="preserve"> </w:t>
-      </w:r>
-      <w:r>
-        <w:t xml:space="preserve">It is stored on the logger, in the CSV header and often in file names, so it should be a study code, not a name.</w:t>
+        <w:t xml:space="preserve">Participant IDs.</w:t>
+      </w:r>
+      <w:r>
+        <w:t xml:space="preserve"> </w:t>
+      </w:r>
+      <w:r>
+        <w:t xml:space="preserve">Letters, digits,</w:t>
+      </w:r>
+      <w:r>
+        <w:t xml:space="preserve"> </w:t>
+      </w:r>
+      <w:r>
+        <w:rPr>
+          <w:rStyle w:val="VerbatimChar"/>
+        </w:rPr>
+        <w:t xml:space="preserve">-</w:t>
+      </w:r>
+      <w:r>
+        <w:t xml:space="preserve"> </w:t>
+      </w:r>
+      <w:r>
+        <w:t xml:space="preserve">and</w:t>
+      </w:r>
+      <w:r>
+        <w:t xml:space="preserve"> </w:t>
+      </w:r>
+      <w:r>
+        <w:rPr>
+          <w:rStyle w:val="VerbatimChar"/>
+        </w:rPr>
+        <w:t xml:space="preserve">_</w:t>
+      </w:r>
+      <w:r>
+        <w:t xml:space="preserve">, up to 15 characters: they go into the CSV header and often into file names, where commas or spaces would cause trouble.</w:t>
+      </w:r>
+    </w:p>
+    <w:bookmarkStart w:id="50" w:name="data-handling-app-behaviour"/>
+    <w:p>
+      <w:pPr>
+        <w:pStyle w:val="Heading2"/>
+      </w:pPr>
+      <w:r>
+        <w:t xml:space="preserve">7.1 Data handling (app behaviour)</w:t>
+      </w:r>
+    </w:p>
+    <w:p>
+      <w:pPr>
+        <w:pStyle w:val="FirstParagraph"/>
+      </w:pPr>
+      <w:r>
+        <w:t xml:space="preserve">This describes what the software does with data. It is not a data-handling policy; none exists yet (§1.2 item 4).</w:t>
       </w:r>
     </w:p>
     <w:p>
       <w:pPr>
         <w:numPr>
           <w:ilvl w:val="0"/>
-          <w:numId w:val="1018"/>
+          <w:numId w:val="1019"/>
         </w:numPr>
         <w:pStyle w:val="Compact"/>
       </w:pPr>
@@ -4243,6 +4274,125 @@
           <w:bCs/>
           <w:b/>
         </w:rPr>
+        <w:t xml:space="preserve">Where data goes.</w:t>
+      </w:r>
+      <w:r>
+        <w:t xml:space="preserve"> </w:t>
+      </w:r>
+      <w:r>
+        <w:t xml:space="preserve">Everything stays on the study computer. The app runs a local server that only that computer can reach (</w:t>
+      </w:r>
+      <w:r>
+        <w:rPr>
+          <w:rStyle w:val="VerbatimChar"/>
+        </w:rPr>
+        <w:t xml:space="preserve">127.0.0.1</w:t>
+      </w:r>
+      <w:r>
+        <w:t xml:space="preserve">), and it sends nothing over the internet.</w:t>
+      </w:r>
+    </w:p>
+    <w:p>
+      <w:pPr>
+        <w:numPr>
+          <w:ilvl w:val="0"/>
+          <w:numId w:val="1019"/>
+        </w:numPr>
+        <w:pStyle w:val="Compact"/>
+      </w:pPr>
+      <w:r>
+        <w:rPr>
+          <w:bCs/>
+          <w:b/>
+        </w:rPr>
+        <w:t xml:space="preserve">On the logger.</w:t>
+      </w:r>
+      <w:r>
+        <w:t xml:space="preserve"> </w:t>
+      </w:r>
+      <w:r>
+        <w:t xml:space="preserve">Readings and the participant ID are stored unencrypted in the logger’s flash memory, and stay there until the logger is initialized again (§4.1). Anyone with the app and the logger can download them.</w:t>
+      </w:r>
+    </w:p>
+    <w:p>
+      <w:pPr>
+        <w:numPr>
+          <w:ilvl w:val="0"/>
+          <w:numId w:val="1019"/>
+        </w:numPr>
+        <w:pStyle w:val="Compact"/>
+      </w:pPr>
+      <w:r>
+        <w:rPr>
+          <w:bCs/>
+          <w:b/>
+        </w:rPr>
+        <w:t xml:space="preserve">Downloads.</w:t>
+      </w:r>
+      <w:r>
+        <w:t xml:space="preserve"> </w:t>
+      </w:r>
+      <w:r>
+        <w:t xml:space="preserve">The browser saves each download as a plain CSV file, normally in the Downloads folder. The file holds the participant ID, the start time and every reading. The app keeps no copy.</w:t>
+      </w:r>
+    </w:p>
+    <w:p>
+      <w:pPr>
+        <w:numPr>
+          <w:ilvl w:val="0"/>
+          <w:numId w:val="1019"/>
+        </w:numPr>
+        <w:pStyle w:val="Compact"/>
+      </w:pPr>
+      <w:r>
+        <w:rPr>
+          <w:bCs/>
+          <w:b/>
+        </w:rPr>
+        <w:t xml:space="preserve">Analysis page.</w:t>
+      </w:r>
+      <w:r>
+        <w:t xml:space="preserve"> </w:t>
+      </w:r>
+      <w:r>
+        <w:t xml:space="preserve">An uploaded file is processed in memory and is not saved by the app.</w:t>
+      </w:r>
+    </w:p>
+    <w:p>
+      <w:pPr>
+        <w:numPr>
+          <w:ilvl w:val="0"/>
+          <w:numId w:val="1019"/>
+        </w:numPr>
+        <w:pStyle w:val="Compact"/>
+      </w:pPr>
+      <w:r>
+        <w:rPr>
+          <w:bCs/>
+          <w:b/>
+        </w:rPr>
+        <w:t xml:space="preserve">Participant ID.</w:t>
+      </w:r>
+      <w:r>
+        <w:t xml:space="preserve"> </w:t>
+      </w:r>
+      <w:r>
+        <w:t xml:space="preserve">It is stored on the logger, in the CSV header and often in file names, so it should be a study code, not a name.</w:t>
+      </w:r>
+    </w:p>
+    <w:p>
+      <w:pPr>
+        <w:numPr>
+          <w:ilvl w:val="0"/>
+          <w:numId w:val="1019"/>
+        </w:numPr>
+        <w:pStyle w:val="Compact"/>
+      </w:pPr>
+      <w:r>
+        <w:rPr>
+          <w:bCs/>
+          <w:b/>
+        </w:rPr>
         <w:t xml:space="preserve">Logs.</w:t>
       </w:r>
       <w:r>
@@ -4252,9 +4402,9 @@
         <w:t xml:space="preserve">The app’s messages go to its console window only; it writes no log files.</w:t>
       </w:r>
     </w:p>
-    <w:bookmarkEnd w:id="49"/>
     <w:bookmarkEnd w:id="50"/>
-    <w:bookmarkStart w:id="51" w:name="directions-to-explore"/>
+    <w:bookmarkEnd w:id="51"/>
+    <w:bookmarkStart w:id="52" w:name="directions-to-explore"/>
     <w:p>
       <w:pPr>
         <w:pStyle w:val="Heading1"/>
@@ -4420,7 +4570,7 @@
         </w:tc>
       </w:tr>
     </w:tbl>
-    <w:bookmarkEnd w:id="51"/>
+    <w:bookmarkEnd w:id="52"/>
     <w:sectPr/>
   </w:body>
 </w:document>
@@ -4658,6 +4808,9 @@
     <w:abstractNumId w:val="991"/>
   </w:num>
   <w:num w:numId="1018">
+    <w:abstractNumId w:val="991"/>
+  </w:num>
+  <w:num w:numId="1019">
     <w:abstractNumId w:val="991"/>
   </w:num>
 </w:numbering>

</xml_diff>

<commit_message>
Final pass on handover and SOP
- Port Jamie's SOP edits (safety callout, "check the connection")
- Handover: ethics and data-governance next steps no longer point to
  the SOP, since no plans exist yet
- Average wear time framed as a definition choice, not an error
  (handover Summary, §5.5, next step 7; SOP §8 callout)
- Remove the §1.1 start-time bullet that repeated the §5 callout
- Light language fixes (handover About, §1.1, §4.4, §5.4; SOP §6);
  all cross-references re-checked

Co-Authored-By: Claude Opus 5.5 <noreply@anthropic.com>
Claude-Session: https://claude.ai/code/session_01Ue3sWJSFRo3Bxhe8SfexR3
</commit_message>
<xml_diff>
--- a/docs/Project_Handover.docx
+++ b/docs/Project_Handover.docx
@@ -306,7 +306,7 @@
         <w:pStyle w:val="BodyText"/>
       </w:pPr>
       <w:r>
-        <w:t xml:space="preserve">The muscle contraction variant of the project work will not be discussed as it was only explored at a preliminary level and has a different objective, where its focus is observing how much does the splint deactivate the target muscle.</w:t>
+        <w:t xml:space="preserve">The muscle contraction variant of the project work will not be discussed as it was only explored at a preliminary level and has a different objective: observing how much the splint deactivates the target muscle.</w:t>
       </w:r>
     </w:p>
     <w:p>
@@ -580,7 +580,7 @@
         <w:t xml:space="preserve"> </w:t>
       </w:r>
       <w:r>
-        <w:t xml:space="preserve">The system works end to end: a logger can be set up with the app, worn in the splint for up to about a month, and downloaded, and the app turns the recording into daily wear time and an hour-by-hour picture of when the splint was worn. Two loggers have been built. They take a reading every 5 minutes, and the app estimates wear time from those readings. The detection has not yet been fully validated against a record of actual wear, and the app’s average daily wear time currently leaves out days with no detected wear, so it overstates adherence (§5.5). Before a study with participants, ethics approval and a data-governance plan are needed, the known firmware issues should be fixed, battery life measured, and wear detection validated (§1.2).</w:t>
+        <w:t xml:space="preserve">The system works end to end: a logger can be set up with the app, worn in the splint for up to about a month, and downloaded, and the app turns the recording into daily wear time and an hour-by-hour picture of when the splint was worn. Two loggers have been built. They take a reading every 5 minutes, and the app estimates wear time from those readings. The detection has not yet been fully validated against a record of actual wear. Before a study with participants, ethics approval and a data-governance plan are needed, the known firmware issues should be fixed, battery life measured, and wear detection validated (§1.2).</w:t>
       </w:r>
     </w:p>
     <w:bookmarkStart w:id="21" w:name="current-state"/>
@@ -655,7 +655,7 @@
         <w:t xml:space="preserve"> </w:t>
       </w:r>
       <w:r>
-        <w:t xml:space="preserve">Recordings of up to about 36 days have been collected and analyzed to tune the wearing detection algorithm. There are two loggers built, where one of them needs reconnection at the rear 3.3 V trace to update the firmware while the other one is ready for deployment. The logger that requires updated firmware has a tag attached noting that its firmware needs updating.</w:t>
+        <w:t xml:space="preserve">Recordings of up to about 36 days have been collected and analyzed to tune the wear-detection algorithm. Two loggers have been built: one is ready for deployment; the other needs its rear 3.3 V trace reconnected to update its firmware and has a tag attached saying so.</w:t>
       </w:r>
     </w:p>
     <w:p>
@@ -1088,7 +1088,7 @@
               <w:rPr>
                 <w:sz w:val="19"/>
               </w:rPr>
-              <w:t xml:space="preserve">§7.1; SOP §1</w:t>
+              <w:t xml:space="preserve">§7.1</w:t>
             </w:r>
           </w:p>
         </w:tc>
@@ -1149,22 +1149,22 @@
               <w:rPr>
                 <w:sz w:val="19"/>
               </w:rPr>
-              <w:t xml:space="preserve">the app leaves data handling to the user (§7.1). Decide where recordings and deployment logs are stored, who can access them, the participant ID scheme, how long data is kept, and how it is moved off the study computer; then update the SOP (§9).</w:t>
-            </w:r>
-          </w:p>
-        </w:tc>
-        <w:tc>
-          <w:tcPr/>
-          <w:p>
-            <w:pPr>
-              <w:pStyle w:val="Compact"/>
-              <w:jc w:val="left"/>
-            </w:pPr>
-            <w:r>
-              <w:rPr>
-                <w:sz w:val="19"/>
-              </w:rPr>
-              <w:t xml:space="preserve">§7.1; SOP §9</w:t>
+              <w:t xml:space="preserve">the app leaves data handling to the user (§7.1). Decide where recordings and deployment logs are stored, who can access them, the participant ID scheme, how long data is kept, and how it is moved off the study computer.</w:t>
+            </w:r>
+          </w:p>
+        </w:tc>
+        <w:tc>
+          <w:tcPr/>
+          <w:p>
+            <w:pPr>
+              <w:pStyle w:val="Compact"/>
+              <w:jc w:val="left"/>
+            </w:pPr>
+            <w:r>
+              <w:rPr>
+                <w:sz w:val="19"/>
+              </w:rPr>
+              <w:t xml:space="preserve">§7.1</w:t>
             </w:r>
           </w:p>
         </w:tc>
@@ -1333,22 +1333,22 @@
               <w:rPr>
                 <w:sz w:val="19"/>
               </w:rPr>
-              <w:t xml:space="preserve">7. Daily average in the app</w:t>
-            </w:r>
-          </w:p>
-        </w:tc>
-        <w:tc>
-          <w:tcPr/>
-          <w:p>
-            <w:pPr>
-              <w:pStyle w:val="Compact"/>
-              <w:jc w:val="left"/>
-            </w:pPr>
-            <w:r>
-              <w:rPr>
-                <w:sz w:val="19"/>
-              </w:rPr>
-              <w:t xml:space="preserve">Known issue</w:t>
+              <w:t xml:space="preserve">7. Daily average definition</w:t>
+            </w:r>
+          </w:p>
+        </w:tc>
+        <w:tc>
+          <w:tcPr/>
+          <w:p>
+            <w:pPr>
+              <w:pStyle w:val="Compact"/>
+              <w:jc w:val="left"/>
+            </w:pPr>
+            <w:r>
+              <w:rPr>
+                <w:sz w:val="19"/>
+              </w:rPr>
+              <w:t xml:space="preserve">To confirm</w:t>
             </w:r>
           </w:p>
         </w:tc>
@@ -1377,31 +1377,7 @@
               <w:rPr>
                 <w:sz w:val="19"/>
               </w:rPr>
-              <w:t xml:space="preserve">“</w:t>
-            </w:r>
-            <w:r>
-              <w:rPr>
-                <w:sz w:val="19"/>
-              </w:rPr>
-              <w:t xml:space="preserve">Average Wear Time Per Day</w:t>
-            </w:r>
-            <w:r>
-              <w:rPr>
-                <w:sz w:val="19"/>
-              </w:rPr>
-              <w:t xml:space="preserve">”</w:t>
-            </w:r>
-            <w:r>
-              <w:rPr>
-                <w:sz w:val="19"/>
-              </w:rPr>
-              <w:t xml:space="preserve"> </w:t>
-            </w:r>
-            <w:r>
-              <w:rPr>
-                <w:sz w:val="19"/>
-              </w:rPr>
-              <w:t xml:space="preserve">leaves out days with no detected wear, so it overstates adherence; the partial first and last days count as full days. Average over every calendar day of the recording, and report the partial first and last days separately. Until then, divide Total Wear Time by the number of days in the recording (SOP §8).</w:t>
+              <w:t xml:space="preserve">the app averages wear time only over days with detected wear (§5.5). Decide which definition the study uses. If every day of the recording should count, divide Total Wear Time by the number of days (SOP §8), or change the app to do so.</w:t>
             </w:r>
           </w:p>
         </w:tc>
@@ -3476,7 +3452,7 @@
         <w:t xml:space="preserve"> </w:t>
       </w:r>
       <w:r>
-        <w:t xml:space="preserve">Timestamps rely on the board’s oscillator, with no correction. With the board’s crystal (tens of ppm) the error is about 1–2 minutes a month, well under one interval; while this is not measured directly, it is a commonly known limitation of using onboard crystal (check: §1.2 item 6).</w:t>
+        <w:t xml:space="preserve">Timestamps rely on the board’s oscillator, with no correction. With the board’s crystal (tens of ppm) the error is about 1–2 minutes a month, well under one interval; this has not been measured directly, but it is typical of an onboard crystal (check: §1.2 item 6).</w:t>
       </w:r>
     </w:p>
     <w:bookmarkEnd w:id="40"/>
@@ -3878,7 +3854,7 @@
         <w:pStyle w:val="FirstParagraph"/>
       </w:pPr>
       <w:r>
-        <w:t xml:space="preserve">All thresholds were set by inspecting a small number of recordings. A finer tuning may be required based on the larger sample data; SOP Appendix C describes how.</w:t>
+        <w:t xml:space="preserve">All thresholds were set by inspecting a small number of recordings. Finer tuning may be needed once more data are available; SOP Appendix C describes how.</w:t>
       </w:r>
     </w:p>
     <w:bookmarkEnd w:id="46"/>
@@ -3904,13 +3880,7 @@
           <w:bCs/>
           <w:b/>
         </w:rPr>
-        <w:t xml:space="preserve">Limitation:</w:t>
-      </w:r>
-      <w:r>
-        <w:t xml:space="preserve"> </w:t>
-      </w:r>
-      <w:r>
-        <w:t xml:space="preserve">The app’s</w:t>
+        <w:t xml:space="preserve">Note:</w:t>
       </w:r>
       <w:r>
         <w:t xml:space="preserve"> </w:t>
@@ -3928,7 +3898,7 @@
         <w:t xml:space="preserve"> </w:t>
       </w:r>
       <w:r>
-        <w:t xml:space="preserve">is the mean over days with at least one detected wear event. Days with no detected wear are left out, so the average overstates adherence, and the partial first and last days of a recording are counted as full days. Until this is fixed (§1.2 item 7), divide Total Wear Time by the number of days in the recording (SOP §8).</w:t>
+        <w:t xml:space="preserve">is the mean over days with at least one detected wear event, so a day with no detected wear (e.g. the splint was not worn at all) is not counted, and the partial first and last days count as days. If this is not the definition the study needs, divide Total Wear Time by the number of days in the recording (SOP §8).</w:t>
       </w:r>
     </w:p>
     <w:bookmarkEnd w:id="47"/>

</xml_diff>

<commit_message>
Handover: battery test before firmware fixes; rewrite design sections as prose
Reorder next steps so battery life is measured first (it sets the urgency of
the firmware fixes), keep Jamie's edits, rewrite §3-§7 in the SOP's readable
style, and update item cross-references.

Co-Authored-By: Claude Opus 5.5 <noreply@anthropic.com>
Claude-Session: https://claude.ai/code/session_01Ue3sWJSFRo3Bxhe8SfexR3
</commit_message>
<xml_diff>
--- a/docs/Project_Handover.docx
+++ b/docs/Project_Handover.docx
@@ -580,7 +580,7 @@
         <w:t xml:space="preserve"> </w:t>
       </w:r>
       <w:r>
-        <w:t xml:space="preserve">The system works end to end: a logger can be set up with the app, worn in the splint for up to about a month, and downloaded, and the app turns the recording into daily wear time and an hour-by-hour picture of when the splint was worn. Two loggers have been built. They take a reading every 5 minutes, and the app estimates wear time from those readings. The detection has not yet been fully validated against a record of actual wear. Before a study with participants, ethics approval and a data-governance plan are needed, the known firmware issues should be fixed, battery life measured, and wear detection validated (§1.2).</w:t>
+        <w:t xml:space="preserve">The system works end to end: a logger can be set up with the app, worn in the splint for up to about a month, and downloaded, and the app turns the recording into daily wear time and an hour-by-hour picture of when the splint was worn. Two prototype loggers have been built. They take a reading every 5 minutes, and the app estimates wear time from those readings. The detection has not yet been fully validated against a record of actual wear.</w:t>
       </w:r>
     </w:p>
     <w:bookmarkStart w:id="21" w:name="current-state"/>
@@ -611,7 +611,7 @@
         <w:t xml:space="preserve"> </w:t>
       </w:r>
       <w:r>
-        <w:t xml:space="preserve">Arduino Nano 33 BLE Sense (nRF52840) with its built-in HS300x temperature and APDS9960 proximity sensors. It records one reading every 5 minutes to its own flash memory, for up to about 52 days of storage, and is configured and read over USB.</w:t>
+        <w:t xml:space="preserve">Arduino Nano 33 BLE Sense Rev2 (nRF52840) with its built-in HS300x temperature and APDS9960 proximity sensors. The logger reserves about 176 KB of its flash memory for readings (15 000 readings of 12 bytes each). At one reading every 5 minutes, this comfortably covers the recommended deployment of up to one month. It is set up and read over USB.</w:t>
       </w:r>
     </w:p>
     <w:p>
@@ -633,7 +633,7 @@
         <w:t xml:space="preserve"> </w:t>
       </w:r>
       <w:r>
-        <w:t xml:space="preserve">It initializes loggers, downloads recordings to CSV, recovers lost start times, and shows detected wear events, daily wear totals and an hour-of-day timeline. Built for Windows and macOS by GitHub Actions on each version tag, and published on the repository’s Releases page.</w:t>
+        <w:t xml:space="preserve">It initializes loggers, downloads recordings to CSV, recovers lost start times, and shows detected wear events, daily wear totals and an hour-of-day timeline. It is built for Windows and macOS by GitHub Actions on each version tag, and published on the repository’s Releases page.</w:t>
       </w:r>
     </w:p>
     <w:p>
@@ -655,7 +655,7 @@
         <w:t xml:space="preserve"> </w:t>
       </w:r>
       <w:r>
-        <w:t xml:space="preserve">Recordings of up to about 36 days have been collected and analyzed to tune the wear-detection algorithm. Two loggers have been built: one is ready for deployment; the other needs its rear 3.3 V trace reconnected to update its firmware and has a tag attached saying so.</w:t>
+        <w:t xml:space="preserve">Recordings of up to about 36 days have been collected and analyzed to tune the wear-detection algorithm. Two loggers have been built: one is ready for deployment; the other needs its rear 3.3 V jumper trace reconnected to update its firmware (it is labelled).</w:t>
       </w:r>
     </w:p>
     <w:p>
@@ -677,7 +677,7 @@
         <w:t xml:space="preserve"> </w:t>
       </w:r>
       <w:r>
-        <w:t xml:space="preserve">Resting current below about 750 µA on the bench. The proximity reading was found to drift upward over a 35-day recording, and the analysis now allows for it (§5.3). 22 automated tests (wear detection, time zones, timestamp recovery, serial protocol) run on every change to the app.</w:t>
+        <w:t xml:space="preserve">Resting current is below about 750 µA on the bench. The proximity reading was found to drift upward over a 35-day recording, and the analysis now accounts for it (§5.3). 22 automated tests (wear detection, time zones, timestamp recovery, serial protocol) run on every change to the app.</w:t>
       </w:r>
     </w:p>
     <w:bookmarkEnd w:id="21"/>
@@ -695,7 +695,7 @@
         <w:pStyle w:val="FirstParagraph"/>
       </w:pPr>
       <w:r>
-        <w:t xml:space="preserve">All remaining work, in recommended order.</w:t>
+        <w:t xml:space="preserve">All remaining work, in recommended order. Battery life comes first because its result decides how urgent the firmware fixes are.</w:t>
       </w:r>
     </w:p>
     <w:tbl>
@@ -808,22 +808,22 @@
               <w:rPr>
                 <w:sz w:val="19"/>
               </w:rPr>
-              <w:t xml:space="preserve">1. Firmware fixes (timing, storage, start time)</w:t>
-            </w:r>
-          </w:p>
-        </w:tc>
-        <w:tc>
-          <w:tcPr/>
-          <w:p>
-            <w:pPr>
-              <w:pStyle w:val="Compact"/>
-              <w:jc w:val="left"/>
-            </w:pPr>
-            <w:r>
-              <w:rPr>
-                <w:sz w:val="19"/>
-              </w:rPr>
-              <w:t xml:space="preserve">Predicted from code; not bench-tested</w:t>
+              <w:t xml:space="preserve">1. Battery life</w:t>
+            </w:r>
+          </w:p>
+        </w:tc>
+        <w:tc>
+          <w:tcPr/>
+          <w:p>
+            <w:pPr>
+              <w:pStyle w:val="Compact"/>
+              <w:jc w:val="left"/>
+            </w:pPr>
+            <w:r>
+              <w:rPr>
+                <w:sz w:val="19"/>
+              </w:rPr>
+              <w:t xml:space="preserve">Not measured with the latest firmware; resting current below ~750 µA</w:t>
             </w:r>
           </w:p>
         </w:tc>
@@ -852,91 +852,22 @@
               <w:rPr>
                 <w:sz w:val="19"/>
               </w:rPr>
-              <w:t xml:space="preserve">recordings longer than about 7 weeks may be corrupted, and timestamps are only right if the logger is powered on at the entered start time. First confirm the storage issue: initialize a logger with a 1-second interval (temporary change to</w:t>
-            </w:r>
-            <w:r>
-              <w:rPr>
-                <w:sz w:val="19"/>
-              </w:rPr>
-              <w:t xml:space="preserve"> </w:t>
-            </w:r>
-            <w:r>
-              <w:rPr>
-                <w:rStyle w:val="VerbatimChar"/>
-                <w:sz w:val="19"/>
-              </w:rPr>
-              <w:t xml:space="preserve">WAKEUP_INTERVAL_SECONDS</w:t>
-            </w:r>
-            <w:r>
-              <w:rPr>
-                <w:sz w:val="19"/>
-              </w:rPr>
-              <w:t xml:space="preserve"> </w:t>
-            </w:r>
-            <w:r>
-              <w:rPr>
-                <w:sz w:val="19"/>
-              </w:rPr>
-              <w:t xml:space="preserve">in</w:t>
-            </w:r>
-            <w:r>
-              <w:rPr>
-                <w:sz w:val="19"/>
-              </w:rPr>
-              <w:t xml:space="preserve"> </w:t>
-            </w:r>
-            <w:r>
-              <w:rPr>
-                <w:rStyle w:val="VerbatimChar"/>
-                <w:sz w:val="19"/>
-              </w:rPr>
-              <w:t xml:space="preserve">arduino.py</w:t>
-            </w:r>
-            <w:r>
-              <w:rPr>
-                <w:sz w:val="19"/>
-              </w:rPr>
-              <w:t xml:space="preserve">, running the app from Python; SOP Appendix A) and leave it for 5 hours; the download should stop at exactly 15 000 rows. Then fix wrap-safe sleep and the storage limit (small, low risk), then start data collection at Initialize, in one firmware release. Bench-test for a full month, re-flash loggers after downloading their data, and update the SOP.</w:t>
-            </w:r>
-          </w:p>
-        </w:tc>
-        <w:tc>
-          <w:tcPr/>
-          <w:p>
-            <w:pPr>
-              <w:pStyle w:val="Compact"/>
-              <w:jc w:val="left"/>
-            </w:pPr>
-            <w:r>
-              <w:rPr>
-                <w:sz w:val="19"/>
-              </w:rPr>
-              <w:t xml:space="preserve">§4.4;</w:t>
-            </w:r>
-            <w:r>
-              <w:rPr>
-                <w:sz w:val="19"/>
-              </w:rPr>
-              <w:t xml:space="preserve"> </w:t>
-            </w:r>
-            <w:r>
-              <w:rPr>
-                <w:rStyle w:val="VerbatimChar"/>
-                <w:sz w:val="19"/>
-              </w:rPr>
-              <w:t xml:space="preserve">HANDOFF.md</w:t>
-            </w:r>
-            <w:r>
-              <w:rPr>
-                <w:sz w:val="19"/>
-              </w:rPr>
-              <w:t xml:space="preserve"> </w:t>
-            </w:r>
-            <w:r>
-              <w:rPr>
-                <w:sz w:val="19"/>
-              </w:rPr>
-              <w:t xml:space="preserve">§8</w:t>
+              <w:t xml:space="preserve">sets how long a deployment can safely run, and how urgent item 2 is. Leave one logger on the bench for a full month, or until the battery dies. A CR2450 (~620 mAh) at ~750 µA gives a rough upper bound of about 34 days, consistent with the ~36-day recording. Until it is measured, fit a new cell for every deployment.</w:t>
+            </w:r>
+          </w:p>
+        </w:tc>
+        <w:tc>
+          <w:tcPr/>
+          <w:p>
+            <w:pPr>
+              <w:pStyle w:val="Compact"/>
+              <w:jc w:val="left"/>
+            </w:pPr>
+            <w:r>
+              <w:rPr>
+                <w:sz w:val="19"/>
+              </w:rPr>
+              <w:t xml:space="preserve">§3.2; §4.3</w:t>
             </w:r>
           </w:p>
         </w:tc>
@@ -953,22 +884,22 @@
               <w:rPr>
                 <w:sz w:val="19"/>
               </w:rPr>
-              <w:t xml:space="preserve">2. Battery life</w:t>
-            </w:r>
-          </w:p>
-        </w:tc>
-        <w:tc>
-          <w:tcPr/>
-          <w:p>
-            <w:pPr>
-              <w:pStyle w:val="Compact"/>
-              <w:jc w:val="left"/>
-            </w:pPr>
-            <w:r>
-              <w:rPr>
-                <w:sz w:val="19"/>
-              </w:rPr>
-              <w:t xml:space="preserve">Not measured with the latest firmware; resting current below ~750 µA</w:t>
+              <w:t xml:space="preserve">2. Firmware fixes (start time, timing, storage)</w:t>
+            </w:r>
+          </w:p>
+        </w:tc>
+        <w:tc>
+          <w:tcPr/>
+          <w:p>
+            <w:pPr>
+              <w:pStyle w:val="Compact"/>
+              <w:jc w:val="left"/>
+            </w:pPr>
+            <w:r>
+              <w:rPr>
+                <w:sz w:val="19"/>
+              </w:rPr>
+              <w:t xml:space="preserve">Predicted from code; not bench-tested</w:t>
             </w:r>
           </w:p>
         </w:tc>
@@ -997,22 +928,91 @@
               <w:rPr>
                 <w:sz w:val="19"/>
               </w:rPr>
-              <w:t xml:space="preserve">sets how long a deployment can safely run. A CR2450 (~620 mAh) at ~750 µA gives a rough upper bound of about 34 days, consistent with the ~36-day recording; until measured, fit a new cell for every deployment. Leave one logger on the bench for a full month, or until the battery dies, to measure battery life.</w:t>
-            </w:r>
-          </w:p>
-        </w:tc>
-        <w:tc>
-          <w:tcPr/>
-          <w:p>
-            <w:pPr>
-              <w:pStyle w:val="Compact"/>
-              <w:jc w:val="left"/>
-            </w:pPr>
-            <w:r>
-              <w:rPr>
-                <w:sz w:val="19"/>
-              </w:rPr>
-              <w:t xml:space="preserve">§3.2; §4.3</w:t>
+              <w:t xml:space="preserve">timestamps are only right if the logger is powered on at the entered start time, and recordings longer than about 7 weeks may be corrupted. First, make data collection start at Initialize. Then add wrap-safe sleep and the storage limit; if item 1 confirms a battery life of 30–40 days, a recording never reaches 15 000 readings, so these two are safeguards rather than urgent work. To confirm the storage issue, initialize a logger with a 1-second interval (a temporary change to</w:t>
+            </w:r>
+            <w:r>
+              <w:rPr>
+                <w:sz w:val="19"/>
+              </w:rPr>
+              <w:t xml:space="preserve"> </w:t>
+            </w:r>
+            <w:r>
+              <w:rPr>
+                <w:rStyle w:val="VerbatimChar"/>
+                <w:sz w:val="19"/>
+              </w:rPr>
+              <w:t xml:space="preserve">WAKEUP_INTERVAL_SECONDS</w:t>
+            </w:r>
+            <w:r>
+              <w:rPr>
+                <w:sz w:val="19"/>
+              </w:rPr>
+              <w:t xml:space="preserve"> </w:t>
+            </w:r>
+            <w:r>
+              <w:rPr>
+                <w:sz w:val="19"/>
+              </w:rPr>
+              <w:t xml:space="preserve">in</w:t>
+            </w:r>
+            <w:r>
+              <w:rPr>
+                <w:sz w:val="19"/>
+              </w:rPr>
+              <w:t xml:space="preserve"> </w:t>
+            </w:r>
+            <w:r>
+              <w:rPr>
+                <w:rStyle w:val="VerbatimChar"/>
+                <w:sz w:val="19"/>
+              </w:rPr>
+              <w:t xml:space="preserve">arduino.py</w:t>
+            </w:r>
+            <w:r>
+              <w:rPr>
+                <w:sz w:val="19"/>
+              </w:rPr>
+              <w:t xml:space="preserve">, running the app from Python; SOP Appendix A) and leave it for 5 hours: the download should stop at exactly 15 000 rows. Release the fixes as one firmware update, bench-test it for a full month, re-flash the loggers after downloading their data, and update the SOP.</w:t>
+            </w:r>
+          </w:p>
+        </w:tc>
+        <w:tc>
+          <w:tcPr/>
+          <w:p>
+            <w:pPr>
+              <w:pStyle w:val="Compact"/>
+              <w:jc w:val="left"/>
+            </w:pPr>
+            <w:r>
+              <w:rPr>
+                <w:sz w:val="19"/>
+              </w:rPr>
+              <w:t xml:space="preserve">§4.4;</w:t>
+            </w:r>
+            <w:r>
+              <w:rPr>
+                <w:sz w:val="19"/>
+              </w:rPr>
+              <w:t xml:space="preserve"> </w:t>
+            </w:r>
+            <w:r>
+              <w:rPr>
+                <w:rStyle w:val="VerbatimChar"/>
+                <w:sz w:val="19"/>
+              </w:rPr>
+              <w:t xml:space="preserve">HANDOFF.md</w:t>
+            </w:r>
+            <w:r>
+              <w:rPr>
+                <w:sz w:val="19"/>
+              </w:rPr>
+              <w:t xml:space="preserve"> </w:t>
+            </w:r>
+            <w:r>
+              <w:rPr>
+                <w:sz w:val="19"/>
+              </w:rPr>
+              <w:t xml:space="preserve">§8</w:t>
             </w:r>
           </w:p>
         </w:tc>
@@ -1225,7 +1225,7 @@
               <w:rPr>
                 <w:sz w:val="19"/>
               </w:rPr>
-              <w:t xml:space="preserve">needed before wear times are reported as study results. Collect ground truth on a few deployments (e.g. a wear diary or supervised sessions), check overnight wear especially, and re-tune the thresholds accordingly.</w:t>
+              <w:t xml:space="preserve">needed before wear times are reported as study results. On a few deployments, keep an independent record of when the splint was actually worn (ground truth), e.g. a wear diary or supervised sessions. Compare it with the detected wear, especially overnight, and re-tune the thresholds accordingly.</w:t>
             </w:r>
           </w:p>
         </w:tc>
@@ -1950,22 +1950,22 @@
               <w:rPr>
                 <w:sz w:val="19"/>
               </w:rPr>
-              <w:t xml:space="preserve">Ground truth</w:t>
-            </w:r>
-          </w:p>
-        </w:tc>
-        <w:tc>
-          <w:tcPr/>
-          <w:p>
-            <w:pPr>
-              <w:pStyle w:val="Compact"/>
-              <w:jc w:val="left"/>
-            </w:pPr>
-            <w:r>
-              <w:rPr>
-                <w:sz w:val="19"/>
-              </w:rPr>
-              <w:t xml:space="preserve">An independent record of when the splint was actually worn (e.g. a wear diary or a supervised session), used to check the detection</w:t>
+              <w:t xml:space="preserve">HS300x</w:t>
+            </w:r>
+          </w:p>
+        </w:tc>
+        <w:tc>
+          <w:tcPr/>
+          <w:p>
+            <w:pPr>
+              <w:pStyle w:val="Compact"/>
+              <w:jc w:val="left"/>
+            </w:pPr>
+            <w:r>
+              <w:rPr>
+                <w:sz w:val="19"/>
+              </w:rPr>
+              <w:t xml:space="preserve">The board’s temperature (and humidity) sensor; only temperature is used</w:t>
             </w:r>
           </w:p>
         </w:tc>
@@ -1982,22 +1982,22 @@
               <w:rPr>
                 <w:sz w:val="19"/>
               </w:rPr>
-              <w:t xml:space="preserve">HS300x</w:t>
-            </w:r>
-          </w:p>
-        </w:tc>
-        <w:tc>
-          <w:tcPr/>
-          <w:p>
-            <w:pPr>
-              <w:pStyle w:val="Compact"/>
-              <w:jc w:val="left"/>
-            </w:pPr>
-            <w:r>
-              <w:rPr>
-                <w:sz w:val="19"/>
-              </w:rPr>
-              <w:t xml:space="preserve">The board’s temperature (and humidity) sensor; only temperature is used</w:t>
+              <w:t xml:space="preserve">APDS9960</w:t>
+            </w:r>
+          </w:p>
+        </w:tc>
+        <w:tc>
+          <w:tcPr/>
+          <w:p>
+            <w:pPr>
+              <w:pStyle w:val="Compact"/>
+              <w:jc w:val="left"/>
+            </w:pPr>
+            <w:r>
+              <w:rPr>
+                <w:sz w:val="19"/>
+              </w:rPr>
+              <w:t xml:space="preserve">The board’s proximity sensor. Reads 0–255; a low value means the splint is worn</w:t>
             </w:r>
           </w:p>
         </w:tc>
@@ -2014,22 +2014,52 @@
               <w:rPr>
                 <w:sz w:val="19"/>
               </w:rPr>
-              <w:t xml:space="preserve">APDS9960</w:t>
-            </w:r>
-          </w:p>
-        </w:tc>
-        <w:tc>
-          <w:tcPr/>
-          <w:p>
-            <w:pPr>
-              <w:pStyle w:val="Compact"/>
-              <w:jc w:val="left"/>
-            </w:pPr>
-            <w:r>
-              <w:rPr>
-                <w:sz w:val="19"/>
-              </w:rPr>
-              <w:t xml:space="preserve">The board’s proximity sensor. Reads 0–255; a low value means the splint is worn</w:t>
+              <w:t xml:space="preserve">Firmware</w:t>
+            </w:r>
+          </w:p>
+        </w:tc>
+        <w:tc>
+          <w:tcPr/>
+          <w:p>
+            <w:pPr>
+              <w:pStyle w:val="Compact"/>
+              <w:jc w:val="left"/>
+            </w:pPr>
+            <w:r>
+              <w:rPr>
+                <w:sz w:val="19"/>
+              </w:rPr>
+              <w:t xml:space="preserve">The program running on the logger (an Arduino</w:t>
+            </w:r>
+            <w:r>
+              <w:rPr>
+                <w:sz w:val="19"/>
+              </w:rPr>
+              <w:t xml:space="preserve"> </w:t>
+            </w:r>
+            <w:r>
+              <w:rPr>
+                <w:sz w:val="19"/>
+              </w:rPr>
+              <w:t xml:space="preserve">“</w:t>
+            </w:r>
+            <w:r>
+              <w:rPr>
+                <w:sz w:val="19"/>
+              </w:rPr>
+              <w:t xml:space="preserve">sketch</w:t>
+            </w:r>
+            <w:r>
+              <w:rPr>
+                <w:sz w:val="19"/>
+              </w:rPr>
+              <w:t xml:space="preserve">”</w:t>
+            </w:r>
+            <w:r>
+              <w:rPr>
+                <w:sz w:val="19"/>
+              </w:rPr>
+              <w:t xml:space="preserve">). Changing it means re-flashing every logger</w:t>
             </w:r>
           </w:p>
         </w:tc>
@@ -2046,68 +2076,6 @@
               <w:rPr>
                 <w:sz w:val="19"/>
               </w:rPr>
-              <w:t xml:space="preserve">Firmware</w:t>
-            </w:r>
-          </w:p>
-        </w:tc>
-        <w:tc>
-          <w:tcPr/>
-          <w:p>
-            <w:pPr>
-              <w:pStyle w:val="Compact"/>
-              <w:jc w:val="left"/>
-            </w:pPr>
-            <w:r>
-              <w:rPr>
-                <w:sz w:val="19"/>
-              </w:rPr>
-              <w:t xml:space="preserve">The program running on the logger (an Arduino</w:t>
-            </w:r>
-            <w:r>
-              <w:rPr>
-                <w:sz w:val="19"/>
-              </w:rPr>
-              <w:t xml:space="preserve"> </w:t>
-            </w:r>
-            <w:r>
-              <w:rPr>
-                <w:sz w:val="19"/>
-              </w:rPr>
-              <w:t xml:space="preserve">“</w:t>
-            </w:r>
-            <w:r>
-              <w:rPr>
-                <w:sz w:val="19"/>
-              </w:rPr>
-              <w:t xml:space="preserve">sketch</w:t>
-            </w:r>
-            <w:r>
-              <w:rPr>
-                <w:sz w:val="19"/>
-              </w:rPr>
-              <w:t xml:space="preserve">”</w:t>
-            </w:r>
-            <w:r>
-              <w:rPr>
-                <w:sz w:val="19"/>
-              </w:rPr>
-              <w:t xml:space="preserve">). Changing it means re-flashing every logger</w:t>
-            </w:r>
-          </w:p>
-        </w:tc>
-      </w:tr>
-      <w:tr>
-        <w:tc>
-          <w:tcPr/>
-          <w:p>
-            <w:pPr>
-              <w:pStyle w:val="Compact"/>
-              <w:jc w:val="left"/>
-            </w:pPr>
-            <w:r>
-              <w:rPr>
-                <w:sz w:val="19"/>
-              </w:rPr>
               <w:t xml:space="preserve">Flash</w:t>
             </w:r>
           </w:p>
@@ -2124,70 +2092,6 @@
                 <w:sz w:val="19"/>
               </w:rPr>
               <w:t xml:space="preserve">The logger’s built-in memory, which keeps the settings and readings without power</w:t>
-            </w:r>
-          </w:p>
-        </w:tc>
-      </w:tr>
-      <w:tr>
-        <w:tc>
-          <w:tcPr/>
-          <w:p>
-            <w:pPr>
-              <w:pStyle w:val="Compact"/>
-              <w:jc w:val="left"/>
-            </w:pPr>
-            <w:r>
-              <w:rPr>
-                <w:sz w:val="19"/>
-              </w:rPr>
-              <w:t xml:space="preserve">Initialize</w:t>
-            </w:r>
-          </w:p>
-        </w:tc>
-        <w:tc>
-          <w:tcPr/>
-          <w:p>
-            <w:pPr>
-              <w:pStyle w:val="Compact"/>
-              <w:jc w:val="left"/>
-            </w:pPr>
-            <w:r>
-              <w:rPr>
-                <w:sz w:val="19"/>
-              </w:rPr>
-              <w:t xml:space="preserve">Sending the start time and participant ID to the logger; erases the previous recording</w:t>
-            </w:r>
-          </w:p>
-        </w:tc>
-      </w:tr>
-      <w:tr>
-        <w:tc>
-          <w:tcPr/>
-          <w:p>
-            <w:pPr>
-              <w:pStyle w:val="Compact"/>
-              <w:jc w:val="left"/>
-            </w:pPr>
-            <w:r>
-              <w:rPr>
-                <w:sz w:val="19"/>
-              </w:rPr>
-              <w:t xml:space="preserve">Data collection / idle</w:t>
-            </w:r>
-          </w:p>
-        </w:tc>
-        <w:tc>
-          <w:tcPr/>
-          <w:p>
-            <w:pPr>
-              <w:pStyle w:val="Compact"/>
-              <w:jc w:val="left"/>
-            </w:pPr>
-            <w:r>
-              <w:rPr>
-                <w:sz w:val="19"/>
-              </w:rPr>
-              <w:t xml:space="preserve">The logger recording with USB off / waiting for the app with USB on. Switches on every power-up</w:t>
             </w:r>
           </w:p>
         </w:tc>
@@ -2524,22 +2428,22 @@
               <w:rPr>
                 <w:sz w:val="19"/>
               </w:rPr>
-              <w:t xml:space="preserve">Long, unattended recording</w:t>
-            </w:r>
-          </w:p>
-        </w:tc>
-        <w:tc>
-          <w:tcPr/>
-          <w:p>
-            <w:pPr>
-              <w:pStyle w:val="Compact"/>
-              <w:jc w:val="left"/>
-            </w:pPr>
-            <w:r>
-              <w:rPr>
-                <w:sz w:val="19"/>
-              </w:rPr>
-              <w:t xml:space="preserve">Record for weeks with no interaction: no charging, no syncing, no app on the patient’s phone</w:t>
+              <w:t xml:space="preserve">Long duration of recording</w:t>
+            </w:r>
+          </w:p>
+        </w:tc>
+        <w:tc>
+          <w:tcPr/>
+          <w:p>
+            <w:pPr>
+              <w:pStyle w:val="Compact"/>
+              <w:jc w:val="left"/>
+            </w:pPr>
+            <w:r>
+              <w:rPr>
+                <w:sz w:val="19"/>
+              </w:rPr>
+              <w:t xml:space="preserve">Record unattended for about a month</w:t>
             </w:r>
           </w:p>
         </w:tc>
@@ -2571,7 +2475,7 @@
               <w:rPr>
                 <w:sz w:val="19"/>
               </w:rPr>
-              <w:t xml:space="preserve">One app to set up a logger, download it, and see the results</w:t>
+              <w:t xml:space="preserve">Easy for the clinician to set up a logger, download it, and see the results</w:t>
             </w:r>
           </w:p>
         </w:tc>
@@ -2603,7 +2507,7 @@
               <w:rPr>
                 <w:sz w:val="19"/>
               </w:rPr>
-              <w:t xml:space="preserve">Use a standard board with built-in sensors, so loggers are easy to build and replace. Originally estimated at about $60 per logger, mostly the Arduino Nano 33 BLE Sense Rev2, whose price has been fluctuating and recently rising</w:t>
+              <w:t xml:space="preserve">Easy to build and replace</w:t>
             </w:r>
           </w:p>
         </w:tc>
@@ -2642,15 +2546,7 @@
         <w:pStyle w:val="FirstParagraph"/>
       </w:pPr>
       <w:r>
-        <w:t xml:space="preserve">Sections 3–7 explain the technical design; readers who only need the status can stop after §2.</w:t>
-      </w:r>
-    </w:p>
-    <w:p>
-      <w:pPr>
-        <w:pStyle w:val="BodyText"/>
-      </w:pPr>
-      <w:r>
-        <w:t xml:space="preserve">The logger records on its own during the deployment. It only talks to a computer before (Initialize) and after (Download) a deployment, over USB serial (Figure 1).</w:t>
+        <w:t xml:space="preserve">Sections 3–7 explain how the logger and the app are designed, and why. In short, the logger records on its own during a deployment and talks to a computer only before it (Initialize) and after it (Download), over USB (Figure 1).</w:t>
       </w:r>
     </w:p>
     <w:p>
@@ -2719,68 +2615,18 @@
     </w:p>
     <w:p>
       <w:pPr>
-        <w:numPr>
-          <w:ilvl w:val="0"/>
-          <w:numId w:val="1004"/>
-        </w:numPr>
-        <w:pStyle w:val="Compact"/>
-      </w:pPr>
-      <w:r>
-        <w:rPr>
-          <w:bCs/>
-          <w:b/>
-        </w:rPr>
-        <w:t xml:space="preserve">Design Decision:</w:t>
-      </w:r>
-      <w:r>
-        <w:t xml:space="preserve"> </w:t>
-      </w:r>
-      <w:r>
-        <w:t xml:space="preserve">The logger only measures and stores. All interpretation (time zones, wear detection, summaries) happens in the app.</w:t>
-      </w:r>
-    </w:p>
-    <w:p>
-      <w:pPr>
-        <w:numPr>
-          <w:ilvl w:val="0"/>
-          <w:numId w:val="1004"/>
-        </w:numPr>
-        <w:pStyle w:val="Compact"/>
-      </w:pPr>
-      <w:r>
-        <w:rPr>
-          <w:bCs/>
-          <w:b/>
-        </w:rPr>
-        <w:t xml:space="preserve">Why:</w:t>
-      </w:r>
-      <w:r>
-        <w:t xml:space="preserve"> </w:t>
-      </w:r>
-      <w:r>
-        <w:t xml:space="preserve">This enables fine-tuning the detection algorithm as raw recordings are preserved. It also keeps the firmware small and simple, ideal for low power mode operation.</w:t>
-      </w:r>
-    </w:p>
-    <w:p>
-      <w:pPr>
-        <w:numPr>
-          <w:ilvl w:val="0"/>
-          <w:numId w:val="1004"/>
-        </w:numPr>
-        <w:pStyle w:val="Compact"/>
-      </w:pPr>
-      <w:r>
-        <w:rPr>
-          <w:bCs/>
-          <w:b/>
-        </w:rPr>
-        <w:t xml:space="preserve">Alternatives:</w:t>
-      </w:r>
-      <w:r>
-        <w:t xml:space="preserve"> </w:t>
-      </w:r>
-      <w:r>
-        <w:t xml:space="preserve">Detecting wear directly on the board; streaming over Bluetooth to a phone (needs the patient’s phone and consumes more power).</w:t>
+        <w:pStyle w:val="FirstParagraph"/>
+      </w:pPr>
+      <w:r>
+        <w:t xml:space="preserve">The logger only measures and stores; all interpretation (time zones, wear detection and summaries) happens in the app. Because the raw readings are kept, the detection can be re-tuned later and old recordings analyzed again. It also keeps the firmware small and simple, which suits low-power operation.</w:t>
+      </w:r>
+    </w:p>
+    <w:p>
+      <w:pPr>
+        <w:pStyle w:val="BodyText"/>
+      </w:pPr>
+      <w:r>
+        <w:t xml:space="preserve">The alternatives were to detect wear on the board itself, which would discard the raw data, or to stream readings to a phone over Bluetooth, which needs the patient’s phone and more power.</w:t>
       </w:r>
     </w:p>
     <w:bookmarkEnd w:id="31"/>
@@ -2795,112 +2641,26 @@
     </w:p>
     <w:p>
       <w:pPr>
-        <w:numPr>
-          <w:ilvl w:val="0"/>
-          <w:numId w:val="1005"/>
-        </w:numPr>
-        <w:pStyle w:val="Compact"/>
-      </w:pPr>
-      <w:r>
-        <w:rPr>
-          <w:bCs/>
-          <w:b/>
-        </w:rPr>
-        <w:t xml:space="preserve">Design Decision:</w:t>
-      </w:r>
-      <w:r>
-        <w:t xml:space="preserve"> </w:t>
-      </w:r>
-      <w:r>
-        <w:t xml:space="preserve">Arduino Nano 33 BLE Sense, using its built-in HS300x temperature and APDS9960 proximity sensors.</w:t>
-      </w:r>
-    </w:p>
-    <w:p>
-      <w:pPr>
-        <w:numPr>
-          <w:ilvl w:val="0"/>
-          <w:numId w:val="1005"/>
-        </w:numPr>
-        <w:pStyle w:val="Compact"/>
-      </w:pPr>
-      <w:r>
-        <w:rPr>
-          <w:bCs/>
-          <w:b/>
-        </w:rPr>
-        <w:t xml:space="preserve">Why:</w:t>
-      </w:r>
-      <w:r>
-        <w:t xml:space="preserve"> </w:t>
-      </w:r>
-      <w:r>
-        <w:t xml:space="preserve">Both sensors are already on the board, so there is no extra wiring. The nRF52840 has enough flash for a month of readings and can be put into a low-power state. The board also has Bluetooth available if pursuing a wireless version in future.</w:t>
-      </w:r>
-    </w:p>
-    <w:p>
-      <w:pPr>
-        <w:numPr>
-          <w:ilvl w:val="0"/>
-          <w:numId w:val="1005"/>
-        </w:numPr>
-        <w:pStyle w:val="Compact"/>
-      </w:pPr>
-      <w:r>
-        <w:rPr>
-          <w:bCs/>
-          <w:b/>
-        </w:rPr>
-        <w:t xml:space="preserve">Trade-off:</w:t>
-      </w:r>
-      <w:r>
-        <w:t xml:space="preserve"> </w:t>
-      </w:r>
-      <w:r>
-        <w:t xml:space="preserve">The board is larger and draws more current than a custom designed printed circuit board.</w:t>
-      </w:r>
-    </w:p>
-    <w:p>
-      <w:pPr>
-        <w:numPr>
-          <w:ilvl w:val="0"/>
-          <w:numId w:val="1005"/>
-        </w:numPr>
-        <w:pStyle w:val="Compact"/>
-      </w:pPr>
-      <w:r>
-        <w:rPr>
-          <w:bCs/>
-          <w:b/>
-        </w:rPr>
-        <w:t xml:space="preserve">Power:</w:t>
-      </w:r>
-      <w:r>
-        <w:t xml:space="preserve"> </w:t>
-      </w:r>
-      <w:r>
-        <w:t xml:space="preserve">A CR2450 coin cell on the 3.3 V pin, with the 3.3 V jumper on the back of the board cut so the board’s regulator and USB circuitry draw no power. As a result, USB alone cannot power the logger: the cell must be connected whenever it is used with the app, and flashing new firmware needs the jumper bridged, then cut again (SOP §3.2). This is why one logger currently needs its 3.3 V trace reconnected before its firmware can be updated (§1.1).</w:t>
-      </w:r>
-    </w:p>
-    <w:p>
-      <w:pPr>
-        <w:numPr>
-          <w:ilvl w:val="0"/>
-          <w:numId w:val="1005"/>
-        </w:numPr>
-        <w:pStyle w:val="Compact"/>
-      </w:pPr>
-      <w:r>
-        <w:rPr>
-          <w:bCs/>
-          <w:b/>
-        </w:rPr>
-        <w:t xml:space="preserve">Case and mounting:</w:t>
-      </w:r>
-      <w:r>
-        <w:t xml:space="preserve"> </w:t>
-      </w:r>
-      <w:r>
-        <w:t xml:space="preserve">A 3D-printed case (</w:t>
+        <w:pStyle w:val="FirstParagraph"/>
+      </w:pPr>
+      <w:r>
+        <w:t xml:space="preserve">The logger is an Arduino Nano 33 BLE Sense Rev2, chosen because its built-in HS300x temperature and APDS9960 proximity sensors need no extra wiring. Its nRF52840 chip has enough flash memory for a month of readings, can run in a low-power state, and has Bluetooth if a wireless version is pursued later. The trade-off is that the board is larger and draws more current than a custom printed circuit board would (§8).</w:t>
+      </w:r>
+    </w:p>
+    <w:p>
+      <w:pPr>
+        <w:pStyle w:val="BodyText"/>
+      </w:pPr>
+      <w:r>
+        <w:t xml:space="preserve">It runs on a CR2450 coin cell connected to the 3.3 V pin. The 3.3 V jumper on the back of the board is cut so that the board’s regulator and USB circuitry draw no power. As a result, USB alone cannot power the logger: the cell must be connected whenever the logger is used with the app, and flashing new firmware needs the jumper bridged first and cut again afterwards (SOP §3.2). This is why one of the two loggers needs its jumper reconnected before its firmware can be updated (§1.1).</w:t>
+      </w:r>
+    </w:p>
+    <w:p>
+      <w:pPr>
+        <w:pStyle w:val="BodyText"/>
+      </w:pPr>
+      <w:r>
+        <w:t xml:space="preserve">The board sits in a 3D-printed case (</w:t>
       </w:r>
       <w:r>
         <w:rPr>
@@ -2912,7 +2672,7 @@
         <w:t xml:space="preserve"> </w:t>
       </w:r>
       <w:r>
-        <w:t xml:space="preserve">in the repository) holds the board with the sensors facing the skin, behind skin-friendly tape. The PI (an orthopedist) moulds the case into each participant’s custom splint while moulding the splint itself, and it is secured through the thermoplastic with Chicago screws, so the case and logger can be moved to the next participant’s splint.</w:t>
+        <w:t xml:space="preserve">in the repository), with the sensors facing the skin behind skin-friendly tape. The PI (an orthopedist) moulds the case into each participant’s custom splint while making the splint, and Chicago screws secure it through the thermoplastic, so the case and logger can be moved to the next participant’s splint.</w:t>
       </w:r>
     </w:p>
     <w:bookmarkEnd w:id="32"/>
@@ -2926,57 +2686,21 @@
         <w:t xml:space="preserve">4. Firmware</w:t>
       </w:r>
     </w:p>
-    <w:bookmarkStart w:id="34" w:name="mode-chosen-by-power-up"/>
+    <w:bookmarkStart w:id="34" w:name="mode-chosen-at-power-up"/>
     <w:p>
       <w:pPr>
         <w:pStyle w:val="Heading2"/>
       </w:pPr>
       <w:r>
-        <w:t xml:space="preserve">4.1 Mode chosen by power-up</w:t>
-      </w:r>
-    </w:p>
-    <w:p>
-      <w:pPr>
-        <w:numPr>
-          <w:ilvl w:val="0"/>
-          <w:numId w:val="1006"/>
-        </w:numPr>
-        <w:pStyle w:val="Compact"/>
-      </w:pPr>
-      <w:r>
-        <w:rPr>
-          <w:bCs/>
-          <w:b/>
-        </w:rPr>
-        <w:t xml:space="preserve">Design Decision:</w:t>
-      </w:r>
-      <w:r>
-        <w:t xml:space="preserve"> </w:t>
-      </w:r>
-      <w:r>
-        <w:t xml:space="preserve">The logger keeps a mode flag in flash and changes it on every power-up: an initialized logger with no data starts data collection; a logger collecting data becomes idle (Figure 1).</w:t>
-      </w:r>
-    </w:p>
-    <w:p>
-      <w:pPr>
-        <w:numPr>
-          <w:ilvl w:val="0"/>
-          <w:numId w:val="1006"/>
-        </w:numPr>
-        <w:pStyle w:val="Compact"/>
-      </w:pPr>
-      <w:r>
-        <w:rPr>
-          <w:bCs/>
-          <w:b/>
-        </w:rPr>
-        <w:t xml:space="preserve">Why:</w:t>
-      </w:r>
-      <w:r>
-        <w:t xml:space="preserve"> </w:t>
-      </w:r>
-      <w:r>
-        <w:t xml:space="preserve">During data collection USB is switched off to save power, so the computer can’t send a</w:t>
+        <w:t xml:space="preserve">4.1 Mode chosen at power-up</w:t>
+      </w:r>
+    </w:p>
+    <w:p>
+      <w:pPr>
+        <w:pStyle w:val="FirstParagraph"/>
+      </w:pPr>
+      <w:r>
+        <w:t xml:space="preserve">The logger has no buttons or commands to start and stop recording. Instead, the firmware keeps a mode flag in flash and changes it each time the logger is powered up: an initialized logger with no data starts collecting data, and a logger that was collecting data becomes idle (Figure 1). This is needed because USB is switched off during data collection to save power, so the computer cannot send a</w:t>
       </w:r>
       <w:r>
         <w:t xml:space="preserve"> </w:t>
@@ -2994,121 +2718,41 @@
         <w:t xml:space="preserve"> </w:t>
       </w:r>
       <w:r>
-        <w:t xml:space="preserve">command. Power-cycling is the only control available without extra buttons.</w:t>
-      </w:r>
-    </w:p>
-    <w:p>
-      <w:pPr>
-        <w:numPr>
-          <w:ilvl w:val="0"/>
-          <w:numId w:val="1006"/>
-        </w:numPr>
-        <w:pStyle w:val="Compact"/>
-      </w:pPr>
-      <w:r>
-        <w:rPr>
-          <w:bCs/>
-          <w:b/>
-        </w:rPr>
-        <w:t xml:space="preserve">Limitation:</w:t>
-      </w:r>
-      <w:r>
-        <w:t xml:space="preserve"> </w:t>
-      </w:r>
-      <w:r>
-        <w:t xml:space="preserve">The logger can’t be seen by the app during data collection; power-cycle it first. Any reset or power loss during data collection also counts as a power-up, so the recording ends there: the data so far is kept, but nothing more is recorded. Secure the battery and record any interruption in the deployment log.</w:t>
+        <w:t xml:space="preserve">command.</w:t>
+      </w:r>
+    </w:p>
+    <w:p>
+      <w:pPr>
+        <w:pStyle w:val="BodyText"/>
+      </w:pPr>
+      <w:r>
+        <w:t xml:space="preserve">As a result, the app cannot see a logger while it is collecting data; the logger has to be power-cycled first. Any reset or power loss counts as a power-cycle, so the recording keeps every reading up to that moment but stops there.</w:t>
       </w:r>
     </w:p>
     <w:bookmarkEnd w:id="34"/>
-    <w:bookmarkStart w:id="35" w:name="settings-stored-twice-ab-with-a-checksum"/>
+    <w:bookmarkStart w:id="35" w:name="settings-stored-twice"/>
     <w:p>
       <w:pPr>
         <w:pStyle w:val="Heading2"/>
       </w:pPr>
       <w:r>
-        <w:t xml:space="preserve">4.2 Settings stored twice (A/B), with a checksum</w:t>
-      </w:r>
-    </w:p>
-    <w:p>
-      <w:pPr>
-        <w:numPr>
-          <w:ilvl w:val="0"/>
-          <w:numId w:val="1007"/>
-        </w:numPr>
-        <w:pStyle w:val="Compact"/>
-      </w:pPr>
-      <w:r>
-        <w:rPr>
-          <w:bCs/>
-          <w:b/>
-        </w:rPr>
-        <w:t xml:space="preserve">Design Decision:</w:t>
-      </w:r>
-      <w:r>
-        <w:t xml:space="preserve"> </w:t>
-      </w:r>
-      <w:r>
-        <w:t xml:space="preserve">The settings (start time, interval, participant ID, mode) are kept in two flash pages. Each save writes to the page</w:t>
-      </w:r>
-      <w:r>
-        <w:t xml:space="preserve"> </w:t>
-      </w:r>
-      <w:r>
-        <w:rPr>
-          <w:iCs/>
-          <w:i/>
-        </w:rPr>
-        <w:t xml:space="preserve">not</w:t>
-      </w:r>
-      <w:r>
-        <w:t xml:space="preserve"> </w:t>
-      </w:r>
-      <w:r>
-        <w:t xml:space="preserve">holding the current copy, with a magic number, sequence number and CRC; on power-up the newest valid copy wins.</w:t>
-      </w:r>
-    </w:p>
-    <w:p>
-      <w:pPr>
-        <w:numPr>
-          <w:ilvl w:val="0"/>
-          <w:numId w:val="1007"/>
-        </w:numPr>
-        <w:pStyle w:val="Compact"/>
-      </w:pPr>
-      <w:r>
-        <w:rPr>
-          <w:bCs/>
-          <w:b/>
-        </w:rPr>
-        <w:t xml:space="preserve">Why:</w:t>
-      </w:r>
-      <w:r>
-        <w:t xml:space="preserve"> </w:t>
-      </w:r>
-      <w:r>
-        <w:t xml:space="preserve">The earlier single-page layout could be wiped by a reset during a save, losing the start time. The A/B layout always leaves one good copy.</w:t>
-      </w:r>
-    </w:p>
-    <w:p>
-      <w:pPr>
-        <w:numPr>
-          <w:ilvl w:val="0"/>
-          <w:numId w:val="1007"/>
-        </w:numPr>
-        <w:pStyle w:val="Compact"/>
-      </w:pPr>
-      <w:r>
-        <w:rPr>
-          <w:bCs/>
-          <w:b/>
-        </w:rPr>
-        <w:t xml:space="preserve">Constraint:</w:t>
-      </w:r>
-      <w:r>
-        <w:t xml:space="preserve"> </w:t>
-      </w:r>
-      <w:r>
-        <w:t xml:space="preserve">Loggers flashed before this change hold settings the current firmware doesn’t recognize. They report</w:t>
+        <w:t xml:space="preserve">4.2 Settings stored twice</w:t>
+      </w:r>
+    </w:p>
+    <w:p>
+      <w:pPr>
+        <w:pStyle w:val="FirstParagraph"/>
+      </w:pPr>
+      <w:r>
+        <w:t xml:space="preserve">The settings (start time, interval, participant ID and mode) are saved in two separate flash pages. Each save goes to the page that does not hold the current copy and carries a sequence number and a checksum (CRC); at power-up the newest valid copy is used. A reset during a save can therefore never destroy the last good copy, which is how the earlier single-page layout could lose the start time.</w:t>
+      </w:r>
+    </w:p>
+    <w:p>
+      <w:pPr>
+        <w:pStyle w:val="BodyText"/>
+      </w:pPr>
+      <w:r>
+        <w:t xml:space="preserve">Loggers flashed before this change hold settings that the current firmware does not recognize. They report</w:t>
       </w:r>
       <w:r>
         <w:t xml:space="preserve"> </w:t>
@@ -3123,7 +2767,7 @@
         <w:t xml:space="preserve"> </w:t>
       </w:r>
       <w:r>
-        <w:t xml:space="preserve">start times until re-initialized; these loggers will need to be updated to the latest firmware.</w:t>
+        <w:t xml:space="preserve">start times until they are re-initialized, and need to be updated to the latest firmware.</w:t>
       </w:r>
     </w:p>
     <w:bookmarkEnd w:id="35"/>
@@ -3138,24 +2782,10 @@
     </w:p>
     <w:p>
       <w:pPr>
-        <w:numPr>
-          <w:ilvl w:val="0"/>
-          <w:numId w:val="1008"/>
-        </w:numPr>
-        <w:pStyle w:val="Compact"/>
-      </w:pPr>
-      <w:r>
-        <w:rPr>
-          <w:bCs/>
-          <w:b/>
-        </w:rPr>
-        <w:t xml:space="preserve">Design Decision:</w:t>
-      </w:r>
-      <w:r>
-        <w:t xml:space="preserve"> </w:t>
-      </w:r>
-      <w:r>
-        <w:t xml:space="preserve">During data collection the firmware disables USB, UART, the radio and other unused peripherals, and waits between readings with</w:t>
+        <w:pStyle w:val="FirstParagraph"/>
+      </w:pPr>
+      <w:r>
+        <w:t xml:space="preserve">During data collection the firmware switches off USB, the serial ports, the radio and other unused parts of the chip, and waits between readings with</w:t>
       </w:r>
       <w:r>
         <w:t xml:space="preserve"> </w:t>
@@ -3167,29 +2797,7 @@
         <w:t xml:space="preserve">delay()</w:t>
       </w:r>
       <w:r>
-        <w:t xml:space="preserve">. Resting current measured below about 750 µA.</w:t>
-      </w:r>
-    </w:p>
-    <w:p>
-      <w:pPr>
-        <w:numPr>
-          <w:ilvl w:val="0"/>
-          <w:numId w:val="1008"/>
-        </w:numPr>
-        <w:pStyle w:val="Compact"/>
-      </w:pPr>
-      <w:r>
-        <w:rPr>
-          <w:bCs/>
-          <w:b/>
-        </w:rPr>
-        <w:t xml:space="preserve">Why:</w:t>
-      </w:r>
-      <w:r>
-        <w:t xml:space="preserve"> </w:t>
-      </w:r>
-      <w:r>
-        <w:t xml:space="preserve">A deeper sleep (RTC2 timer +</w:t>
+        <w:t xml:space="preserve">. The resting current measured below about 750 µA. A deeper sleep mode (RTC2 timer +</w:t>
       </w:r>
       <w:r>
         <w:t xml:space="preserve"> </w:t>
@@ -3201,7 +2809,7 @@
         <w:t xml:space="preserve">__WFI</w:t>
       </w:r>
       <w:r>
-        <w:t xml:space="preserve">) was tried, but the Arduino never woke up to resume collecting data once in deep sleep; it may still be worth revisiting to further optimize battery life.</w:t>
+        <w:t xml:space="preserve">) was tried, but the board never woke up from it to take the next reading; it may still be worth revisiting to extend battery life.</w:t>
       </w:r>
     </w:p>
     <w:bookmarkEnd w:id="36"/>
@@ -3212,6 +2820,50 @@
       </w:pPr>
       <w:r>
         <w:t xml:space="preserve">4.4 Fixed 5-minute interval, elapsed-time records</w:t>
+      </w:r>
+    </w:p>
+    <w:p>
+      <w:pPr>
+        <w:pStyle w:val="FirstParagraph"/>
+      </w:pPr>
+      <w:r>
+        <w:t xml:space="preserve">The logger takes one reading every 5 minutes (</w:t>
+      </w:r>
+      <w:r>
+        <w:rPr>
+          <w:rStyle w:val="VerbatimChar"/>
+        </w:rPr>
+        <w:t xml:space="preserve">WAKEUP_INTERVAL_SECONDS</w:t>
+      </w:r>
+      <w:r>
+        <w:t xml:space="preserve"> </w:t>
+      </w:r>
+      <w:r>
+        <w:t xml:space="preserve">in</w:t>
+      </w:r>
+      <w:r>
+        <w:t xml:space="preserve"> </w:t>
+      </w:r>
+      <w:r>
+        <w:rPr>
+          <w:rStyle w:val="VerbatimChar"/>
+        </w:rPr>
+        <w:t xml:space="preserve">arduino.py</w:t>
+      </w:r>
+      <w:r>
+        <w:t xml:space="preserve">, sent at Initialize). The board has no real-time clock, so each record stores the seconds elapsed since data collection started (counted by</w:t>
+      </w:r>
+      <w:r>
+        <w:t xml:space="preserve"> </w:t>
+      </w:r>
+      <w:r>
+        <w:rPr>
+          <w:rStyle w:val="VerbatimChar"/>
+        </w:rPr>
+        <w:t xml:space="preserve">millis()</w:t>
+      </w:r>
+      <w:r>
+        <w:t xml:space="preserve">), plus the temperature and proximity, in 12 bytes. The app adds the start time when the data are downloaded (Figure 2).</w:t>
       </w:r>
     </w:p>
     <w:p>
@@ -3271,9 +2923,25 @@
     </w:p>
     <w:p>
       <w:pPr>
+        <w:pStyle w:val="BodyText"/>
+      </w:pPr>
+      <w:r>
+        <w:t xml:space="preserve">Five minutes resolves wear periods well enough for daily totals, and a month of readings fits in flash. The analysis works out the actual interval from the timestamps, so the interval can be changed without changing the analysis.</w:t>
+      </w:r>
+    </w:p>
+    <w:p>
+      <w:pPr>
+        <w:pStyle w:val="BodyText"/>
+      </w:pPr>
+      <w:r>
+        <w:t xml:space="preserve">This design has three limitations:</w:t>
+      </w:r>
+    </w:p>
+    <w:p>
+      <w:pPr>
         <w:numPr>
           <w:ilvl w:val="0"/>
-          <w:numId w:val="1009"/>
+          <w:numId w:val="1004"/>
         </w:numPr>
         <w:pStyle w:val="Compact"/>
       </w:pPr>
@@ -3282,37 +2950,29 @@
           <w:bCs/>
           <w:b/>
         </w:rPr>
-        <w:t xml:space="preserve">Design Decision:</w:t>
-      </w:r>
-      <w:r>
-        <w:t xml:space="preserve"> </w:t>
-      </w:r>
-      <w:r>
-        <w:t xml:space="preserve">One reading every 300 seconds (5 minutes) (</w:t>
-      </w:r>
+        <w:t xml:space="preserve">Start time.</w:t>
+      </w:r>
+      <w:r>
+        <w:t xml:space="preserve"> </w:t>
+      </w:r>
+      <w:r>
+        <w:t xml:space="preserve">Elapsed time counts from the power-on that starts data collection, while the start time is the one entered at Initialize. Any gap between the two shifts every timestamp by that amount, and nothing in the file shows it. §1.2 item 2 removes this.</w:t>
+      </w:r>
+    </w:p>
+    <w:p>
+      <w:pPr>
+        <w:numPr>
+          <w:ilvl w:val="0"/>
+          <w:numId w:val="1004"/>
+        </w:numPr>
+        <w:pStyle w:val="Compact"/>
+      </w:pPr>
       <w:r>
         <w:rPr>
-          <w:rStyle w:val="VerbatimChar"/>
+          <w:bCs/>
+          <w:b/>
         </w:rPr>
-        <w:t xml:space="preserve">WAKEUP_INTERVAL_SECONDS</w:t>
-      </w:r>
-      <w:r>
-        <w:t xml:space="preserve"> </w:t>
-      </w:r>
-      <w:r>
-        <w:t xml:space="preserve">in</w:t>
-      </w:r>
-      <w:r>
-        <w:t xml:space="preserve"> </w:t>
-      </w:r>
-      <w:r>
-        <w:rPr>
-          <w:rStyle w:val="VerbatimChar"/>
-        </w:rPr>
-        <w:t xml:space="preserve">arduino.py</w:t>
-      </w:r>
-      <w:r>
-        <w:t xml:space="preserve">, sent at Initialize). Each record stores seconds elapsed since data collection started (from</w:t>
+        <w:t xml:space="preserve">Rollover.</w:t>
       </w:r>
       <w:r>
         <w:t xml:space="preserve"> </w:t>
@@ -3324,14 +2984,26 @@
         <w:t xml:space="preserve">millis()</w:t>
       </w:r>
       <w:r>
-        <w:t xml:space="preserve">), plus temperature and proximity, in 12 bytes; the app adds the start time.</w:t>
+        <w:t xml:space="preserve"> </w:t>
+      </w:r>
+      <w:r>
+        <w:t xml:space="preserve">wraps after about 49.7 days, and the sleep check (</w:t>
+      </w:r>
+      <w:r>
+        <w:rPr>
+          <w:rStyle w:val="VerbatimChar"/>
+        </w:rPr>
+        <w:t xml:space="preserve">nextWakeTime &gt; currentTime</w:t>
+      </w:r>
+      <w:r>
+        <w:t xml:space="preserve">) is not wrap-safe: expect a burst of readings, then a long gap. The stored elapsed times stay correct. §1.2 item 2 fixes this; until then, keep deployments to about a month.</w:t>
       </w:r>
     </w:p>
     <w:p>
       <w:pPr>
         <w:numPr>
           <w:ilvl w:val="0"/>
-          <w:numId w:val="1009"/>
+          <w:numId w:val="1004"/>
         </w:numPr>
         <w:pStyle w:val="Compact"/>
       </w:pPr>
@@ -3340,20 +3012,120 @@
           <w:bCs/>
           <w:b/>
         </w:rPr>
-        <w:t xml:space="preserve">Why:</w:t>
-      </w:r>
-      <w:r>
-        <w:t xml:space="preserve"> </w:t>
-      </w:r>
-      <w:r>
-        <w:t xml:space="preserve">The board has no real-time clock, so elapsed time is the simplest reliable record. 5 minutes resolves wear periods well enough for daily totals, and fits a month in flash. The analysis infers the real interval from the timestamps, so the interval can be changed without changing the analysis.</w:t>
+        <w:t xml:space="preserve">Clock accuracy.</w:t>
+      </w:r>
+      <w:r>
+        <w:t xml:space="preserve"> </w:t>
+      </w:r>
+      <w:r>
+        <w:t xml:space="preserve">Timestamps rely on the board’s crystal, with no correction. Its error is typically about 1–2 minutes a month, well under one reading interval; this has not been measured directly (§1.2 item 6).</w:t>
+      </w:r>
+    </w:p>
+    <w:bookmarkEnd w:id="40"/>
+    <w:bookmarkStart w:id="41" w:name="reliable-proximity-readings"/>
+    <w:p>
+      <w:pPr>
+        <w:pStyle w:val="Heading2"/>
+      </w:pPr>
+      <w:r>
+        <w:t xml:space="preserve">4.5 Reliable proximity readings</w:t>
+      </w:r>
+    </w:p>
+    <w:p>
+      <w:pPr>
+        <w:pStyle w:val="FirstParagraph"/>
+      </w:pPr>
+      <w:r>
+        <w:t xml:space="preserve">The first two proximity readings after the sensor wakes are unsettled, so the firmware discards them. Every wait for the sensor has a time limit, so a faulty sensor logs</w:t>
+      </w:r>
+      <w:r>
+        <w:t xml:space="preserve"> </w:t>
+      </w:r>
+      <w:r>
+        <w:rPr>
+          <w:rStyle w:val="VerbatimChar"/>
+        </w:rPr>
+        <w:t xml:space="preserve">0</w:t>
+      </w:r>
+      <w:r>
+        <w:t xml:space="preserve"> </w:t>
+      </w:r>
+      <w:r>
+        <w:t xml:space="preserve">instead of freezing the logger for the rest of the deployment.</w:t>
+      </w:r>
+    </w:p>
+    <w:bookmarkEnd w:id="41"/>
+    <w:bookmarkEnd w:id="42"/>
+    <w:bookmarkStart w:id="48" w:name="wear-detection-algorithm"/>
+    <w:p>
+      <w:pPr>
+        <w:pStyle w:val="Heading1"/>
+      </w:pPr>
+      <w:r>
+        <w:t xml:space="preserve">5. Wear-detection algorithm</w:t>
+      </w:r>
+    </w:p>
+    <w:p>
+      <w:pPr>
+        <w:pStyle w:val="FirstParagraph"/>
+      </w:pPr>
+      <w:r>
+        <w:t xml:space="preserve">The app decides when the splint was worn from two signals: the skin warms the temperature sensor, and the splint covers the proximity sensor. The full parameter table is in</w:t>
+      </w:r>
+      <w:r>
+        <w:t xml:space="preserve"> </w:t>
+      </w:r>
+      <w:r>
+        <w:rPr>
+          <w:rStyle w:val="VerbatimChar"/>
+        </w:rPr>
+        <w:t xml:space="preserve">HANDOFF.md</w:t>
+      </w:r>
+      <w:r>
+        <w:t xml:space="preserve"> </w:t>
+      </w:r>
+      <w:r>
+        <w:t xml:space="preserve">§4, and SOP Appendix C describes how to re-tune it.</w:t>
+      </w:r>
+    </w:p>
+    <w:bookmarkStart w:id="43" w:name="temperature-above-a-rolling-baseline"/>
+    <w:p>
+      <w:pPr>
+        <w:pStyle w:val="Heading2"/>
+      </w:pPr>
+      <w:r>
+        <w:t xml:space="preserve">5.1 Temperature above a rolling baseline</w:t>
+      </w:r>
+    </w:p>
+    <w:p>
+      <w:pPr>
+        <w:pStyle w:val="FirstParagraph"/>
+      </w:pPr>
+      <w:r>
+        <w:t xml:space="preserve">Room temperature changes over the day, so a fixed temperature threshold would fail. Instead, the app takes the lowest temperature over a rolling window of about 2 hours as the room temperature (the baseline) and looks at the rise above it (delta).</w:t>
+      </w:r>
+    </w:p>
+    <w:p>
+      <w:pPr>
+        <w:pStyle w:val="BodyText"/>
+      </w:pPr>
+      <w:r>
+        <w:t xml:space="preserve">A wear event starts when the proximity sensor is covered, the temperature has risen over the last ~15 minutes, and either it jumped by at least 0.8 °C in one reading or it is at least 3 °C above the baseline. The 15-minute check stops a cooling splint from triggering a false start. An event ends when the proximity sensor is uncovered, or when the temperature falls fast (by at least 0.4 °C per reading) and is back near the baseline or below 80 % of the event’s peak rise.</w:t>
+      </w:r>
+    </w:p>
+    <w:p>
+      <w:pPr>
+        <w:pStyle w:val="BodyText"/>
+      </w:pPr>
+      <w:r>
+        <w:t xml:space="preserve">Two limitations follow:</w:t>
       </w:r>
     </w:p>
     <w:p>
       <w:pPr>
         <w:numPr>
           <w:ilvl w:val="0"/>
-          <w:numId w:val="1009"/>
+          <w:numId w:val="1005"/>
         </w:numPr>
         <w:pStyle w:val="Compact"/>
       </w:pPr>
@@ -3362,114 +3134,20 @@
           <w:bCs/>
           <w:b/>
         </w:rPr>
-        <w:t xml:space="preserve">Limitations:</w:t>
-      </w:r>
-    </w:p>
-    <w:p>
-      <w:pPr>
-        <w:numPr>
-          <w:ilvl w:val="1"/>
-          <w:numId w:val="1010"/>
-        </w:numPr>
-        <w:pStyle w:val="Compact"/>
-      </w:pPr>
-      <w:r>
-        <w:rPr>
-          <w:iCs/>
-          <w:i/>
-        </w:rPr>
-        <w:t xml:space="preserve">Start time.</w:t>
-      </w:r>
-      <w:r>
-        <w:t xml:space="preserve"> </w:t>
-      </w:r>
-      <w:r>
-        <w:t xml:space="preserve">Elapsed time counts from the power-on that starts data collection, while the start time is the one typed into the app at Initialize. Any gap between the two shifts every timestamp by that amount, and nothing in the file shows it. Fix: §1.2 item 1.</w:t>
-      </w:r>
-    </w:p>
-    <w:p>
-      <w:pPr>
-        <w:numPr>
-          <w:ilvl w:val="1"/>
-          <w:numId w:val="1010"/>
-        </w:numPr>
-        <w:pStyle w:val="Compact"/>
-      </w:pPr>
-      <w:r>
-        <w:rPr>
-          <w:iCs/>
-          <w:i/>
-        </w:rPr>
-        <w:t xml:space="preserve">Rollover.</w:t>
-      </w:r>
-      <w:r>
-        <w:t xml:space="preserve"> </w:t>
-      </w:r>
-      <w:r>
-        <w:rPr>
-          <w:rStyle w:val="VerbatimChar"/>
-        </w:rPr>
-        <w:t xml:space="preserve">millis()</w:t>
-      </w:r>
-      <w:r>
-        <w:t xml:space="preserve"> </w:t>
-      </w:r>
-      <w:r>
-        <w:t xml:space="preserve">is 32-bit and wraps at about 49.7 days, and the sleep check</w:t>
-      </w:r>
-      <w:r>
-        <w:t xml:space="preserve"> </w:t>
-      </w:r>
-      <w:r>
-        <w:rPr>
-          <w:rStyle w:val="VerbatimChar"/>
-        </w:rPr>
-        <w:t xml:space="preserve">nextWakeTime &gt; currentTime</w:t>
-      </w:r>
-      <w:r>
-        <w:t xml:space="preserve"> </w:t>
-      </w:r>
-      <w:r>
-        <w:t xml:space="preserve">is not wrap-safe: expect a burst of readings, then a long gap. The stored elapsed times stay correct. Fix: §1.2 item 1; until then, keep deployments to about a month.</w:t>
-      </w:r>
-    </w:p>
-    <w:p>
-      <w:pPr>
-        <w:numPr>
-          <w:ilvl w:val="1"/>
-          <w:numId w:val="1010"/>
-        </w:numPr>
-        <w:pStyle w:val="Compact"/>
-      </w:pPr>
-      <w:r>
-        <w:rPr>
-          <w:iCs/>
-          <w:i/>
-        </w:rPr>
-        <w:t xml:space="preserve">Clock accuracy.</w:t>
-      </w:r>
-      <w:r>
-        <w:t xml:space="preserve"> </w:t>
-      </w:r>
-      <w:r>
-        <w:t xml:space="preserve">Timestamps rely on the board’s oscillator, with no correction. With the board’s crystal (tens of ppm) the error is about 1–2 minutes a month, well under one interval; this has not been measured directly, but it is typical of an onboard crystal (check: §1.2 item 6).</w:t>
-      </w:r>
-    </w:p>
-    <w:bookmarkEnd w:id="40"/>
-    <w:bookmarkStart w:id="41" w:name="robust-proximity-reads"/>
-    <w:p>
-      <w:pPr>
-        <w:pStyle w:val="Heading2"/>
-      </w:pPr>
-      <w:r>
-        <w:t xml:space="preserve">4.5 Robust proximity reads</w:t>
+        <w:t xml:space="preserve">Short wear.</w:t>
+      </w:r>
+      <w:r>
+        <w:t xml:space="preserve"> </w:t>
+      </w:r>
+      <w:r>
+        <w:t xml:space="preserve">Events shorter than 2 readings are dropped, so wear under about 10 minutes is not counted, and each start and end time is accurate to one 5-minute step.</w:t>
       </w:r>
     </w:p>
     <w:p>
       <w:pPr>
         <w:numPr>
           <w:ilvl w:val="0"/>
-          <w:numId w:val="1011"/>
+          <w:numId w:val="1005"/>
         </w:numPr>
         <w:pStyle w:val="Compact"/>
       </w:pPr>
@@ -3478,194 +3156,13 @@
           <w:bCs/>
           <w:b/>
         </w:rPr>
-        <w:t xml:space="preserve">Design Decision:</w:t>
-      </w:r>
-      <w:r>
-        <w:t xml:space="preserve"> </w:t>
-      </w:r>
-      <w:r>
-        <w:t xml:space="preserve">Discard the first 2 proximity samples after the sensor wakes, and bound every wait with a timeout; a missing sensor logs</w:t>
-      </w:r>
-      <w:r>
-        <w:t xml:space="preserve"> </w:t>
-      </w:r>
-      <w:r>
-        <w:rPr>
-          <w:rStyle w:val="VerbatimChar"/>
-        </w:rPr>
-        <w:t xml:space="preserve">0</w:t>
-      </w:r>
-      <w:r>
-        <w:t xml:space="preserve">.</w:t>
-      </w:r>
-    </w:p>
-    <w:p>
-      <w:pPr>
-        <w:numPr>
-          <w:ilvl w:val="0"/>
-          <w:numId w:val="1011"/>
-        </w:numPr>
-        <w:pStyle w:val="Compact"/>
-      </w:pPr>
-      <w:r>
-        <w:rPr>
-          <w:bCs/>
-          <w:b/>
-        </w:rPr>
-        <w:t xml:space="preserve">Why:</w:t>
-      </w:r>
-      <w:r>
-        <w:t xml:space="preserve"> </w:t>
-      </w:r>
-      <w:r>
-        <w:t xml:space="preserve">The first samples after wake-up are unsettled, and an unbounded wait on a faulty sensor would freeze the logger for the rest of the deployment.</w:t>
-      </w:r>
-    </w:p>
-    <w:bookmarkEnd w:id="41"/>
-    <w:bookmarkEnd w:id="42"/>
-    <w:bookmarkStart w:id="48" w:name="wear-detection-algorithm"/>
-    <w:p>
-      <w:pPr>
-        <w:pStyle w:val="Heading1"/>
-      </w:pPr>
-      <w:r>
-        <w:t xml:space="preserve">5. Wear-detection algorithm</w:t>
-      </w:r>
-    </w:p>
-    <w:p>
-      <w:pPr>
-        <w:pStyle w:val="FirstParagraph"/>
-      </w:pPr>
-      <w:r>
-        <w:t xml:space="preserve">Full parameter table:</w:t>
-      </w:r>
-      <w:r>
-        <w:t xml:space="preserve"> </w:t>
-      </w:r>
-      <w:r>
-        <w:rPr>
-          <w:rStyle w:val="VerbatimChar"/>
-        </w:rPr>
-        <w:t xml:space="preserve">HANDOFF.md</w:t>
-      </w:r>
-      <w:r>
-        <w:t xml:space="preserve"> </w:t>
-      </w:r>
-      <w:r>
-        <w:t xml:space="preserve">§4. How to re-tune: SOP Appendix C.</w:t>
-      </w:r>
-    </w:p>
-    <w:bookmarkStart w:id="43" w:name="temperature-above-a-rolling-baseline"/>
-    <w:p>
-      <w:pPr>
-        <w:pStyle w:val="Heading2"/>
-      </w:pPr>
-      <w:r>
-        <w:t xml:space="preserve">5.1 Temperature above a rolling baseline</w:t>
-      </w:r>
-    </w:p>
-    <w:p>
-      <w:pPr>
-        <w:numPr>
-          <w:ilvl w:val="0"/>
-          <w:numId w:val="1012"/>
-        </w:numPr>
-        <w:pStyle w:val="Compact"/>
-      </w:pPr>
-      <w:r>
-        <w:rPr>
-          <w:bCs/>
-          <w:b/>
-        </w:rPr>
-        <w:t xml:space="preserve">Design Decision:</w:t>
-      </w:r>
-      <w:r>
-        <w:t xml:space="preserve"> </w:t>
-      </w:r>
-      <w:r>
-        <w:t xml:space="preserve">Take room temperature as the rolling minimum over about 2 hours, and look at the rise above it (delta). An event starts when the proximity sensor is covered, the temperature has risen over the last ~15 minutes, and either the jump is ≥ 0.8 °C in one sample or the rise is ≥ 3 °C. It ends when the proximity sensor is uncovered, or the temperature is falling fast (≥ 0.4 °C per sample) and is near baseline or below 80 % of the event’s peak rise.</w:t>
-      </w:r>
-    </w:p>
-    <w:p>
-      <w:pPr>
-        <w:numPr>
-          <w:ilvl w:val="0"/>
-          <w:numId w:val="1012"/>
-        </w:numPr>
-        <w:pStyle w:val="Compact"/>
-      </w:pPr>
-      <w:r>
-        <w:rPr>
-          <w:bCs/>
-          <w:b/>
-        </w:rPr>
-        <w:t xml:space="preserve">Why:</w:t>
-      </w:r>
-      <w:r>
-        <w:t xml:space="preserve"> </w:t>
-      </w:r>
-      <w:r>
-        <w:t xml:space="preserve">Room temperature changes over the day, so a fixed threshold would fail; the rolling minimum follows it. The 15-minute trend check stops cooling slopes from triggering false onsets.</w:t>
-      </w:r>
-    </w:p>
-    <w:p>
-      <w:pPr>
-        <w:numPr>
-          <w:ilvl w:val="0"/>
-          <w:numId w:val="1012"/>
-        </w:numPr>
-        <w:pStyle w:val="Compact"/>
-      </w:pPr>
-      <w:r>
-        <w:rPr>
-          <w:bCs/>
-          <w:b/>
-        </w:rPr>
-        <w:t xml:space="preserve">Limitations:</w:t>
-      </w:r>
-    </w:p>
-    <w:p>
-      <w:pPr>
-        <w:numPr>
-          <w:ilvl w:val="1"/>
-          <w:numId w:val="1013"/>
-        </w:numPr>
-        <w:pStyle w:val="Compact"/>
-      </w:pPr>
-      <w:r>
-        <w:rPr>
-          <w:iCs/>
-          <w:i/>
-        </w:rPr>
-        <w:t xml:space="preserve">Short wear.</w:t>
-      </w:r>
-      <w:r>
-        <w:t xml:space="preserve"> </w:t>
-      </w:r>
-      <w:r>
-        <w:t xml:space="preserve">Events shorter than 2 readings are dropped, so wear periods under about 10 minutes are not counted, and every start and end time is accurate to one 5-minute step.</w:t>
-      </w:r>
-    </w:p>
-    <w:p>
-      <w:pPr>
-        <w:numPr>
-          <w:ilvl w:val="1"/>
-          <w:numId w:val="1013"/>
-        </w:numPr>
-        <w:pStyle w:val="Compact"/>
-      </w:pPr>
-      <w:r>
-        <w:rPr>
-          <w:iCs/>
-          <w:i/>
-        </w:rPr>
         <w:t xml:space="preserve">Long wear.</w:t>
       </w:r>
       <w:r>
         <w:t xml:space="preserve"> </w:t>
       </w:r>
       <w:r>
-        <w:t xml:space="preserve">After about an hour of continuous wear the 2-hour window holds only</w:t>
+        <w:t xml:space="preserve">After about an hour of continuous wear, the 2-hour window holds only</w:t>
       </w:r>
       <w:r>
         <w:t xml:space="preserve"> </w:t>
@@ -3683,7 +3180,7 @@
         <w:t xml:space="preserve"> </w:t>
       </w:r>
       <w:r>
-        <w:t xml:space="preserve">samples, so the baseline rises to skin temperature and delta falls to about 0. From then on, a single drop of 0.4 °C between samples ends the event, and it cannot restart (that needs delta ≥ 3 °C or a jump ≥ 0.8 °C). On synthetic 8-hour overnight wear, noise with a standard deviation of 0.15 °C split the nights into short pieces; with 0.04 °C they were detected whole. Possible fixes are in SOP Appendix C; validation is §1.2 item 5.</w:t>
+        <w:t xml:space="preserve">readings, so the baseline rises to skin temperature and delta falls to about 0. From then on, a single drop of 0.4 °C ends the event, and it cannot restart (that needs delta ≥ 3 °C or a jump ≥ 0.8 °C). On synthetic 8-hour overnight wear, sensor noise of 0.15 °C (standard deviation) split the nights into short pieces, while 0.04 °C left them whole. Possible fixes are in SOP Appendix C; checking overnight wear is part of §1.2 item 5.</w:t>
       </w:r>
     </w:p>
     <w:bookmarkEnd w:id="43"/>
@@ -3698,61 +3195,10 @@
     </w:p>
     <w:p>
       <w:pPr>
-        <w:numPr>
-          <w:ilvl w:val="0"/>
-          <w:numId w:val="1014"/>
-        </w:numPr>
-        <w:pStyle w:val="Compact"/>
-      </w:pPr>
-      <w:r>
-        <w:rPr>
-          <w:bCs/>
-          <w:b/>
-        </w:rPr>
-        <w:t xml:space="preserve">Design Decision:</w:t>
-      </w:r>
-      <w:r>
-        <w:t xml:space="preserve"> </w:t>
-      </w:r>
-      <w:r>
-        <w:t xml:space="preserve">Use the proximity sensor only to confirm</w:t>
-      </w:r>
-      <w:r>
-        <w:t xml:space="preserve"> </w:t>
-      </w:r>
-      <w:r>
-        <w:t xml:space="preserve">“</w:t>
-      </w:r>
-      <w:r>
-        <w:t xml:space="preserve">covered</w:t>
-      </w:r>
-      <w:r>
-        <w:t xml:space="preserve">”</w:t>
-      </w:r>
-      <w:r>
-        <w:t xml:space="preserve">, not to detect wear on its own.</w:t>
-      </w:r>
-    </w:p>
-    <w:p>
-      <w:pPr>
-        <w:numPr>
-          <w:ilvl w:val="0"/>
-          <w:numId w:val="1014"/>
-        </w:numPr>
-        <w:pStyle w:val="Compact"/>
-      </w:pPr>
-      <w:r>
-        <w:rPr>
-          <w:bCs/>
-          <w:b/>
-        </w:rPr>
-        <w:t xml:space="preserve">Why:</w:t>
-      </w:r>
-      <w:r>
-        <w:t xml:space="preserve"> </w:t>
-      </w:r>
-      <w:r>
-        <w:t xml:space="preserve">Temperature alone can’t tell wear from a warm environment (e.g. the splint left on a radiator or in the sun); the covered sensor rules those out.</w:t>
+        <w:pStyle w:val="FirstParagraph"/>
+      </w:pPr>
+      <w:r>
+        <w:t xml:space="preserve">The proximity sensor is used only to confirm that the splint is covered, not to detect wear on its own. Temperature alone cannot tell wear from a warm environment, such as a splint left on a radiator or in the sun; requiring the sensor to be covered rules those out.</w:t>
       </w:r>
     </w:p>
     <w:bookmarkEnd w:id="44"/>
@@ -3779,24 +3225,36 @@
     </w:p>
     <w:p>
       <w:pPr>
-        <w:numPr>
-          <w:ilvl w:val="0"/>
-          <w:numId w:val="1015"/>
-        </w:numPr>
-        <w:pStyle w:val="Compact"/>
-      </w:pPr>
-      <w:r>
-        <w:rPr>
-          <w:bCs/>
-          <w:b/>
-        </w:rPr>
-        <w:t xml:space="preserve">Design Decision:</w:t>
-      </w:r>
-      <w:r>
-        <w:t xml:space="preserve"> </w:t>
-      </w:r>
-      <w:r>
-        <w:t xml:space="preserve">Track the proximity floor as the rolling 10th percentile over about a day, subtract it, and call the sensor covered when the remainder is within the noise (</w:t>
+        <w:pStyle w:val="FirstParagraph"/>
+      </w:pPr>
+      <w:r>
+        <w:t xml:space="preserve">Over a 35-day recording, the proximity reading while worn crept from 0 into the 50s as the battery discharged. The original test (proximity equal to 0) therefore stopped working after about 11 days, and wear was missed from then on.</w:t>
+      </w:r>
+    </w:p>
+    <w:p>
+      <w:pPr>
+        <w:pStyle w:val="BodyText"/>
+      </w:pPr>
+      <w:r>
+        <w:t xml:space="preserve">The app now tracks the proximity</w:t>
+      </w:r>
+      <w:r>
+        <w:t xml:space="preserve"> </w:t>
+      </w:r>
+      <w:r>
+        <w:t xml:space="preserve">“</w:t>
+      </w:r>
+      <w:r>
+        <w:t xml:space="preserve">floor</w:t>
+      </w:r>
+      <w:r>
+        <w:t xml:space="preserve">”</w:t>
+      </w:r>
+      <w:r>
+        <w:t xml:space="preserve"> </w:t>
+      </w:r>
+      <w:r>
+        <w:t xml:space="preserve">as the rolling 10th percentile over about a day, subtracts it, and treats the sensor as covered when what remains is within the noise (</w:t>
       </w:r>
       <w:r>
         <w:rPr>
@@ -3808,37 +3266,6 @@
         <w:t xml:space="preserve">, where MAD is the median absolute deviation).</w:t>
       </w:r>
     </w:p>
-    <w:p>
-      <w:pPr>
-        <w:numPr>
-          <w:ilvl w:val="0"/>
-          <w:numId w:val="1015"/>
-        </w:numPr>
-        <w:pStyle w:val="Compact"/>
-      </w:pPr>
-      <w:r>
-        <w:rPr>
-          <w:bCs/>
-          <w:b/>
-        </w:rPr>
-        <w:t xml:space="preserve">Why:</w:t>
-      </w:r>
-      <w:r>
-        <w:t xml:space="preserve"> </w:t>
-      </w:r>
-      <w:r>
-        <w:t xml:space="preserve">On a 35-day recording the proximity reading while worn crept from 0 into the 50s as the battery discharged. The original test (</w:t>
-      </w:r>
-      <w:r>
-        <w:rPr>
-          <w:rStyle w:val="VerbatimChar"/>
-        </w:rPr>
-        <w:t xml:space="preserve">prox == 0</w:t>
-      </w:r>
-      <w:r>
-        <w:t xml:space="preserve">) stopped working after about 11 days, and wear was missed from then on.</w:t>
-      </w:r>
-    </w:p>
     <w:bookmarkEnd w:id="45"/>
     <w:bookmarkStart w:id="46" w:name="thresholds-are-empirical"/>
     <w:p>
@@ -3869,18 +3296,10 @@
     </w:p>
     <w:p>
       <w:pPr>
-        <w:numPr>
-          <w:ilvl w:val="0"/>
-          <w:numId w:val="1016"/>
-        </w:numPr>
-        <w:pStyle w:val="Compact"/>
-      </w:pPr>
-      <w:r>
-        <w:rPr>
-          <w:bCs/>
-          <w:b/>
-        </w:rPr>
-        <w:t xml:space="preserve">Note:</w:t>
+        <w:pStyle w:val="FirstParagraph"/>
+      </w:pPr>
+      <w:r>
+        <w:t xml:space="preserve">The app’s</w:t>
       </w:r>
       <w:r>
         <w:t xml:space="preserve"> </w:t>
@@ -3898,7 +3317,7 @@
         <w:t xml:space="preserve"> </w:t>
       </w:r>
       <w:r>
-        <w:t xml:space="preserve">is the mean over days with at least one detected wear event, so a day with no detected wear (e.g. the splint was not worn at all) is not counted, and the partial first and last days count as days. If this is not the definition the study needs, divide Total Wear Time by the number of days in the recording (SOP §8).</w:t>
+        <w:t xml:space="preserve">is the mean over days with at least one detected wear event. A day with no detected wear (e.g. the splint was not worn at all) is therefore not counted, and the partial first and last days count as days. If this is not the definition the study needs, divide Total Wear Time by the number of days in the recording (SOP §8).</w:t>
       </w:r>
     </w:p>
     <w:bookmarkEnd w:id="47"/>
@@ -3914,24 +3333,10 @@
     </w:p>
     <w:p>
       <w:pPr>
-        <w:numPr>
-          <w:ilvl w:val="0"/>
-          <w:numId w:val="1017"/>
-        </w:numPr>
-        <w:pStyle w:val="Compact"/>
-      </w:pPr>
-      <w:r>
-        <w:rPr>
-          <w:bCs/>
-          <w:b/>
-        </w:rPr>
-        <w:t xml:space="preserve">Design Decision:</w:t>
-      </w:r>
-      <w:r>
-        <w:t xml:space="preserve"> </w:t>
-      </w:r>
-      <w:r>
-        <w:t xml:space="preserve">The logger knows only UTC epoch seconds. The app asks for and shows</w:t>
+        <w:pStyle w:val="FirstParagraph"/>
+      </w:pPr>
+      <w:r>
+        <w:t xml:space="preserve">The logger knows only UTC time, stored as epoch seconds. The app asks for and shows</w:t>
       </w:r>
       <w:r>
         <w:t xml:space="preserve"> </w:t>
@@ -3947,7 +3352,7 @@
         <w:t xml:space="preserve"> </w:t>
       </w:r>
       <w:r>
-        <w:t xml:space="preserve">(America/New_York, daylight-saving aware) everywhere, and writes timestamps with their UTC offset (e.g. </w:t>
+        <w:t xml:space="preserve">(America/New_York, daylight-saving aware) everywhere, because the study runs in Ontario, and writes every timestamp with its UTC offset (e.g. </w:t>
       </w:r>
       <w:r>
         <w:rPr>
@@ -3956,73 +3361,7 @@
         <w:t xml:space="preserve">-04:00</w:t>
       </w:r>
       <w:r>
-        <w:t xml:space="preserve">).</w:t>
-      </w:r>
-    </w:p>
-    <w:p>
-      <w:pPr>
-        <w:numPr>
-          <w:ilvl w:val="0"/>
-          <w:numId w:val="1017"/>
-        </w:numPr>
-        <w:pStyle w:val="Compact"/>
-      </w:pPr>
-      <w:r>
-        <w:rPr>
-          <w:bCs/>
-          <w:b/>
-        </w:rPr>
-        <w:t xml:space="preserve">Why:</w:t>
-      </w:r>
-      <w:r>
-        <w:t xml:space="preserve"> </w:t>
-      </w:r>
-      <w:r>
-        <w:t xml:space="preserve">The study runs in Ontario. The offset keeps the repeated hour at the November change unambiguous, and durations across the change come out right.</w:t>
-      </w:r>
-    </w:p>
-    <w:p>
-      <w:pPr>
-        <w:numPr>
-          <w:ilvl w:val="0"/>
-          <w:numId w:val="1017"/>
-        </w:numPr>
-        <w:pStyle w:val="Compact"/>
-      </w:pPr>
-      <w:r>
-        <w:rPr>
-          <w:bCs/>
-          <w:b/>
-        </w:rPr>
-        <w:t xml:space="preserve">Recovery:</w:t>
-      </w:r>
-      <w:r>
-        <w:t xml:space="preserve"> </w:t>
-      </w:r>
-      <w:r>
-        <w:t xml:space="preserve">If a logger loses its start time, the elapsed times survive. The app detects such files and rebuilds the timestamps from a start time the user enters, during download or on the Data Analysis page.</w:t>
-      </w:r>
-    </w:p>
-    <w:p>
-      <w:pPr>
-        <w:numPr>
-          <w:ilvl w:val="0"/>
-          <w:numId w:val="1017"/>
-        </w:numPr>
-        <w:pStyle w:val="Compact"/>
-      </w:pPr>
-      <w:r>
-        <w:rPr>
-          <w:bCs/>
-          <w:b/>
-        </w:rPr>
-        <w:t xml:space="preserve">To change the zone:</w:t>
-      </w:r>
-      <w:r>
-        <w:t xml:space="preserve"> </w:t>
-      </w:r>
-      <w:r>
-        <w:t xml:space="preserve">edit</w:t>
+        <w:t xml:space="preserve">). The offset keeps the repeated hour at the November clock change unambiguous, and durations across the change come out right. To change the time zone, edit</w:t>
       </w:r>
       <w:r>
         <w:t xml:space="preserve"> </w:t>
@@ -4037,6 +3376,14 @@
         <w:t xml:space="preserve">.</w:t>
       </w:r>
     </w:p>
+    <w:p>
+      <w:pPr>
+        <w:pStyle w:val="BodyText"/>
+      </w:pPr>
+      <w:r>
+        <w:t xml:space="preserve">If a logger loses its start time, the elapsed times survive. The app detects such files and rebuilds the timestamps from a start time the user enters, either during download or on the Data Analysis page.</w:t>
+      </w:r>
+    </w:p>
     <w:bookmarkEnd w:id="49"/>
     <w:bookmarkStart w:id="51" w:name="desktop-application"/>
     <w:p>
@@ -4049,24 +3396,10 @@
     </w:p>
     <w:p>
       <w:pPr>
-        <w:numPr>
-          <w:ilvl w:val="0"/>
-          <w:numId w:val="1018"/>
-        </w:numPr>
-        <w:pStyle w:val="Compact"/>
-      </w:pPr>
-      <w:r>
-        <w:rPr>
-          <w:bCs/>
-          <w:b/>
-        </w:rPr>
-        <w:t xml:space="preserve">Browser-based interface (Dash + Flask-SocketIO).</w:t>
-      </w:r>
-      <w:r>
-        <w:t xml:space="preserve"> </w:t>
-      </w:r>
-      <w:r>
-        <w:t xml:space="preserve">Plotly/Dash provide the charts and tables; the app runs a local server on</w:t>
+        <w:pStyle w:val="FirstParagraph"/>
+      </w:pPr>
+      <w:r>
+        <w:t xml:space="preserve">The app is a small web application (Dash and Flask-SocketIO, with Plotly charts) that runs a local server on</w:t>
       </w:r>
       <w:r>
         <w:t xml:space="preserve"> </w:t>
@@ -4081,76 +3414,15 @@
         <w:t xml:space="preserve"> </w:t>
       </w:r>
       <w:r>
-        <w:t xml:space="preserve">and opens the browser.</w:t>
-      </w:r>
-    </w:p>
-    <w:p>
-      <w:pPr>
-        <w:numPr>
-          <w:ilvl w:val="0"/>
-          <w:numId w:val="1018"/>
-        </w:numPr>
-        <w:pStyle w:val="Compact"/>
-      </w:pPr>
-      <w:r>
-        <w:rPr>
-          <w:bCs/>
-          <w:b/>
-        </w:rPr>
-        <w:t xml:space="preserve">Heartbeat shutdown.</w:t>
-      </w:r>
-      <w:r>
-        <w:t xml:space="preserve"> </w:t>
-      </w:r>
-      <w:r>
-        <w:t xml:space="preserve">The page sends a heartbeat every 5 s. With none for 5 minutes, the server warns the page and exits, so closing the tab doesn’t leave a hidden server holding the serial port.</w:t>
-      </w:r>
-    </w:p>
-    <w:p>
-      <w:pPr>
-        <w:numPr>
-          <w:ilvl w:val="0"/>
-          <w:numId w:val="1018"/>
-        </w:numPr>
-        <w:pStyle w:val="Compact"/>
-      </w:pPr>
-      <w:r>
-        <w:rPr>
-          <w:bCs/>
-          <w:b/>
-        </w:rPr>
-        <w:t xml:space="preserve">Works offline.</w:t>
-      </w:r>
-      <w:r>
-        <w:t xml:space="preserve"> </w:t>
-      </w:r>
-      <w:r>
-        <w:t xml:space="preserve">All required assets are packaged, allowing the application to be usable in offline conditions as well.</w:t>
-      </w:r>
-    </w:p>
-    <w:p>
-      <w:pPr>
-        <w:numPr>
-          <w:ilvl w:val="0"/>
-          <w:numId w:val="1018"/>
-        </w:numPr>
-        <w:pStyle w:val="Compact"/>
-      </w:pPr>
-      <w:r>
-        <w:rPr>
-          <w:bCs/>
-          <w:b/>
-        </w:rPr>
-        <w:t xml:space="preserve">Automated releases.</w:t>
-      </w:r>
-      <w:r>
-        <w:t xml:space="preserve"> </w:t>
-      </w:r>
-      <w:r>
-        <w:t xml:space="preserve">GitHub Actions builds stand-alone Windows and macOS programs on each</w:t>
-      </w:r>
-      <w:r>
-        <w:t xml:space="preserve"> </w:t>
+        <w:t xml:space="preserve">and opens in the browser. While the page is open it sends a heartbeat every 5 seconds; if none arrives for 5 minutes, the server warns the page and exits, so closing the tab does not leave a hidden server holding the logger’s connection. All its assets are packaged with it, so it also works offline.</w:t>
+      </w:r>
+    </w:p>
+    <w:p>
+      <w:pPr>
+        <w:pStyle w:val="BodyText"/>
+      </w:pPr>
+      <w:r>
+        <w:t xml:space="preserve">GitHub Actions builds stand-alone Windows and macOS programs, with Python included, each time a version tag (</w:t>
       </w:r>
       <w:r>
         <w:rPr>
@@ -4159,32 +3431,7 @@
         <w:t xml:space="preserve">v*</w:t>
       </w:r>
       <w:r>
-        <w:t xml:space="preserve"> </w:t>
-      </w:r>
-      <w:r>
-        <w:t xml:space="preserve">tag, with Python included, so staff need no Python (SOP Appendix B).</w:t>
-      </w:r>
-    </w:p>
-    <w:p>
-      <w:pPr>
-        <w:numPr>
-          <w:ilvl w:val="0"/>
-          <w:numId w:val="1018"/>
-        </w:numPr>
-        <w:pStyle w:val="Compact"/>
-      </w:pPr>
-      <w:r>
-        <w:rPr>
-          <w:bCs/>
-          <w:b/>
-        </w:rPr>
-        <w:t xml:space="preserve">Participant IDs.</w:t>
-      </w:r>
-      <w:r>
-        <w:t xml:space="preserve"> </w:t>
-      </w:r>
-      <w:r>
-        <w:t xml:space="preserve">Letters, digits,</w:t>
+        <w:t xml:space="preserve">) is pushed, so staff need no Python (SOP Appendix B). Participant IDs are limited to letters, digits,</w:t>
       </w:r>
       <w:r>
         <w:t xml:space="preserve"> </w:t>
@@ -4211,7 +3458,7 @@
         <w:t xml:space="preserve">_</w:t>
       </w:r>
       <w:r>
-        <w:t xml:space="preserve">, up to 15 characters: they go into the CSV header and often into file names, where commas or spaces would cause trouble.</w:t>
+        <w:t xml:space="preserve">, up to 15 characters, because they go into the CSV header and often into file names, where commas or spaces would cause trouble.</w:t>
       </w:r>
     </w:p>
     <w:bookmarkStart w:id="50" w:name="data-handling-app-behaviour"/>
@@ -4235,7 +3482,7 @@
       <w:pPr>
         <w:numPr>
           <w:ilvl w:val="0"/>
-          <w:numId w:val="1019"/>
+          <w:numId w:val="1006"/>
         </w:numPr>
         <w:pStyle w:val="Compact"/>
       </w:pPr>
@@ -4266,7 +3513,7 @@
       <w:pPr>
         <w:numPr>
           <w:ilvl w:val="0"/>
-          <w:numId w:val="1019"/>
+          <w:numId w:val="1006"/>
         </w:numPr>
         <w:pStyle w:val="Compact"/>
       </w:pPr>
@@ -4288,7 +3535,7 @@
       <w:pPr>
         <w:numPr>
           <w:ilvl w:val="0"/>
-          <w:numId w:val="1019"/>
+          <w:numId w:val="1006"/>
         </w:numPr>
         <w:pStyle w:val="Compact"/>
       </w:pPr>
@@ -4310,7 +3557,7 @@
       <w:pPr>
         <w:numPr>
           <w:ilvl w:val="0"/>
-          <w:numId w:val="1019"/>
+          <w:numId w:val="1006"/>
         </w:numPr>
         <w:pStyle w:val="Compact"/>
       </w:pPr>
@@ -4332,7 +3579,7 @@
       <w:pPr>
         <w:numPr>
           <w:ilvl w:val="0"/>
-          <w:numId w:val="1019"/>
+          <w:numId w:val="1006"/>
         </w:numPr>
         <w:pStyle w:val="Compact"/>
       </w:pPr>
@@ -4354,7 +3601,7 @@
       <w:pPr>
         <w:numPr>
           <w:ilvl w:val="0"/>
-          <w:numId w:val="1019"/>
+          <w:numId w:val="1006"/>
         </w:numPr>
         <w:pStyle w:val="Compact"/>
       </w:pPr>
@@ -4742,45 +3989,6 @@
     <w:abstractNumId w:val="991"/>
   </w:num>
   <w:num w:numId="1006">
-    <w:abstractNumId w:val="991"/>
-  </w:num>
-  <w:num w:numId="1007">
-    <w:abstractNumId w:val="991"/>
-  </w:num>
-  <w:num w:numId="1008">
-    <w:abstractNumId w:val="991"/>
-  </w:num>
-  <w:num w:numId="1009">
-    <w:abstractNumId w:val="991"/>
-  </w:num>
-  <w:num w:numId="1010">
-    <w:abstractNumId w:val="991"/>
-  </w:num>
-  <w:num w:numId="1011">
-    <w:abstractNumId w:val="991"/>
-  </w:num>
-  <w:num w:numId="1012">
-    <w:abstractNumId w:val="991"/>
-  </w:num>
-  <w:num w:numId="1013">
-    <w:abstractNumId w:val="991"/>
-  </w:num>
-  <w:num w:numId="1014">
-    <w:abstractNumId w:val="991"/>
-  </w:num>
-  <w:num w:numId="1015">
-    <w:abstractNumId w:val="991"/>
-  </w:num>
-  <w:num w:numId="1016">
-    <w:abstractNumId w:val="991"/>
-  </w:num>
-  <w:num w:numId="1017">
-    <w:abstractNumId w:val="991"/>
-  </w:num>
-  <w:num w:numId="1018">
-    <w:abstractNumId w:val="991"/>
-  </w:num>
-  <w:num w:numId="1019">
     <w:abstractNumId w:val="991"/>
   </w:num>
 </w:numbering>

</xml_diff>

<commit_message>
Handover: treat start time as a setup step, not a bug; trim document end
Drop start time from the firmware-fix next step and HANDOFF.md known
issues; keep a reminder to set the start time to when the battery is
connected. Port Jamie's 'jumper trace' edit, shorten the last table row so
the document fits on 9 pages, and end the docx with a 1-pt paragraph so Word
does not add a blank page after the final table.

Co-Authored-By: Claude Opus 5.5 <noreply@anthropic.com>
Claude-Session: https://claude.ai/code/session_01Ue3sWJSFRo3Bxhe8SfexR3
</commit_message>
<xml_diff>
--- a/docs/Project_Handover.docx
+++ b/docs/Project_Handover.docx
@@ -884,7 +884,7 @@
               <w:rPr>
                 <w:sz w:val="19"/>
               </w:rPr>
-              <w:t xml:space="preserve">2. Firmware fixes (start time, timing, storage)</w:t>
+              <w:t xml:space="preserve">2. Firmware fixes (timing, storage)</w:t>
             </w:r>
           </w:p>
         </w:tc>
@@ -928,7 +928,7 @@
               <w:rPr>
                 <w:sz w:val="19"/>
               </w:rPr>
-              <w:t xml:space="preserve">timestamps are only right if the logger is powered on at the entered start time, and recordings longer than about 7 weeks may be corrupted. First, make data collection start at Initialize. Then add wrap-safe sleep and the storage limit; if item 1 confirms a battery life of 30–40 days, a recording never reaches 15 000 readings, so these two are safeguards rather than urgent work. To confirm the storage issue, initialize a logger with a 1-second interval (a temporary change to</w:t>
+              <w:t xml:space="preserve">recordings longer than about 7 weeks may be corrupted. Add wrap-safe sleep and the storage limit; if item 1 confirms a battery life of 30–40 days, a recording never reaches 15 000 readings, so these two are safeguards rather than urgent work. To confirm the storage issue, initialize a logger with a 1-second interval (a temporary change to</w:t>
             </w:r>
             <w:r>
               <w:rPr>
@@ -2652,7 +2652,7 @@
         <w:pStyle w:val="BodyText"/>
       </w:pPr>
       <w:r>
-        <w:t xml:space="preserve">It runs on a CR2450 coin cell connected to the 3.3 V pin. The 3.3 V jumper on the back of the board is cut so that the board’s regulator and USB circuitry draw no power. As a result, USB alone cannot power the logger: the cell must be connected whenever the logger is used with the app, and flashing new firmware needs the jumper bridged first and cut again afterwards (SOP §3.2). This is why one of the two loggers needs its jumper reconnected before its firmware can be updated (§1.1).</w:t>
+        <w:t xml:space="preserve">It runs on a CR2450 coin cell connected to the 3.3 V pin. The 3.3 V jumper trace on the back of the board is cut so that the board’s regulator and USB circuitry draw no power. As a result, USB alone cannot power the logger: the cell must be connected whenever the logger is used with the app, and flashing new firmware needs the jumper bridged first and cut again afterwards (SOP §3.2). This is why one of the two loggers needs its jumper reconnected before its firmware can be updated (§1.1).</w:t>
       </w:r>
     </w:p>
     <w:p>
@@ -2934,7 +2934,7 @@
         <w:pStyle w:val="BodyText"/>
       </w:pPr>
       <w:r>
-        <w:t xml:space="preserve">This design has three limitations:</w:t>
+        <w:t xml:space="preserve">Three points follow from this design:</w:t>
       </w:r>
     </w:p>
     <w:p>
@@ -2956,7 +2956,7 @@
         <w:t xml:space="preserve"> </w:t>
       </w:r>
       <w:r>
-        <w:t xml:space="preserve">Elapsed time counts from the power-on that starts data collection, while the start time is the one entered at Initialize. Any gap between the two shifts every timestamp by that amount, and nothing in the file shows it. §1.2 item 2 removes this.</w:t>
+        <w:t xml:space="preserve">Elapsed time counts from the power-on that starts data collection, while the start time is the one entered at Initialize. If the battery will be connected later than planned, change the start time at Initialize to match (SOP §5); any gap between the two shifts every timestamp by that amount, and nothing in the file shows it.</w:t>
       </w:r>
     </w:p>
     <w:p>
@@ -3781,13 +3781,21 @@
               <w:rPr>
                 <w:sz w:val="19"/>
               </w:rPr>
-              <w:t xml:space="preserve">Only the parts needed (microcontroller, temperature and proximity sensors, power regulation) on a board shaped for the splint: smaller, lower current, and better sensor placement against the skin. Needs hardware design and validation</w:t>
+              <w:t xml:space="preserve">Only the parts needed (microcontroller, sensors, power regulation) on a board shaped for the splint: smaller, lower current, better sensor contact with the skin. Needs hardware design and validation</w:t>
             </w:r>
           </w:p>
         </w:tc>
       </w:tr>
     </w:tbl>
     <w:bookmarkEnd w:id="52"/>
+    <w:p>
+      <w:pPr>
+        <w:spacing w:before="0" w:after="0" w:line="20" w:lineRule="exact"/>
+        <w:rPr>
+          <w:sz w:val="2"/>
+        </w:rPr>
+      </w:pPr>
+    </w:p>
     <w:sectPr/>
   </w:body>
 </w:document>

</xml_diff>

<commit_message>
Docs: final wording polish before submission
Fix the battery-estimate wording, define-free PLA note (drop MSK-IF),
clearer key-term and resting-current phrasing, and matching version lines.

Co-Authored-By: Claude Opus 5.5 <noreply@anthropic.com>
Claude-Session: https://claude.ai/code/session_01Ue3sWJSFRo3Bxhe8SfexR3
</commit_message>
<xml_diff>
--- a/docs/Project_Handover.docx
+++ b/docs/Project_Handover.docx
@@ -159,7 +159,7 @@
           <w:iCs/>
           <w:i/>
         </w:rPr>
-        <w:t xml:space="preserve">October 2026 Ver. Prepared by Jamie Kim.</w:t>
+        <w:t xml:space="preserve">Version: October 2026. Prepared by Jamie Kim.</w:t>
       </w:r>
     </w:p>
     <w:bookmarkStart w:id="20" w:name="about-this-document"/>
@@ -852,7 +852,7 @@
               <w:rPr>
                 <w:sz w:val="19"/>
               </w:rPr>
-              <w:t xml:space="preserve">sets how long a deployment can safely run, and how urgent item 2 is. Leave one logger on the bench for a full month, or until the battery dies. A CR2450 (~620 mAh) at ~750 µA gives a rough upper bound of about 34 days, consistent with the ~36-day recording. Until it is measured, fit a new cell for every deployment.</w:t>
+              <w:t xml:space="preserve">sets how long a deployment can safely run, and how urgent item 2 is. Leave one logger on the bench for a full month, or until the battery dies. A CR2450 (~620 mAh) at ~750 µA lasts roughly 34 days, in line with the ~36-day recording. Until it is measured, fit a new cell for every deployment.</w:t>
             </w:r>
           </w:p>
         </w:tc>
@@ -1837,7 +1837,7 @@
               <w:rPr>
                 <w:sz w:val="19"/>
               </w:rPr>
-              <w:t xml:space="preserve">The Arduino Nano 33 BLE Sense board with programmed hardware, designed to be in the splint</w:t>
+              <w:t xml:space="preserve">The Arduino Nano 33 BLE Sense board running the project firmware, designed to be in the splint</w:t>
             </w:r>
           </w:p>
         </w:tc>
@@ -2797,7 +2797,7 @@
         <w:t xml:space="preserve">delay()</w:t>
       </w:r>
       <w:r>
-        <w:t xml:space="preserve">. The resting current measured below about 750 µA. A deeper sleep mode (RTC2 timer +</w:t>
+        <w:t xml:space="preserve">. The measured resting current is below about 750 µA. A deeper sleep mode (RTC2 timer +</w:t>
       </w:r>
       <w:r>
         <w:t xml:space="preserve"> </w:t>

</xml_diff>